<commit_message>
Cambios en documento de memoria
Estado del arte (faltan explicacion de modelos de marchine learning usado) + ETL + EDA (Estructurados completo) + Prospección (Productividad, sostenibilidad y riesgo climatico) + Problema 1 de machine learning con sus resultados explicados
</commit_message>
<xml_diff>
--- a/memoria.docx
+++ b/memoria.docx
@@ -529,15 +529,731 @@
     </w:p>
     <w:p>
       <w:pPr>
-        <w:rPr>
+        <w:spacing w:line="276" w:lineRule="auto"/>
+        <w:jc w:val="both"/>
+        <w:rPr>
+          <w:rFonts w:ascii="Arial" w:hAnsi="Arial" w:cs="Arial"/>
+          <w:sz w:val="24"/>
+        </w:rPr>
+      </w:pPr>
+      <w:r>
+        <w:rPr>
+          <w:rFonts w:ascii="Arial" w:hAnsi="Arial" w:cs="Arial"/>
+          <w:sz w:val="24"/>
+        </w:rPr>
+        <w:t xml:space="preserve">Hoy en día </w:t>
+      </w:r>
+      <w:r>
+        <w:rPr>
+          <w:rFonts w:ascii="Arial" w:hAnsi="Arial" w:cs="Arial"/>
+          <w:sz w:val="24"/>
+        </w:rPr>
+        <w:t>todo lo que gira en torno al ecosistema agrícola y ganadero se ve afectado por la variabilidad climática y los posibles elementos externos que pueden afectar a los mercados. Por ello, el análisis de datos en estos sectores se apoya fuertemente en la fusión de datos de diferentes fuentes de las que poder obtener todo lo que se necesitar para la detección temprana de posibles mejoras o anomalías que se pueden producir ante determinadas situaciones.</w:t>
+      </w:r>
+    </w:p>
+    <w:p>
+      <w:pPr>
+        <w:spacing w:line="276" w:lineRule="auto"/>
+        <w:jc w:val="both"/>
+        <w:rPr>
+          <w:rFonts w:ascii="Arial" w:hAnsi="Arial" w:cs="Arial"/>
+          <w:sz w:val="24"/>
+        </w:rPr>
+      </w:pPr>
+      <w:r>
+        <w:rPr>
+          <w:rFonts w:ascii="Arial" w:hAnsi="Arial" w:cs="Arial"/>
+          <w:sz w:val="24"/>
+        </w:rPr>
+        <w:t>Las técnicas de análisis de datos que van a usar van más allá del simple análisis descriptivo tradicional. Entre las diferentes técnicas podemos encontrar:</w:t>
+      </w:r>
+    </w:p>
+    <w:p>
+      <w:pPr>
+        <w:pStyle w:val="Prrafodelista"/>
+        <w:numPr>
+          <w:ilvl w:val="0"/>
+          <w:numId w:val="15"/>
+        </w:numPr>
+        <w:spacing w:line="276" w:lineRule="auto"/>
+        <w:jc w:val="both"/>
+        <w:rPr>
+          <w:rFonts w:ascii="Arial" w:hAnsi="Arial" w:cs="Arial"/>
+          <w:sz w:val="24"/>
+        </w:rPr>
+      </w:pPr>
+      <w:r>
+        <w:rPr>
+          <w:rFonts w:ascii="Arial" w:hAnsi="Arial" w:cs="Arial"/>
+          <w:sz w:val="24"/>
+        </w:rPr>
+        <w:t xml:space="preserve">Técnicas de aplanamiento </w:t>
+      </w:r>
+      <w:r>
+        <w:rPr>
+          <w:rFonts w:ascii="Arial" w:hAnsi="Arial" w:cs="Arial"/>
+          <w:sz w:val="24"/>
+        </w:rPr>
+        <w:t>de estructuras anidadas (JSON/XML) a formatos tabulares (CSV) lo cual permitirá el cruce de diferentes fuentes de datos para obtener mejores resultados.</w:t>
+      </w:r>
+    </w:p>
+    <w:p>
+      <w:pPr>
+        <w:pStyle w:val="Prrafodelista"/>
+        <w:numPr>
+          <w:ilvl w:val="0"/>
+          <w:numId w:val="15"/>
+        </w:numPr>
+        <w:spacing w:line="276" w:lineRule="auto"/>
+        <w:jc w:val="both"/>
+        <w:rPr>
+          <w:rFonts w:ascii="Arial" w:hAnsi="Arial" w:cs="Arial"/>
+          <w:sz w:val="24"/>
+        </w:rPr>
+      </w:pPr>
+      <w:r>
+        <w:rPr>
+          <w:rFonts w:ascii="Arial" w:hAnsi="Arial" w:cs="Arial"/>
+          <w:sz w:val="24"/>
+        </w:rPr>
+        <w:t xml:space="preserve">Detección de elementos faltantes y anomalías en los datos para poder hacer una correcta limpieza de los diferentes </w:t>
+      </w:r>
+      <w:proofErr w:type="spellStart"/>
+      <w:r>
+        <w:rPr>
+          <w:rFonts w:ascii="Arial" w:hAnsi="Arial" w:cs="Arial"/>
+          <w:sz w:val="24"/>
+        </w:rPr>
+        <w:t>datasets</w:t>
+      </w:r>
+      <w:proofErr w:type="spellEnd"/>
+      <w:r>
+        <w:rPr>
+          <w:rFonts w:ascii="Arial" w:hAnsi="Arial" w:cs="Arial"/>
+          <w:sz w:val="24"/>
+        </w:rPr>
+        <w:t xml:space="preserve"> de los que se dispone.</w:t>
+      </w:r>
+    </w:p>
+    <w:p>
+      <w:pPr>
+        <w:pStyle w:val="Prrafodelista"/>
+        <w:numPr>
+          <w:ilvl w:val="0"/>
+          <w:numId w:val="15"/>
+        </w:numPr>
+        <w:spacing w:line="276" w:lineRule="auto"/>
+        <w:jc w:val="both"/>
+        <w:rPr>
+          <w:rFonts w:ascii="Arial" w:hAnsi="Arial" w:cs="Arial"/>
+          <w:sz w:val="24"/>
+        </w:rPr>
+      </w:pPr>
+      <w:r>
+        <w:rPr>
+          <w:rFonts w:ascii="Arial" w:hAnsi="Arial" w:cs="Arial"/>
+          <w:sz w:val="24"/>
+        </w:rPr>
+        <w:t>Análisis exploratorio de datos para comprobar posible relaciones en los datos lo cual permita obtener conclusiones que pueden llegar a ser relevantes y detectar posibles anomalías que puedan resolver problemas en el futuro.</w:t>
+      </w:r>
+    </w:p>
+    <w:p>
+      <w:pPr>
+        <w:pStyle w:val="Prrafodelista"/>
+        <w:numPr>
+          <w:ilvl w:val="0"/>
+          <w:numId w:val="15"/>
+        </w:numPr>
+        <w:spacing w:line="276" w:lineRule="auto"/>
+        <w:jc w:val="both"/>
+        <w:rPr>
+          <w:rFonts w:ascii="Arial" w:hAnsi="Arial" w:cs="Arial"/>
+          <w:sz w:val="24"/>
+        </w:rPr>
+      </w:pPr>
+      <w:r>
+        <w:rPr>
+          <w:rFonts w:ascii="Arial" w:hAnsi="Arial" w:cs="Arial"/>
+          <w:sz w:val="24"/>
+        </w:rPr>
+        <w:t>Técnicas de creación de variables sintéticas que permitan transformar los datos en indicadores clave para obtener más información de los datos.</w:t>
+      </w:r>
+    </w:p>
+    <w:p>
+      <w:pPr>
+        <w:pStyle w:val="Prrafodelista"/>
+        <w:numPr>
+          <w:ilvl w:val="0"/>
+          <w:numId w:val="15"/>
+        </w:numPr>
+        <w:spacing w:line="276" w:lineRule="auto"/>
+        <w:jc w:val="both"/>
+        <w:rPr>
+          <w:rFonts w:ascii="Arial" w:hAnsi="Arial" w:cs="Arial"/>
+          <w:sz w:val="24"/>
+        </w:rPr>
+      </w:pPr>
+      <w:r>
+        <w:rPr>
+          <w:rFonts w:ascii="Arial" w:hAnsi="Arial" w:cs="Arial"/>
+          <w:sz w:val="24"/>
+        </w:rPr>
+        <w:t>Técnicas de minería de datos para extraer conocimiento y generar modelos que me permitan resolver problemas rápidamente.</w:t>
+      </w:r>
+    </w:p>
+    <w:p>
+      <w:pPr>
+        <w:spacing w:line="276" w:lineRule="auto"/>
+        <w:jc w:val="both"/>
+        <w:rPr>
+          <w:rFonts w:ascii="Arial" w:hAnsi="Arial" w:cs="Arial"/>
+          <w:sz w:val="24"/>
+        </w:rPr>
+      </w:pPr>
+      <w:r>
+        <w:rPr>
+          <w:rFonts w:ascii="Arial" w:hAnsi="Arial" w:cs="Arial"/>
+          <w:sz w:val="24"/>
+        </w:rPr>
+        <w:t xml:space="preserve">En el caso de la minería de datos </w:t>
+      </w:r>
+      <w:r>
+        <w:rPr>
+          <w:rFonts w:ascii="Arial" w:hAnsi="Arial" w:cs="Arial"/>
+          <w:sz w:val="24"/>
+        </w:rPr>
+        <w:t>hemos utilizado diferentes modelos de aprendizaje automático en función de la tarea que se quería resolver:</w:t>
+      </w:r>
+    </w:p>
+    <w:p>
+      <w:pPr>
+        <w:spacing w:line="276" w:lineRule="auto"/>
+        <w:jc w:val="both"/>
+        <w:rPr>
+          <w:rFonts w:ascii="Arial" w:hAnsi="Arial" w:cs="Arial"/>
+          <w:b/>
           <w:color w:val="FF0000"/>
-        </w:rPr>
-      </w:pPr>
-      <w:r>
-        <w:rPr>
+          <w:sz w:val="24"/>
+        </w:rPr>
+      </w:pPr>
+      <w:r>
+        <w:rPr>
+          <w:rFonts w:ascii="Arial" w:hAnsi="Arial" w:cs="Arial"/>
+          <w:b/>
           <w:color w:val="FF0000"/>
-        </w:rPr>
-        <w:t xml:space="preserve"> TO DO</w:t>
+          <w:sz w:val="24"/>
+        </w:rPr>
+        <w:t>TO DO</w:t>
+      </w:r>
+      <w:r>
+        <w:rPr>
+          <w:rFonts w:ascii="Arial" w:hAnsi="Arial" w:cs="Arial"/>
+          <w:b/>
+          <w:color w:val="FF0000"/>
+          <w:sz w:val="24"/>
+        </w:rPr>
+        <w:t xml:space="preserve"> (métodos de machine </w:t>
+      </w:r>
+      <w:proofErr w:type="spellStart"/>
+      <w:r>
+        <w:rPr>
+          <w:rFonts w:ascii="Arial" w:hAnsi="Arial" w:cs="Arial"/>
+          <w:b/>
+          <w:color w:val="FF0000"/>
+          <w:sz w:val="24"/>
+        </w:rPr>
+        <w:t>learning</w:t>
+      </w:r>
+      <w:proofErr w:type="spellEnd"/>
+      <w:r>
+        <w:rPr>
+          <w:rFonts w:ascii="Arial" w:hAnsi="Arial" w:cs="Arial"/>
+          <w:b/>
+          <w:color w:val="FF0000"/>
+          <w:sz w:val="24"/>
+        </w:rPr>
+        <w:t xml:space="preserve"> utilizados: regresión lineal </w:t>
+      </w:r>
+      <w:proofErr w:type="spellStart"/>
+      <w:r>
+        <w:rPr>
+          <w:rFonts w:ascii="Arial" w:hAnsi="Arial" w:cs="Arial"/>
+          <w:b/>
+          <w:color w:val="FF0000"/>
+          <w:sz w:val="24"/>
+        </w:rPr>
+        <w:t>multiple</w:t>
+      </w:r>
+      <w:proofErr w:type="spellEnd"/>
+      <w:r>
+        <w:rPr>
+          <w:rFonts w:ascii="Arial" w:hAnsi="Arial" w:cs="Arial"/>
+          <w:b/>
+          <w:color w:val="FF0000"/>
+          <w:sz w:val="24"/>
+        </w:rPr>
+        <w:t xml:space="preserve">, </w:t>
+      </w:r>
+      <w:proofErr w:type="spellStart"/>
+      <w:r>
+        <w:rPr>
+          <w:rFonts w:ascii="Arial" w:hAnsi="Arial" w:cs="Arial"/>
+          <w:b/>
+          <w:color w:val="FF0000"/>
+          <w:sz w:val="24"/>
+        </w:rPr>
+        <w:t>random</w:t>
+      </w:r>
+      <w:proofErr w:type="spellEnd"/>
+      <w:r>
+        <w:rPr>
+          <w:rFonts w:ascii="Arial" w:hAnsi="Arial" w:cs="Arial"/>
+          <w:b/>
+          <w:color w:val="FF0000"/>
+          <w:sz w:val="24"/>
+        </w:rPr>
+        <w:t xml:space="preserve"> </w:t>
+      </w:r>
+      <w:proofErr w:type="spellStart"/>
+      <w:r>
+        <w:rPr>
+          <w:rFonts w:ascii="Arial" w:hAnsi="Arial" w:cs="Arial"/>
+          <w:b/>
+          <w:color w:val="FF0000"/>
+          <w:sz w:val="24"/>
+        </w:rPr>
+        <w:t>forest</w:t>
+      </w:r>
+      <w:proofErr w:type="spellEnd"/>
+      <w:r>
+        <w:rPr>
+          <w:rFonts w:ascii="Arial" w:hAnsi="Arial" w:cs="Arial"/>
+          <w:b/>
+          <w:color w:val="FF0000"/>
+          <w:sz w:val="24"/>
+        </w:rPr>
+        <w:t xml:space="preserve"> para extracción de características, redes de neuronas)</w:t>
+      </w:r>
+    </w:p>
+    <w:p>
+      <w:pPr>
+        <w:spacing w:line="276" w:lineRule="auto"/>
+        <w:jc w:val="both"/>
+        <w:rPr>
+          <w:rFonts w:ascii="Arial" w:hAnsi="Arial" w:cs="Arial"/>
+          <w:sz w:val="24"/>
+        </w:rPr>
+      </w:pPr>
+      <w:r>
+        <w:rPr>
+          <w:rFonts w:ascii="Arial" w:hAnsi="Arial" w:cs="Arial"/>
+          <w:sz w:val="24"/>
+        </w:rPr>
+        <w:t>Hoy en día existen numerosos proyectos que realizan investigaciones en el ámbito de la agricultura y el Big Data como pueden ser:</w:t>
+      </w:r>
+    </w:p>
+    <w:p>
+      <w:pPr>
+        <w:pStyle w:val="Prrafodelista"/>
+        <w:numPr>
+          <w:ilvl w:val="0"/>
+          <w:numId w:val="15"/>
+        </w:numPr>
+        <w:spacing w:line="276" w:lineRule="auto"/>
+        <w:jc w:val="both"/>
+        <w:rPr>
+          <w:rFonts w:ascii="Arial" w:hAnsi="Arial" w:cs="Arial"/>
+          <w:sz w:val="24"/>
+        </w:rPr>
+      </w:pPr>
+      <w:r>
+        <w:rPr>
+          <w:rFonts w:ascii="Arial" w:hAnsi="Arial" w:cs="Arial"/>
+          <w:b/>
+          <w:sz w:val="24"/>
+        </w:rPr>
+        <w:t xml:space="preserve">Machine </w:t>
+      </w:r>
+      <w:proofErr w:type="spellStart"/>
+      <w:r>
+        <w:rPr>
+          <w:rFonts w:ascii="Arial" w:hAnsi="Arial" w:cs="Arial"/>
+          <w:b/>
+          <w:sz w:val="24"/>
+        </w:rPr>
+        <w:t>learning</w:t>
+      </w:r>
+      <w:proofErr w:type="spellEnd"/>
+      <w:r>
+        <w:rPr>
+          <w:rFonts w:ascii="Arial" w:hAnsi="Arial" w:cs="Arial"/>
+          <w:b/>
+          <w:sz w:val="24"/>
+        </w:rPr>
+        <w:t xml:space="preserve"> in </w:t>
+      </w:r>
+      <w:proofErr w:type="spellStart"/>
+      <w:r>
+        <w:rPr>
+          <w:rFonts w:ascii="Arial" w:hAnsi="Arial" w:cs="Arial"/>
+          <w:b/>
+          <w:sz w:val="24"/>
+        </w:rPr>
+        <w:t>agriculture</w:t>
+      </w:r>
+      <w:proofErr w:type="spellEnd"/>
+      <w:r>
+        <w:rPr>
+          <w:rFonts w:ascii="Arial" w:hAnsi="Arial" w:cs="Arial"/>
+          <w:b/>
+          <w:sz w:val="24"/>
+        </w:rPr>
+        <w:t xml:space="preserve">: A </w:t>
+      </w:r>
+      <w:proofErr w:type="spellStart"/>
+      <w:r>
+        <w:rPr>
+          <w:rFonts w:ascii="Arial" w:hAnsi="Arial" w:cs="Arial"/>
+          <w:b/>
+          <w:sz w:val="24"/>
+        </w:rPr>
+        <w:t>review</w:t>
+      </w:r>
+      <w:proofErr w:type="spellEnd"/>
+      <w:r>
+        <w:rPr>
+          <w:rFonts w:ascii="Arial" w:hAnsi="Arial" w:cs="Arial"/>
+          <w:sz w:val="24"/>
+        </w:rPr>
+        <w:t>:</w:t>
+      </w:r>
+      <w:r>
+        <w:rPr>
+          <w:rFonts w:ascii="Arial" w:hAnsi="Arial" w:cs="Arial"/>
+          <w:sz w:val="24"/>
+        </w:rPr>
+        <w:t xml:space="preserve"> Este artículo fundamental valido la superioridad de los modelos de </w:t>
+      </w:r>
+      <w:proofErr w:type="spellStart"/>
+      <w:r>
+        <w:rPr>
+          <w:rFonts w:ascii="Arial" w:hAnsi="Arial" w:cs="Arial"/>
+          <w:sz w:val="24"/>
+        </w:rPr>
+        <w:t>ensemble</w:t>
+      </w:r>
+      <w:proofErr w:type="spellEnd"/>
+      <w:r>
+        <w:rPr>
+          <w:rFonts w:ascii="Arial" w:hAnsi="Arial" w:cs="Arial"/>
+          <w:sz w:val="24"/>
+        </w:rPr>
+        <w:t xml:space="preserve"> frente a regresiones clásicas para predecir rendimientos en escenarios con alta varianza de insumos (fertilizantes y agua).</w:t>
+      </w:r>
+    </w:p>
+    <w:p>
+      <w:pPr>
+        <w:pStyle w:val="Prrafodelista"/>
+        <w:numPr>
+          <w:ilvl w:val="0"/>
+          <w:numId w:val="15"/>
+        </w:numPr>
+        <w:jc w:val="both"/>
+        <w:rPr>
+          <w:rFonts w:ascii="Arial" w:hAnsi="Arial" w:cs="Arial"/>
+          <w:sz w:val="24"/>
+        </w:rPr>
+      </w:pPr>
+      <w:proofErr w:type="spellStart"/>
+      <w:r>
+        <w:rPr>
+          <w:rFonts w:ascii="Arial" w:hAnsi="Arial" w:cs="Arial"/>
+          <w:b/>
+          <w:sz w:val="24"/>
+        </w:rPr>
+        <w:lastRenderedPageBreak/>
+        <w:t>Advances</w:t>
+      </w:r>
+      <w:proofErr w:type="spellEnd"/>
+      <w:r>
+        <w:rPr>
+          <w:rFonts w:ascii="Arial" w:hAnsi="Arial" w:cs="Arial"/>
+          <w:b/>
+          <w:sz w:val="24"/>
+        </w:rPr>
+        <w:t xml:space="preserve"> in Machine Learning </w:t>
+      </w:r>
+      <w:proofErr w:type="spellStart"/>
+      <w:r>
+        <w:rPr>
+          <w:rFonts w:ascii="Arial" w:hAnsi="Arial" w:cs="Arial"/>
+          <w:b/>
+          <w:sz w:val="24"/>
+        </w:rPr>
+        <w:t>for</w:t>
+      </w:r>
+      <w:proofErr w:type="spellEnd"/>
+      <w:r>
+        <w:rPr>
+          <w:rFonts w:ascii="Arial" w:hAnsi="Arial" w:cs="Arial"/>
+          <w:b/>
+          <w:sz w:val="24"/>
+        </w:rPr>
+        <w:t xml:space="preserve"> </w:t>
+      </w:r>
+      <w:proofErr w:type="spellStart"/>
+      <w:r>
+        <w:rPr>
+          <w:rFonts w:ascii="Arial" w:hAnsi="Arial" w:cs="Arial"/>
+          <w:b/>
+          <w:sz w:val="24"/>
+        </w:rPr>
+        <w:t>Crop</w:t>
+      </w:r>
+      <w:proofErr w:type="spellEnd"/>
+      <w:r>
+        <w:rPr>
+          <w:rFonts w:ascii="Arial" w:hAnsi="Arial" w:cs="Arial"/>
+          <w:b/>
+          <w:sz w:val="24"/>
+        </w:rPr>
+        <w:t xml:space="preserve"> </w:t>
+      </w:r>
+      <w:proofErr w:type="spellStart"/>
+      <w:r>
+        <w:rPr>
+          <w:rFonts w:ascii="Arial" w:hAnsi="Arial" w:cs="Arial"/>
+          <w:b/>
+          <w:sz w:val="24"/>
+        </w:rPr>
+        <w:t>Yield</w:t>
+      </w:r>
+      <w:proofErr w:type="spellEnd"/>
+      <w:r>
+        <w:rPr>
+          <w:rFonts w:ascii="Arial" w:hAnsi="Arial" w:cs="Arial"/>
+          <w:b/>
+          <w:sz w:val="24"/>
+        </w:rPr>
+        <w:t xml:space="preserve"> </w:t>
+      </w:r>
+      <w:proofErr w:type="spellStart"/>
+      <w:r>
+        <w:rPr>
+          <w:rFonts w:ascii="Arial" w:hAnsi="Arial" w:cs="Arial"/>
+          <w:b/>
+          <w:sz w:val="24"/>
+        </w:rPr>
+        <w:t>Prediction</w:t>
+      </w:r>
+      <w:proofErr w:type="spellEnd"/>
+      <w:r>
+        <w:rPr>
+          <w:rFonts w:ascii="Arial" w:hAnsi="Arial" w:cs="Arial"/>
+          <w:b/>
+          <w:sz w:val="24"/>
+        </w:rPr>
+        <w:t xml:space="preserve">: A </w:t>
+      </w:r>
+      <w:proofErr w:type="spellStart"/>
+      <w:r>
+        <w:rPr>
+          <w:rFonts w:ascii="Arial" w:hAnsi="Arial" w:cs="Arial"/>
+          <w:b/>
+          <w:sz w:val="24"/>
+        </w:rPr>
+        <w:t>Comprehensive</w:t>
+      </w:r>
+      <w:proofErr w:type="spellEnd"/>
+      <w:r>
+        <w:rPr>
+          <w:rFonts w:ascii="Arial" w:hAnsi="Arial" w:cs="Arial"/>
+          <w:b/>
+          <w:sz w:val="24"/>
+        </w:rPr>
+        <w:t xml:space="preserve"> </w:t>
+      </w:r>
+      <w:proofErr w:type="spellStart"/>
+      <w:r>
+        <w:rPr>
+          <w:rFonts w:ascii="Arial" w:hAnsi="Arial" w:cs="Arial"/>
+          <w:b/>
+          <w:sz w:val="24"/>
+        </w:rPr>
+        <w:t>Review</w:t>
+      </w:r>
+      <w:proofErr w:type="spellEnd"/>
+      <w:r>
+        <w:rPr>
+          <w:rFonts w:ascii="Arial" w:hAnsi="Arial" w:cs="Arial"/>
+          <w:b/>
+          <w:sz w:val="24"/>
+        </w:rPr>
+        <w:t xml:space="preserve"> of </w:t>
+      </w:r>
+      <w:proofErr w:type="spellStart"/>
+      <w:r>
+        <w:rPr>
+          <w:rFonts w:ascii="Arial" w:hAnsi="Arial" w:cs="Arial"/>
+          <w:b/>
+          <w:sz w:val="24"/>
+        </w:rPr>
+        <w:t>Techniques</w:t>
+      </w:r>
+      <w:proofErr w:type="spellEnd"/>
+      <w:r>
+        <w:rPr>
+          <w:rFonts w:ascii="Arial" w:hAnsi="Arial" w:cs="Arial"/>
+          <w:b/>
+          <w:sz w:val="24"/>
+        </w:rPr>
+        <w:t xml:space="preserve">, </w:t>
+      </w:r>
+      <w:proofErr w:type="spellStart"/>
+      <w:r>
+        <w:rPr>
+          <w:rFonts w:ascii="Arial" w:hAnsi="Arial" w:cs="Arial"/>
+          <w:b/>
+          <w:sz w:val="24"/>
+        </w:rPr>
+        <w:t>Trends</w:t>
+      </w:r>
+      <w:proofErr w:type="spellEnd"/>
+      <w:r>
+        <w:rPr>
+          <w:rFonts w:ascii="Arial" w:hAnsi="Arial" w:cs="Arial"/>
+          <w:b/>
+          <w:sz w:val="24"/>
+        </w:rPr>
+        <w:t xml:space="preserve">, and </w:t>
+      </w:r>
+      <w:proofErr w:type="spellStart"/>
+      <w:r>
+        <w:rPr>
+          <w:rFonts w:ascii="Arial" w:hAnsi="Arial" w:cs="Arial"/>
+          <w:b/>
+          <w:sz w:val="24"/>
+        </w:rPr>
+        <w:t>Challenges</w:t>
+      </w:r>
+      <w:proofErr w:type="spellEnd"/>
+      <w:r>
+        <w:rPr>
+          <w:rFonts w:ascii="Arial" w:hAnsi="Arial" w:cs="Arial"/>
+          <w:b/>
+          <w:sz w:val="24"/>
+        </w:rPr>
+        <w:t>:</w:t>
+      </w:r>
+      <w:r>
+        <w:rPr>
+          <w:rFonts w:ascii="Arial" w:hAnsi="Arial" w:cs="Arial"/>
+          <w:sz w:val="24"/>
+        </w:rPr>
+        <w:t xml:space="preserve"> </w:t>
+      </w:r>
+      <w:r>
+        <w:rPr>
+          <w:rFonts w:ascii="Arial" w:hAnsi="Arial" w:cs="Arial"/>
+          <w:sz w:val="24"/>
+        </w:rPr>
+        <w:t xml:space="preserve">Este estudio revisa la eficacia de algoritmos como </w:t>
+      </w:r>
+      <w:proofErr w:type="spellStart"/>
+      <w:r>
+        <w:rPr>
+          <w:rFonts w:ascii="Arial" w:hAnsi="Arial" w:cs="Arial"/>
+          <w:sz w:val="24"/>
+        </w:rPr>
+        <w:t>Random</w:t>
+      </w:r>
+      <w:proofErr w:type="spellEnd"/>
+      <w:r>
+        <w:rPr>
+          <w:rFonts w:ascii="Arial" w:hAnsi="Arial" w:cs="Arial"/>
+          <w:sz w:val="24"/>
+        </w:rPr>
+        <w:t xml:space="preserve"> </w:t>
+      </w:r>
+      <w:proofErr w:type="spellStart"/>
+      <w:r>
+        <w:rPr>
+          <w:rFonts w:ascii="Arial" w:hAnsi="Arial" w:cs="Arial"/>
+          <w:sz w:val="24"/>
+        </w:rPr>
+        <w:t>Forest</w:t>
+      </w:r>
+      <w:proofErr w:type="spellEnd"/>
+      <w:r>
+        <w:rPr>
+          <w:rFonts w:ascii="Arial" w:hAnsi="Arial" w:cs="Arial"/>
+          <w:sz w:val="24"/>
+        </w:rPr>
+        <w:t xml:space="preserve"> y </w:t>
+      </w:r>
+      <w:proofErr w:type="spellStart"/>
+      <w:r>
+        <w:rPr>
+          <w:rFonts w:ascii="Arial" w:hAnsi="Arial" w:cs="Arial"/>
+          <w:sz w:val="24"/>
+        </w:rPr>
+        <w:t>Gradient</w:t>
+      </w:r>
+      <w:proofErr w:type="spellEnd"/>
+      <w:r>
+        <w:rPr>
+          <w:rFonts w:ascii="Arial" w:hAnsi="Arial" w:cs="Arial"/>
+          <w:sz w:val="24"/>
+        </w:rPr>
+        <w:t xml:space="preserve"> </w:t>
+      </w:r>
+      <w:proofErr w:type="spellStart"/>
+      <w:r>
+        <w:rPr>
+          <w:rFonts w:ascii="Arial" w:hAnsi="Arial" w:cs="Arial"/>
+          <w:sz w:val="24"/>
+        </w:rPr>
+        <w:t>Boosting</w:t>
+      </w:r>
+      <w:proofErr w:type="spellEnd"/>
+      <w:r>
+        <w:rPr>
+          <w:rFonts w:ascii="Arial" w:hAnsi="Arial" w:cs="Arial"/>
+          <w:sz w:val="24"/>
+        </w:rPr>
+        <w:t xml:space="preserve"> </w:t>
+      </w:r>
+      <w:proofErr w:type="spellStart"/>
+      <w:r>
+        <w:rPr>
+          <w:rFonts w:ascii="Arial" w:hAnsi="Arial" w:cs="Arial"/>
+          <w:sz w:val="24"/>
+        </w:rPr>
+        <w:t>Decision</w:t>
+      </w:r>
+      <w:proofErr w:type="spellEnd"/>
+      <w:r>
+        <w:rPr>
+          <w:rFonts w:ascii="Arial" w:hAnsi="Arial" w:cs="Arial"/>
+          <w:sz w:val="24"/>
+        </w:rPr>
+        <w:t xml:space="preserve"> </w:t>
+      </w:r>
+      <w:proofErr w:type="spellStart"/>
+      <w:r>
+        <w:rPr>
+          <w:rFonts w:ascii="Arial" w:hAnsi="Arial" w:cs="Arial"/>
+          <w:sz w:val="24"/>
+        </w:rPr>
+        <w:t>Trees</w:t>
+      </w:r>
+      <w:proofErr w:type="spellEnd"/>
+      <w:r>
+        <w:rPr>
+          <w:rFonts w:ascii="Arial" w:hAnsi="Arial" w:cs="Arial"/>
+          <w:sz w:val="24"/>
+        </w:rPr>
+        <w:t xml:space="preserve"> frente a redes neuronales, destacando los retos en la heterogeneidad de los datos agrícolas y la necesidad de justificar la generalización de los modelos.</w:t>
       </w:r>
     </w:p>
     <w:p>
@@ -928,6 +1644,7 @@
                 <w:bdr w:val="none" w:sz="0" w:space="0" w:color="auto" w:frame="1"/>
                 <w:lang w:eastAsia="es-ES"/>
               </w:rPr>
+              <w:lastRenderedPageBreak/>
               <w:t>Característica</w:t>
             </w:r>
           </w:p>
@@ -2799,7 +3516,6 @@
                 <w:bdr w:val="none" w:sz="0" w:space="0" w:color="auto" w:frame="1"/>
                 <w:lang w:eastAsia="es-ES"/>
               </w:rPr>
-              <w:lastRenderedPageBreak/>
               <w:t>intensidad_emisiones</w:t>
             </w:r>
             <w:proofErr w:type="spellEnd"/>
@@ -4633,7 +5349,6 @@
                 <w:bdr w:val="none" w:sz="0" w:space="0" w:color="auto" w:frame="1"/>
                 <w:lang w:eastAsia="es-ES"/>
               </w:rPr>
-              <w:lastRenderedPageBreak/>
               <w:t>indice_evi</w:t>
             </w:r>
             <w:proofErr w:type="spellEnd"/>
@@ -4916,6 +5631,7 @@
                 <w:bdr w:val="none" w:sz="0" w:space="0" w:color="auto" w:frame="1"/>
                 <w:lang w:eastAsia="es-ES"/>
               </w:rPr>
+              <w:lastRenderedPageBreak/>
               <w:t>cobertura_nubes</w:t>
             </w:r>
             <w:proofErr w:type="spellEnd"/>
@@ -6735,7 +7451,6 @@
           <w:rFonts w:ascii="Arial" w:hAnsi="Arial" w:cs="Arial"/>
           <w:sz w:val="24"/>
         </w:rPr>
-        <w:lastRenderedPageBreak/>
         <w:t>Políticas_agricolas.csv: Cuenta con un conjunto de 159 registros. Contiene acuerdos, regulaciones y subsidios del os diferentes países.</w:t>
       </w:r>
     </w:p>
@@ -6868,6 +7583,7 @@
                 <w:bdr w:val="none" w:sz="0" w:space="0" w:color="auto" w:frame="1"/>
                 <w:lang w:eastAsia="es-ES"/>
               </w:rPr>
+              <w:lastRenderedPageBreak/>
               <w:t>codigo</w:t>
             </w:r>
             <w:proofErr w:type="spellEnd"/>
@@ -8425,7 +9141,6 @@
                 <w:bdr w:val="none" w:sz="0" w:space="0" w:color="auto" w:frame="1"/>
                 <w:lang w:eastAsia="es-ES"/>
               </w:rPr>
-              <w:lastRenderedPageBreak/>
               <w:t>impacto_cultivos</w:t>
             </w:r>
             <w:proofErr w:type="spellEnd"/>
@@ -8604,6 +9319,7 @@
           <w:rFonts w:ascii="Arial" w:hAnsi="Arial" w:cs="Arial"/>
           <w:sz w:val="24"/>
         </w:rPr>
+        <w:lastRenderedPageBreak/>
         <w:t xml:space="preserve">Reporte_plagas.csv: Cuenta con un conjunto de 100 registros. Recoge datos sobre la detección de plagas, el </w:t>
       </w:r>
       <w:r>
@@ -9580,18 +10296,8 @@
           <w:i/>
           <w:sz w:val="24"/>
         </w:rPr>
-        <w:t xml:space="preserve">Machine </w:t>
-      </w:r>
-      <w:proofErr w:type="spellStart"/>
-      <w:r>
-        <w:rPr>
-          <w:rFonts w:ascii="Arial" w:hAnsi="Arial" w:cs="Arial"/>
-          <w:i/>
-          <w:sz w:val="24"/>
-        </w:rPr>
-        <w:t>Learning</w:t>
-      </w:r>
-      <w:proofErr w:type="spellEnd"/>
+        <w:t>Machine Learning</w:t>
+      </w:r>
       <w:r>
         <w:rPr>
           <w:rFonts w:ascii="Arial" w:hAnsi="Arial" w:cs="Arial"/>
@@ -10176,15 +10882,7 @@
           <w:rFonts w:ascii="Arial" w:hAnsi="Arial" w:cs="Arial"/>
           <w:sz w:val="24"/>
         </w:rPr>
-        <w:t xml:space="preserve">presenta 142 valores nulos (54%). Esto representa la ausencia de </w:t>
-      </w:r>
-      <w:r>
-        <w:rPr>
-          <w:rFonts w:ascii="Arial" w:hAnsi="Arial" w:cs="Arial"/>
-          <w:sz w:val="24"/>
-        </w:rPr>
-        <w:lastRenderedPageBreak/>
-        <w:t>catástrofes en ese período para esa región, requiriendo una imputación categórica (ej. "Ninguno") en la fase de modelado.</w:t>
+        <w:t>presenta 142 valores nulos (54%). Esto representa la ausencia de catástrofes en ese período para esa región, requiriendo una imputación categórica (ej. "Ninguno") en la fase de modelado.</w:t>
       </w:r>
     </w:p>
     <w:p>
@@ -10247,7 +10945,15 @@
           <w:rFonts w:ascii="Arial" w:hAnsi="Arial" w:cs="Arial"/>
           <w:sz w:val="24"/>
         </w:rPr>
-        <w:t xml:space="preserve"> (84% nulos), </w:t>
+        <w:t xml:space="preserve"> (84% </w:t>
+      </w:r>
+      <w:r>
+        <w:rPr>
+          <w:rFonts w:ascii="Arial" w:hAnsi="Arial" w:cs="Arial"/>
+          <w:sz w:val="24"/>
+        </w:rPr>
+        <w:lastRenderedPageBreak/>
+        <w:t xml:space="preserve">nulos), </w:t>
       </w:r>
       <w:proofErr w:type="spellStart"/>
       <w:r>
@@ -10407,15 +11113,476 @@
     </w:p>
     <w:p>
       <w:pPr>
-        <w:rPr>
-          <w:color w:val="FF0000"/>
-        </w:rPr>
-      </w:pPr>
-      <w:r>
-        <w:rPr>
-          <w:color w:val="FF0000"/>
-        </w:rPr>
-        <w:t>TO DO</w:t>
+        <w:pStyle w:val="Prrafodelista"/>
+        <w:numPr>
+          <w:ilvl w:val="0"/>
+          <w:numId w:val="13"/>
+        </w:numPr>
+        <w:spacing w:line="276" w:lineRule="auto"/>
+        <w:jc w:val="both"/>
+        <w:rPr>
+          <w:rFonts w:ascii="Arial" w:hAnsi="Arial" w:cs="Arial"/>
+          <w:b/>
+          <w:sz w:val="24"/>
+        </w:rPr>
+      </w:pPr>
+      <w:r>
+        <w:rPr>
+          <w:rFonts w:ascii="Arial" w:hAnsi="Arial" w:cs="Arial"/>
+          <w:b/>
+          <w:sz w:val="24"/>
+        </w:rPr>
+        <w:t>Limpieza</w:t>
+      </w:r>
+    </w:p>
+    <w:p>
+      <w:pPr>
+        <w:tabs>
+          <w:tab w:val="left" w:pos="1080"/>
+        </w:tabs>
+        <w:spacing w:line="276" w:lineRule="auto"/>
+        <w:jc w:val="both"/>
+        <w:rPr>
+          <w:rFonts w:ascii="Arial" w:hAnsi="Arial" w:cs="Arial"/>
+          <w:sz w:val="24"/>
+        </w:rPr>
+      </w:pPr>
+      <w:r>
+        <w:rPr>
+          <w:rFonts w:ascii="Arial" w:hAnsi="Arial" w:cs="Arial"/>
+          <w:sz w:val="24"/>
+        </w:rPr>
+        <w:t xml:space="preserve">Como hemos indicado en </w:t>
+      </w:r>
+      <w:r>
+        <w:rPr>
+          <w:rFonts w:ascii="Arial" w:hAnsi="Arial" w:cs="Arial"/>
+          <w:sz w:val="24"/>
+        </w:rPr>
+        <w:t xml:space="preserve">el apartado donde se explican los diferentes </w:t>
+      </w:r>
+      <w:proofErr w:type="spellStart"/>
+      <w:r>
+        <w:rPr>
+          <w:rFonts w:ascii="Arial" w:hAnsi="Arial" w:cs="Arial"/>
+          <w:sz w:val="24"/>
+        </w:rPr>
+        <w:t>datasets</w:t>
+      </w:r>
+      <w:proofErr w:type="spellEnd"/>
+      <w:r>
+        <w:rPr>
+          <w:rFonts w:ascii="Arial" w:hAnsi="Arial" w:cs="Arial"/>
+          <w:sz w:val="24"/>
+        </w:rPr>
+        <w:t xml:space="preserve"> con los que contamos, hemos encontrado una serie de valores nulos. Por ello, hemos llevado a cabo un proceso de limpieza para asegurar la integridad de los datos.</w:t>
+      </w:r>
+    </w:p>
+    <w:p>
+      <w:pPr>
+        <w:tabs>
+          <w:tab w:val="left" w:pos="1080"/>
+        </w:tabs>
+        <w:spacing w:line="276" w:lineRule="auto"/>
+        <w:jc w:val="both"/>
+        <w:rPr>
+          <w:rFonts w:ascii="Arial" w:hAnsi="Arial" w:cs="Arial"/>
+          <w:sz w:val="24"/>
+        </w:rPr>
+      </w:pPr>
+      <w:r>
+        <w:rPr>
+          <w:rFonts w:ascii="Arial" w:hAnsi="Arial" w:cs="Arial"/>
+          <w:sz w:val="24"/>
+        </w:rPr>
+        <w:t>El proceso de limpieza ha tenido dos partes, la primera de ellas ha sido la gestión de los valores nulos en el dataset de condiciones climáticas. En este, la variable de eventos extremos presenta un 54% de valores nulos. Si eliminamos las filas correspondientes se perdería mucha información relevante por lo que hemos decidido reemplazarlo por el valor “sin evento”, ya que la ausencia de datos nos indica un periodo en el que no han ocurrido eventos extremos.</w:t>
+      </w:r>
+    </w:p>
+    <w:p>
+      <w:pPr>
+        <w:tabs>
+          <w:tab w:val="left" w:pos="1080"/>
+        </w:tabs>
+        <w:spacing w:line="276" w:lineRule="auto"/>
+        <w:jc w:val="both"/>
+        <w:rPr>
+          <w:rFonts w:ascii="Arial" w:hAnsi="Arial" w:cs="Arial"/>
+          <w:sz w:val="24"/>
+        </w:rPr>
+      </w:pPr>
+      <w:r>
+        <w:rPr>
+          <w:rFonts w:ascii="Arial" w:hAnsi="Arial" w:cs="Arial"/>
+          <w:sz w:val="24"/>
+        </w:rPr>
+        <w:t xml:space="preserve">La segunda parte ha sido la gestión de los nulos en el dataset de políticas agrícolas donde hay varias </w:t>
+      </w:r>
+      <w:r>
+        <w:rPr>
+          <w:rFonts w:ascii="Arial" w:hAnsi="Arial" w:cs="Arial"/>
+          <w:sz w:val="24"/>
+        </w:rPr>
+        <w:t>características que presentan valores nulos. Entre ellas están el año de firma del acuerdo internacional, donde hemos comprobado que estos años en nulo se corresponde con aquellos acuerdos que no se han firmado por lo que no se pueden eliminar las filas y hemos decidido darlo un valor de 0. También, en este mismo conjunto de datos, existen otras dos variables con valores nulos como son la multa por hectárea y el porcentaje mínimo</w:t>
+      </w:r>
+      <w:r>
+        <w:rPr>
+          <w:rFonts w:ascii="Arial" w:hAnsi="Arial" w:cs="Arial"/>
+          <w:sz w:val="24"/>
+        </w:rPr>
+        <w:t xml:space="preserve"> a las cuales también les hemos imputado un valor de 0 para no eliminar las filas evitando la perdida de la información. Los nulos en estas dos últimas variables se interpretan como la ausencia de una penalización económica o de umbrales obligatorios en </w:t>
+      </w:r>
+      <w:r>
+        <w:rPr>
+          <w:rFonts w:ascii="Arial" w:hAnsi="Arial" w:cs="Arial"/>
+          <w:sz w:val="24"/>
+        </w:rPr>
+        <w:t>las regulaciones</w:t>
+      </w:r>
+      <w:r>
+        <w:rPr>
+          <w:rFonts w:ascii="Arial" w:hAnsi="Arial" w:cs="Arial"/>
+          <w:sz w:val="24"/>
+        </w:rPr>
+        <w:t xml:space="preserve"> a las que se refieren.</w:t>
+      </w:r>
+    </w:p>
+    <w:p>
+      <w:pPr>
+        <w:pStyle w:val="Prrafodelista"/>
+        <w:numPr>
+          <w:ilvl w:val="0"/>
+          <w:numId w:val="13"/>
+        </w:numPr>
+        <w:tabs>
+          <w:tab w:val="left" w:pos="1080"/>
+        </w:tabs>
+        <w:spacing w:line="276" w:lineRule="auto"/>
+        <w:jc w:val="both"/>
+        <w:rPr>
+          <w:rFonts w:ascii="Arial" w:hAnsi="Arial" w:cs="Arial"/>
+          <w:b/>
+          <w:sz w:val="24"/>
+        </w:rPr>
+      </w:pPr>
+      <w:r>
+        <w:rPr>
+          <w:rFonts w:ascii="Arial" w:hAnsi="Arial" w:cs="Arial"/>
+          <w:b/>
+          <w:sz w:val="24"/>
+        </w:rPr>
+        <w:t>Transformaciones</w:t>
+      </w:r>
+    </w:p>
+    <w:p>
+      <w:pPr>
+        <w:tabs>
+          <w:tab w:val="left" w:pos="1080"/>
+        </w:tabs>
+        <w:spacing w:line="276" w:lineRule="auto"/>
+        <w:jc w:val="both"/>
+        <w:rPr>
+          <w:rFonts w:ascii="Arial" w:hAnsi="Arial" w:cs="Arial"/>
+          <w:sz w:val="24"/>
+        </w:rPr>
+      </w:pPr>
+      <w:r>
+        <w:rPr>
+          <w:rFonts w:ascii="Arial" w:hAnsi="Arial" w:cs="Arial"/>
+          <w:sz w:val="24"/>
+        </w:rPr>
+        <w:t>Inicialmente, la</w:t>
+      </w:r>
+      <w:r>
+        <w:rPr>
+          <w:rFonts w:ascii="Arial" w:hAnsi="Arial" w:cs="Arial"/>
+          <w:sz w:val="24"/>
+        </w:rPr>
+        <w:t>s</w:t>
+      </w:r>
+      <w:r>
+        <w:rPr>
+          <w:rFonts w:ascii="Arial" w:hAnsi="Arial" w:cs="Arial"/>
+          <w:sz w:val="24"/>
+        </w:rPr>
+        <w:t xml:space="preserve"> variable</w:t>
+      </w:r>
+      <w:r>
+        <w:rPr>
+          <w:rFonts w:ascii="Arial" w:hAnsi="Arial" w:cs="Arial"/>
+          <w:sz w:val="24"/>
+        </w:rPr>
+        <w:t>s</w:t>
+      </w:r>
+      <w:r>
+        <w:rPr>
+          <w:rFonts w:ascii="Arial" w:hAnsi="Arial" w:cs="Arial"/>
+          <w:sz w:val="24"/>
+        </w:rPr>
+        <w:t xml:space="preserve"> fecha del dataset de precios de mercado </w:t>
+      </w:r>
+      <w:r>
+        <w:rPr>
+          <w:rFonts w:ascii="Arial" w:hAnsi="Arial" w:cs="Arial"/>
+          <w:sz w:val="24"/>
+        </w:rPr>
+        <w:t xml:space="preserve">y de las imágenes de los satélites </w:t>
+      </w:r>
+      <w:r>
+        <w:rPr>
+          <w:rFonts w:ascii="Arial" w:hAnsi="Arial" w:cs="Arial"/>
+          <w:sz w:val="24"/>
+        </w:rPr>
+        <w:t>fue</w:t>
+      </w:r>
+      <w:r>
+        <w:rPr>
+          <w:rFonts w:ascii="Arial" w:hAnsi="Arial" w:cs="Arial"/>
+          <w:sz w:val="24"/>
+        </w:rPr>
+        <w:t>ron</w:t>
+      </w:r>
+      <w:r>
+        <w:rPr>
+          <w:rFonts w:ascii="Arial" w:hAnsi="Arial" w:cs="Arial"/>
+          <w:sz w:val="24"/>
+        </w:rPr>
+        <w:t xml:space="preserve"> inferida</w:t>
+      </w:r>
+      <w:r>
+        <w:rPr>
+          <w:rFonts w:ascii="Arial" w:hAnsi="Arial" w:cs="Arial"/>
+          <w:sz w:val="24"/>
+        </w:rPr>
+        <w:t>s</w:t>
+      </w:r>
+      <w:r>
+        <w:rPr>
+          <w:rFonts w:ascii="Arial" w:hAnsi="Arial" w:cs="Arial"/>
+          <w:sz w:val="24"/>
+        </w:rPr>
+        <w:t xml:space="preserve"> como una cadena de texto, por lo que hemos visto necesaria la transformación ha tipo </w:t>
+      </w:r>
+      <w:proofErr w:type="spellStart"/>
+      <w:r>
+        <w:rPr>
+          <w:rFonts w:ascii="Arial" w:hAnsi="Arial" w:cs="Arial"/>
+          <w:i/>
+          <w:sz w:val="24"/>
+        </w:rPr>
+        <w:t>Datetime</w:t>
+      </w:r>
+      <w:proofErr w:type="spellEnd"/>
+      <w:r>
+        <w:rPr>
+          <w:rFonts w:ascii="Arial" w:hAnsi="Arial" w:cs="Arial"/>
+          <w:sz w:val="24"/>
+        </w:rPr>
+        <w:t>. Lo mismo ha ocurrido con la</w:t>
+      </w:r>
+      <w:r>
+        <w:rPr>
+          <w:rFonts w:ascii="Arial" w:hAnsi="Arial" w:cs="Arial"/>
+          <w:sz w:val="24"/>
+        </w:rPr>
+        <w:t>s</w:t>
+      </w:r>
+      <w:r>
+        <w:rPr>
+          <w:rFonts w:ascii="Arial" w:hAnsi="Arial" w:cs="Arial"/>
+          <w:sz w:val="24"/>
+        </w:rPr>
+        <w:t xml:space="preserve"> fecha</w:t>
+      </w:r>
+      <w:r>
+        <w:rPr>
+          <w:rFonts w:ascii="Arial" w:hAnsi="Arial" w:cs="Arial"/>
+          <w:sz w:val="24"/>
+        </w:rPr>
+        <w:t>s</w:t>
+      </w:r>
+      <w:r>
+        <w:rPr>
+          <w:rFonts w:ascii="Arial" w:hAnsi="Arial" w:cs="Arial"/>
+          <w:sz w:val="24"/>
+        </w:rPr>
+        <w:t xml:space="preserve"> que aparece</w:t>
+      </w:r>
+      <w:r>
+        <w:rPr>
+          <w:rFonts w:ascii="Arial" w:hAnsi="Arial" w:cs="Arial"/>
+          <w:sz w:val="24"/>
+        </w:rPr>
+        <w:t>n</w:t>
+      </w:r>
+      <w:r>
+        <w:rPr>
+          <w:rFonts w:ascii="Arial" w:hAnsi="Arial" w:cs="Arial"/>
+          <w:sz w:val="24"/>
+        </w:rPr>
+        <w:t xml:space="preserve"> separada</w:t>
+      </w:r>
+      <w:r>
+        <w:rPr>
+          <w:rFonts w:ascii="Arial" w:hAnsi="Arial" w:cs="Arial"/>
+          <w:sz w:val="24"/>
+        </w:rPr>
+        <w:t>s en año, mes y día en los</w:t>
+      </w:r>
+      <w:r>
+        <w:rPr>
+          <w:rFonts w:ascii="Arial" w:hAnsi="Arial" w:cs="Arial"/>
+          <w:sz w:val="24"/>
+        </w:rPr>
+        <w:t xml:space="preserve"> dataset de reporte de plagas</w:t>
+      </w:r>
+      <w:r>
+        <w:rPr>
+          <w:rFonts w:ascii="Arial" w:hAnsi="Arial" w:cs="Arial"/>
+          <w:sz w:val="24"/>
+        </w:rPr>
+        <w:t xml:space="preserve"> y noticias</w:t>
+      </w:r>
+      <w:r>
+        <w:rPr>
+          <w:rFonts w:ascii="Arial" w:hAnsi="Arial" w:cs="Arial"/>
+          <w:sz w:val="24"/>
+        </w:rPr>
+        <w:t>, donde hemos juntado la fecha en una variable para poder usarlo como tipo de fecha en caso de que sea necesario en fases posteriores.</w:t>
+      </w:r>
+    </w:p>
+    <w:p>
+      <w:pPr>
+        <w:pStyle w:val="Prrafodelista"/>
+        <w:numPr>
+          <w:ilvl w:val="0"/>
+          <w:numId w:val="13"/>
+        </w:numPr>
+        <w:tabs>
+          <w:tab w:val="left" w:pos="1080"/>
+        </w:tabs>
+        <w:spacing w:line="276" w:lineRule="auto"/>
+        <w:jc w:val="both"/>
+        <w:rPr>
+          <w:rFonts w:ascii="Arial" w:hAnsi="Arial" w:cs="Arial"/>
+          <w:b/>
+          <w:sz w:val="24"/>
+        </w:rPr>
+      </w:pPr>
+      <w:r>
+        <w:rPr>
+          <w:rFonts w:ascii="Arial" w:hAnsi="Arial" w:cs="Arial"/>
+          <w:b/>
+          <w:sz w:val="24"/>
+        </w:rPr>
+        <w:t>Anomalías en los datos</w:t>
+      </w:r>
+    </w:p>
+    <w:p>
+      <w:pPr>
+        <w:tabs>
+          <w:tab w:val="left" w:pos="1080"/>
+        </w:tabs>
+        <w:spacing w:line="276" w:lineRule="auto"/>
+        <w:jc w:val="both"/>
+        <w:rPr>
+          <w:rFonts w:ascii="Arial" w:hAnsi="Arial" w:cs="Arial"/>
+          <w:sz w:val="24"/>
+        </w:rPr>
+      </w:pPr>
+      <w:r>
+        <w:rPr>
+          <w:rFonts w:ascii="Arial" w:hAnsi="Arial" w:cs="Arial"/>
+          <w:sz w:val="24"/>
+        </w:rPr>
+        <w:lastRenderedPageBreak/>
+        <w:t>Durante la inspección de los datos hemos detectado varias cosas interesantes como son:</w:t>
+      </w:r>
+    </w:p>
+    <w:p>
+      <w:pPr>
+        <w:pStyle w:val="Prrafodelista"/>
+        <w:numPr>
+          <w:ilvl w:val="0"/>
+          <w:numId w:val="5"/>
+        </w:numPr>
+        <w:tabs>
+          <w:tab w:val="left" w:pos="1080"/>
+        </w:tabs>
+        <w:spacing w:line="276" w:lineRule="auto"/>
+        <w:jc w:val="both"/>
+        <w:rPr>
+          <w:rFonts w:ascii="Arial" w:hAnsi="Arial" w:cs="Arial"/>
+          <w:sz w:val="24"/>
+        </w:rPr>
+      </w:pPr>
+      <w:r>
+        <w:rPr>
+          <w:rFonts w:ascii="Arial" w:hAnsi="Arial" w:cs="Arial"/>
+          <w:sz w:val="24"/>
+        </w:rPr>
+        <w:t xml:space="preserve">Existen fechas en </w:t>
+      </w:r>
+      <w:r>
+        <w:rPr>
+          <w:rFonts w:ascii="Arial" w:hAnsi="Arial" w:cs="Arial"/>
+          <w:sz w:val="24"/>
+        </w:rPr>
+        <w:t>el dataset de imágenes del satélite cuya fecha es posterior a la actual, siendo el año máximo que aparece de 2033.</w:t>
+      </w:r>
+    </w:p>
+    <w:p>
+      <w:pPr>
+        <w:pStyle w:val="Prrafodelista"/>
+        <w:numPr>
+          <w:ilvl w:val="0"/>
+          <w:numId w:val="5"/>
+        </w:numPr>
+        <w:tabs>
+          <w:tab w:val="left" w:pos="1080"/>
+        </w:tabs>
+        <w:spacing w:line="276" w:lineRule="auto"/>
+        <w:jc w:val="both"/>
+        <w:rPr>
+          <w:rFonts w:ascii="Arial" w:hAnsi="Arial" w:cs="Arial"/>
+          <w:sz w:val="24"/>
+        </w:rPr>
+      </w:pPr>
+      <w:r>
+        <w:rPr>
+          <w:rFonts w:ascii="Arial" w:hAnsi="Arial" w:cs="Arial"/>
+          <w:sz w:val="24"/>
+        </w:rPr>
+        <w:t xml:space="preserve">Hay valores de índice de </w:t>
+      </w:r>
+      <w:proofErr w:type="spellStart"/>
+      <w:r>
+        <w:rPr>
+          <w:rFonts w:ascii="Arial" w:hAnsi="Arial" w:cs="Arial"/>
+          <w:sz w:val="24"/>
+        </w:rPr>
+        <w:t>nvdi</w:t>
+      </w:r>
+      <w:proofErr w:type="spellEnd"/>
+      <w:r>
+        <w:rPr>
+          <w:rFonts w:ascii="Arial" w:hAnsi="Arial" w:cs="Arial"/>
+          <w:sz w:val="24"/>
+        </w:rPr>
+        <w:t xml:space="preserve"> (</w:t>
+      </w:r>
+      <w:r>
+        <w:rPr>
+          <w:rFonts w:ascii="Arial" w:hAnsi="Arial" w:cs="Arial"/>
+          <w:sz w:val="24"/>
+        </w:rPr>
+        <w:t>Índice de Vegetación de Diferencia Normalizad</w:t>
+      </w:r>
+      <w:r>
+        <w:rPr>
+          <w:rFonts w:ascii="Arial" w:hAnsi="Arial" w:cs="Arial"/>
+          <w:sz w:val="24"/>
+        </w:rPr>
+        <w:t>a) con valores mayores que 1, cuando el valor real para estas variables es de entre -1 y 1, por lo que aquellas que tengan valores mayores a 1 las hemos acotado a ese valor.</w:t>
       </w:r>
     </w:p>
     <w:p>
@@ -10623,7 +11790,6 @@
           <w:rFonts w:ascii="Arial" w:hAnsi="Arial" w:cs="Arial"/>
           <w:sz w:val="24"/>
         </w:rPr>
-        <w:lastRenderedPageBreak/>
         <w:t>Como se puede observar no existe una correlación lineal entre estas dos variables</w:t>
       </w:r>
       <w:r>
@@ -10648,6 +11814,7 @@
           <w:noProof/>
           <w:lang w:eastAsia="es-ES"/>
         </w:rPr>
+        <w:lastRenderedPageBreak/>
         <w:drawing>
           <wp:inline distT="0" distB="0" distL="0" distR="0" wp14:anchorId="77FDAFB1" wp14:editId="5A4A1F7F">
             <wp:extent cx="3686175" cy="2363677"/>
@@ -10820,7 +11987,6 @@
           <w:rFonts w:ascii="Arial" w:hAnsi="Arial" w:cs="Arial"/>
           <w:sz w:val="24"/>
         </w:rPr>
-        <w:lastRenderedPageBreak/>
         <w:t>Como se puede observar siguen siendo los datos muy dispersos, por lo que eliminando el cultivo predominante tampoco se presenta relación lineal alguna entre la cantidad de fertilizante y el rendimiento que se obtiene.</w:t>
       </w:r>
     </w:p>
@@ -10856,6 +12022,7 @@
           <w:sz w:val="24"/>
           <w:u w:val="single"/>
         </w:rPr>
+        <w:lastRenderedPageBreak/>
         <w:t>Superficie vs producción</w:t>
       </w:r>
       <w:r>
@@ -11049,7 +12216,6 @@
           <w:rFonts w:ascii="Arial" w:hAnsi="Arial" w:cs="Arial"/>
           <w:sz w:val="24"/>
         </w:rPr>
-        <w:lastRenderedPageBreak/>
         <w:t xml:space="preserve">También podemos comprobar que pasa para </w:t>
       </w:r>
       <w:r>
@@ -11078,6 +12244,7 @@
           <w:sz w:val="24"/>
           <w:lang w:eastAsia="es-ES"/>
         </w:rPr>
+        <w:lastRenderedPageBreak/>
         <w:drawing>
           <wp:inline distT="0" distB="0" distL="0" distR="0" wp14:anchorId="3818547F" wp14:editId="4270C1A5">
             <wp:extent cx="4286250" cy="2556932"/>
@@ -11575,7 +12742,9 @@
         <w:rPr>
           <w:rFonts w:ascii="Arial" w:hAnsi="Arial" w:cs="Arial"/>
           <w:b/>
-          <w:sz w:val="24"/>
+          <w:noProof/>
+          <w:sz w:val="24"/>
+          <w:lang w:eastAsia="es-ES"/>
         </w:rPr>
         <w:lastRenderedPageBreak/>
         <w:drawing>
@@ -11666,7 +12835,9 @@
       <w:r>
         <w:rPr>
           <w:rFonts w:ascii="Arial" w:hAnsi="Arial" w:cs="Arial"/>
-          <w:sz w:val="24"/>
+          <w:noProof/>
+          <w:sz w:val="24"/>
+          <w:lang w:eastAsia="es-ES"/>
         </w:rPr>
         <w:drawing>
           <wp:inline distT="0" distB="0" distL="0" distR="0" wp14:anchorId="271CCB8C" wp14:editId="16B98A7D">
@@ -11785,7 +12956,9 @@
         <w:rPr>
           <w:rFonts w:ascii="Arial" w:hAnsi="Arial" w:cs="Arial"/>
           <w:b/>
-          <w:sz w:val="24"/>
+          <w:noProof/>
+          <w:sz w:val="24"/>
+          <w:lang w:eastAsia="es-ES"/>
         </w:rPr>
         <w:drawing>
           <wp:inline distT="0" distB="0" distL="0" distR="0" wp14:anchorId="7799370E" wp14:editId="47B86355">
@@ -11895,7 +13068,9 @@
         <w:rPr>
           <w:rFonts w:ascii="Arial" w:hAnsi="Arial" w:cs="Arial"/>
           <w:b/>
-          <w:sz w:val="24"/>
+          <w:noProof/>
+          <w:sz w:val="24"/>
+          <w:lang w:eastAsia="es-ES"/>
         </w:rPr>
         <w:drawing>
           <wp:inline distT="0" distB="0" distL="0" distR="0" wp14:anchorId="634734DF" wp14:editId="5D108147">
@@ -12101,7 +13276,9 @@
         <w:rPr>
           <w:rFonts w:ascii="Arial" w:hAnsi="Arial" w:cs="Arial"/>
           <w:b/>
-          <w:sz w:val="24"/>
+          <w:noProof/>
+          <w:sz w:val="24"/>
+          <w:lang w:eastAsia="es-ES"/>
         </w:rPr>
         <w:drawing>
           <wp:inline distT="0" distB="0" distL="0" distR="0" wp14:anchorId="72B4B46F" wp14:editId="255EA77D">
@@ -12327,7 +13504,9 @@
       <w:r>
         <w:rPr>
           <w:rFonts w:ascii="Arial" w:hAnsi="Arial" w:cs="Arial"/>
-          <w:sz w:val="24"/>
+          <w:noProof/>
+          <w:sz w:val="24"/>
+          <w:lang w:eastAsia="es-ES"/>
         </w:rPr>
         <w:drawing>
           <wp:inline distT="0" distB="0" distL="0" distR="0" wp14:anchorId="4F3A9430" wp14:editId="011C40DC">
@@ -12454,7 +13633,9 @@
         <w:rPr>
           <w:rFonts w:ascii="Arial" w:hAnsi="Arial" w:cs="Arial"/>
           <w:b/>
-          <w:sz w:val="24"/>
+          <w:noProof/>
+          <w:sz w:val="24"/>
+          <w:lang w:eastAsia="es-ES"/>
         </w:rPr>
         <w:drawing>
           <wp:inline distT="0" distB="0" distL="0" distR="0" wp14:anchorId="31249BF0" wp14:editId="34C2C2A6">
@@ -12557,7 +13738,9 @@
         <w:rPr>
           <w:rFonts w:ascii="Arial" w:hAnsi="Arial" w:cs="Arial"/>
           <w:b/>
-          <w:sz w:val="24"/>
+          <w:noProof/>
+          <w:sz w:val="24"/>
+          <w:lang w:eastAsia="es-ES"/>
         </w:rPr>
         <w:drawing>
           <wp:inline distT="0" distB="0" distL="0" distR="0" wp14:anchorId="5EC598B3" wp14:editId="7F8E390F">
@@ -12709,17 +13892,1664 @@
           <w:rFonts w:ascii="Arial" w:hAnsi="Arial" w:cs="Arial"/>
           <w:sz w:val="24"/>
         </w:rPr>
-        <w:t xml:space="preserve">sugiere que dichos países enfrentan graves deficiencias estructurales </w:t>
+        <w:t>sugiere que dichos países enfrentan graves deficiencias estructurales lo que los convierte en objetivos prioritarios para futuras políticas de transición agrícola.</w:t>
+      </w:r>
+    </w:p>
+    <w:p>
+      <w:pPr>
+        <w:pStyle w:val="Ttulo2"/>
+        <w:numPr>
+          <w:ilvl w:val="1"/>
+          <w:numId w:val="7"/>
+        </w:numPr>
+        <w:spacing w:line="276" w:lineRule="auto"/>
+        <w:jc w:val="both"/>
+      </w:pPr>
+      <w:r>
+        <w:rPr>
+          <w:rFonts w:ascii="Arial" w:hAnsi="Arial" w:cs="Arial"/>
+          <w:b/>
+          <w:color w:val="auto"/>
+        </w:rPr>
+        <w:t>Prospección</w:t>
+      </w:r>
+      <w:r>
+        <w:t xml:space="preserve"> </w:t>
+      </w:r>
+    </w:p>
+    <w:p>
+      <w:pPr>
+        <w:pStyle w:val="Prrafodelista"/>
+        <w:numPr>
+          <w:ilvl w:val="0"/>
+          <w:numId w:val="14"/>
+        </w:numPr>
+        <w:spacing w:line="276" w:lineRule="auto"/>
+        <w:jc w:val="both"/>
+        <w:rPr>
+          <w:rFonts w:ascii="Arial" w:hAnsi="Arial" w:cs="Arial"/>
+          <w:b/>
+          <w:sz w:val="24"/>
+        </w:rPr>
+      </w:pPr>
+      <w:r>
+        <w:rPr>
+          <w:rFonts w:ascii="Arial" w:hAnsi="Arial" w:cs="Arial"/>
+          <w:b/>
+          <w:sz w:val="24"/>
+        </w:rPr>
+        <w:t>Productividad</w:t>
+      </w:r>
+    </w:p>
+    <w:p>
+      <w:pPr>
+        <w:spacing w:line="276" w:lineRule="auto"/>
+        <w:jc w:val="both"/>
+        <w:rPr>
+          <w:rFonts w:ascii="Arial" w:hAnsi="Arial" w:cs="Arial"/>
+          <w:sz w:val="24"/>
+        </w:rPr>
+      </w:pPr>
+      <w:r>
+        <w:rPr>
+          <w:rFonts w:ascii="Arial" w:hAnsi="Arial" w:cs="Arial"/>
+          <w:sz w:val="24"/>
+        </w:rPr>
+        <w:t xml:space="preserve">La productividad agrícola viene dada por una serie de factores los cuales hemos obtenido mediante es uso de técnicas de aprendizaje automático, en concreto con el algoritmo de </w:t>
+      </w:r>
+      <w:proofErr w:type="spellStart"/>
+      <w:r>
+        <w:rPr>
+          <w:rFonts w:ascii="Arial" w:hAnsi="Arial" w:cs="Arial"/>
+          <w:i/>
+          <w:sz w:val="24"/>
+        </w:rPr>
+        <w:t>Random</w:t>
+      </w:r>
+      <w:proofErr w:type="spellEnd"/>
+      <w:r>
+        <w:rPr>
+          <w:rFonts w:ascii="Arial" w:hAnsi="Arial" w:cs="Arial"/>
+          <w:i/>
+          <w:sz w:val="24"/>
+        </w:rPr>
+        <w:t xml:space="preserve"> </w:t>
+      </w:r>
+      <w:proofErr w:type="spellStart"/>
+      <w:r>
+        <w:rPr>
+          <w:rFonts w:ascii="Arial" w:hAnsi="Arial" w:cs="Arial"/>
+          <w:i/>
+          <w:sz w:val="24"/>
+        </w:rPr>
+        <w:t>Forest</w:t>
+      </w:r>
+      <w:proofErr w:type="spellEnd"/>
+      <w:r>
+        <w:rPr>
+          <w:rFonts w:ascii="Arial" w:hAnsi="Arial" w:cs="Arial"/>
+          <w:sz w:val="24"/>
+        </w:rPr>
+        <w:t>.</w:t>
+      </w:r>
+    </w:p>
+    <w:p>
+      <w:pPr>
+        <w:spacing w:line="276" w:lineRule="auto"/>
+        <w:jc w:val="both"/>
+        <w:rPr>
+          <w:rFonts w:ascii="Arial" w:hAnsi="Arial" w:cs="Arial"/>
+          <w:sz w:val="24"/>
+        </w:rPr>
+      </w:pPr>
+      <w:r>
+        <w:rPr>
+          <w:rFonts w:ascii="Arial" w:hAnsi="Arial" w:cs="Arial"/>
+          <w:noProof/>
+          <w:sz w:val="24"/>
+          <w:lang w:eastAsia="es-ES"/>
+        </w:rPr>
+        <w:lastRenderedPageBreak/>
+        <w:drawing>
+          <wp:inline distT="0" distB="0" distL="0" distR="0" wp14:anchorId="0B7AEEF7" wp14:editId="10B8A140">
+            <wp:extent cx="5400040" cy="3218180"/>
+            <wp:effectExtent l="0" t="0" r="0" b="1270"/>
+            <wp:docPr id="3" name="Imagen 3"/>
+            <wp:cNvGraphicFramePr>
+              <a:graphicFrameLocks xmlns:a="http://schemas.openxmlformats.org/drawingml/2006/main" noChangeAspect="1"/>
+            </wp:cNvGraphicFramePr>
+            <a:graphic xmlns:a="http://schemas.openxmlformats.org/drawingml/2006/main">
+              <a:graphicData uri="http://schemas.openxmlformats.org/drawingml/2006/picture">
+                <pic:pic xmlns:pic="http://schemas.openxmlformats.org/drawingml/2006/picture">
+                  <pic:nvPicPr>
+                    <pic:cNvPr id="1" name=""/>
+                    <pic:cNvPicPr/>
+                  </pic:nvPicPr>
+                  <pic:blipFill>
+                    <a:blip r:embed="rId26"/>
+                    <a:stretch>
+                      <a:fillRect/>
+                    </a:stretch>
+                  </pic:blipFill>
+                  <pic:spPr>
+                    <a:xfrm>
+                      <a:off x="0" y="0"/>
+                      <a:ext cx="5400040" cy="3218180"/>
+                    </a:xfrm>
+                    <a:prstGeom prst="rect">
+                      <a:avLst/>
+                    </a:prstGeom>
+                  </pic:spPr>
+                </pic:pic>
+              </a:graphicData>
+            </a:graphic>
+          </wp:inline>
+        </w:drawing>
+      </w:r>
+    </w:p>
+    <w:p>
+      <w:pPr>
+        <w:spacing w:line="276" w:lineRule="auto"/>
+        <w:jc w:val="both"/>
+        <w:rPr>
+          <w:rFonts w:ascii="Arial" w:hAnsi="Arial" w:cs="Arial"/>
+          <w:sz w:val="24"/>
+        </w:rPr>
+      </w:pPr>
+      <w:r>
+        <w:rPr>
+          <w:rFonts w:ascii="Arial" w:hAnsi="Arial" w:cs="Arial"/>
+          <w:sz w:val="24"/>
+        </w:rPr>
+        <w:t>Como podemos observar el algoritmo a identificado que la productividad agrícola viene determinada por una combinación de la gestión humana y las condiciones ambientales. Donde el uso de fertilizantes y el agua de riego establecen el potencial de producción y la precipitación total interviene como factor importante para determinar dicha producción.</w:t>
+      </w:r>
+    </w:p>
+    <w:p>
+      <w:pPr>
+        <w:spacing w:line="276" w:lineRule="auto"/>
+        <w:jc w:val="both"/>
+        <w:rPr>
+          <w:rFonts w:ascii="Arial" w:hAnsi="Arial" w:cs="Arial"/>
+          <w:sz w:val="24"/>
+        </w:rPr>
+      </w:pPr>
+      <w:r>
+        <w:rPr>
+          <w:rFonts w:ascii="Arial" w:hAnsi="Arial" w:cs="Arial"/>
+          <w:sz w:val="24"/>
+        </w:rPr>
+        <w:t>En cuanto a la productividad ganadera</w:t>
+      </w:r>
+      <w:r>
+        <w:rPr>
+          <w:rFonts w:ascii="Arial" w:hAnsi="Arial" w:cs="Arial"/>
+          <w:sz w:val="24"/>
+        </w:rPr>
+        <w:t xml:space="preserve">, para determinar qué factores son los determinantes en el rendimiento hemos usado otra vez el algoritmo de </w:t>
+      </w:r>
+      <w:proofErr w:type="spellStart"/>
+      <w:r>
+        <w:rPr>
+          <w:rFonts w:ascii="Arial" w:hAnsi="Arial" w:cs="Arial"/>
+          <w:i/>
+          <w:sz w:val="24"/>
+        </w:rPr>
+        <w:t>Random</w:t>
+      </w:r>
+      <w:proofErr w:type="spellEnd"/>
+      <w:r>
+        <w:rPr>
+          <w:rFonts w:ascii="Arial" w:hAnsi="Arial" w:cs="Arial"/>
+          <w:i/>
+          <w:sz w:val="24"/>
+        </w:rPr>
+        <w:t xml:space="preserve"> </w:t>
+      </w:r>
+      <w:proofErr w:type="spellStart"/>
+      <w:r>
+        <w:rPr>
+          <w:rFonts w:ascii="Arial" w:hAnsi="Arial" w:cs="Arial"/>
+          <w:i/>
+          <w:sz w:val="24"/>
+        </w:rPr>
+        <w:t>Forest</w:t>
+      </w:r>
+      <w:proofErr w:type="spellEnd"/>
+      <w:r>
+        <w:rPr>
+          <w:rFonts w:ascii="Arial" w:hAnsi="Arial" w:cs="Arial"/>
+          <w:sz w:val="24"/>
+        </w:rPr>
+        <w:t xml:space="preserve"> sobre la variable de eficiencia de carne (toneladas de carne producidas por cabeza), teniendo en cuenta que se han excluido variables como la cantidad de animales que hay y las toneladas de carne que producen ya que van implícitas en la variable objetivo.</w:t>
+      </w:r>
+    </w:p>
+    <w:p>
+      <w:pPr>
+        <w:spacing w:line="276" w:lineRule="auto"/>
+        <w:jc w:val="center"/>
+        <w:rPr>
+          <w:rFonts w:ascii="Arial" w:hAnsi="Arial" w:cs="Arial"/>
+          <w:sz w:val="24"/>
+        </w:rPr>
+      </w:pPr>
+      <w:r>
+        <w:rPr>
+          <w:rFonts w:ascii="Arial" w:hAnsi="Arial" w:cs="Arial"/>
+          <w:noProof/>
+          <w:sz w:val="24"/>
+          <w:lang w:eastAsia="es-ES"/>
+        </w:rPr>
+        <w:drawing>
+          <wp:inline distT="0" distB="0" distL="0" distR="0" wp14:anchorId="71F5B353" wp14:editId="234869A2">
+            <wp:extent cx="4971415" cy="2965662"/>
+            <wp:effectExtent l="0" t="0" r="635" b="6350"/>
+            <wp:docPr id="10" name="Imagen 10"/>
+            <wp:cNvGraphicFramePr>
+              <a:graphicFrameLocks xmlns:a="http://schemas.openxmlformats.org/drawingml/2006/main" noChangeAspect="1"/>
+            </wp:cNvGraphicFramePr>
+            <a:graphic xmlns:a="http://schemas.openxmlformats.org/drawingml/2006/main">
+              <a:graphicData uri="http://schemas.openxmlformats.org/drawingml/2006/picture">
+                <pic:pic xmlns:pic="http://schemas.openxmlformats.org/drawingml/2006/picture">
+                  <pic:nvPicPr>
+                    <pic:cNvPr id="1" name=""/>
+                    <pic:cNvPicPr/>
+                  </pic:nvPicPr>
+                  <pic:blipFill>
+                    <a:blip r:embed="rId27"/>
+                    <a:stretch>
+                      <a:fillRect/>
+                    </a:stretch>
+                  </pic:blipFill>
+                  <pic:spPr>
+                    <a:xfrm>
+                      <a:off x="0" y="0"/>
+                      <a:ext cx="4981423" cy="2971632"/>
+                    </a:xfrm>
+                    <a:prstGeom prst="rect">
+                      <a:avLst/>
+                    </a:prstGeom>
+                  </pic:spPr>
+                </pic:pic>
+              </a:graphicData>
+            </a:graphic>
+          </wp:inline>
+        </w:drawing>
+      </w:r>
+    </w:p>
+    <w:p>
+      <w:pPr>
+        <w:spacing w:line="276" w:lineRule="auto"/>
+        <w:jc w:val="both"/>
+        <w:rPr>
+          <w:rFonts w:ascii="Arial" w:hAnsi="Arial" w:cs="Arial"/>
+          <w:sz w:val="24"/>
+        </w:rPr>
+      </w:pPr>
+      <w:r>
+        <w:rPr>
+          <w:rFonts w:ascii="Arial" w:hAnsi="Arial" w:cs="Arial"/>
+          <w:sz w:val="24"/>
+        </w:rPr>
+        <w:lastRenderedPageBreak/>
+        <w:t>La gráfica muestra que la productividad en el ámbito ganadero viene determinada casi en su totalidad por la intensidad de emisiones del animal. Además, el modelo identifica variables como la producción de la leche como un predictor secundario por lo que puede impactar en la productividad final del animal.</w:t>
+      </w:r>
+    </w:p>
+    <w:p>
+      <w:pPr>
+        <w:spacing w:line="276" w:lineRule="auto"/>
+        <w:jc w:val="both"/>
+        <w:rPr>
+          <w:rFonts w:ascii="Arial" w:hAnsi="Arial" w:cs="Arial"/>
+          <w:sz w:val="24"/>
+        </w:rPr>
+      </w:pPr>
+      <w:r>
+        <w:rPr>
+          <w:rFonts w:ascii="Arial" w:hAnsi="Arial" w:cs="Arial"/>
+          <w:sz w:val="24"/>
+        </w:rPr>
+        <w:t>Además cabe destacar</w:t>
+      </w:r>
+      <w:r>
+        <w:rPr>
+          <w:rFonts w:ascii="Arial" w:hAnsi="Arial" w:cs="Arial"/>
+          <w:sz w:val="24"/>
+        </w:rPr>
+        <w:t xml:space="preserve"> que no existe ninguna región que destaque significativamente sobre otra en términos de producción sino que las medianas de rendimiento se mantienen en todas las regiones.</w:t>
+      </w:r>
+    </w:p>
+    <w:p>
+      <w:pPr>
+        <w:pStyle w:val="Prrafodelista"/>
+        <w:numPr>
+          <w:ilvl w:val="0"/>
+          <w:numId w:val="14"/>
+        </w:numPr>
+        <w:spacing w:line="276" w:lineRule="auto"/>
+        <w:jc w:val="both"/>
+        <w:rPr>
+          <w:rFonts w:ascii="Arial" w:hAnsi="Arial" w:cs="Arial"/>
+          <w:b/>
+          <w:sz w:val="24"/>
+        </w:rPr>
+      </w:pPr>
+      <w:r>
+        <w:rPr>
+          <w:rFonts w:ascii="Arial" w:hAnsi="Arial" w:cs="Arial"/>
+          <w:b/>
+          <w:sz w:val="24"/>
+        </w:rPr>
+        <w:t>Sostenibilidad</w:t>
+      </w:r>
+    </w:p>
+    <w:p>
+      <w:pPr>
+        <w:spacing w:line="276" w:lineRule="auto"/>
+        <w:jc w:val="both"/>
+        <w:rPr>
+          <w:rFonts w:ascii="Arial" w:hAnsi="Arial" w:cs="Arial"/>
+          <w:sz w:val="24"/>
+        </w:rPr>
+      </w:pPr>
+      <w:r>
+        <w:rPr>
+          <w:rFonts w:ascii="Arial" w:hAnsi="Arial" w:cs="Arial"/>
+          <w:sz w:val="24"/>
+        </w:rPr>
+        <w:t>Como ya hemos comprobado anteriormente no existe una relación lineal entre el fertilizante (causante de las emisiones en la producción agrícola) y el rendimiento que se obtiene. Esto sugiere en el ámbito de la sostenibilidad que la adición de más fertilizante no aumenta la cosecha sino que genera un impacto ambiental innecesario sin aumentar la productividad.</w:t>
+      </w:r>
+    </w:p>
+    <w:p>
+      <w:pPr>
+        <w:spacing w:line="276" w:lineRule="auto"/>
+        <w:jc w:val="both"/>
+        <w:rPr>
+          <w:rFonts w:ascii="Arial" w:hAnsi="Arial" w:cs="Arial"/>
+          <w:sz w:val="24"/>
+        </w:rPr>
+      </w:pPr>
+      <w:r>
+        <w:rPr>
+          <w:rFonts w:ascii="Arial" w:hAnsi="Arial" w:cs="Arial"/>
+          <w:sz w:val="24"/>
+        </w:rPr>
+        <w:t>En cambio sí podemos evaluar</w:t>
+      </w:r>
+      <w:r>
+        <w:rPr>
+          <w:rFonts w:ascii="Arial" w:hAnsi="Arial" w:cs="Arial"/>
+          <w:sz w:val="24"/>
+        </w:rPr>
+        <w:t xml:space="preserve"> la sostenibilidad en cada uno de los países, teniendo en cuenta</w:t>
+      </w:r>
+      <w:r>
+        <w:rPr>
+          <w:rFonts w:ascii="Arial" w:hAnsi="Arial" w:cs="Arial"/>
+          <w:sz w:val="24"/>
+        </w:rPr>
+        <w:t xml:space="preserve"> la intensidad de emisiones para el ganado y la influencia de la fertilización por tonelada de cultivo. </w:t>
+      </w:r>
+    </w:p>
+    <w:p>
+      <w:pPr>
+        <w:spacing w:line="276" w:lineRule="auto"/>
+        <w:jc w:val="both"/>
+        <w:rPr>
+          <w:rFonts w:ascii="Arial" w:hAnsi="Arial" w:cs="Arial"/>
+          <w:sz w:val="24"/>
+        </w:rPr>
+      </w:pPr>
+      <w:r>
+        <w:rPr>
+          <w:rFonts w:ascii="Arial" w:hAnsi="Arial" w:cs="Arial"/>
+          <w:sz w:val="24"/>
+        </w:rPr>
+        <w:drawing>
+          <wp:inline distT="0" distB="0" distL="0" distR="0" wp14:anchorId="2D648509" wp14:editId="5E00EE78">
+            <wp:extent cx="5400040" cy="2679700"/>
+            <wp:effectExtent l="0" t="0" r="0" b="6350"/>
+            <wp:docPr id="18" name="Imagen 18"/>
+            <wp:cNvGraphicFramePr>
+              <a:graphicFrameLocks xmlns:a="http://schemas.openxmlformats.org/drawingml/2006/main" noChangeAspect="1"/>
+            </wp:cNvGraphicFramePr>
+            <a:graphic xmlns:a="http://schemas.openxmlformats.org/drawingml/2006/main">
+              <a:graphicData uri="http://schemas.openxmlformats.org/drawingml/2006/picture">
+                <pic:pic xmlns:pic="http://schemas.openxmlformats.org/drawingml/2006/picture">
+                  <pic:nvPicPr>
+                    <pic:cNvPr id="1" name=""/>
+                    <pic:cNvPicPr/>
+                  </pic:nvPicPr>
+                  <pic:blipFill>
+                    <a:blip r:embed="rId28"/>
+                    <a:stretch>
+                      <a:fillRect/>
+                    </a:stretch>
+                  </pic:blipFill>
+                  <pic:spPr>
+                    <a:xfrm>
+                      <a:off x="0" y="0"/>
+                      <a:ext cx="5400040" cy="2679700"/>
+                    </a:xfrm>
+                    <a:prstGeom prst="rect">
+                      <a:avLst/>
+                    </a:prstGeom>
+                  </pic:spPr>
+                </pic:pic>
+              </a:graphicData>
+            </a:graphic>
+          </wp:inline>
+        </w:drawing>
+      </w:r>
+    </w:p>
+    <w:p>
+      <w:pPr>
+        <w:spacing w:line="276" w:lineRule="auto"/>
+        <w:jc w:val="both"/>
+        <w:rPr>
+          <w:rFonts w:ascii="Arial" w:hAnsi="Arial" w:cs="Arial"/>
+          <w:sz w:val="24"/>
+        </w:rPr>
+      </w:pPr>
+      <w:r>
+        <w:rPr>
+          <w:rFonts w:ascii="Arial" w:hAnsi="Arial" w:cs="Arial"/>
+          <w:sz w:val="24"/>
+        </w:rPr>
+        <w:t>En cuanto a la agricultura, los países que menos emisiones tienen son México, EEUU y Kenia, lo que demuestra una mayor capacidad para transformar recursos en alimento con un impacto químico reducido. Mientras que los países más a la derecha del gráfico requieren una carga de fertilizante mayor para obtener una buena producción.</w:t>
+      </w:r>
+    </w:p>
+    <w:p>
+      <w:pPr>
+        <w:spacing w:line="276" w:lineRule="auto"/>
+        <w:jc w:val="both"/>
+        <w:rPr>
+          <w:rFonts w:ascii="Arial" w:hAnsi="Arial" w:cs="Arial"/>
+          <w:sz w:val="24"/>
+        </w:rPr>
+      </w:pPr>
+      <w:r>
+        <w:rPr>
+          <w:rFonts w:ascii="Arial" w:hAnsi="Arial" w:cs="Arial"/>
+          <w:sz w:val="24"/>
+        </w:rPr>
+        <w:lastRenderedPageBreak/>
+        <w:drawing>
+          <wp:inline distT="0" distB="0" distL="0" distR="0" wp14:anchorId="414F298B" wp14:editId="34162CAB">
+            <wp:extent cx="5400040" cy="2679700"/>
+            <wp:effectExtent l="0" t="0" r="0" b="6350"/>
+            <wp:docPr id="22" name="Imagen 22"/>
+            <wp:cNvGraphicFramePr>
+              <a:graphicFrameLocks xmlns:a="http://schemas.openxmlformats.org/drawingml/2006/main" noChangeAspect="1"/>
+            </wp:cNvGraphicFramePr>
+            <a:graphic xmlns:a="http://schemas.openxmlformats.org/drawingml/2006/main">
+              <a:graphicData uri="http://schemas.openxmlformats.org/drawingml/2006/picture">
+                <pic:pic xmlns:pic="http://schemas.openxmlformats.org/drawingml/2006/picture">
+                  <pic:nvPicPr>
+                    <pic:cNvPr id="1" name=""/>
+                    <pic:cNvPicPr/>
+                  </pic:nvPicPr>
+                  <pic:blipFill>
+                    <a:blip r:embed="rId29"/>
+                    <a:stretch>
+                      <a:fillRect/>
+                    </a:stretch>
+                  </pic:blipFill>
+                  <pic:spPr>
+                    <a:xfrm>
+                      <a:off x="0" y="0"/>
+                      <a:ext cx="5400040" cy="2679700"/>
+                    </a:xfrm>
+                    <a:prstGeom prst="rect">
+                      <a:avLst/>
+                    </a:prstGeom>
+                  </pic:spPr>
+                </pic:pic>
+              </a:graphicData>
+            </a:graphic>
+          </wp:inline>
+        </w:drawing>
+      </w:r>
+    </w:p>
+    <w:p>
+      <w:pPr>
+        <w:spacing w:line="276" w:lineRule="auto"/>
+        <w:jc w:val="both"/>
+        <w:rPr>
+          <w:rFonts w:ascii="Arial" w:hAnsi="Arial" w:cs="Arial"/>
+          <w:sz w:val="24"/>
+        </w:rPr>
+      </w:pPr>
+      <w:r>
+        <w:rPr>
+          <w:rFonts w:ascii="Arial" w:hAnsi="Arial" w:cs="Arial"/>
+          <w:sz w:val="24"/>
+        </w:rPr>
+        <w:t xml:space="preserve">Por otro lado en cuanto a ganadería, podemos comprobar que aquellos países líderes en sostenibilidad </w:t>
+      </w:r>
+      <w:r>
+        <w:rPr>
+          <w:rFonts w:ascii="Arial" w:hAnsi="Arial" w:cs="Arial"/>
+          <w:sz w:val="24"/>
+        </w:rPr>
+        <w:t>(menor intensidad de emisiones) son México, Francia y Kenia. Por lo que comprobando ambos resultados y si sumamos tanto ganadería como agricultura podemos afirmar que el país más sostenible es México.</w:t>
+      </w:r>
+    </w:p>
+    <w:p>
+      <w:pPr>
+        <w:pStyle w:val="Prrafodelista"/>
+        <w:numPr>
+          <w:ilvl w:val="0"/>
+          <w:numId w:val="14"/>
+        </w:numPr>
+        <w:spacing w:line="276" w:lineRule="auto"/>
+        <w:jc w:val="both"/>
+        <w:rPr>
+          <w:rFonts w:ascii="Arial" w:hAnsi="Arial" w:cs="Arial"/>
+          <w:b/>
+          <w:sz w:val="24"/>
+        </w:rPr>
+      </w:pPr>
+      <w:r>
+        <w:rPr>
+          <w:rFonts w:ascii="Arial" w:hAnsi="Arial" w:cs="Arial"/>
+          <w:b/>
+          <w:sz w:val="24"/>
+        </w:rPr>
+        <w:t>Riesgo climático</w:t>
+      </w:r>
+    </w:p>
+    <w:p>
+      <w:pPr>
+        <w:spacing w:line="276" w:lineRule="auto"/>
+        <w:jc w:val="both"/>
+        <w:rPr>
+          <w:rFonts w:ascii="Arial" w:hAnsi="Arial" w:cs="Arial"/>
+          <w:sz w:val="24"/>
+        </w:rPr>
+      </w:pPr>
+      <w:r>
+        <w:rPr>
+          <w:rFonts w:ascii="Arial" w:hAnsi="Arial" w:cs="Arial"/>
+          <w:sz w:val="24"/>
+        </w:rPr>
+        <w:t>A la hora de llevar a cabo actividades de producción agrícola es muy necesario tener en cuenta que pueden ocurrir diferentes eventos que pueden alterar la producción. Por ello, es interesante comprobar cuáles son los cultivos más vulnerables ante estos eventos.</w:t>
+      </w:r>
+    </w:p>
+    <w:p>
+      <w:pPr>
+        <w:spacing w:line="276" w:lineRule="auto"/>
+        <w:jc w:val="both"/>
+        <w:rPr>
+          <w:rFonts w:ascii="Arial" w:hAnsi="Arial" w:cs="Arial"/>
+          <w:sz w:val="24"/>
+        </w:rPr>
+      </w:pPr>
+      <w:r>
+        <w:rPr>
+          <w:rFonts w:ascii="Arial" w:hAnsi="Arial" w:cs="Arial"/>
+          <w:sz w:val="24"/>
+        </w:rPr>
+        <w:drawing>
+          <wp:inline distT="0" distB="0" distL="0" distR="0" wp14:anchorId="01F97E63" wp14:editId="391A8B6B">
+            <wp:extent cx="5400040" cy="3163570"/>
+            <wp:effectExtent l="0" t="0" r="0" b="0"/>
+            <wp:docPr id="23" name="Imagen 23"/>
+            <wp:cNvGraphicFramePr>
+              <a:graphicFrameLocks xmlns:a="http://schemas.openxmlformats.org/drawingml/2006/main" noChangeAspect="1"/>
+            </wp:cNvGraphicFramePr>
+            <a:graphic xmlns:a="http://schemas.openxmlformats.org/drawingml/2006/main">
+              <a:graphicData uri="http://schemas.openxmlformats.org/drawingml/2006/picture">
+                <pic:pic xmlns:pic="http://schemas.openxmlformats.org/drawingml/2006/picture">
+                  <pic:nvPicPr>
+                    <pic:cNvPr id="1" name=""/>
+                    <pic:cNvPicPr/>
+                  </pic:nvPicPr>
+                  <pic:blipFill>
+                    <a:blip r:embed="rId30"/>
+                    <a:stretch>
+                      <a:fillRect/>
+                    </a:stretch>
+                  </pic:blipFill>
+                  <pic:spPr>
+                    <a:xfrm>
+                      <a:off x="0" y="0"/>
+                      <a:ext cx="5400040" cy="3163570"/>
+                    </a:xfrm>
+                    <a:prstGeom prst="rect">
+                      <a:avLst/>
+                    </a:prstGeom>
+                  </pic:spPr>
+                </pic:pic>
+              </a:graphicData>
+            </a:graphic>
+          </wp:inline>
+        </w:drawing>
+      </w:r>
+    </w:p>
+    <w:p>
+      <w:pPr>
+        <w:spacing w:line="276" w:lineRule="auto"/>
+        <w:jc w:val="both"/>
+        <w:rPr>
+          <w:rFonts w:ascii="Arial" w:hAnsi="Arial" w:cs="Arial"/>
+          <w:sz w:val="24"/>
+        </w:rPr>
+      </w:pPr>
+      <w:r>
+        <w:rPr>
+          <w:rFonts w:ascii="Arial" w:hAnsi="Arial" w:cs="Arial"/>
+          <w:sz w:val="24"/>
+        </w:rPr>
+        <w:t xml:space="preserve">Como podemos comprobar, ante la presencia de eventos extremos, los cultivos que más reducen su producción (hasta un 15%) son el café y la soja, mientras </w:t>
+      </w:r>
+      <w:r>
+        <w:rPr>
+          <w:rFonts w:ascii="Arial" w:hAnsi="Arial" w:cs="Arial"/>
+          <w:sz w:val="24"/>
+        </w:rPr>
+        <w:lastRenderedPageBreak/>
+        <w:t>que otros cultivos como el maíz o la caña de azúcar son más estables a pesar de las condiciones adversas.</w:t>
+      </w:r>
+    </w:p>
+    <w:p>
+      <w:pPr>
+        <w:spacing w:line="276" w:lineRule="auto"/>
+        <w:jc w:val="both"/>
+        <w:rPr>
+          <w:rFonts w:ascii="Arial" w:hAnsi="Arial" w:cs="Arial"/>
+          <w:sz w:val="24"/>
+        </w:rPr>
+      </w:pPr>
+      <w:r>
+        <w:rPr>
+          <w:rFonts w:ascii="Arial" w:hAnsi="Arial" w:cs="Arial"/>
+          <w:sz w:val="24"/>
+        </w:rPr>
+        <w:t xml:space="preserve">Además, cabe la posibilidad de predecir las pérdidas de rendimiento agrícola causadas por eventos como puede ser la sequía. Para ello, se pueden emplear modelos de aprendizaje automático. Mediante el uso de </w:t>
+      </w:r>
+      <w:r>
+        <w:rPr>
+          <w:rFonts w:ascii="Arial" w:hAnsi="Arial" w:cs="Arial"/>
+          <w:sz w:val="24"/>
+        </w:rPr>
+        <w:t>variables climáticas podemos estimar el rendimiento final de los distintos cultivos antes de la cosecha.</w:t>
+      </w:r>
+    </w:p>
+    <w:p>
+      <w:pPr>
+        <w:spacing w:line="276" w:lineRule="auto"/>
+        <w:jc w:val="both"/>
+        <w:rPr>
+          <w:rFonts w:ascii="Arial" w:hAnsi="Arial" w:cs="Arial"/>
+          <w:sz w:val="24"/>
+        </w:rPr>
+      </w:pPr>
+      <w:r>
+        <w:rPr>
+          <w:rFonts w:ascii="Arial" w:hAnsi="Arial" w:cs="Arial"/>
+          <w:sz w:val="24"/>
+        </w:rPr>
+        <w:drawing>
+          <wp:inline distT="0" distB="0" distL="0" distR="0" wp14:anchorId="36BBE92F" wp14:editId="2AC71803">
+            <wp:extent cx="5400040" cy="3459480"/>
+            <wp:effectExtent l="0" t="0" r="0" b="7620"/>
+            <wp:docPr id="24" name="Imagen 24"/>
+            <wp:cNvGraphicFramePr>
+              <a:graphicFrameLocks xmlns:a="http://schemas.openxmlformats.org/drawingml/2006/main" noChangeAspect="1"/>
+            </wp:cNvGraphicFramePr>
+            <a:graphic xmlns:a="http://schemas.openxmlformats.org/drawingml/2006/main">
+              <a:graphicData uri="http://schemas.openxmlformats.org/drawingml/2006/picture">
+                <pic:pic xmlns:pic="http://schemas.openxmlformats.org/drawingml/2006/picture">
+                  <pic:nvPicPr>
+                    <pic:cNvPr id="1" name=""/>
+                    <pic:cNvPicPr/>
+                  </pic:nvPicPr>
+                  <pic:blipFill>
+                    <a:blip r:embed="rId31"/>
+                    <a:stretch>
+                      <a:fillRect/>
+                    </a:stretch>
+                  </pic:blipFill>
+                  <pic:spPr>
+                    <a:xfrm>
+                      <a:off x="0" y="0"/>
+                      <a:ext cx="5400040" cy="3459480"/>
+                    </a:xfrm>
+                    <a:prstGeom prst="rect">
+                      <a:avLst/>
+                    </a:prstGeom>
+                  </pic:spPr>
+                </pic:pic>
+              </a:graphicData>
+            </a:graphic>
+          </wp:inline>
+        </w:drawing>
+      </w:r>
+    </w:p>
+    <w:p>
+      <w:pPr>
+        <w:spacing w:line="276" w:lineRule="auto"/>
+        <w:jc w:val="both"/>
+        <w:rPr>
+          <w:rFonts w:ascii="Arial" w:hAnsi="Arial" w:cs="Arial"/>
+          <w:sz w:val="24"/>
+        </w:rPr>
+      </w:pPr>
+      <w:r>
+        <w:rPr>
+          <w:rFonts w:ascii="Arial" w:hAnsi="Arial" w:cs="Arial"/>
+          <w:sz w:val="24"/>
+        </w:rPr>
+        <w:t>Como se puede comprobar cada cultivo se ve afectado por diferentes variables climáticas, lo que indica que no existe un único factor que anticipe la sequía. De modo que esta capacidad predictiva tiene un alto valor ya que permite detectar señales climáticas que ayuden a estimar la caída de la producción.</w:t>
+      </w:r>
+    </w:p>
+    <w:p>
+      <w:pPr>
+        <w:pStyle w:val="Ttulo2"/>
+        <w:numPr>
+          <w:ilvl w:val="1"/>
+          <w:numId w:val="7"/>
+        </w:numPr>
+        <w:spacing w:line="276" w:lineRule="auto"/>
+        <w:jc w:val="both"/>
+        <w:rPr>
+          <w:rFonts w:ascii="Arial" w:hAnsi="Arial" w:cs="Arial"/>
+          <w:b/>
+          <w:color w:val="auto"/>
+        </w:rPr>
+      </w:pPr>
+      <w:r>
+        <w:rPr>
+          <w:rFonts w:ascii="Arial" w:hAnsi="Arial" w:cs="Arial"/>
+          <w:b/>
+          <w:color w:val="auto"/>
+        </w:rPr>
+        <w:t>Machine Learning</w:t>
+      </w:r>
+    </w:p>
+    <w:p>
+      <w:pPr>
+        <w:pStyle w:val="Ttulo3"/>
+        <w:numPr>
+          <w:ilvl w:val="2"/>
+          <w:numId w:val="7"/>
+        </w:numPr>
+        <w:jc w:val="both"/>
+        <w:rPr>
+          <w:rFonts w:ascii="Arial" w:hAnsi="Arial" w:cs="Arial"/>
+          <w:b/>
+          <w:color w:val="auto"/>
+        </w:rPr>
+      </w:pPr>
+      <w:r>
+        <w:rPr>
+          <w:rFonts w:ascii="Arial" w:hAnsi="Arial" w:cs="Arial"/>
+          <w:b/>
+          <w:color w:val="auto"/>
+        </w:rPr>
+        <w:t>Predicción de Rendimiento Agrícola</w:t>
+      </w:r>
+    </w:p>
+    <w:p>
+      <w:pPr>
+        <w:spacing w:line="276" w:lineRule="auto"/>
+        <w:jc w:val="both"/>
+        <w:rPr>
+          <w:rFonts w:ascii="Arial" w:hAnsi="Arial" w:cs="Arial"/>
+          <w:sz w:val="24"/>
+        </w:rPr>
+      </w:pPr>
+      <w:r>
+        <w:rPr>
+          <w:rFonts w:ascii="Arial" w:hAnsi="Arial" w:cs="Arial"/>
+          <w:sz w:val="24"/>
+        </w:rPr>
+        <w:t>El problema consiste</w:t>
+      </w:r>
+      <w:r>
+        <w:rPr>
+          <w:rFonts w:ascii="Arial" w:hAnsi="Arial" w:cs="Arial"/>
+          <w:sz w:val="24"/>
+        </w:rPr>
+        <w:t xml:space="preserve"> en desarrollar un modelo predictivo capaz de estimar el rendimiento de los cultivos anticipándonos a la cosecha. La capacidad de predecir este rendimiento es vital para conseguir una buena planificación y gestión de riesgos.</w:t>
+      </w:r>
+    </w:p>
+    <w:p>
+      <w:pPr>
+        <w:spacing w:line="276" w:lineRule="auto"/>
+        <w:jc w:val="both"/>
+        <w:rPr>
+          <w:rFonts w:ascii="Arial" w:hAnsi="Arial" w:cs="Arial"/>
+          <w:sz w:val="24"/>
+        </w:rPr>
+      </w:pPr>
+      <w:r>
+        <w:rPr>
+          <w:rFonts w:ascii="Arial" w:hAnsi="Arial" w:cs="Arial"/>
+          <w:sz w:val="24"/>
+        </w:rPr>
+        <w:t>Para resolver el problema vamos a emplear dos modelos. El primero de ellos será un modelo simple como es una regresión lineal múltiple y el segundo un modelo más avanzado como es una red de neuronas lo que permitirá modelar relaciones más complejas.</w:t>
+      </w:r>
+    </w:p>
+    <w:p>
+      <w:pPr>
+        <w:spacing w:line="276" w:lineRule="auto"/>
+        <w:jc w:val="both"/>
+        <w:rPr>
+          <w:rFonts w:ascii="Arial" w:hAnsi="Arial" w:cs="Arial"/>
+          <w:sz w:val="24"/>
+        </w:rPr>
+      </w:pPr>
+      <w:r>
+        <w:rPr>
+          <w:rFonts w:ascii="Arial" w:hAnsi="Arial" w:cs="Arial"/>
+          <w:sz w:val="24"/>
+        </w:rPr>
+        <w:t xml:space="preserve">Para ello, lo primero que hemos tenido que hacer ha sido generar el dataset adecuado con el que se van a realizar los entrenamientos. En este caso hemos </w:t>
+      </w:r>
+      <w:r>
+        <w:rPr>
+          <w:rFonts w:ascii="Arial" w:hAnsi="Arial" w:cs="Arial"/>
+          <w:sz w:val="24"/>
+        </w:rPr>
+        <w:lastRenderedPageBreak/>
+        <w:t>combinado la producción agrícola</w:t>
+      </w:r>
+      <w:r>
+        <w:rPr>
+          <w:rFonts w:ascii="Arial" w:hAnsi="Arial" w:cs="Arial"/>
+          <w:sz w:val="24"/>
+        </w:rPr>
+        <w:t xml:space="preserve"> </w:t>
+      </w:r>
+      <w:r>
+        <w:rPr>
+          <w:rFonts w:ascii="Arial" w:hAnsi="Arial" w:cs="Arial"/>
+          <w:sz w:val="24"/>
+        </w:rPr>
+        <w:t>con las condiciones climáticas</w:t>
+      </w:r>
+      <w:r>
+        <w:rPr>
+          <w:rFonts w:ascii="Arial" w:hAnsi="Arial" w:cs="Arial"/>
+          <w:sz w:val="24"/>
+        </w:rPr>
+        <w:t>. No se combinan las imágenes satelitales puesto que las fechas van desde 2020 hasta 2033, mientras que en la producción solo tenemos datos desde 2011 hasta 2020</w:t>
+      </w:r>
+      <w:r>
+        <w:rPr>
+          <w:rFonts w:ascii="Arial" w:hAnsi="Arial" w:cs="Arial"/>
+          <w:sz w:val="24"/>
+        </w:rPr>
+        <w:t>.</w:t>
+      </w:r>
+    </w:p>
+    <w:p>
+      <w:pPr>
+        <w:spacing w:line="276" w:lineRule="auto"/>
+        <w:jc w:val="both"/>
+        <w:rPr>
+          <w:rFonts w:ascii="Arial" w:hAnsi="Arial" w:cs="Arial"/>
+          <w:sz w:val="24"/>
+        </w:rPr>
+      </w:pPr>
+      <w:r>
+        <w:rPr>
+          <w:rFonts w:ascii="Arial" w:hAnsi="Arial" w:cs="Arial"/>
+          <w:sz w:val="24"/>
+        </w:rPr>
+        <w:t>Una vez tenemos el conjunto de datos separados en variables objetivo y predictoras, procedemos a la fase de preprocesamiento de los datos donde hemos realizado un escalado de las variables numéricas continuas y una codificación de las variables categóricas que hemos usado para las predicciones. Una vez tenemos ya los conjuntos de datos preparados pasamos a la fase de modelado, que cuenta con dos modelos:</w:t>
+      </w:r>
+    </w:p>
+    <w:p>
+      <w:pPr>
+        <w:pStyle w:val="Prrafodelista"/>
+        <w:numPr>
+          <w:ilvl w:val="0"/>
+          <w:numId w:val="5"/>
+        </w:numPr>
+        <w:spacing w:line="276" w:lineRule="auto"/>
+        <w:jc w:val="both"/>
+        <w:rPr>
+          <w:rFonts w:ascii="Arial" w:hAnsi="Arial" w:cs="Arial"/>
+          <w:sz w:val="24"/>
+        </w:rPr>
+      </w:pPr>
+      <w:r>
+        <w:rPr>
+          <w:rFonts w:ascii="Arial" w:hAnsi="Arial" w:cs="Arial"/>
+          <w:b/>
+          <w:sz w:val="24"/>
+        </w:rPr>
+        <w:t xml:space="preserve">Regresión Lineal Múltiple: </w:t>
+      </w:r>
+      <w:r>
+        <w:rPr>
+          <w:rFonts w:ascii="Arial" w:hAnsi="Arial" w:cs="Arial"/>
+          <w:sz w:val="24"/>
+        </w:rPr>
+        <w:t>Se encarga de calcular una relación lineal entre las características independientes y la variable dependiente</w:t>
+      </w:r>
+      <w:r>
+        <w:rPr>
+          <w:rFonts w:ascii="Arial" w:hAnsi="Arial" w:cs="Arial"/>
+          <w:sz w:val="24"/>
+        </w:rPr>
+        <w:t xml:space="preserve">. Para evaluar el desempeño del este modelo y evitar el </w:t>
+      </w:r>
+      <w:r>
+        <w:rPr>
+          <w:rFonts w:ascii="Arial" w:hAnsi="Arial" w:cs="Arial"/>
+          <w:i/>
+          <w:sz w:val="24"/>
+        </w:rPr>
+        <w:t>overfitting</w:t>
+      </w:r>
+      <w:r>
+        <w:rPr>
+          <w:rFonts w:ascii="Arial" w:hAnsi="Arial" w:cs="Arial"/>
+          <w:sz w:val="24"/>
+        </w:rPr>
+        <w:t xml:space="preserve"> hemos realizado una validación cruzada de 5 particiones. Y como métricas hemos empleado el MSE, RMSE y R cuadrado, que han sido resultado de la media de cada una de las iteraciones de la validación cruzada. Los resultados de este modelo se comentaran en el apartado correspondiente de la memoria.</w:t>
+      </w:r>
+    </w:p>
+    <w:p>
+      <w:pPr>
+        <w:pStyle w:val="Prrafodelista"/>
+        <w:numPr>
+          <w:ilvl w:val="0"/>
+          <w:numId w:val="5"/>
+        </w:numPr>
+        <w:spacing w:line="276" w:lineRule="auto"/>
+        <w:jc w:val="both"/>
+        <w:rPr>
+          <w:rFonts w:ascii="Arial" w:hAnsi="Arial" w:cs="Arial"/>
+          <w:sz w:val="24"/>
+        </w:rPr>
+      </w:pPr>
+      <w:r>
+        <w:rPr>
+          <w:rFonts w:ascii="Arial" w:hAnsi="Arial" w:cs="Arial"/>
+          <w:b/>
+          <w:sz w:val="24"/>
+        </w:rPr>
+        <w:t xml:space="preserve">Red de neuronas: </w:t>
+      </w:r>
+      <w:r>
+        <w:rPr>
+          <w:rFonts w:ascii="Arial" w:hAnsi="Arial" w:cs="Arial"/>
+          <w:sz w:val="24"/>
+        </w:rPr>
+        <w:t>Este modelo se ha elegido puesto que permite tratar relaciones no lineales y aprender patrones más complejos. Lo primero que se ha tenido que especificar es una arquitectura, que ha sido la siguiente:</w:t>
+      </w:r>
+    </w:p>
+    <w:p>
+      <w:pPr>
+        <w:pStyle w:val="Prrafodelista"/>
+        <w:spacing w:line="276" w:lineRule="auto"/>
+        <w:ind w:left="502"/>
+        <w:jc w:val="center"/>
+        <w:rPr>
+          <w:rFonts w:ascii="Arial" w:hAnsi="Arial" w:cs="Arial"/>
+          <w:sz w:val="24"/>
+        </w:rPr>
+      </w:pPr>
+      <w:r>
+        <w:rPr>
+          <w:rFonts w:ascii="Arial" w:hAnsi="Arial" w:cs="Arial"/>
+          <w:sz w:val="24"/>
+        </w:rPr>
+        <w:drawing>
+          <wp:inline distT="0" distB="0" distL="0" distR="0" wp14:anchorId="23FE873B" wp14:editId="3B88CF1A">
+            <wp:extent cx="2400300" cy="3717221"/>
+            <wp:effectExtent l="0" t="0" r="0" b="0"/>
+            <wp:docPr id="25" name="Imagen 25"/>
+            <wp:cNvGraphicFramePr>
+              <a:graphicFrameLocks xmlns:a="http://schemas.openxmlformats.org/drawingml/2006/main" noChangeAspect="1"/>
+            </wp:cNvGraphicFramePr>
+            <a:graphic xmlns:a="http://schemas.openxmlformats.org/drawingml/2006/main">
+              <a:graphicData uri="http://schemas.openxmlformats.org/drawingml/2006/picture">
+                <pic:pic xmlns:pic="http://schemas.openxmlformats.org/drawingml/2006/picture">
+                  <pic:nvPicPr>
+                    <pic:cNvPr id="1" name=""/>
+                    <pic:cNvPicPr/>
+                  </pic:nvPicPr>
+                  <pic:blipFill>
+                    <a:blip r:embed="rId32"/>
+                    <a:stretch>
+                      <a:fillRect/>
+                    </a:stretch>
+                  </pic:blipFill>
+                  <pic:spPr>
+                    <a:xfrm>
+                      <a:off x="0" y="0"/>
+                      <a:ext cx="2415758" cy="3741161"/>
+                    </a:xfrm>
+                    <a:prstGeom prst="rect">
+                      <a:avLst/>
+                    </a:prstGeom>
+                  </pic:spPr>
+                </pic:pic>
+              </a:graphicData>
+            </a:graphic>
+          </wp:inline>
+        </w:drawing>
+      </w:r>
+    </w:p>
+    <w:p>
+      <w:pPr>
+        <w:pStyle w:val="Prrafodelista"/>
+        <w:spacing w:line="276" w:lineRule="auto"/>
+        <w:ind w:left="502"/>
+        <w:jc w:val="both"/>
+        <w:rPr>
+          <w:rFonts w:ascii="Arial" w:hAnsi="Arial" w:cs="Arial"/>
+          <w:sz w:val="24"/>
+        </w:rPr>
+      </w:pPr>
+      <w:r>
+        <w:rPr>
+          <w:rFonts w:ascii="Arial" w:hAnsi="Arial" w:cs="Arial"/>
+          <w:sz w:val="24"/>
+        </w:rPr>
+        <w:t xml:space="preserve">Una capa de entrada de 16 neuronas, conectada a una primera capa oculta que cuenta con 64 neuronas para buscar patrones más complejos en los datos. Le siguen dos capas ocultas de 32 y 16 neuronas respectivamente, buscando descartar el ruido y conservar las relaciones más relevantes. Y por último, al tratarse de un problema de regresión, la capa final consiste de </w:t>
+      </w:r>
+      <w:r>
+        <w:rPr>
+          <w:rFonts w:ascii="Arial" w:hAnsi="Arial" w:cs="Arial"/>
+          <w:sz w:val="24"/>
+        </w:rPr>
+        <w:lastRenderedPageBreak/>
+        <w:t xml:space="preserve">una única neurona con activación lineal. Todas las capas ocultas tienen una función de activación </w:t>
+      </w:r>
+      <w:r>
+        <w:rPr>
+          <w:rFonts w:ascii="Arial" w:hAnsi="Arial" w:cs="Arial"/>
+          <w:i/>
+          <w:sz w:val="24"/>
+        </w:rPr>
+        <w:t>ReLU</w:t>
+      </w:r>
+      <w:r>
+        <w:rPr>
+          <w:rFonts w:ascii="Arial" w:hAnsi="Arial" w:cs="Arial"/>
+          <w:sz w:val="24"/>
+        </w:rPr>
+        <w:t xml:space="preserve"> ya que permite introducir la no linealidad en el aprendizaje.</w:t>
+      </w:r>
+    </w:p>
+    <w:p>
+      <w:pPr>
+        <w:pStyle w:val="Prrafodelista"/>
+        <w:spacing w:line="276" w:lineRule="auto"/>
+        <w:ind w:left="502"/>
+        <w:jc w:val="both"/>
+        <w:rPr>
+          <w:rFonts w:ascii="Arial" w:hAnsi="Arial" w:cs="Arial"/>
+          <w:sz w:val="24"/>
+        </w:rPr>
+      </w:pPr>
+    </w:p>
+    <w:p>
+      <w:pPr>
+        <w:pStyle w:val="Prrafodelista"/>
+        <w:spacing w:line="276" w:lineRule="auto"/>
+        <w:ind w:left="502"/>
+        <w:jc w:val="both"/>
+        <w:rPr>
+          <w:rFonts w:ascii="Arial" w:hAnsi="Arial" w:cs="Arial"/>
+          <w:sz w:val="24"/>
+        </w:rPr>
+      </w:pPr>
+      <w:r>
+        <w:rPr>
+          <w:rFonts w:ascii="Arial" w:hAnsi="Arial" w:cs="Arial"/>
+          <w:sz w:val="24"/>
+        </w:rPr>
+        <w:t xml:space="preserve">Para mitigar el sobreajuste y garantizar la robustez del modelo hemos introducido capas de </w:t>
+      </w:r>
+      <w:proofErr w:type="spellStart"/>
+      <w:r>
+        <w:rPr>
+          <w:rFonts w:ascii="Arial" w:hAnsi="Arial" w:cs="Arial"/>
+          <w:i/>
+          <w:sz w:val="24"/>
+        </w:rPr>
+        <w:t>Dropout</w:t>
+      </w:r>
+      <w:proofErr w:type="spellEnd"/>
+      <w:r>
+        <w:rPr>
+          <w:rFonts w:ascii="Arial" w:hAnsi="Arial" w:cs="Arial"/>
+          <w:sz w:val="24"/>
+        </w:rPr>
+        <w:t xml:space="preserve">, apagando aleatoriamente un número de neuronas para que la red no dependa de ninguna variable de forma aislada. Además, configuramos un mecanismo de </w:t>
+      </w:r>
+      <w:proofErr w:type="spellStart"/>
+      <w:r>
+        <w:rPr>
+          <w:rFonts w:ascii="Arial" w:hAnsi="Arial" w:cs="Arial"/>
+          <w:i/>
+          <w:sz w:val="24"/>
+        </w:rPr>
+        <w:t>Early</w:t>
+      </w:r>
+      <w:proofErr w:type="spellEnd"/>
+      <w:r>
+        <w:rPr>
+          <w:rFonts w:ascii="Arial" w:hAnsi="Arial" w:cs="Arial"/>
+          <w:i/>
+          <w:sz w:val="24"/>
+        </w:rPr>
+        <w:t xml:space="preserve"> </w:t>
+      </w:r>
+      <w:proofErr w:type="spellStart"/>
+      <w:r>
+        <w:rPr>
+          <w:rFonts w:ascii="Arial" w:hAnsi="Arial" w:cs="Arial"/>
+          <w:i/>
+          <w:sz w:val="24"/>
+        </w:rPr>
+        <w:t>Stopping</w:t>
+      </w:r>
+      <w:proofErr w:type="spellEnd"/>
+      <w:r>
+        <w:rPr>
+          <w:rFonts w:ascii="Arial" w:hAnsi="Arial" w:cs="Arial"/>
+          <w:sz w:val="24"/>
+        </w:rPr>
+        <w:t xml:space="preserve"> para detener el entrenamiento en caso de que no se produzcan mejoras con el paso de las iteraciones.</w:t>
+      </w:r>
+    </w:p>
+    <w:p>
+      <w:pPr>
+        <w:pStyle w:val="Prrafodelista"/>
+        <w:spacing w:line="276" w:lineRule="auto"/>
+        <w:ind w:left="502"/>
+        <w:jc w:val="both"/>
+        <w:rPr>
+          <w:rFonts w:ascii="Arial" w:hAnsi="Arial" w:cs="Arial"/>
+          <w:sz w:val="24"/>
+        </w:rPr>
+      </w:pPr>
+    </w:p>
+    <w:p>
+      <w:pPr>
+        <w:pStyle w:val="Prrafodelista"/>
+        <w:spacing w:line="276" w:lineRule="auto"/>
+        <w:ind w:left="502"/>
+        <w:jc w:val="both"/>
+        <w:rPr>
+          <w:rFonts w:ascii="Arial" w:hAnsi="Arial" w:cs="Arial"/>
+          <w:sz w:val="24"/>
+        </w:rPr>
+      </w:pPr>
+      <w:r>
+        <w:rPr>
+          <w:rFonts w:ascii="Arial" w:hAnsi="Arial" w:cs="Arial"/>
+          <w:sz w:val="24"/>
+        </w:rPr>
+        <w:t>Hemos usado las mismas métricas de evaluación que en la regresión lineal para poder comparar los modelos que hemos generado. Lo cual se llevara a cabo en el apartado correspondiente a los resultados obtenidos.</w:t>
+      </w:r>
+    </w:p>
+    <w:p>
+      <w:pPr>
+        <w:spacing w:line="276" w:lineRule="auto"/>
+        <w:jc w:val="both"/>
+        <w:rPr>
+          <w:rFonts w:ascii="Arial" w:hAnsi="Arial" w:cs="Arial"/>
+          <w:sz w:val="24"/>
+        </w:rPr>
+      </w:pPr>
+    </w:p>
+    <w:p>
+      <w:pPr>
+        <w:spacing w:line="276" w:lineRule="auto"/>
+        <w:jc w:val="both"/>
+        <w:rPr>
+          <w:rFonts w:ascii="Arial" w:hAnsi="Arial" w:cs="Arial"/>
+          <w:sz w:val="24"/>
+        </w:rPr>
+      </w:pPr>
+    </w:p>
+    <w:p>
+      <w:pPr>
+        <w:pStyle w:val="Ttulo1"/>
+        <w:numPr>
+          <w:ilvl w:val="0"/>
+          <w:numId w:val="7"/>
+        </w:numPr>
+        <w:spacing w:line="276" w:lineRule="auto"/>
+        <w:jc w:val="both"/>
+        <w:rPr>
+          <w:rFonts w:ascii="Arial" w:hAnsi="Arial" w:cs="Arial"/>
+          <w:b/>
+          <w:color w:val="auto"/>
+        </w:rPr>
+      </w:pPr>
+      <w:r>
+        <w:rPr>
+          <w:rFonts w:ascii="Arial" w:hAnsi="Arial" w:cs="Arial"/>
+          <w:b/>
+          <w:color w:val="auto"/>
+        </w:rPr>
+        <w:t>Resultados</w:t>
+      </w:r>
+    </w:p>
+    <w:p>
+      <w:pPr>
+        <w:pStyle w:val="Ttulo2"/>
+        <w:numPr>
+          <w:ilvl w:val="1"/>
+          <w:numId w:val="7"/>
+        </w:numPr>
+        <w:spacing w:line="276" w:lineRule="auto"/>
+        <w:jc w:val="both"/>
+        <w:rPr>
+          <w:rFonts w:ascii="Arial" w:hAnsi="Arial" w:cs="Arial"/>
+          <w:b/>
+          <w:color w:val="auto"/>
+        </w:rPr>
+      </w:pPr>
+      <w:r>
+        <w:rPr>
+          <w:rFonts w:ascii="Arial" w:hAnsi="Arial" w:cs="Arial"/>
+          <w:b/>
+          <w:color w:val="auto"/>
+        </w:rPr>
+        <w:t>Predicción de rendimiento agrícola</w:t>
+      </w:r>
+    </w:p>
+    <w:p>
+      <w:pPr>
+        <w:spacing w:line="276" w:lineRule="auto"/>
+        <w:jc w:val="both"/>
+        <w:rPr>
+          <w:rFonts w:ascii="Arial" w:hAnsi="Arial" w:cs="Arial"/>
+          <w:sz w:val="24"/>
+        </w:rPr>
+      </w:pPr>
+      <w:r>
+        <w:rPr>
+          <w:rFonts w:ascii="Arial" w:hAnsi="Arial" w:cs="Arial"/>
+          <w:sz w:val="24"/>
+        </w:rPr>
+        <w:t>Tras el entrenamiento de los modelos para este problema hemos obtenido los siguientes resultados para cada modelo:</w:t>
+      </w:r>
+    </w:p>
+    <w:tbl>
+      <w:tblPr>
+        <w:tblStyle w:val="Tablaconcuadrcula"/>
+        <w:tblW w:w="0" w:type="auto"/>
+        <w:tblLook w:val="04A0" w:firstRow="1" w:lastRow="0" w:firstColumn="1" w:lastColumn="0" w:noHBand="0" w:noVBand="1"/>
+      </w:tblPr>
+      <w:tblGrid>
+        <w:gridCol w:w="2123"/>
+        <w:gridCol w:w="2123"/>
+        <w:gridCol w:w="2124"/>
+        <w:gridCol w:w="2124"/>
+      </w:tblGrid>
+      <w:tr>
+        <w:tc>
+          <w:tcPr>
+            <w:tcW w:w="2123" w:type="dxa"/>
+            <w:vAlign w:val="center"/>
+          </w:tcPr>
+          <w:p>
+            <w:pPr>
+              <w:spacing w:line="276" w:lineRule="auto"/>
+              <w:jc w:val="center"/>
+              <w:rPr>
+                <w:rFonts w:ascii="Arial" w:hAnsi="Arial" w:cs="Arial"/>
+                <w:b/>
+                <w:sz w:val="24"/>
+              </w:rPr>
+            </w:pPr>
+            <w:r>
+              <w:rPr>
+                <w:rFonts w:ascii="Arial" w:hAnsi="Arial" w:cs="Arial"/>
+                <w:b/>
+                <w:sz w:val="24"/>
+              </w:rPr>
+              <w:t>Modelo</w:t>
+            </w:r>
+          </w:p>
+        </w:tc>
+        <w:tc>
+          <w:tcPr>
+            <w:tcW w:w="2123" w:type="dxa"/>
+            <w:vAlign w:val="center"/>
+          </w:tcPr>
+          <w:p>
+            <w:pPr>
+              <w:spacing w:line="276" w:lineRule="auto"/>
+              <w:jc w:val="center"/>
+              <w:rPr>
+                <w:rFonts w:ascii="Arial" w:hAnsi="Arial" w:cs="Arial"/>
+                <w:b/>
+                <w:sz w:val="24"/>
+              </w:rPr>
+            </w:pPr>
+            <w:r>
+              <w:rPr>
+                <w:rFonts w:ascii="Arial" w:hAnsi="Arial" w:cs="Arial"/>
+                <w:b/>
+                <w:sz w:val="24"/>
+              </w:rPr>
+              <w:t>R cuadrado</w:t>
+            </w:r>
+          </w:p>
+        </w:tc>
+        <w:tc>
+          <w:tcPr>
+            <w:tcW w:w="2124" w:type="dxa"/>
+            <w:vAlign w:val="center"/>
+          </w:tcPr>
+          <w:p>
+            <w:pPr>
+              <w:spacing w:line="276" w:lineRule="auto"/>
+              <w:jc w:val="center"/>
+              <w:rPr>
+                <w:rFonts w:ascii="Arial" w:hAnsi="Arial" w:cs="Arial"/>
+                <w:b/>
+                <w:sz w:val="24"/>
+              </w:rPr>
+            </w:pPr>
+            <w:r>
+              <w:rPr>
+                <w:rFonts w:ascii="Arial" w:hAnsi="Arial" w:cs="Arial"/>
+                <w:b/>
+                <w:sz w:val="24"/>
+              </w:rPr>
+              <w:t>MAE</w:t>
+            </w:r>
+          </w:p>
+        </w:tc>
+        <w:tc>
+          <w:tcPr>
+            <w:tcW w:w="2124" w:type="dxa"/>
+            <w:vAlign w:val="center"/>
+          </w:tcPr>
+          <w:p>
+            <w:pPr>
+              <w:spacing w:line="276" w:lineRule="auto"/>
+              <w:jc w:val="center"/>
+              <w:rPr>
+                <w:rFonts w:ascii="Arial" w:hAnsi="Arial" w:cs="Arial"/>
+                <w:b/>
+                <w:sz w:val="24"/>
+              </w:rPr>
+            </w:pPr>
+            <w:r>
+              <w:rPr>
+                <w:rFonts w:ascii="Arial" w:hAnsi="Arial" w:cs="Arial"/>
+                <w:b/>
+                <w:sz w:val="24"/>
+              </w:rPr>
+              <w:t>RMSE</w:t>
+            </w:r>
+          </w:p>
+        </w:tc>
+      </w:tr>
+      <w:tr>
+        <w:tc>
+          <w:tcPr>
+            <w:tcW w:w="2123" w:type="dxa"/>
+            <w:vAlign w:val="center"/>
+          </w:tcPr>
+          <w:p>
+            <w:pPr>
+              <w:spacing w:line="276" w:lineRule="auto"/>
+              <w:jc w:val="center"/>
+              <w:rPr>
+                <w:rFonts w:ascii="Arial" w:hAnsi="Arial" w:cs="Arial"/>
+                <w:b/>
+                <w:sz w:val="24"/>
+              </w:rPr>
+            </w:pPr>
+            <w:r>
+              <w:rPr>
+                <w:rFonts w:ascii="Arial" w:hAnsi="Arial" w:cs="Arial"/>
+                <w:b/>
+                <w:sz w:val="24"/>
+              </w:rPr>
+              <w:t>Regresión múltiple</w:t>
+            </w:r>
+          </w:p>
+        </w:tc>
+        <w:tc>
+          <w:tcPr>
+            <w:tcW w:w="2123" w:type="dxa"/>
+            <w:vAlign w:val="center"/>
+          </w:tcPr>
+          <w:p>
+            <w:pPr>
+              <w:spacing w:line="276" w:lineRule="auto"/>
+              <w:jc w:val="center"/>
+              <w:rPr>
+                <w:rFonts w:ascii="Arial" w:hAnsi="Arial" w:cs="Arial"/>
+                <w:sz w:val="24"/>
+              </w:rPr>
+            </w:pPr>
+            <w:r>
+              <w:rPr>
+                <w:rFonts w:ascii="Arial" w:hAnsi="Arial" w:cs="Arial"/>
+                <w:sz w:val="24"/>
+              </w:rPr>
+              <w:t>0.9285</w:t>
+            </w:r>
+          </w:p>
+        </w:tc>
+        <w:tc>
+          <w:tcPr>
+            <w:tcW w:w="2124" w:type="dxa"/>
+            <w:vAlign w:val="center"/>
+          </w:tcPr>
+          <w:p>
+            <w:pPr>
+              <w:spacing w:line="276" w:lineRule="auto"/>
+              <w:jc w:val="center"/>
+              <w:rPr>
+                <w:rFonts w:ascii="Arial" w:hAnsi="Arial" w:cs="Arial"/>
+                <w:sz w:val="24"/>
+              </w:rPr>
+            </w:pPr>
+            <w:r>
+              <w:rPr>
+                <w:rFonts w:ascii="Arial" w:hAnsi="Arial" w:cs="Arial"/>
+                <w:sz w:val="24"/>
+              </w:rPr>
+              <w:t>3.15 Ton/ha</w:t>
+            </w:r>
+          </w:p>
+        </w:tc>
+        <w:tc>
+          <w:tcPr>
+            <w:tcW w:w="2124" w:type="dxa"/>
+            <w:vAlign w:val="center"/>
+          </w:tcPr>
+          <w:p>
+            <w:pPr>
+              <w:spacing w:line="276" w:lineRule="auto"/>
+              <w:jc w:val="center"/>
+              <w:rPr>
+                <w:rFonts w:ascii="Arial" w:hAnsi="Arial" w:cs="Arial"/>
+                <w:sz w:val="24"/>
+              </w:rPr>
+            </w:pPr>
+            <w:r>
+              <w:rPr>
+                <w:rFonts w:ascii="Arial" w:hAnsi="Arial" w:cs="Arial"/>
+                <w:sz w:val="24"/>
+              </w:rPr>
+              <w:t>7.24 Ton/ha</w:t>
+            </w:r>
+          </w:p>
+        </w:tc>
+      </w:tr>
+      <w:tr>
+        <w:tc>
+          <w:tcPr>
+            <w:tcW w:w="2123" w:type="dxa"/>
+            <w:vAlign w:val="center"/>
+          </w:tcPr>
+          <w:p>
+            <w:pPr>
+              <w:spacing w:line="276" w:lineRule="auto"/>
+              <w:jc w:val="center"/>
+              <w:rPr>
+                <w:rFonts w:ascii="Arial" w:hAnsi="Arial" w:cs="Arial"/>
+                <w:b/>
+                <w:sz w:val="24"/>
+              </w:rPr>
+            </w:pPr>
+            <w:r>
+              <w:rPr>
+                <w:rFonts w:ascii="Arial" w:hAnsi="Arial" w:cs="Arial"/>
+                <w:b/>
+                <w:sz w:val="24"/>
+              </w:rPr>
+              <w:t>Red de neuronas</w:t>
+            </w:r>
+          </w:p>
+        </w:tc>
+        <w:tc>
+          <w:tcPr>
+            <w:tcW w:w="2123" w:type="dxa"/>
+            <w:vAlign w:val="center"/>
+          </w:tcPr>
+          <w:p>
+            <w:pPr>
+              <w:spacing w:line="276" w:lineRule="auto"/>
+              <w:jc w:val="center"/>
+              <w:rPr>
+                <w:rFonts w:ascii="Arial" w:hAnsi="Arial" w:cs="Arial"/>
+                <w:sz w:val="24"/>
+              </w:rPr>
+            </w:pPr>
+            <w:r>
+              <w:rPr>
+                <w:rFonts w:ascii="Arial" w:hAnsi="Arial" w:cs="Arial"/>
+                <w:sz w:val="24"/>
+              </w:rPr>
+              <w:t>0.9297</w:t>
+            </w:r>
+          </w:p>
+        </w:tc>
+        <w:tc>
+          <w:tcPr>
+            <w:tcW w:w="2124" w:type="dxa"/>
+            <w:vAlign w:val="center"/>
+          </w:tcPr>
+          <w:p>
+            <w:pPr>
+              <w:spacing w:line="276" w:lineRule="auto"/>
+              <w:jc w:val="center"/>
+              <w:rPr>
+                <w:rFonts w:ascii="Arial" w:hAnsi="Arial" w:cs="Arial"/>
+                <w:sz w:val="24"/>
+              </w:rPr>
+            </w:pPr>
+            <w:r>
+              <w:rPr>
+                <w:rFonts w:ascii="Arial" w:hAnsi="Arial" w:cs="Arial"/>
+                <w:sz w:val="24"/>
+              </w:rPr>
+              <w:t>4.06 Ton/ha</w:t>
+            </w:r>
+          </w:p>
+        </w:tc>
+        <w:tc>
+          <w:tcPr>
+            <w:tcW w:w="2124" w:type="dxa"/>
+            <w:vAlign w:val="center"/>
+          </w:tcPr>
+          <w:p>
+            <w:pPr>
+              <w:spacing w:line="276" w:lineRule="auto"/>
+              <w:jc w:val="center"/>
+              <w:rPr>
+                <w:rFonts w:ascii="Arial" w:hAnsi="Arial" w:cs="Arial"/>
+                <w:sz w:val="24"/>
+              </w:rPr>
+            </w:pPr>
+            <w:r>
+              <w:rPr>
+                <w:rFonts w:ascii="Arial" w:hAnsi="Arial" w:cs="Arial"/>
+                <w:sz w:val="24"/>
+              </w:rPr>
+              <w:t>8.38 Ton/ha</w:t>
+            </w:r>
+          </w:p>
+        </w:tc>
+      </w:tr>
+    </w:tbl>
+    <w:p>
+      <w:pPr>
+        <w:spacing w:line="276" w:lineRule="auto"/>
+        <w:jc w:val="both"/>
+        <w:rPr>
+          <w:rFonts w:ascii="Arial" w:hAnsi="Arial" w:cs="Arial"/>
+          <w:sz w:val="24"/>
+        </w:rPr>
+      </w:pPr>
+      <w:r>
+        <w:rPr>
+          <w:rFonts w:ascii="Arial" w:hAnsi="Arial" w:cs="Arial"/>
+          <w:sz w:val="24"/>
+        </w:rPr>
+        <w:t>Al contrastar ambos modelos, observamos que ambos modelos explican prácticamente la misma cantidad de varianza en los datos con un valor de R cuadrado cercano al 93%, pero el modelo de regresión lineal es superior en la precisión absoluta ya que comete un error medio absoluto menor y penaliza menos los errores extremos.</w:t>
+      </w:r>
+    </w:p>
+    <w:p>
+      <w:pPr>
+        <w:spacing w:line="276" w:lineRule="auto"/>
+        <w:jc w:val="both"/>
+        <w:rPr>
+          <w:rFonts w:ascii="Arial" w:hAnsi="Arial" w:cs="Arial"/>
+          <w:sz w:val="24"/>
+        </w:rPr>
+      </w:pPr>
+      <w:r>
+        <w:rPr>
+          <w:rFonts w:ascii="Arial" w:hAnsi="Arial" w:cs="Arial"/>
+          <w:sz w:val="24"/>
+        </w:rPr>
+        <w:t xml:space="preserve">La superioridad del modelo lineal indica que el rendimiento está fuertemente dominado por escalones lineales fijos. Es decir, que la diferencia entre el rendimiento de la producción de caña de azúcar y otra cualquiera como puede ser la de té, es tan abismal </w:t>
+      </w:r>
+      <w:r>
+        <w:rPr>
+          <w:rFonts w:ascii="Arial" w:hAnsi="Arial" w:cs="Arial"/>
+          <w:sz w:val="24"/>
+        </w:rPr>
+        <w:t>que un modelo lineal simple codificando el tipo de cultivo captura casi toda la complejidad del problema sin necesidad de buscar patrones ocultos profundos</w:t>
+      </w:r>
+      <w:r>
+        <w:rPr>
+          <w:rFonts w:ascii="Arial" w:hAnsi="Arial" w:cs="Arial"/>
+          <w:sz w:val="24"/>
+        </w:rPr>
+        <w:t>.</w:t>
+      </w:r>
+    </w:p>
+    <w:p>
+      <w:pPr>
+        <w:spacing w:line="276" w:lineRule="auto"/>
+        <w:jc w:val="both"/>
+        <w:rPr>
+          <w:rFonts w:ascii="Arial" w:hAnsi="Arial" w:cs="Arial"/>
+          <w:sz w:val="24"/>
+        </w:rPr>
+      </w:pPr>
+      <w:r>
+        <w:rPr>
+          <w:rFonts w:ascii="Arial" w:hAnsi="Arial" w:cs="Arial"/>
+          <w:sz w:val="24"/>
+        </w:rPr>
+        <w:t xml:space="preserve">Además, la regresión múltiple me permite una mejor interpretación de los resultados. Esto es debido a que nos ofrece cuales son las características que mejor contribuyen a las predicciones. </w:t>
       </w:r>
       <w:bookmarkStart w:id="0" w:name="_GoBack"/>
       <w:bookmarkEnd w:id="0"/>
-      <w:r>
-        <w:rPr>
-          <w:rFonts w:ascii="Arial" w:hAnsi="Arial" w:cs="Arial"/>
-          <w:sz w:val="24"/>
-        </w:rPr>
-        <w:t>lo que los convierte en objetivos prioritarios para futuras políticas de transición agrícola.</w:t>
-      </w:r>
     </w:p>
     <w:p>
       <w:pPr>
@@ -12727,21 +15557,134 @@
         <w:jc w:val="both"/>
         <w:rPr>
           <w:rFonts w:ascii="Arial" w:hAnsi="Arial" w:cs="Arial"/>
+          <w:sz w:val="24"/>
+        </w:rPr>
+      </w:pPr>
+    </w:p>
+    <w:p>
+      <w:pPr>
+        <w:spacing w:line="276" w:lineRule="auto"/>
+        <w:jc w:val="both"/>
+        <w:rPr>
+          <w:rFonts w:ascii="Arial" w:hAnsi="Arial" w:cs="Arial"/>
+          <w:sz w:val="24"/>
+        </w:rPr>
+      </w:pPr>
+    </w:p>
+    <w:p>
+      <w:pPr>
+        <w:spacing w:line="276" w:lineRule="auto"/>
+        <w:jc w:val="both"/>
+        <w:rPr>
+          <w:rFonts w:ascii="Arial" w:hAnsi="Arial" w:cs="Arial"/>
           <w:b/>
           <w:sz w:val="24"/>
         </w:rPr>
       </w:pPr>
+      <w:proofErr w:type="spellStart"/>
       <w:r>
         <w:rPr>
           <w:rFonts w:ascii="Arial" w:hAnsi="Arial" w:cs="Arial"/>
           <w:b/>
           <w:sz w:val="24"/>
         </w:rPr>
-        <w:t xml:space="preserve"> </w:t>
+        <w:t>Bibliografia</w:t>
+      </w:r>
+      <w:proofErr w:type="spellEnd"/>
+      <w:r>
+        <w:rPr>
+          <w:rFonts w:ascii="Arial" w:hAnsi="Arial" w:cs="Arial"/>
+          <w:b/>
+          <w:sz w:val="24"/>
+        </w:rPr>
+        <w:t>:</w:t>
+      </w:r>
+    </w:p>
+    <w:p>
+      <w:pPr>
+        <w:pStyle w:val="Prrafodelista"/>
+        <w:numPr>
+          <w:ilvl w:val="0"/>
+          <w:numId w:val="5"/>
+        </w:numPr>
+        <w:spacing w:line="276" w:lineRule="auto"/>
+        <w:jc w:val="both"/>
+        <w:rPr>
+          <w:rFonts w:ascii="Arial" w:hAnsi="Arial" w:cs="Arial"/>
+          <w:b/>
+          <w:sz w:val="24"/>
+        </w:rPr>
+      </w:pPr>
+      <w:hyperlink r:id="rId33" w:history="1">
+        <w:r>
+          <w:rPr>
+            <w:rStyle w:val="Hipervnculo"/>
+          </w:rPr>
+          <w:t>https://www.mdpi.com/1424-8220/18/8/2674</w:t>
+        </w:r>
+      </w:hyperlink>
+      <w:r>
+        <w:t xml:space="preserve"> (</w:t>
+      </w:r>
+      <w:proofErr w:type="spellStart"/>
+      <w:r>
+        <w:t>paper</w:t>
+      </w:r>
+      <w:proofErr w:type="spellEnd"/>
+      <w:r>
+        <w:t xml:space="preserve"> 1)</w:t>
+      </w:r>
+    </w:p>
+    <w:p>
+      <w:pPr>
+        <w:pStyle w:val="Prrafodelista"/>
+        <w:numPr>
+          <w:ilvl w:val="0"/>
+          <w:numId w:val="5"/>
+        </w:numPr>
+        <w:spacing w:line="276" w:lineRule="auto"/>
+        <w:jc w:val="both"/>
+        <w:rPr>
+          <w:rFonts w:ascii="Arial" w:hAnsi="Arial" w:cs="Arial"/>
+          <w:sz w:val="24"/>
+        </w:rPr>
+      </w:pPr>
+      <w:hyperlink r:id="rId34" w:history="1">
+        <w:r>
+          <w:rPr>
+            <w:rStyle w:val="Hipervnculo"/>
+            <w:rFonts w:ascii="Arial" w:hAnsi="Arial" w:cs="Arial"/>
+            <w:sz w:val="24"/>
+          </w:rPr>
+          <w:t>https://www.researchgate.net/publication/392224673_Advances_in_Machine_Learning_for_Crop_Yield_Prediction_A_Comprehensive_Review_of_Techniques_Trends_and_Challenges</w:t>
+        </w:r>
+      </w:hyperlink>
+      <w:r>
+        <w:rPr>
+          <w:rFonts w:ascii="Arial" w:hAnsi="Arial" w:cs="Arial"/>
+          <w:sz w:val="24"/>
+        </w:rPr>
+        <w:t xml:space="preserve"> (</w:t>
+      </w:r>
+      <w:proofErr w:type="spellStart"/>
+      <w:r>
+        <w:rPr>
+          <w:rFonts w:ascii="Arial" w:hAnsi="Arial" w:cs="Arial"/>
+          <w:sz w:val="24"/>
+        </w:rPr>
+        <w:t>paper</w:t>
+      </w:r>
+      <w:proofErr w:type="spellEnd"/>
+      <w:r>
+        <w:rPr>
+          <w:rFonts w:ascii="Arial" w:hAnsi="Arial" w:cs="Arial"/>
+          <w:sz w:val="24"/>
+        </w:rPr>
+        <w:t xml:space="preserve"> 2)</w:t>
       </w:r>
     </w:p>
     <w:sectPr>
-      <w:footerReference w:type="default" r:id="rId26"/>
+      <w:footerReference w:type="default" r:id="rId35"/>
       <w:pgSz w:w="11906" w:h="16838"/>
       <w:pgMar w:top="1417" w:right="1701" w:bottom="1417" w:left="1701" w:header="708" w:footer="708" w:gutter="0"/>
       <w:cols w:space="708"/>
@@ -12805,7 +15748,7 @@
           <w:rPr>
             <w:noProof/>
           </w:rPr>
-          <w:t>16</w:t>
+          <w:t>26</w:t>
         </w:r>
         <w:r>
           <w:fldChar w:fldCharType="end"/>
@@ -12940,7 +15883,7 @@
   <w:abstractNum w:abstractNumId="1" w15:restartNumberingAfterBreak="0">
     <w:nsid w:val="151861F3"/>
     <w:multiLevelType w:val="multilevel"/>
-    <w:tmpl w:val="29063264"/>
+    <w:tmpl w:val="3258B950"/>
     <w:lvl w:ilvl="0">
       <w:start w:val="1"/>
       <w:numFmt w:val="decimal"/>
@@ -12963,7 +15906,8 @@
         <w:ind w:left="1080" w:hanging="720"/>
       </w:pPr>
       <w:rPr>
-        <w:rFonts w:hint="default"/>
+        <w:rFonts w:ascii="Arial" w:hAnsi="Arial" w:cs="Arial" w:hint="default"/>
+        <w:b/>
         <w:color w:val="auto"/>
       </w:rPr>
     </w:lvl>
@@ -13353,13 +16297,13 @@
     </w:lvl>
   </w:abstractNum>
   <w:abstractNum w:abstractNumId="5" w15:restartNumberingAfterBreak="0">
-    <w:nsid w:val="3BB55AD3"/>
+    <w:nsid w:val="3B9B5FDA"/>
     <w:multiLevelType w:val="hybridMultilevel"/>
-    <w:tmpl w:val="4B00CEA8"/>
-    <w:lvl w:ilvl="0" w:tplc="0C0A000F">
+    <w:tmpl w:val="0B320098"/>
+    <w:lvl w:ilvl="0" w:tplc="0C0A0017">
       <w:start w:val="1"/>
-      <w:numFmt w:val="decimal"/>
-      <w:lvlText w:val="%1."/>
+      <w:numFmt w:val="lowerLetter"/>
+      <w:lvlText w:val="%1)"/>
       <w:lvlJc w:val="left"/>
       <w:pPr>
         <w:ind w:left="720" w:hanging="360"/>
@@ -13442,6 +16386,95 @@
     </w:lvl>
   </w:abstractNum>
   <w:abstractNum w:abstractNumId="6" w15:restartNumberingAfterBreak="0">
+    <w:nsid w:val="3BB55AD3"/>
+    <w:multiLevelType w:val="hybridMultilevel"/>
+    <w:tmpl w:val="4B00CEA8"/>
+    <w:lvl w:ilvl="0" w:tplc="0C0A000F">
+      <w:start w:val="1"/>
+      <w:numFmt w:val="decimal"/>
+      <w:lvlText w:val="%1."/>
+      <w:lvlJc w:val="left"/>
+      <w:pPr>
+        <w:ind w:left="720" w:hanging="360"/>
+      </w:pPr>
+      <w:rPr>
+        <w:rFonts w:hint="default"/>
+      </w:rPr>
+    </w:lvl>
+    <w:lvl w:ilvl="1" w:tplc="0C0A0019" w:tentative="1">
+      <w:start w:val="1"/>
+      <w:numFmt w:val="lowerLetter"/>
+      <w:lvlText w:val="%2."/>
+      <w:lvlJc w:val="left"/>
+      <w:pPr>
+        <w:ind w:left="1440" w:hanging="360"/>
+      </w:pPr>
+    </w:lvl>
+    <w:lvl w:ilvl="2" w:tplc="0C0A001B" w:tentative="1">
+      <w:start w:val="1"/>
+      <w:numFmt w:val="lowerRoman"/>
+      <w:lvlText w:val="%3."/>
+      <w:lvlJc w:val="right"/>
+      <w:pPr>
+        <w:ind w:left="2160" w:hanging="180"/>
+      </w:pPr>
+    </w:lvl>
+    <w:lvl w:ilvl="3" w:tplc="0C0A000F" w:tentative="1">
+      <w:start w:val="1"/>
+      <w:numFmt w:val="decimal"/>
+      <w:lvlText w:val="%4."/>
+      <w:lvlJc w:val="left"/>
+      <w:pPr>
+        <w:ind w:left="2880" w:hanging="360"/>
+      </w:pPr>
+    </w:lvl>
+    <w:lvl w:ilvl="4" w:tplc="0C0A0019" w:tentative="1">
+      <w:start w:val="1"/>
+      <w:numFmt w:val="lowerLetter"/>
+      <w:lvlText w:val="%5."/>
+      <w:lvlJc w:val="left"/>
+      <w:pPr>
+        <w:ind w:left="3600" w:hanging="360"/>
+      </w:pPr>
+    </w:lvl>
+    <w:lvl w:ilvl="5" w:tplc="0C0A001B" w:tentative="1">
+      <w:start w:val="1"/>
+      <w:numFmt w:val="lowerRoman"/>
+      <w:lvlText w:val="%6."/>
+      <w:lvlJc w:val="right"/>
+      <w:pPr>
+        <w:ind w:left="4320" w:hanging="180"/>
+      </w:pPr>
+    </w:lvl>
+    <w:lvl w:ilvl="6" w:tplc="0C0A000F" w:tentative="1">
+      <w:start w:val="1"/>
+      <w:numFmt w:val="decimal"/>
+      <w:lvlText w:val="%7."/>
+      <w:lvlJc w:val="left"/>
+      <w:pPr>
+        <w:ind w:left="5040" w:hanging="360"/>
+      </w:pPr>
+    </w:lvl>
+    <w:lvl w:ilvl="7" w:tplc="0C0A0019" w:tentative="1">
+      <w:start w:val="1"/>
+      <w:numFmt w:val="lowerLetter"/>
+      <w:lvlText w:val="%8."/>
+      <w:lvlJc w:val="left"/>
+      <w:pPr>
+        <w:ind w:left="5760" w:hanging="360"/>
+      </w:pPr>
+    </w:lvl>
+    <w:lvl w:ilvl="8" w:tplc="0C0A001B" w:tentative="1">
+      <w:start w:val="1"/>
+      <w:numFmt w:val="lowerRoman"/>
+      <w:lvlText w:val="%9."/>
+      <w:lvlJc w:val="right"/>
+      <w:pPr>
+        <w:ind w:left="6480" w:hanging="180"/>
+      </w:pPr>
+    </w:lvl>
+  </w:abstractNum>
+  <w:abstractNum w:abstractNumId="7" w15:restartNumberingAfterBreak="0">
     <w:nsid w:val="3CFC5033"/>
     <w:multiLevelType w:val="hybridMultilevel"/>
     <w:tmpl w:val="E124BDA2"/>
@@ -13527,7 +16560,7 @@
       </w:pPr>
     </w:lvl>
   </w:abstractNum>
-  <w:abstractNum w:abstractNumId="7" w15:restartNumberingAfterBreak="0">
+  <w:abstractNum w:abstractNumId="8" w15:restartNumberingAfterBreak="0">
     <w:nsid w:val="49405B27"/>
     <w:multiLevelType w:val="multilevel"/>
     <w:tmpl w:val="29A038DE"/>
@@ -13616,7 +16649,7 @@
       </w:pPr>
     </w:lvl>
   </w:abstractNum>
-  <w:abstractNum w:abstractNumId="8" w15:restartNumberingAfterBreak="0">
+  <w:abstractNum w:abstractNumId="9" w15:restartNumberingAfterBreak="0">
     <w:nsid w:val="4B471FD2"/>
     <w:multiLevelType w:val="hybridMultilevel"/>
     <w:tmpl w:val="D1E496AA"/>
@@ -13705,7 +16738,7 @@
       </w:pPr>
     </w:lvl>
   </w:abstractNum>
-  <w:abstractNum w:abstractNumId="9" w15:restartNumberingAfterBreak="0">
+  <w:abstractNum w:abstractNumId="10" w15:restartNumberingAfterBreak="0">
     <w:nsid w:val="4F3A39D3"/>
     <w:multiLevelType w:val="hybridMultilevel"/>
     <w:tmpl w:val="05BAEA86"/>
@@ -13794,7 +16827,7 @@
       </w:pPr>
     </w:lvl>
   </w:abstractNum>
-  <w:abstractNum w:abstractNumId="10" w15:restartNumberingAfterBreak="0">
+  <w:abstractNum w:abstractNumId="11" w15:restartNumberingAfterBreak="0">
     <w:nsid w:val="548C3DB9"/>
     <w:multiLevelType w:val="hybridMultilevel"/>
     <w:tmpl w:val="B7E440CC"/>
@@ -13889,17 +16922,106 @@
       </w:pPr>
     </w:lvl>
   </w:abstractNum>
-  <w:abstractNum w:abstractNumId="11" w15:restartNumberingAfterBreak="0">
-    <w:nsid w:val="7B6812BC"/>
+  <w:abstractNum w:abstractNumId="12" w15:restartNumberingAfterBreak="0">
+    <w:nsid w:val="561934C3"/>
     <w:multiLevelType w:val="hybridMultilevel"/>
-    <w:tmpl w:val="B4D4A3B4"/>
-    <w:lvl w:ilvl="0" w:tplc="822C7756">
-      <w:start w:val="2"/>
+    <w:tmpl w:val="BEC88A58"/>
+    <w:lvl w:ilvl="0" w:tplc="0C0A0017">
+      <w:start w:val="1"/>
+      <w:numFmt w:val="lowerLetter"/>
+      <w:lvlText w:val="%1)"/>
+      <w:lvlJc w:val="left"/>
+      <w:pPr>
+        <w:ind w:left="720" w:hanging="360"/>
+      </w:pPr>
+      <w:rPr>
+        <w:rFonts w:hint="default"/>
+      </w:rPr>
+    </w:lvl>
+    <w:lvl w:ilvl="1" w:tplc="0C0A0019" w:tentative="1">
+      <w:start w:val="1"/>
+      <w:numFmt w:val="lowerLetter"/>
+      <w:lvlText w:val="%2."/>
+      <w:lvlJc w:val="left"/>
+      <w:pPr>
+        <w:ind w:left="1440" w:hanging="360"/>
+      </w:pPr>
+    </w:lvl>
+    <w:lvl w:ilvl="2" w:tplc="0C0A001B" w:tentative="1">
+      <w:start w:val="1"/>
+      <w:numFmt w:val="lowerRoman"/>
+      <w:lvlText w:val="%3."/>
+      <w:lvlJc w:val="right"/>
+      <w:pPr>
+        <w:ind w:left="2160" w:hanging="180"/>
+      </w:pPr>
+    </w:lvl>
+    <w:lvl w:ilvl="3" w:tplc="0C0A000F" w:tentative="1">
+      <w:start w:val="1"/>
+      <w:numFmt w:val="decimal"/>
+      <w:lvlText w:val="%4."/>
+      <w:lvlJc w:val="left"/>
+      <w:pPr>
+        <w:ind w:left="2880" w:hanging="360"/>
+      </w:pPr>
+    </w:lvl>
+    <w:lvl w:ilvl="4" w:tplc="0C0A0019" w:tentative="1">
+      <w:start w:val="1"/>
+      <w:numFmt w:val="lowerLetter"/>
+      <w:lvlText w:val="%5."/>
+      <w:lvlJc w:val="left"/>
+      <w:pPr>
+        <w:ind w:left="3600" w:hanging="360"/>
+      </w:pPr>
+    </w:lvl>
+    <w:lvl w:ilvl="5" w:tplc="0C0A001B" w:tentative="1">
+      <w:start w:val="1"/>
+      <w:numFmt w:val="lowerRoman"/>
+      <w:lvlText w:val="%6."/>
+      <w:lvlJc w:val="right"/>
+      <w:pPr>
+        <w:ind w:left="4320" w:hanging="180"/>
+      </w:pPr>
+    </w:lvl>
+    <w:lvl w:ilvl="6" w:tplc="0C0A000F" w:tentative="1">
+      <w:start w:val="1"/>
+      <w:numFmt w:val="decimal"/>
+      <w:lvlText w:val="%7."/>
+      <w:lvlJc w:val="left"/>
+      <w:pPr>
+        <w:ind w:left="5040" w:hanging="360"/>
+      </w:pPr>
+    </w:lvl>
+    <w:lvl w:ilvl="7" w:tplc="0C0A0019" w:tentative="1">
+      <w:start w:val="1"/>
+      <w:numFmt w:val="lowerLetter"/>
+      <w:lvlText w:val="%8."/>
+      <w:lvlJc w:val="left"/>
+      <w:pPr>
+        <w:ind w:left="5760" w:hanging="360"/>
+      </w:pPr>
+    </w:lvl>
+    <w:lvl w:ilvl="8" w:tplc="0C0A001B" w:tentative="1">
+      <w:start w:val="1"/>
+      <w:numFmt w:val="lowerRoman"/>
+      <w:lvlText w:val="%9."/>
+      <w:lvlJc w:val="right"/>
+      <w:pPr>
+        <w:ind w:left="6480" w:hanging="180"/>
+      </w:pPr>
+    </w:lvl>
+  </w:abstractNum>
+  <w:abstractNum w:abstractNumId="13" w15:restartNumberingAfterBreak="0">
+    <w:nsid w:val="61414DE0"/>
+    <w:multiLevelType w:val="hybridMultilevel"/>
+    <w:tmpl w:val="B0C28F26"/>
+    <w:lvl w:ilvl="0" w:tplc="7A964CD4">
+      <w:start w:val="3"/>
       <w:numFmt w:val="bullet"/>
       <w:lvlText w:val="-"/>
       <w:lvlJc w:val="left"/>
       <w:pPr>
-        <w:ind w:left="502" w:hanging="360"/>
+        <w:ind w:left="720" w:hanging="360"/>
       </w:pPr>
       <w:rPr>
         <w:rFonts w:ascii="Arial" w:eastAsiaTheme="minorHAnsi" w:hAnsi="Arial" w:cs="Arial" w:hint="default"/>
@@ -13911,7 +17033,7 @@
       <w:lvlText w:val="o"/>
       <w:lvlJc w:val="left"/>
       <w:pPr>
-        <w:ind w:left="1222" w:hanging="360"/>
+        <w:ind w:left="1440" w:hanging="360"/>
       </w:pPr>
       <w:rPr>
         <w:rFonts w:ascii="Courier New" w:hAnsi="Courier New" w:cs="Courier New" w:hint="default"/>
@@ -13923,7 +17045,7 @@
       <w:lvlText w:val=""/>
       <w:lvlJc w:val="left"/>
       <w:pPr>
-        <w:ind w:left="1942" w:hanging="360"/>
+        <w:ind w:left="2160" w:hanging="360"/>
       </w:pPr>
       <w:rPr>
         <w:rFonts w:ascii="Wingdings" w:hAnsi="Wingdings" w:hint="default"/>
@@ -13935,7 +17057,7 @@
       <w:lvlText w:val=""/>
       <w:lvlJc w:val="left"/>
       <w:pPr>
-        <w:ind w:left="2662" w:hanging="360"/>
+        <w:ind w:left="2880" w:hanging="360"/>
       </w:pPr>
       <w:rPr>
         <w:rFonts w:ascii="Symbol" w:hAnsi="Symbol" w:hint="default"/>
@@ -13947,7 +17069,7 @@
       <w:lvlText w:val="o"/>
       <w:lvlJc w:val="left"/>
       <w:pPr>
-        <w:ind w:left="3382" w:hanging="360"/>
+        <w:ind w:left="3600" w:hanging="360"/>
       </w:pPr>
       <w:rPr>
         <w:rFonts w:ascii="Courier New" w:hAnsi="Courier New" w:cs="Courier New" w:hint="default"/>
@@ -13959,7 +17081,7 @@
       <w:lvlText w:val=""/>
       <w:lvlJc w:val="left"/>
       <w:pPr>
-        <w:ind w:left="4102" w:hanging="360"/>
+        <w:ind w:left="4320" w:hanging="360"/>
       </w:pPr>
       <w:rPr>
         <w:rFonts w:ascii="Wingdings" w:hAnsi="Wingdings" w:hint="default"/>
@@ -13971,7 +17093,7 @@
       <w:lvlText w:val=""/>
       <w:lvlJc w:val="left"/>
       <w:pPr>
-        <w:ind w:left="4822" w:hanging="360"/>
+        <w:ind w:left="5040" w:hanging="360"/>
       </w:pPr>
       <w:rPr>
         <w:rFonts w:ascii="Symbol" w:hAnsi="Symbol" w:hint="default"/>
@@ -13983,7 +17105,7 @@
       <w:lvlText w:val="o"/>
       <w:lvlJc w:val="left"/>
       <w:pPr>
-        <w:ind w:left="5542" w:hanging="360"/>
+        <w:ind w:left="5760" w:hanging="360"/>
       </w:pPr>
       <w:rPr>
         <w:rFonts w:ascii="Courier New" w:hAnsi="Courier New" w:cs="Courier New" w:hint="default"/>
@@ -13995,6 +17117,119 @@
       <w:lvlText w:val=""/>
       <w:lvlJc w:val="left"/>
       <w:pPr>
+        <w:ind w:left="6480" w:hanging="360"/>
+      </w:pPr>
+      <w:rPr>
+        <w:rFonts w:ascii="Wingdings" w:hAnsi="Wingdings" w:hint="default"/>
+      </w:rPr>
+    </w:lvl>
+  </w:abstractNum>
+  <w:abstractNum w:abstractNumId="14" w15:restartNumberingAfterBreak="0">
+    <w:nsid w:val="7B6812BC"/>
+    <w:multiLevelType w:val="hybridMultilevel"/>
+    <w:tmpl w:val="B4D4A3B4"/>
+    <w:lvl w:ilvl="0" w:tplc="822C7756">
+      <w:start w:val="2"/>
+      <w:numFmt w:val="bullet"/>
+      <w:lvlText w:val="-"/>
+      <w:lvlJc w:val="left"/>
+      <w:pPr>
+        <w:ind w:left="502" w:hanging="360"/>
+      </w:pPr>
+      <w:rPr>
+        <w:rFonts w:ascii="Arial" w:eastAsiaTheme="minorHAnsi" w:hAnsi="Arial" w:cs="Arial" w:hint="default"/>
+      </w:rPr>
+    </w:lvl>
+    <w:lvl w:ilvl="1" w:tplc="0C0A0003" w:tentative="1">
+      <w:start w:val="1"/>
+      <w:numFmt w:val="bullet"/>
+      <w:lvlText w:val="o"/>
+      <w:lvlJc w:val="left"/>
+      <w:pPr>
+        <w:ind w:left="1222" w:hanging="360"/>
+      </w:pPr>
+      <w:rPr>
+        <w:rFonts w:ascii="Courier New" w:hAnsi="Courier New" w:cs="Courier New" w:hint="default"/>
+      </w:rPr>
+    </w:lvl>
+    <w:lvl w:ilvl="2" w:tplc="0C0A0005" w:tentative="1">
+      <w:start w:val="1"/>
+      <w:numFmt w:val="bullet"/>
+      <w:lvlText w:val=""/>
+      <w:lvlJc w:val="left"/>
+      <w:pPr>
+        <w:ind w:left="1942" w:hanging="360"/>
+      </w:pPr>
+      <w:rPr>
+        <w:rFonts w:ascii="Wingdings" w:hAnsi="Wingdings" w:hint="default"/>
+      </w:rPr>
+    </w:lvl>
+    <w:lvl w:ilvl="3" w:tplc="0C0A0001" w:tentative="1">
+      <w:start w:val="1"/>
+      <w:numFmt w:val="bullet"/>
+      <w:lvlText w:val=""/>
+      <w:lvlJc w:val="left"/>
+      <w:pPr>
+        <w:ind w:left="2662" w:hanging="360"/>
+      </w:pPr>
+      <w:rPr>
+        <w:rFonts w:ascii="Symbol" w:hAnsi="Symbol" w:hint="default"/>
+      </w:rPr>
+    </w:lvl>
+    <w:lvl w:ilvl="4" w:tplc="0C0A0003" w:tentative="1">
+      <w:start w:val="1"/>
+      <w:numFmt w:val="bullet"/>
+      <w:lvlText w:val="o"/>
+      <w:lvlJc w:val="left"/>
+      <w:pPr>
+        <w:ind w:left="3382" w:hanging="360"/>
+      </w:pPr>
+      <w:rPr>
+        <w:rFonts w:ascii="Courier New" w:hAnsi="Courier New" w:cs="Courier New" w:hint="default"/>
+      </w:rPr>
+    </w:lvl>
+    <w:lvl w:ilvl="5" w:tplc="0C0A0005" w:tentative="1">
+      <w:start w:val="1"/>
+      <w:numFmt w:val="bullet"/>
+      <w:lvlText w:val=""/>
+      <w:lvlJc w:val="left"/>
+      <w:pPr>
+        <w:ind w:left="4102" w:hanging="360"/>
+      </w:pPr>
+      <w:rPr>
+        <w:rFonts w:ascii="Wingdings" w:hAnsi="Wingdings" w:hint="default"/>
+      </w:rPr>
+    </w:lvl>
+    <w:lvl w:ilvl="6" w:tplc="0C0A0001" w:tentative="1">
+      <w:start w:val="1"/>
+      <w:numFmt w:val="bullet"/>
+      <w:lvlText w:val=""/>
+      <w:lvlJc w:val="left"/>
+      <w:pPr>
+        <w:ind w:left="4822" w:hanging="360"/>
+      </w:pPr>
+      <w:rPr>
+        <w:rFonts w:ascii="Symbol" w:hAnsi="Symbol" w:hint="default"/>
+      </w:rPr>
+    </w:lvl>
+    <w:lvl w:ilvl="7" w:tplc="0C0A0003" w:tentative="1">
+      <w:start w:val="1"/>
+      <w:numFmt w:val="bullet"/>
+      <w:lvlText w:val="o"/>
+      <w:lvlJc w:val="left"/>
+      <w:pPr>
+        <w:ind w:left="5542" w:hanging="360"/>
+      </w:pPr>
+      <w:rPr>
+        <w:rFonts w:ascii="Courier New" w:hAnsi="Courier New" w:cs="Courier New" w:hint="default"/>
+      </w:rPr>
+    </w:lvl>
+    <w:lvl w:ilvl="8" w:tplc="0C0A0005" w:tentative="1">
+      <w:start w:val="1"/>
+      <w:numFmt w:val="bullet"/>
+      <w:lvlText w:val=""/>
+      <w:lvlJc w:val="left"/>
+      <w:pPr>
         <w:ind w:left="6262" w:hanging="360"/>
       </w:pPr>
       <w:rPr>
@@ -14003,22 +17238,22 @@
     </w:lvl>
   </w:abstractNum>
   <w:num w:numId="1">
-    <w:abstractNumId w:val="5"/>
+    <w:abstractNumId w:val="6"/>
   </w:num>
   <w:num w:numId="2">
-    <w:abstractNumId w:val="6"/>
+    <w:abstractNumId w:val="7"/>
   </w:num>
   <w:num w:numId="3">
-    <w:abstractNumId w:val="9"/>
+    <w:abstractNumId w:val="10"/>
   </w:num>
   <w:num w:numId="4">
-    <w:abstractNumId w:val="10"/>
+    <w:abstractNumId w:val="11"/>
   </w:num>
   <w:num w:numId="5">
-    <w:abstractNumId w:val="11"/>
+    <w:abstractNumId w:val="14"/>
   </w:num>
   <w:num w:numId="6">
-    <w:abstractNumId w:val="8"/>
+    <w:abstractNumId w:val="9"/>
   </w:num>
   <w:num w:numId="7">
     <w:abstractNumId w:val="1"/>
@@ -14033,10 +17268,19 @@
     <w:abstractNumId w:val="3"/>
   </w:num>
   <w:num w:numId="11">
-    <w:abstractNumId w:val="7"/>
+    <w:abstractNumId w:val="8"/>
   </w:num>
   <w:num w:numId="12">
     <w:abstractNumId w:val="2"/>
+  </w:num>
+  <w:num w:numId="13">
+    <w:abstractNumId w:val="5"/>
+  </w:num>
+  <w:num w:numId="14">
+    <w:abstractNumId w:val="12"/>
+  </w:num>
+  <w:num w:numId="15">
+    <w:abstractNumId w:val="13"/>
   </w:num>
 </w:numbering>
 </file>
@@ -14665,6 +17909,17 @@
     <w:uiPriority w:val="99"/>
     <w:rsid w:val="00EF0232"/>
   </w:style>
+  <w:style w:type="character" w:styleId="Hipervnculo">
+    <w:name w:val="Hyperlink"/>
+    <w:basedOn w:val="Fuentedeprrafopredeter"/>
+    <w:uiPriority w:val="99"/>
+    <w:unhideWhenUsed/>
+    <w:rsid w:val="00C827D2"/>
+    <w:rPr>
+      <w:color w:val="0563C1" w:themeColor="hyperlink"/>
+      <w:u w:val="single"/>
+    </w:rPr>
+  </w:style>
 </w:styles>
 </file>
 
@@ -14934,7 +18189,7 @@
 </file>
 
 <file path=customXml/itemProps1.xml><?xml version="1.0" encoding="utf-8"?>
-<ds:datastoreItem xmlns:ds="http://schemas.openxmlformats.org/officeDocument/2006/customXml" ds:itemID="{9C8F7B78-6897-4DE1-AE73-0E210A233DDC}">
+<ds:datastoreItem xmlns:ds="http://schemas.openxmlformats.org/officeDocument/2006/customXml" ds:itemID="{51DD3726-52D8-456B-A2BC-3BF3B07F77C4}">
   <ds:schemaRefs>
     <ds:schemaRef ds:uri="http://schemas.openxmlformats.org/officeDocument/2006/bibliography"/>
   </ds:schemaRefs>

</xml_diff>

<commit_message>
Memoria con 3 primeros problemas y sus resultados
</commit_message>
<xml_diff>
--- a/memoria.docx
+++ b/memoria.docx
@@ -616,23 +616,7 @@
           <w:rFonts w:ascii="Arial" w:hAnsi="Arial" w:cs="Arial"/>
           <w:sz w:val="24"/>
         </w:rPr>
-        <w:t xml:space="preserve">Detección de elementos faltantes y anomalías en los datos para poder hacer una correcta limpieza de los diferentes </w:t>
-      </w:r>
-      <w:proofErr w:type="spellStart"/>
-      <w:r>
-        <w:rPr>
-          <w:rFonts w:ascii="Arial" w:hAnsi="Arial" w:cs="Arial"/>
-          <w:sz w:val="24"/>
-        </w:rPr>
-        <w:t>datasets</w:t>
-      </w:r>
-      <w:proofErr w:type="spellEnd"/>
-      <w:r>
-        <w:rPr>
-          <w:rFonts w:ascii="Arial" w:hAnsi="Arial" w:cs="Arial"/>
-          <w:sz w:val="24"/>
-        </w:rPr>
-        <w:t xml:space="preserve"> de los que se dispone.</w:t>
+        <w:t>Detección de elementos faltantes y anomalías en los datos para poder hacer una correcta limpieza de los diferentes datasets de los que se dispone.</w:t>
       </w:r>
     </w:p>
     <w:p>
@@ -832,7 +816,45 @@
           <w:color w:val="FF0000"/>
           <w:sz w:val="24"/>
         </w:rPr>
-        <w:t xml:space="preserve"> para extracción de características, redes de neuronas)</w:t>
+        <w:t xml:space="preserve"> para extracción de características, redes de neuronas</w:t>
+      </w:r>
+      <w:r>
+        <w:rPr>
+          <w:rFonts w:ascii="Arial" w:hAnsi="Arial" w:cs="Arial"/>
+          <w:b/>
+          <w:color w:val="FF0000"/>
+          <w:sz w:val="24"/>
+        </w:rPr>
+        <w:t xml:space="preserve">, KNN y </w:t>
+      </w:r>
+      <w:proofErr w:type="spellStart"/>
+      <w:r>
+        <w:rPr>
+          <w:rFonts w:ascii="Arial" w:hAnsi="Arial" w:cs="Arial"/>
+          <w:b/>
+          <w:color w:val="FF0000"/>
+          <w:sz w:val="24"/>
+        </w:rPr>
+        <w:t>random</w:t>
+      </w:r>
+      <w:proofErr w:type="spellEnd"/>
+      <w:r>
+        <w:rPr>
+          <w:rFonts w:ascii="Arial" w:hAnsi="Arial" w:cs="Arial"/>
+          <w:b/>
+          <w:color w:val="FF0000"/>
+          <w:sz w:val="24"/>
+        </w:rPr>
+        <w:t xml:space="preserve"> forest para crear modelos</w:t>
+      </w:r>
+      <w:r>
+        <w:rPr>
+          <w:rFonts w:ascii="Arial" w:hAnsi="Arial" w:cs="Arial"/>
+          <w:b/>
+          <w:color w:val="FF0000"/>
+          <w:sz w:val="24"/>
+        </w:rPr>
+        <w:t>)</w:t>
       </w:r>
     </w:p>
     <w:p>
@@ -934,7 +956,6 @@
         </w:rPr>
         <w:t xml:space="preserve"> Este artículo fundamental valido la superioridad de los modelos de </w:t>
       </w:r>
-      <w:proofErr w:type="spellStart"/>
       <w:r>
         <w:rPr>
           <w:rFonts w:ascii="Arial" w:hAnsi="Arial" w:cs="Arial"/>
@@ -942,7 +963,6 @@
         </w:rPr>
         <w:t>ensemble</w:t>
       </w:r>
-      <w:proofErr w:type="spellEnd"/>
       <w:r>
         <w:rPr>
           <w:rFonts w:ascii="Arial" w:hAnsi="Arial" w:cs="Arial"/>
@@ -981,7 +1001,7 @@
           <w:b/>
           <w:sz w:val="24"/>
         </w:rPr>
-        <w:t xml:space="preserve"> in Machine Learning </w:t>
+        <w:t xml:space="preserve"> in Machine </w:t>
       </w:r>
       <w:proofErr w:type="spellStart"/>
       <w:r>
@@ -990,6 +1010,24 @@
           <w:b/>
           <w:sz w:val="24"/>
         </w:rPr>
+        <w:t>Learning</w:t>
+      </w:r>
+      <w:proofErr w:type="spellEnd"/>
+      <w:r>
+        <w:rPr>
+          <w:rFonts w:ascii="Arial" w:hAnsi="Arial" w:cs="Arial"/>
+          <w:b/>
+          <w:sz w:val="24"/>
+        </w:rPr>
+        <w:t xml:space="preserve"> </w:t>
+      </w:r>
+      <w:proofErr w:type="spellStart"/>
+      <w:r>
+        <w:rPr>
+          <w:rFonts w:ascii="Arial" w:hAnsi="Arial" w:cs="Arial"/>
+          <w:b/>
+          <w:sz w:val="24"/>
+        </w:rPr>
         <w:t>for</w:t>
       </w:r>
       <w:proofErr w:type="spellEnd"/>
@@ -1157,39 +1195,7 @@
           <w:rFonts w:ascii="Arial" w:hAnsi="Arial" w:cs="Arial"/>
           <w:sz w:val="24"/>
         </w:rPr>
-        <w:t xml:space="preserve">Este estudio revisa la eficacia de algoritmos como </w:t>
-      </w:r>
-      <w:proofErr w:type="spellStart"/>
-      <w:r>
-        <w:rPr>
-          <w:rFonts w:ascii="Arial" w:hAnsi="Arial" w:cs="Arial"/>
-          <w:sz w:val="24"/>
-        </w:rPr>
-        <w:t>Random</w:t>
-      </w:r>
-      <w:proofErr w:type="spellEnd"/>
-      <w:r>
-        <w:rPr>
-          <w:rFonts w:ascii="Arial" w:hAnsi="Arial" w:cs="Arial"/>
-          <w:sz w:val="24"/>
-        </w:rPr>
-        <w:t xml:space="preserve"> </w:t>
-      </w:r>
-      <w:proofErr w:type="spellStart"/>
-      <w:r>
-        <w:rPr>
-          <w:rFonts w:ascii="Arial" w:hAnsi="Arial" w:cs="Arial"/>
-          <w:sz w:val="24"/>
-        </w:rPr>
-        <w:t>Forest</w:t>
-      </w:r>
-      <w:proofErr w:type="spellEnd"/>
-      <w:r>
-        <w:rPr>
-          <w:rFonts w:ascii="Arial" w:hAnsi="Arial" w:cs="Arial"/>
-          <w:sz w:val="24"/>
-        </w:rPr>
-        <w:t xml:space="preserve"> y </w:t>
+        <w:t xml:space="preserve">Este estudio revisa la eficacia de algoritmos como Random Forest y </w:t>
       </w:r>
       <w:proofErr w:type="spellStart"/>
       <w:r>
@@ -5245,7 +5251,6 @@
               </w:rPr>
               <w:t xml:space="preserve"> / </w:t>
             </w:r>
-            <w:proofErr w:type="spellStart"/>
             <w:r>
               <w:rPr>
                 <w:rFonts w:ascii="Arial" w:eastAsia="Times New Roman" w:hAnsi="Arial" w:cs="Arial"/>
@@ -5257,7 +5262,6 @@
               </w:rPr>
               <w:t>max</w:t>
             </w:r>
-            <w:proofErr w:type="spellEnd"/>
           </w:p>
         </w:tc>
         <w:tc>
@@ -10296,8 +10300,18 @@
           <w:i/>
           <w:sz w:val="24"/>
         </w:rPr>
-        <w:t>Machine Learning</w:t>
-      </w:r>
+        <w:t xml:space="preserve">Machine </w:t>
+      </w:r>
+      <w:proofErr w:type="spellStart"/>
+      <w:r>
+        <w:rPr>
+          <w:rFonts w:ascii="Arial" w:hAnsi="Arial" w:cs="Arial"/>
+          <w:i/>
+          <w:sz w:val="24"/>
+        </w:rPr>
+        <w:t>Learning</w:t>
+      </w:r>
+      <w:proofErr w:type="spellEnd"/>
       <w:r>
         <w:rPr>
           <w:rFonts w:ascii="Arial" w:hAnsi="Arial" w:cs="Arial"/>
@@ -11159,23 +11173,7 @@
           <w:rFonts w:ascii="Arial" w:hAnsi="Arial" w:cs="Arial"/>
           <w:sz w:val="24"/>
         </w:rPr>
-        <w:t xml:space="preserve">el apartado donde se explican los diferentes </w:t>
-      </w:r>
-      <w:proofErr w:type="spellStart"/>
-      <w:r>
-        <w:rPr>
-          <w:rFonts w:ascii="Arial" w:hAnsi="Arial" w:cs="Arial"/>
-          <w:sz w:val="24"/>
-        </w:rPr>
-        <w:t>datasets</w:t>
-      </w:r>
-      <w:proofErr w:type="spellEnd"/>
-      <w:r>
-        <w:rPr>
-          <w:rFonts w:ascii="Arial" w:hAnsi="Arial" w:cs="Arial"/>
-          <w:sz w:val="24"/>
-        </w:rPr>
-        <w:t xml:space="preserve"> con los que contamos, hemos encontrado una serie de valores nulos. Por ello, hemos llevado a cabo un proceso de limpieza para asegurar la integridad de los datos.</w:t>
+        <w:t>el apartado donde se explican los diferentes datasets con los que contamos, hemos encontrado una serie de valores nulos. Por ello, hemos llevado a cabo un proceso de limpieza para asegurar la integridad de los datos.</w:t>
       </w:r>
     </w:p>
     <w:p>
@@ -13957,34 +13955,14 @@
         </w:rPr>
         <w:t xml:space="preserve">La productividad agrícola viene dada por una serie de factores los cuales hemos obtenido mediante es uso de técnicas de aprendizaje automático, en concreto con el algoritmo de </w:t>
       </w:r>
-      <w:proofErr w:type="spellStart"/>
       <w:r>
         <w:rPr>
           <w:rFonts w:ascii="Arial" w:hAnsi="Arial" w:cs="Arial"/>
           <w:i/>
           <w:sz w:val="24"/>
         </w:rPr>
-        <w:t>Random</w:t>
-      </w:r>
-      <w:proofErr w:type="spellEnd"/>
-      <w:r>
-        <w:rPr>
-          <w:rFonts w:ascii="Arial" w:hAnsi="Arial" w:cs="Arial"/>
-          <w:i/>
-          <w:sz w:val="24"/>
-        </w:rPr>
-        <w:t xml:space="preserve"> </w:t>
-      </w:r>
-      <w:proofErr w:type="spellStart"/>
-      <w:r>
-        <w:rPr>
-          <w:rFonts w:ascii="Arial" w:hAnsi="Arial" w:cs="Arial"/>
-          <w:i/>
-          <w:sz w:val="24"/>
-        </w:rPr>
-        <w:t>Forest</w:t>
-      </w:r>
-      <w:proofErr w:type="spellEnd"/>
+        <w:t>Random Forest</w:t>
+      </w:r>
       <w:r>
         <w:rPr>
           <w:rFonts w:ascii="Arial" w:hAnsi="Arial" w:cs="Arial"/>
@@ -14087,34 +14065,14 @@
         </w:rPr>
         <w:t xml:space="preserve">, para determinar qué factores son los determinantes en el rendimiento hemos usado otra vez el algoritmo de </w:t>
       </w:r>
-      <w:proofErr w:type="spellStart"/>
       <w:r>
         <w:rPr>
           <w:rFonts w:ascii="Arial" w:hAnsi="Arial" w:cs="Arial"/>
           <w:i/>
           <w:sz w:val="24"/>
         </w:rPr>
-        <w:t>Random</w:t>
-      </w:r>
-      <w:proofErr w:type="spellEnd"/>
-      <w:r>
-        <w:rPr>
-          <w:rFonts w:ascii="Arial" w:hAnsi="Arial" w:cs="Arial"/>
-          <w:i/>
-          <w:sz w:val="24"/>
-        </w:rPr>
-        <w:t xml:space="preserve"> </w:t>
-      </w:r>
-      <w:proofErr w:type="spellStart"/>
-      <w:r>
-        <w:rPr>
-          <w:rFonts w:ascii="Arial" w:hAnsi="Arial" w:cs="Arial"/>
-          <w:i/>
-          <w:sz w:val="24"/>
-        </w:rPr>
-        <w:t>Forest</w:t>
-      </w:r>
-      <w:proofErr w:type="spellEnd"/>
+        <w:t>Random Forest</w:t>
+      </w:r>
       <w:r>
         <w:rPr>
           <w:rFonts w:ascii="Arial" w:hAnsi="Arial" w:cs="Arial"/>
@@ -14302,7 +14260,9 @@
       <w:r>
         <w:rPr>
           <w:rFonts w:ascii="Arial" w:hAnsi="Arial" w:cs="Arial"/>
-          <w:sz w:val="24"/>
+          <w:noProof/>
+          <w:sz w:val="24"/>
+          <w:lang w:eastAsia="es-ES"/>
         </w:rPr>
         <w:drawing>
           <wp:inline distT="0" distB="0" distL="0" distR="0" wp14:anchorId="2D648509" wp14:editId="5E00EE78">
@@ -14370,7 +14330,9 @@
       <w:r>
         <w:rPr>
           <w:rFonts w:ascii="Arial" w:hAnsi="Arial" w:cs="Arial"/>
-          <w:sz w:val="24"/>
+          <w:noProof/>
+          <w:sz w:val="24"/>
+          <w:lang w:eastAsia="es-ES"/>
         </w:rPr>
         <w:lastRenderedPageBreak/>
         <w:drawing>
@@ -14487,7 +14449,9 @@
       <w:r>
         <w:rPr>
           <w:rFonts w:ascii="Arial" w:hAnsi="Arial" w:cs="Arial"/>
-          <w:sz w:val="24"/>
+          <w:noProof/>
+          <w:sz w:val="24"/>
+          <w:lang w:eastAsia="es-ES"/>
         </w:rPr>
         <w:drawing>
           <wp:inline distT="0" distB="0" distL="0" distR="0" wp14:anchorId="01F97E63" wp14:editId="391A8B6B">
@@ -14587,7 +14551,9 @@
       <w:r>
         <w:rPr>
           <w:rFonts w:ascii="Arial" w:hAnsi="Arial" w:cs="Arial"/>
-          <w:sz w:val="24"/>
+          <w:noProof/>
+          <w:sz w:val="24"/>
+          <w:lang w:eastAsia="es-ES"/>
         </w:rPr>
         <w:drawing>
           <wp:inline distT="0" distB="0" distL="0" distR="0" wp14:anchorId="36BBE92F" wp14:editId="2AC71803">
@@ -14664,8 +14630,18 @@
           <w:b/>
           <w:color w:val="auto"/>
         </w:rPr>
-        <w:t>Machine Learning</w:t>
-      </w:r>
+        <w:t xml:space="preserve">Machine </w:t>
+      </w:r>
+      <w:proofErr w:type="spellStart"/>
+      <w:r>
+        <w:rPr>
+          <w:rFonts w:ascii="Arial" w:hAnsi="Arial" w:cs="Arial"/>
+          <w:b/>
+          <w:color w:val="auto"/>
+        </w:rPr>
+        <w:t>Learning</w:t>
+      </w:r>
+      <w:proofErr w:type="spellEnd"/>
     </w:p>
     <w:p>
       <w:pPr>
@@ -14897,7 +14873,9 @@
       <w:r>
         <w:rPr>
           <w:rFonts w:ascii="Arial" w:hAnsi="Arial" w:cs="Arial"/>
-          <w:sz w:val="24"/>
+          <w:noProof/>
+          <w:sz w:val="24"/>
+          <w:lang w:eastAsia="es-ES"/>
         </w:rPr>
         <w:drawing>
           <wp:inline distT="0" distB="0" distL="0" distR="0" wp14:anchorId="23FE873B" wp14:editId="3B88CF1A">
@@ -15094,13 +15072,27 @@
     </w:p>
     <w:p>
       <w:pPr>
+        <w:pStyle w:val="Ttulo3"/>
+        <w:numPr>
+          <w:ilvl w:val="2"/>
+          <w:numId w:val="7"/>
+        </w:numPr>
         <w:spacing w:line="276" w:lineRule="auto"/>
         <w:jc w:val="both"/>
         <w:rPr>
           <w:rFonts w:ascii="Arial" w:hAnsi="Arial" w:cs="Arial"/>
-          <w:sz w:val="24"/>
-        </w:rPr>
-      </w:pPr>
+          <w:b/>
+          <w:color w:val="auto"/>
+        </w:rPr>
+      </w:pPr>
+      <w:r>
+        <w:rPr>
+          <w:rFonts w:ascii="Arial" w:hAnsi="Arial" w:cs="Arial"/>
+          <w:b/>
+          <w:color w:val="auto"/>
+        </w:rPr>
+        <w:t>Clasificación de riesgo de plagas</w:t>
+      </w:r>
     </w:p>
     <w:p>
       <w:pPr>
@@ -15111,6 +15103,660 @@
           <w:sz w:val="24"/>
         </w:rPr>
       </w:pPr>
+      <w:r>
+        <w:rPr>
+          <w:rFonts w:ascii="Arial" w:hAnsi="Arial" w:cs="Arial"/>
+          <w:sz w:val="24"/>
+        </w:rPr>
+        <w:t>Se trata de un problema de clasificación binaria, donde buscamos desarrollar un modelo predictivo capaz de clasificar si una región agrícola sufrirá o no una plaga</w:t>
+      </w:r>
+      <w:r>
+        <w:rPr>
+          <w:rFonts w:ascii="Arial" w:hAnsi="Arial" w:cs="Arial"/>
+          <w:sz w:val="24"/>
+        </w:rPr>
+        <w:t>, es decir, si existe un riesgo de plagas</w:t>
+      </w:r>
+      <w:r>
+        <w:rPr>
+          <w:rFonts w:ascii="Arial" w:hAnsi="Arial" w:cs="Arial"/>
+          <w:sz w:val="24"/>
+        </w:rPr>
+        <w:t>. El uso de este modelo ayudaría a la anticipación del riesgo de plaga para que los agricultores puedan pensar estrategias de prevención y evitar así perdidas.</w:t>
+      </w:r>
+    </w:p>
+    <w:p>
+      <w:pPr>
+        <w:spacing w:line="276" w:lineRule="auto"/>
+        <w:jc w:val="both"/>
+        <w:rPr>
+          <w:rFonts w:ascii="Arial" w:hAnsi="Arial" w:cs="Arial"/>
+          <w:sz w:val="24"/>
+        </w:rPr>
+      </w:pPr>
+      <w:r>
+        <w:rPr>
+          <w:rFonts w:ascii="Arial" w:hAnsi="Arial" w:cs="Arial"/>
+          <w:sz w:val="24"/>
+        </w:rPr>
+        <w:t xml:space="preserve">Durante la exploración de datos detectamos que los registros de plagas no contaban con suficientes elementos temporales con respecto a los datos históricos de producción. Por ello, para garantizar la viabilidad del modelo hemos creado una variable sintética que es la de alto riesgo. Esta variable etiqueta como posible alto riesgo aquellos registros donde hubo caídas </w:t>
+      </w:r>
+      <w:r>
+        <w:rPr>
+          <w:rFonts w:ascii="Arial" w:hAnsi="Arial" w:cs="Arial"/>
+          <w:sz w:val="24"/>
+        </w:rPr>
+        <w:t>en el rendimiento agrícola con condiciones climáticas de estrés (una alta aridez o prolongados meses de estrés hídrico), que son factores que propician la aparición de plagas.</w:t>
+      </w:r>
+    </w:p>
+    <w:p>
+      <w:pPr>
+        <w:spacing w:line="276" w:lineRule="auto"/>
+        <w:jc w:val="both"/>
+        <w:rPr>
+          <w:rFonts w:ascii="Arial" w:hAnsi="Arial" w:cs="Arial"/>
+          <w:sz w:val="24"/>
+        </w:rPr>
+      </w:pPr>
+      <w:r>
+        <w:rPr>
+          <w:rFonts w:ascii="Arial" w:hAnsi="Arial" w:cs="Arial"/>
+          <w:sz w:val="24"/>
+        </w:rPr>
+        <w:t>Para resolver este problema de clasificación, hemos empleado dos algoritmos diferentes que son:</w:t>
+      </w:r>
+    </w:p>
+    <w:p>
+      <w:pPr>
+        <w:pStyle w:val="Prrafodelista"/>
+        <w:numPr>
+          <w:ilvl w:val="0"/>
+          <w:numId w:val="5"/>
+        </w:numPr>
+        <w:spacing w:line="276" w:lineRule="auto"/>
+        <w:jc w:val="both"/>
+        <w:rPr>
+          <w:rFonts w:ascii="Arial" w:hAnsi="Arial" w:cs="Arial"/>
+          <w:sz w:val="24"/>
+        </w:rPr>
+      </w:pPr>
+      <w:r>
+        <w:rPr>
+          <w:rFonts w:ascii="Arial" w:hAnsi="Arial" w:cs="Arial"/>
+          <w:sz w:val="24"/>
+          <w:u w:val="single"/>
+        </w:rPr>
+        <w:t>Modelo básico KNN:</w:t>
+      </w:r>
+      <w:r>
+        <w:rPr>
+          <w:rFonts w:ascii="Arial" w:hAnsi="Arial" w:cs="Arial"/>
+          <w:sz w:val="24"/>
+        </w:rPr>
+        <w:t xml:space="preserve"> Es un algoritmo que se basa en la clasificación del riesgo de una región buscando los </w:t>
+      </w:r>
+      <w:r>
+        <w:rPr>
+          <w:rFonts w:ascii="Arial" w:hAnsi="Arial" w:cs="Arial"/>
+          <w:i/>
+          <w:sz w:val="24"/>
+        </w:rPr>
+        <w:t>k</w:t>
+      </w:r>
+      <w:r>
+        <w:rPr>
+          <w:rFonts w:ascii="Arial" w:hAnsi="Arial" w:cs="Arial"/>
+          <w:sz w:val="24"/>
+        </w:rPr>
+        <w:t xml:space="preserve"> casos históricos más similares en términos climáticos y agrícolas. Sirve como un modelo base para evaluar si l</w:t>
+      </w:r>
+      <w:r>
+        <w:rPr>
+          <w:rFonts w:ascii="Arial" w:hAnsi="Arial" w:cs="Arial"/>
+          <w:sz w:val="24"/>
+        </w:rPr>
+        <w:t>a similitud directa es suficiente para detectar el riesgo.</w:t>
+      </w:r>
+    </w:p>
+    <w:p>
+      <w:pPr>
+        <w:pStyle w:val="Prrafodelista"/>
+        <w:numPr>
+          <w:ilvl w:val="0"/>
+          <w:numId w:val="5"/>
+        </w:numPr>
+        <w:spacing w:line="276" w:lineRule="auto"/>
+        <w:jc w:val="both"/>
+        <w:rPr>
+          <w:rFonts w:ascii="Arial" w:hAnsi="Arial" w:cs="Arial"/>
+          <w:sz w:val="24"/>
+        </w:rPr>
+      </w:pPr>
+      <w:r>
+        <w:rPr>
+          <w:rFonts w:ascii="Arial" w:hAnsi="Arial" w:cs="Arial"/>
+          <w:sz w:val="24"/>
+          <w:u w:val="single"/>
+        </w:rPr>
+        <w:t>Modelo intermedio Random Forest:</w:t>
+      </w:r>
+      <w:r>
+        <w:rPr>
+          <w:rFonts w:ascii="Arial" w:hAnsi="Arial" w:cs="Arial"/>
+          <w:sz w:val="24"/>
+        </w:rPr>
+        <w:t xml:space="preserve"> Se trata de un modelo de ensamble basado en múltiples árboles de decisión. Permite manejar mejor las relaciones entre las diferentes características y es robusto frente a datos atípicos.</w:t>
+      </w:r>
+    </w:p>
+    <w:p>
+      <w:pPr>
+        <w:spacing w:line="276" w:lineRule="auto"/>
+        <w:ind w:left="142"/>
+        <w:jc w:val="both"/>
+        <w:rPr>
+          <w:rFonts w:ascii="Arial" w:hAnsi="Arial" w:cs="Arial"/>
+          <w:sz w:val="24"/>
+        </w:rPr>
+      </w:pPr>
+      <w:r>
+        <w:rPr>
+          <w:rFonts w:ascii="Arial" w:hAnsi="Arial" w:cs="Arial"/>
+          <w:sz w:val="24"/>
+        </w:rPr>
+        <w:t xml:space="preserve">En ambos modelos, al contar con un desbalanceo de clases, la métrica de evaluación del </w:t>
+      </w:r>
+      <w:proofErr w:type="spellStart"/>
+      <w:r>
+        <w:rPr>
+          <w:rFonts w:ascii="Arial" w:hAnsi="Arial" w:cs="Arial"/>
+          <w:i/>
+          <w:sz w:val="24"/>
+        </w:rPr>
+        <w:t>accuracy</w:t>
+      </w:r>
+      <w:proofErr w:type="spellEnd"/>
+      <w:r>
+        <w:rPr>
+          <w:rFonts w:ascii="Arial" w:hAnsi="Arial" w:cs="Arial"/>
+          <w:sz w:val="24"/>
+        </w:rPr>
+        <w:t xml:space="preserve"> es insuficiente. Por ello, vamos a emplear otras métricas como son: </w:t>
+      </w:r>
+      <w:proofErr w:type="spellStart"/>
+      <w:r>
+        <w:rPr>
+          <w:rFonts w:ascii="Arial" w:hAnsi="Arial" w:cs="Arial"/>
+          <w:i/>
+          <w:sz w:val="24"/>
+        </w:rPr>
+        <w:t>recall</w:t>
+      </w:r>
+      <w:proofErr w:type="spellEnd"/>
+      <w:r>
+        <w:rPr>
+          <w:rFonts w:ascii="Arial" w:hAnsi="Arial" w:cs="Arial"/>
+          <w:i/>
+          <w:sz w:val="24"/>
+        </w:rPr>
+        <w:t xml:space="preserve"> </w:t>
+      </w:r>
+      <w:r>
+        <w:rPr>
+          <w:rFonts w:ascii="Arial" w:hAnsi="Arial" w:cs="Arial"/>
+          <w:sz w:val="24"/>
+        </w:rPr>
+        <w:t xml:space="preserve">(mide la capacidad para detectar todos los verdaderos casos de riesgo minimizando los falsos negativos), </w:t>
+      </w:r>
+      <w:proofErr w:type="spellStart"/>
+      <w:r>
+        <w:rPr>
+          <w:rFonts w:ascii="Arial" w:hAnsi="Arial" w:cs="Arial"/>
+          <w:i/>
+          <w:sz w:val="24"/>
+        </w:rPr>
+        <w:t>precision</w:t>
+      </w:r>
+      <w:proofErr w:type="spellEnd"/>
+      <w:r>
+        <w:rPr>
+          <w:rFonts w:ascii="Arial" w:hAnsi="Arial" w:cs="Arial"/>
+          <w:i/>
+          <w:sz w:val="24"/>
+        </w:rPr>
+        <w:t xml:space="preserve"> </w:t>
+      </w:r>
+      <w:r>
+        <w:rPr>
+          <w:rFonts w:ascii="Arial" w:hAnsi="Arial" w:cs="Arial"/>
+          <w:sz w:val="24"/>
+        </w:rPr>
+        <w:t xml:space="preserve">(mide </w:t>
+      </w:r>
+      <w:r>
+        <w:rPr>
+          <w:rFonts w:ascii="Arial" w:hAnsi="Arial" w:cs="Arial"/>
+          <w:sz w:val="24"/>
+        </w:rPr>
+        <w:lastRenderedPageBreak/>
+        <w:t xml:space="preserve">la proporción de alertas reales frente al total de alertas obtenidas) y </w:t>
+      </w:r>
+      <w:r>
+        <w:rPr>
+          <w:rFonts w:ascii="Arial" w:hAnsi="Arial" w:cs="Arial"/>
+          <w:i/>
+          <w:sz w:val="24"/>
+        </w:rPr>
+        <w:t>f1-score</w:t>
+      </w:r>
+      <w:r>
+        <w:rPr>
+          <w:rFonts w:ascii="Arial" w:hAnsi="Arial" w:cs="Arial"/>
+          <w:sz w:val="24"/>
+        </w:rPr>
+        <w:t xml:space="preserve"> (ofrece una visión balanceada del rendimiento general del modelo).</w:t>
+      </w:r>
+    </w:p>
+    <w:p>
+      <w:pPr>
+        <w:spacing w:line="276" w:lineRule="auto"/>
+        <w:ind w:left="142"/>
+        <w:jc w:val="both"/>
+        <w:rPr>
+          <w:rFonts w:ascii="Arial" w:hAnsi="Arial" w:cs="Arial"/>
+          <w:sz w:val="24"/>
+        </w:rPr>
+      </w:pPr>
+      <w:r>
+        <w:rPr>
+          <w:rFonts w:ascii="Arial" w:hAnsi="Arial" w:cs="Arial"/>
+          <w:sz w:val="24"/>
+        </w:rPr>
+        <w:t xml:space="preserve">Además, para garantizar que los modelos sean capaces de generalizar y evitar el </w:t>
+      </w:r>
+      <w:r>
+        <w:rPr>
+          <w:rFonts w:ascii="Arial" w:hAnsi="Arial" w:cs="Arial"/>
+          <w:i/>
+          <w:sz w:val="24"/>
+        </w:rPr>
+        <w:t>overfitting</w:t>
+      </w:r>
+      <w:r>
+        <w:rPr>
+          <w:rFonts w:ascii="Arial" w:hAnsi="Arial" w:cs="Arial"/>
+          <w:sz w:val="24"/>
+        </w:rPr>
+        <w:t xml:space="preserve"> hemos empleado una validación cruzada estratificada de 5 particiones. La estratificación fue clave para asegurar que se mantuviera la proporción entre clases.</w:t>
+      </w:r>
+    </w:p>
+    <w:p>
+      <w:pPr>
+        <w:pStyle w:val="Ttulo3"/>
+        <w:numPr>
+          <w:ilvl w:val="2"/>
+          <w:numId w:val="7"/>
+        </w:numPr>
+        <w:spacing w:line="276" w:lineRule="auto"/>
+        <w:jc w:val="both"/>
+        <w:rPr>
+          <w:rFonts w:ascii="Arial" w:hAnsi="Arial" w:cs="Arial"/>
+          <w:b/>
+          <w:color w:val="auto"/>
+        </w:rPr>
+      </w:pPr>
+      <w:r>
+        <w:rPr>
+          <w:rFonts w:ascii="Arial" w:hAnsi="Arial" w:cs="Arial"/>
+          <w:b/>
+          <w:color w:val="auto"/>
+        </w:rPr>
+        <w:t>Segmentació</w:t>
+      </w:r>
+      <w:r>
+        <w:rPr>
+          <w:rFonts w:ascii="Arial" w:hAnsi="Arial" w:cs="Arial"/>
+          <w:b/>
+          <w:color w:val="auto"/>
+        </w:rPr>
+        <w:t>n de p</w:t>
+      </w:r>
+      <w:r>
+        <w:rPr>
+          <w:rFonts w:ascii="Arial" w:hAnsi="Arial" w:cs="Arial"/>
+          <w:b/>
+          <w:color w:val="auto"/>
+        </w:rPr>
+        <w:t>aí</w:t>
+      </w:r>
+      <w:r>
+        <w:rPr>
+          <w:rFonts w:ascii="Arial" w:hAnsi="Arial" w:cs="Arial"/>
+          <w:b/>
+          <w:color w:val="auto"/>
+        </w:rPr>
+        <w:t>ses por patrones p</w:t>
+      </w:r>
+      <w:r>
+        <w:rPr>
+          <w:rFonts w:ascii="Arial" w:hAnsi="Arial" w:cs="Arial"/>
+          <w:b/>
+          <w:color w:val="auto"/>
+        </w:rPr>
+        <w:t>roductivos</w:t>
+      </w:r>
+    </w:p>
+    <w:p>
+      <w:pPr>
+        <w:spacing w:line="276" w:lineRule="auto"/>
+        <w:jc w:val="both"/>
+        <w:rPr>
+          <w:rFonts w:ascii="Arial" w:hAnsi="Arial" w:cs="Arial"/>
+          <w:sz w:val="24"/>
+        </w:rPr>
+      </w:pPr>
+      <w:r>
+        <w:rPr>
+          <w:rFonts w:ascii="Arial" w:hAnsi="Arial" w:cs="Arial"/>
+          <w:sz w:val="24"/>
+        </w:rPr>
+        <w:t>Este problema se trata de un reto de aprendizaje no supervisado, donde el objetivo es identificar y agrupar países con características productivas similares, basándonos en su producción agrícola y ganadera per cápita, su eficiencia y su huella de emisiones. Al cruzar los datasets empleados nos hemos quedado con tan solo 12 países que contaban con registros completos de producción agrícola y ganadera.</w:t>
+      </w:r>
+    </w:p>
+    <w:p>
+      <w:pPr>
+        <w:spacing w:line="276" w:lineRule="auto"/>
+        <w:jc w:val="both"/>
+        <w:rPr>
+          <w:rFonts w:ascii="Arial" w:hAnsi="Arial" w:cs="Arial"/>
+          <w:sz w:val="24"/>
+        </w:rPr>
+      </w:pPr>
+      <w:r>
+        <w:rPr>
+          <w:rFonts w:ascii="Arial" w:hAnsi="Arial" w:cs="Arial"/>
+          <w:sz w:val="24"/>
+        </w:rPr>
+        <w:t>Para garantizar que un correcto modelo y contar con las características adecuadas para el entrenamiento, hemos creado nuevas variables:</w:t>
+      </w:r>
+    </w:p>
+    <w:p>
+      <w:pPr>
+        <w:pStyle w:val="Prrafodelista"/>
+        <w:numPr>
+          <w:ilvl w:val="0"/>
+          <w:numId w:val="5"/>
+        </w:numPr>
+        <w:spacing w:line="276" w:lineRule="auto"/>
+        <w:jc w:val="both"/>
+        <w:rPr>
+          <w:rFonts w:ascii="Arial" w:hAnsi="Arial" w:cs="Arial"/>
+          <w:sz w:val="24"/>
+        </w:rPr>
+      </w:pPr>
+      <w:r>
+        <w:rPr>
+          <w:rFonts w:ascii="Arial" w:hAnsi="Arial" w:cs="Arial"/>
+          <w:sz w:val="24"/>
+        </w:rPr>
+        <w:t>Lo primero ha sido la creación de un dataset de población de cada uno de los países por sus años correspondientes, es decir, que por ejemplo para España tenemos un dataset con la población desde los años 2011 hasta 2020.</w:t>
+      </w:r>
+    </w:p>
+    <w:p>
+      <w:pPr>
+        <w:pStyle w:val="Prrafodelista"/>
+        <w:numPr>
+          <w:ilvl w:val="0"/>
+          <w:numId w:val="5"/>
+        </w:numPr>
+        <w:spacing w:line="276" w:lineRule="auto"/>
+        <w:jc w:val="both"/>
+        <w:rPr>
+          <w:rFonts w:ascii="Arial" w:hAnsi="Arial" w:cs="Arial"/>
+          <w:sz w:val="24"/>
+        </w:rPr>
+      </w:pPr>
+      <w:r>
+        <w:rPr>
+          <w:rFonts w:ascii="Arial" w:hAnsi="Arial" w:cs="Arial"/>
+          <w:sz w:val="24"/>
+        </w:rPr>
+        <w:t>Hemos transformado cada producto en una variable independiente. Esto nos permite que al cruzarlo con las poblaciones se crean nuevas variables de producción per cápita de cada cultivo en específico, así como la producción de carne y leche según la especia ganadera.</w:t>
+      </w:r>
+    </w:p>
+    <w:p>
+      <w:pPr>
+        <w:pStyle w:val="Prrafodelista"/>
+        <w:numPr>
+          <w:ilvl w:val="0"/>
+          <w:numId w:val="5"/>
+        </w:numPr>
+        <w:spacing w:line="276" w:lineRule="auto"/>
+        <w:jc w:val="both"/>
+        <w:rPr>
+          <w:rFonts w:ascii="Arial" w:hAnsi="Arial" w:cs="Arial"/>
+          <w:sz w:val="24"/>
+        </w:rPr>
+      </w:pPr>
+      <w:r>
+        <w:rPr>
+          <w:rFonts w:ascii="Arial" w:hAnsi="Arial" w:cs="Arial"/>
+          <w:sz w:val="24"/>
+        </w:rPr>
+        <w:t>Para incluir las emisiones agrícolas, hemos creado una variable sintética a la que hemos aplicado un factor de conversión estándar en el sector que asume la emisión de 3.5 toneladas de CO2 por cada tonelada de fertilizante que se ha usado en la superficie cultivada.</w:t>
+      </w:r>
+    </w:p>
+    <w:p>
+      <w:pPr>
+        <w:spacing w:line="276" w:lineRule="auto"/>
+        <w:ind w:left="142"/>
+        <w:jc w:val="both"/>
+        <w:rPr>
+          <w:rFonts w:ascii="Arial" w:hAnsi="Arial" w:cs="Arial"/>
+          <w:sz w:val="24"/>
+        </w:rPr>
+      </w:pPr>
+      <w:r>
+        <w:rPr>
+          <w:rFonts w:ascii="Arial" w:hAnsi="Arial" w:cs="Arial"/>
+          <w:sz w:val="24"/>
+        </w:rPr>
+        <w:t xml:space="preserve">Para el desarrollo de este problema hemos agrupado por la media de cada país, puesto que sino un país podría pertenecer a </w:t>
+      </w:r>
+      <w:r>
+        <w:rPr>
+          <w:rFonts w:ascii="Arial" w:hAnsi="Arial" w:cs="Arial"/>
+          <w:sz w:val="24"/>
+        </w:rPr>
+        <w:t>un clúster distinto en función del país. Los algoritmos que hemos implementado han sido:</w:t>
+      </w:r>
+    </w:p>
+    <w:p>
+      <w:pPr>
+        <w:pStyle w:val="Prrafodelista"/>
+        <w:numPr>
+          <w:ilvl w:val="0"/>
+          <w:numId w:val="5"/>
+        </w:numPr>
+        <w:spacing w:line="276" w:lineRule="auto"/>
+        <w:jc w:val="both"/>
+        <w:rPr>
+          <w:rFonts w:ascii="Arial" w:hAnsi="Arial" w:cs="Arial"/>
+          <w:sz w:val="24"/>
+        </w:rPr>
+      </w:pPr>
+      <w:r>
+        <w:rPr>
+          <w:rFonts w:ascii="Arial" w:hAnsi="Arial" w:cs="Arial"/>
+          <w:sz w:val="24"/>
+          <w:u w:val="single"/>
+        </w:rPr>
+        <w:t>K-Means:</w:t>
+      </w:r>
+      <w:r>
+        <w:rPr>
+          <w:rFonts w:ascii="Arial" w:hAnsi="Arial" w:cs="Arial"/>
+          <w:sz w:val="24"/>
+        </w:rPr>
+        <w:t xml:space="preserve"> Este algoritmo busca dividir el conjunto de datos en </w:t>
+      </w:r>
+      <w:r>
+        <w:rPr>
+          <w:rFonts w:ascii="Arial" w:hAnsi="Arial" w:cs="Arial"/>
+          <w:i/>
+          <w:sz w:val="24"/>
+        </w:rPr>
+        <w:t>k</w:t>
+      </w:r>
+      <w:r>
+        <w:rPr>
+          <w:rFonts w:ascii="Arial" w:hAnsi="Arial" w:cs="Arial"/>
+          <w:sz w:val="24"/>
+        </w:rPr>
+        <w:t xml:space="preserve"> grupos minimizando la varianza entre ellos.</w:t>
+      </w:r>
+    </w:p>
+    <w:p>
+      <w:pPr>
+        <w:pStyle w:val="Prrafodelista"/>
+        <w:numPr>
+          <w:ilvl w:val="0"/>
+          <w:numId w:val="5"/>
+        </w:numPr>
+        <w:spacing w:line="276" w:lineRule="auto"/>
+        <w:jc w:val="both"/>
+        <w:rPr>
+          <w:rFonts w:ascii="Arial" w:hAnsi="Arial" w:cs="Arial"/>
+          <w:sz w:val="24"/>
+        </w:rPr>
+      </w:pPr>
+      <w:r>
+        <w:rPr>
+          <w:rFonts w:ascii="Arial" w:hAnsi="Arial" w:cs="Arial"/>
+          <w:sz w:val="24"/>
+          <w:u w:val="single"/>
+        </w:rPr>
+        <w:t>DBSCAN:</w:t>
+      </w:r>
+      <w:r>
+        <w:rPr>
+          <w:rFonts w:ascii="Arial" w:hAnsi="Arial" w:cs="Arial"/>
+          <w:sz w:val="24"/>
+        </w:rPr>
+        <w:t xml:space="preserve"> Este algoritmo agrupa puntos basándose en la densidad local. Está pensado para identificar países con modelos productivos atípicos que se desvíen de las normas globales.</w:t>
+      </w:r>
+    </w:p>
+    <w:p>
+      <w:pPr>
+        <w:spacing w:line="276" w:lineRule="auto"/>
+        <w:ind w:left="142"/>
+        <w:jc w:val="both"/>
+        <w:rPr>
+          <w:rFonts w:ascii="Arial" w:hAnsi="Arial" w:cs="Arial"/>
+          <w:sz w:val="24"/>
+        </w:rPr>
+      </w:pPr>
+      <w:r>
+        <w:rPr>
+          <w:rFonts w:ascii="Arial" w:hAnsi="Arial" w:cs="Arial"/>
+          <w:sz w:val="24"/>
+        </w:rPr>
+        <w:t>Para la validación de estos dos modelos no supervisados nos hemos apoyado en dos métricas matemáticas estándar:</w:t>
+      </w:r>
+    </w:p>
+    <w:p>
+      <w:pPr>
+        <w:pStyle w:val="Prrafodelista"/>
+        <w:numPr>
+          <w:ilvl w:val="0"/>
+          <w:numId w:val="5"/>
+        </w:numPr>
+        <w:spacing w:line="276" w:lineRule="auto"/>
+        <w:jc w:val="both"/>
+        <w:rPr>
+          <w:rFonts w:ascii="Arial" w:hAnsi="Arial" w:cs="Arial"/>
+          <w:sz w:val="24"/>
+        </w:rPr>
+      </w:pPr>
+      <w:r>
+        <w:rPr>
+          <w:rFonts w:ascii="Arial" w:hAnsi="Arial" w:cs="Arial"/>
+          <w:sz w:val="24"/>
+          <w:u w:val="single"/>
+        </w:rPr>
+        <w:t>Silhouette Score</w:t>
+      </w:r>
+      <w:r>
+        <w:rPr>
+          <w:rFonts w:ascii="Arial" w:hAnsi="Arial" w:cs="Arial"/>
+          <w:sz w:val="24"/>
+        </w:rPr>
+        <w:t>: Mide la cohesión interna frente a la separación externa (rango de -1 a 1).</w:t>
+      </w:r>
+    </w:p>
+    <w:p>
+      <w:pPr>
+        <w:pStyle w:val="Prrafodelista"/>
+        <w:numPr>
+          <w:ilvl w:val="0"/>
+          <w:numId w:val="5"/>
+        </w:numPr>
+        <w:spacing w:line="276" w:lineRule="auto"/>
+        <w:jc w:val="both"/>
+        <w:rPr>
+          <w:rFonts w:ascii="Arial" w:hAnsi="Arial" w:cs="Arial"/>
+          <w:sz w:val="24"/>
+        </w:rPr>
+      </w:pPr>
+      <w:r>
+        <w:rPr>
+          <w:rFonts w:ascii="Arial" w:hAnsi="Arial" w:cs="Arial"/>
+          <w:sz w:val="24"/>
+          <w:u w:val="single"/>
+        </w:rPr>
+        <w:lastRenderedPageBreak/>
+        <w:t>Davies-Bouldin Index</w:t>
+      </w:r>
+      <w:r>
+        <w:rPr>
+          <w:rFonts w:ascii="Arial" w:hAnsi="Arial" w:cs="Arial"/>
+          <w:sz w:val="24"/>
+        </w:rPr>
+        <w:t xml:space="preserve">: Evalúa la proporción entre la dispersión interna de cada clúster y la distancia entre sus </w:t>
+      </w:r>
+      <w:proofErr w:type="spellStart"/>
+      <w:r>
+        <w:rPr>
+          <w:rFonts w:ascii="Arial" w:hAnsi="Arial" w:cs="Arial"/>
+          <w:sz w:val="24"/>
+        </w:rPr>
+        <w:t>centroides</w:t>
+      </w:r>
+      <w:proofErr w:type="spellEnd"/>
+      <w:r>
+        <w:rPr>
+          <w:rFonts w:ascii="Arial" w:hAnsi="Arial" w:cs="Arial"/>
+          <w:sz w:val="24"/>
+        </w:rPr>
+        <w:t xml:space="preserve"> (cuanto más cercano a 0, mejor es la segmentación).</w:t>
+      </w:r>
+    </w:p>
+    <w:p>
+      <w:pPr>
+        <w:spacing w:line="276" w:lineRule="auto"/>
+        <w:ind w:left="142"/>
+        <w:jc w:val="both"/>
+        <w:rPr>
+          <w:rFonts w:ascii="Arial" w:hAnsi="Arial" w:cs="Arial"/>
+          <w:sz w:val="24"/>
+        </w:rPr>
+      </w:pPr>
+      <w:r>
+        <w:rPr>
+          <w:rFonts w:ascii="Arial" w:hAnsi="Arial" w:cs="Arial"/>
+          <w:sz w:val="24"/>
+        </w:rPr>
+        <w:t>Como en todos los problemas los resultados obtenidos de cada uno de los modelos se comentaran en el apartado correspondiente de resultados.</w:t>
+      </w:r>
     </w:p>
     <w:p>
       <w:pPr>
@@ -15548,11 +16194,1148 @@
         </w:rPr>
         <w:t xml:space="preserve">Además, la regresión múltiple me permite una mejor interpretación de los resultados. Esto es debido a que nos ofrece cuales son las características que mejor contribuyen a las predicciones. </w:t>
       </w:r>
+    </w:p>
+    <w:p>
+      <w:pPr>
+        <w:pStyle w:val="Ttulo2"/>
+        <w:numPr>
+          <w:ilvl w:val="1"/>
+          <w:numId w:val="7"/>
+        </w:numPr>
+        <w:spacing w:line="276" w:lineRule="auto"/>
+        <w:jc w:val="both"/>
+        <w:rPr>
+          <w:rFonts w:ascii="Arial" w:hAnsi="Arial" w:cs="Arial"/>
+          <w:b/>
+          <w:color w:val="auto"/>
+        </w:rPr>
+      </w:pPr>
+      <w:r>
+        <w:rPr>
+          <w:rFonts w:ascii="Arial" w:hAnsi="Arial" w:cs="Arial"/>
+          <w:b/>
+          <w:color w:val="auto"/>
+        </w:rPr>
+        <w:t>Clasificación de riesgo de plagas</w:t>
+      </w:r>
+    </w:p>
+    <w:p>
+      <w:pPr>
+        <w:spacing w:line="276" w:lineRule="auto"/>
+        <w:jc w:val="both"/>
+        <w:rPr>
+          <w:rFonts w:ascii="Arial" w:hAnsi="Arial" w:cs="Arial"/>
+          <w:sz w:val="24"/>
+        </w:rPr>
+      </w:pPr>
+      <w:r>
+        <w:rPr>
+          <w:rFonts w:ascii="Arial" w:hAnsi="Arial" w:cs="Arial"/>
+          <w:sz w:val="24"/>
+        </w:rPr>
+        <w:t>Tras la ejecución de la validación cruzada, los modelos nos arrojan los siguientes resultados sobre el conjunto de pruebas:</w:t>
+      </w:r>
+    </w:p>
+    <w:tbl>
+      <w:tblPr>
+        <w:tblStyle w:val="Tablaconcuadrcula"/>
+        <w:tblW w:w="0" w:type="auto"/>
+        <w:tblLook w:val="04A0" w:firstRow="1" w:lastRow="0" w:firstColumn="1" w:lastColumn="0" w:noHBand="0" w:noVBand="1"/>
+      </w:tblPr>
+      <w:tblGrid>
+        <w:gridCol w:w="1698"/>
+        <w:gridCol w:w="1699"/>
+        <w:gridCol w:w="1699"/>
+        <w:gridCol w:w="1699"/>
+        <w:gridCol w:w="1699"/>
+      </w:tblGrid>
+      <w:tr>
+        <w:tc>
+          <w:tcPr>
+            <w:tcW w:w="1698" w:type="dxa"/>
+            <w:vAlign w:val="center"/>
+          </w:tcPr>
+          <w:p>
+            <w:pPr>
+              <w:spacing w:line="276" w:lineRule="auto"/>
+              <w:jc w:val="center"/>
+              <w:rPr>
+                <w:rFonts w:ascii="Arial" w:hAnsi="Arial" w:cs="Arial"/>
+                <w:b/>
+                <w:sz w:val="24"/>
+              </w:rPr>
+            </w:pPr>
+            <w:r>
+              <w:rPr>
+                <w:rFonts w:ascii="Arial" w:hAnsi="Arial" w:cs="Arial"/>
+                <w:b/>
+                <w:sz w:val="24"/>
+              </w:rPr>
+              <w:t>Modelos</w:t>
+            </w:r>
+          </w:p>
+        </w:tc>
+        <w:tc>
+          <w:tcPr>
+            <w:tcW w:w="1699" w:type="dxa"/>
+            <w:vAlign w:val="center"/>
+          </w:tcPr>
+          <w:p>
+            <w:pPr>
+              <w:spacing w:line="276" w:lineRule="auto"/>
+              <w:jc w:val="center"/>
+              <w:rPr>
+                <w:rFonts w:ascii="Arial" w:hAnsi="Arial" w:cs="Arial"/>
+                <w:b/>
+                <w:sz w:val="24"/>
+              </w:rPr>
+            </w:pPr>
+            <w:proofErr w:type="spellStart"/>
+            <w:r>
+              <w:rPr>
+                <w:rFonts w:ascii="Arial" w:hAnsi="Arial" w:cs="Arial"/>
+                <w:b/>
+                <w:sz w:val="24"/>
+              </w:rPr>
+              <w:t>Accuracy</w:t>
+            </w:r>
+            <w:proofErr w:type="spellEnd"/>
+          </w:p>
+        </w:tc>
+        <w:tc>
+          <w:tcPr>
+            <w:tcW w:w="1699" w:type="dxa"/>
+            <w:vAlign w:val="center"/>
+          </w:tcPr>
+          <w:p>
+            <w:pPr>
+              <w:spacing w:line="276" w:lineRule="auto"/>
+              <w:jc w:val="center"/>
+              <w:rPr>
+                <w:rFonts w:ascii="Arial" w:hAnsi="Arial" w:cs="Arial"/>
+                <w:b/>
+                <w:sz w:val="24"/>
+              </w:rPr>
+            </w:pPr>
+            <w:proofErr w:type="spellStart"/>
+            <w:r>
+              <w:rPr>
+                <w:rFonts w:ascii="Arial" w:hAnsi="Arial" w:cs="Arial"/>
+                <w:b/>
+                <w:sz w:val="24"/>
+              </w:rPr>
+              <w:t>Precision</w:t>
+            </w:r>
+            <w:proofErr w:type="spellEnd"/>
+          </w:p>
+        </w:tc>
+        <w:tc>
+          <w:tcPr>
+            <w:tcW w:w="1699" w:type="dxa"/>
+            <w:vAlign w:val="center"/>
+          </w:tcPr>
+          <w:p>
+            <w:pPr>
+              <w:spacing w:line="276" w:lineRule="auto"/>
+              <w:jc w:val="center"/>
+              <w:rPr>
+                <w:rFonts w:ascii="Arial" w:hAnsi="Arial" w:cs="Arial"/>
+                <w:b/>
+                <w:sz w:val="24"/>
+              </w:rPr>
+            </w:pPr>
+            <w:r>
+              <w:rPr>
+                <w:rFonts w:ascii="Arial" w:hAnsi="Arial" w:cs="Arial"/>
+                <w:b/>
+                <w:sz w:val="24"/>
+              </w:rPr>
+              <w:t>Recall</w:t>
+            </w:r>
+          </w:p>
+        </w:tc>
+        <w:tc>
+          <w:tcPr>
+            <w:tcW w:w="1699" w:type="dxa"/>
+            <w:vAlign w:val="center"/>
+          </w:tcPr>
+          <w:p>
+            <w:pPr>
+              <w:spacing w:line="276" w:lineRule="auto"/>
+              <w:jc w:val="center"/>
+              <w:rPr>
+                <w:rFonts w:ascii="Arial" w:hAnsi="Arial" w:cs="Arial"/>
+                <w:b/>
+                <w:sz w:val="24"/>
+              </w:rPr>
+            </w:pPr>
+            <w:r>
+              <w:rPr>
+                <w:rFonts w:ascii="Arial" w:hAnsi="Arial" w:cs="Arial"/>
+                <w:b/>
+                <w:sz w:val="24"/>
+              </w:rPr>
+              <w:t>F1-Score</w:t>
+            </w:r>
+          </w:p>
+        </w:tc>
+      </w:tr>
+      <w:tr>
+        <w:tc>
+          <w:tcPr>
+            <w:tcW w:w="1698" w:type="dxa"/>
+            <w:vAlign w:val="center"/>
+          </w:tcPr>
+          <w:p>
+            <w:pPr>
+              <w:spacing w:line="276" w:lineRule="auto"/>
+              <w:jc w:val="center"/>
+              <w:rPr>
+                <w:rFonts w:ascii="Arial" w:hAnsi="Arial" w:cs="Arial"/>
+                <w:b/>
+                <w:sz w:val="24"/>
+              </w:rPr>
+            </w:pPr>
+            <w:r>
+              <w:rPr>
+                <w:rFonts w:ascii="Arial" w:hAnsi="Arial" w:cs="Arial"/>
+                <w:b/>
+                <w:sz w:val="24"/>
+              </w:rPr>
+              <w:t>KNN</w:t>
+            </w:r>
+          </w:p>
+        </w:tc>
+        <w:tc>
+          <w:tcPr>
+            <w:tcW w:w="1699" w:type="dxa"/>
+            <w:vAlign w:val="center"/>
+          </w:tcPr>
+          <w:p>
+            <w:pPr>
+              <w:spacing w:line="276" w:lineRule="auto"/>
+              <w:jc w:val="center"/>
+              <w:rPr>
+                <w:rFonts w:ascii="Arial" w:hAnsi="Arial" w:cs="Arial"/>
+                <w:sz w:val="24"/>
+              </w:rPr>
+            </w:pPr>
+            <w:r>
+              <w:rPr>
+                <w:rFonts w:ascii="Arial" w:hAnsi="Arial" w:cs="Arial"/>
+                <w:sz w:val="24"/>
+              </w:rPr>
+              <w:t>0.8012</w:t>
+            </w:r>
+          </w:p>
+        </w:tc>
+        <w:tc>
+          <w:tcPr>
+            <w:tcW w:w="1699" w:type="dxa"/>
+            <w:vAlign w:val="center"/>
+          </w:tcPr>
+          <w:p>
+            <w:pPr>
+              <w:spacing w:line="276" w:lineRule="auto"/>
+              <w:jc w:val="center"/>
+              <w:rPr>
+                <w:rFonts w:ascii="Arial" w:hAnsi="Arial" w:cs="Arial"/>
+                <w:sz w:val="24"/>
+              </w:rPr>
+            </w:pPr>
+            <w:r>
+              <w:rPr>
+                <w:rFonts w:ascii="Arial" w:hAnsi="Arial" w:cs="Arial"/>
+                <w:sz w:val="24"/>
+              </w:rPr>
+              <w:t>0.6698</w:t>
+            </w:r>
+          </w:p>
+        </w:tc>
+        <w:tc>
+          <w:tcPr>
+            <w:tcW w:w="1699" w:type="dxa"/>
+            <w:vAlign w:val="center"/>
+          </w:tcPr>
+          <w:p>
+            <w:pPr>
+              <w:spacing w:line="276" w:lineRule="auto"/>
+              <w:jc w:val="center"/>
+              <w:rPr>
+                <w:rFonts w:ascii="Arial" w:hAnsi="Arial" w:cs="Arial"/>
+                <w:sz w:val="24"/>
+              </w:rPr>
+            </w:pPr>
+            <w:r>
+              <w:rPr>
+                <w:rFonts w:ascii="Arial" w:hAnsi="Arial" w:cs="Arial"/>
+                <w:sz w:val="24"/>
+              </w:rPr>
+              <w:t>0.4004</w:t>
+            </w:r>
+          </w:p>
+        </w:tc>
+        <w:tc>
+          <w:tcPr>
+            <w:tcW w:w="1699" w:type="dxa"/>
+            <w:vAlign w:val="center"/>
+          </w:tcPr>
+          <w:p>
+            <w:pPr>
+              <w:spacing w:line="276" w:lineRule="auto"/>
+              <w:jc w:val="center"/>
+              <w:rPr>
+                <w:rFonts w:ascii="Arial" w:hAnsi="Arial" w:cs="Arial"/>
+                <w:sz w:val="24"/>
+              </w:rPr>
+            </w:pPr>
+            <w:r>
+              <w:rPr>
+                <w:rFonts w:ascii="Arial" w:hAnsi="Arial" w:cs="Arial"/>
+                <w:sz w:val="24"/>
+              </w:rPr>
+              <w:t>0.4934</w:t>
+            </w:r>
+          </w:p>
+        </w:tc>
+      </w:tr>
+      <w:tr>
+        <w:tc>
+          <w:tcPr>
+            <w:tcW w:w="1698" w:type="dxa"/>
+            <w:vAlign w:val="center"/>
+          </w:tcPr>
+          <w:p>
+            <w:pPr>
+              <w:spacing w:line="276" w:lineRule="auto"/>
+              <w:jc w:val="center"/>
+              <w:rPr>
+                <w:rFonts w:ascii="Arial" w:hAnsi="Arial" w:cs="Arial"/>
+                <w:b/>
+                <w:sz w:val="24"/>
+              </w:rPr>
+            </w:pPr>
+            <w:r>
+              <w:rPr>
+                <w:rFonts w:ascii="Arial" w:hAnsi="Arial" w:cs="Arial"/>
+                <w:b/>
+                <w:sz w:val="24"/>
+              </w:rPr>
+              <w:t>Random Forest</w:t>
+            </w:r>
+          </w:p>
+        </w:tc>
+        <w:tc>
+          <w:tcPr>
+            <w:tcW w:w="1699" w:type="dxa"/>
+            <w:vAlign w:val="center"/>
+          </w:tcPr>
+          <w:p>
+            <w:pPr>
+              <w:spacing w:line="276" w:lineRule="auto"/>
+              <w:jc w:val="center"/>
+              <w:rPr>
+                <w:rFonts w:ascii="Arial" w:hAnsi="Arial" w:cs="Arial"/>
+                <w:sz w:val="24"/>
+              </w:rPr>
+            </w:pPr>
+            <w:r>
+              <w:rPr>
+                <w:rFonts w:ascii="Arial" w:hAnsi="Arial" w:cs="Arial"/>
+                <w:sz w:val="24"/>
+              </w:rPr>
+              <w:t>0.8812</w:t>
+            </w:r>
+          </w:p>
+        </w:tc>
+        <w:tc>
+          <w:tcPr>
+            <w:tcW w:w="1699" w:type="dxa"/>
+            <w:vAlign w:val="center"/>
+          </w:tcPr>
+          <w:p>
+            <w:pPr>
+              <w:spacing w:line="276" w:lineRule="auto"/>
+              <w:jc w:val="center"/>
+              <w:rPr>
+                <w:rFonts w:ascii="Arial" w:hAnsi="Arial" w:cs="Arial"/>
+                <w:sz w:val="24"/>
+              </w:rPr>
+            </w:pPr>
+            <w:r>
+              <w:rPr>
+                <w:rFonts w:ascii="Arial" w:hAnsi="Arial" w:cs="Arial"/>
+                <w:sz w:val="24"/>
+              </w:rPr>
+              <w:t>0.8374</w:t>
+            </w:r>
+          </w:p>
+        </w:tc>
+        <w:tc>
+          <w:tcPr>
+            <w:tcW w:w="1699" w:type="dxa"/>
+            <w:vAlign w:val="center"/>
+          </w:tcPr>
+          <w:p>
+            <w:pPr>
+              <w:spacing w:line="276" w:lineRule="auto"/>
+              <w:jc w:val="center"/>
+              <w:rPr>
+                <w:rFonts w:ascii="Arial" w:hAnsi="Arial" w:cs="Arial"/>
+                <w:sz w:val="24"/>
+              </w:rPr>
+            </w:pPr>
+            <w:r>
+              <w:rPr>
+                <w:rFonts w:ascii="Arial" w:hAnsi="Arial" w:cs="Arial"/>
+                <w:sz w:val="24"/>
+              </w:rPr>
+              <w:t>0.6442</w:t>
+            </w:r>
+          </w:p>
+        </w:tc>
+        <w:tc>
+          <w:tcPr>
+            <w:tcW w:w="1699" w:type="dxa"/>
+            <w:vAlign w:val="center"/>
+          </w:tcPr>
+          <w:p>
+            <w:pPr>
+              <w:spacing w:line="276" w:lineRule="auto"/>
+              <w:jc w:val="center"/>
+              <w:rPr>
+                <w:rFonts w:ascii="Arial" w:hAnsi="Arial" w:cs="Arial"/>
+                <w:sz w:val="24"/>
+              </w:rPr>
+            </w:pPr>
+            <w:r>
+              <w:rPr>
+                <w:rFonts w:ascii="Arial" w:hAnsi="Arial" w:cs="Arial"/>
+                <w:sz w:val="24"/>
+              </w:rPr>
+              <w:t>0.7254</w:t>
+            </w:r>
+          </w:p>
+        </w:tc>
+      </w:tr>
+    </w:tbl>
+    <w:p>
+      <w:pPr>
+        <w:spacing w:line="276" w:lineRule="auto"/>
+        <w:jc w:val="both"/>
+        <w:rPr>
+          <w:rFonts w:ascii="Arial" w:hAnsi="Arial" w:cs="Arial"/>
+          <w:sz w:val="24"/>
+        </w:rPr>
+      </w:pPr>
+      <w:r>
+        <w:rPr>
+          <w:rFonts w:ascii="Arial" w:hAnsi="Arial" w:cs="Arial"/>
+          <w:sz w:val="24"/>
+        </w:rPr>
+        <w:t xml:space="preserve">Al comparar ambos algoritmos podemos ver una superioridad predictiva por parte del modelo de </w:t>
+      </w:r>
+      <w:r>
+        <w:rPr>
+          <w:rFonts w:ascii="Arial" w:hAnsi="Arial" w:cs="Arial"/>
+          <w:i/>
+          <w:sz w:val="24"/>
+        </w:rPr>
+        <w:t>Random Forest</w:t>
+      </w:r>
+      <w:r>
+        <w:rPr>
+          <w:rFonts w:ascii="Arial" w:hAnsi="Arial" w:cs="Arial"/>
+          <w:sz w:val="24"/>
+        </w:rPr>
+        <w:t xml:space="preserve"> frente al modelo basado en distancia </w:t>
+      </w:r>
+      <w:r>
+        <w:rPr>
+          <w:rFonts w:ascii="Arial" w:hAnsi="Arial" w:cs="Arial"/>
+          <w:i/>
+          <w:sz w:val="24"/>
+        </w:rPr>
+        <w:t>KNN.</w:t>
+      </w:r>
+    </w:p>
+    <w:p>
+      <w:pPr>
+        <w:spacing w:line="276" w:lineRule="auto"/>
+        <w:jc w:val="both"/>
+        <w:rPr>
+          <w:rFonts w:ascii="Arial" w:hAnsi="Arial" w:cs="Arial"/>
+          <w:sz w:val="24"/>
+        </w:rPr>
+      </w:pPr>
+      <w:r>
+        <w:rPr>
+          <w:rFonts w:ascii="Arial" w:hAnsi="Arial" w:cs="Arial"/>
+          <w:sz w:val="24"/>
+        </w:rPr>
+        <w:lastRenderedPageBreak/>
+        <w:t xml:space="preserve">Mientras que </w:t>
+      </w:r>
+      <w:r>
+        <w:rPr>
+          <w:rFonts w:ascii="Arial" w:hAnsi="Arial" w:cs="Arial"/>
+          <w:i/>
+          <w:sz w:val="24"/>
+        </w:rPr>
+        <w:t>KNN</w:t>
+      </w:r>
+      <w:r>
+        <w:rPr>
+          <w:rFonts w:ascii="Arial" w:hAnsi="Arial" w:cs="Arial"/>
+          <w:sz w:val="24"/>
+        </w:rPr>
+        <w:t xml:space="preserve"> tiene una exactitud alta (0.8012), sufre mucho para detectar la clase minoritaria logrando una sensibilidad de 0.4004. Esto significa que este modelo pasa por alto el 60% de los casos reales de riesgo.</w:t>
+      </w:r>
+    </w:p>
+    <w:p>
+      <w:pPr>
+        <w:spacing w:line="276" w:lineRule="auto"/>
+        <w:jc w:val="both"/>
+        <w:rPr>
+          <w:rFonts w:ascii="Arial" w:hAnsi="Arial" w:cs="Arial"/>
+          <w:sz w:val="24"/>
+        </w:rPr>
+      </w:pPr>
+      <w:r>
+        <w:rPr>
+          <w:rFonts w:ascii="Arial" w:hAnsi="Arial" w:cs="Arial"/>
+          <w:sz w:val="24"/>
+        </w:rPr>
+        <w:t xml:space="preserve">Por el contrario, el modelo </w:t>
+      </w:r>
+      <w:r>
+        <w:rPr>
+          <w:rFonts w:ascii="Arial" w:hAnsi="Arial" w:cs="Arial"/>
+          <w:i/>
+          <w:sz w:val="24"/>
+        </w:rPr>
+        <w:t>Random Forest</w:t>
+      </w:r>
+      <w:r>
+        <w:rPr>
+          <w:rFonts w:ascii="Arial" w:hAnsi="Arial" w:cs="Arial"/>
+          <w:sz w:val="24"/>
+        </w:rPr>
+        <w:t xml:space="preserve"> demuestra una capacidad superior para aislar las complejas interacciones climáticas que llevan al riesgo. Esto se refleja en un aumento de todas las métricas. Pero brilla principalmente en su precisión, ya que cuando lanza una alerta de plaga acierta casi el 84% de las ocasiones.</w:t>
+      </w:r>
+    </w:p>
+    <w:p>
+      <w:pPr>
+        <w:spacing w:line="276" w:lineRule="auto"/>
+        <w:jc w:val="both"/>
+        <w:rPr>
+          <w:rFonts w:ascii="Arial" w:hAnsi="Arial" w:cs="Arial"/>
+          <w:sz w:val="24"/>
+        </w:rPr>
+      </w:pPr>
+      <w:r>
+        <w:rPr>
+          <w:rFonts w:ascii="Arial" w:hAnsi="Arial" w:cs="Arial"/>
+          <w:sz w:val="24"/>
+        </w:rPr>
+        <w:t xml:space="preserve">Con estos resultados podemos validar nuestra hipótesis de anticipar un posible riesgo de plagas. Además, el modelo </w:t>
+      </w:r>
+      <w:r>
+        <w:rPr>
+          <w:rFonts w:ascii="Arial" w:hAnsi="Arial" w:cs="Arial"/>
+          <w:i/>
+          <w:sz w:val="24"/>
+        </w:rPr>
+        <w:t>Random Forest</w:t>
+      </w:r>
+      <w:r>
+        <w:rPr>
+          <w:rFonts w:ascii="Arial" w:hAnsi="Arial" w:cs="Arial"/>
+          <w:sz w:val="24"/>
+        </w:rPr>
+        <w:t xml:space="preserve"> se posiciona como una herramienta de agricultura prevent</w:t>
+      </w:r>
+      <w:r>
+        <w:rPr>
+          <w:rFonts w:ascii="Arial" w:hAnsi="Arial" w:cs="Arial"/>
+          <w:sz w:val="24"/>
+        </w:rPr>
+        <w:t>iva de alto valor. Su alta p</w:t>
+      </w:r>
+      <w:r>
+        <w:rPr>
+          <w:rFonts w:ascii="Arial" w:hAnsi="Arial" w:cs="Arial"/>
+          <w:sz w:val="24"/>
+        </w:rPr>
+        <w:t>recisión (0.8374) garantiza que los agricultores no desperdicien recursos económicos en falsas alarmas. A su vez, su capacidad para anticipar casi dos tercios de las situaciones de riesgo real (</w:t>
+      </w:r>
+      <w:r>
+        <w:rPr>
+          <w:rFonts w:ascii="Arial" w:hAnsi="Arial" w:cs="Arial"/>
+          <w:i/>
+          <w:sz w:val="24"/>
+        </w:rPr>
+        <w:t>Recall</w:t>
+      </w:r>
+      <w:r>
+        <w:rPr>
+          <w:rFonts w:ascii="Arial" w:hAnsi="Arial" w:cs="Arial"/>
+          <w:sz w:val="24"/>
+        </w:rPr>
+        <w:t xml:space="preserve"> de 0.6442) permite a las entidades implementar estrategias de mitigación de manera focalizada y eficiente, minimizando las pérdidas antes de que el daño sea irreversible.</w:t>
+      </w:r>
+    </w:p>
+    <w:p>
+      <w:pPr>
+        <w:pStyle w:val="Prrafodelista"/>
+        <w:numPr>
+          <w:ilvl w:val="1"/>
+          <w:numId w:val="7"/>
+        </w:numPr>
+        <w:spacing w:line="276" w:lineRule="auto"/>
+        <w:jc w:val="both"/>
+        <w:rPr>
+          <w:rFonts w:ascii="Arial" w:eastAsiaTheme="majorEastAsia" w:hAnsi="Arial" w:cs="Arial"/>
+          <w:b/>
+          <w:sz w:val="26"/>
+          <w:szCs w:val="26"/>
+        </w:rPr>
+      </w:pPr>
+      <w:r>
+        <w:rPr>
+          <w:rFonts w:ascii="Arial" w:eastAsiaTheme="majorEastAsia" w:hAnsi="Arial" w:cs="Arial"/>
+          <w:b/>
+          <w:sz w:val="26"/>
+          <w:szCs w:val="26"/>
+        </w:rPr>
+        <w:t>Segmentación de países por patrones productivos</w:t>
+      </w:r>
+    </w:p>
+    <w:p>
+      <w:pPr>
+        <w:spacing w:line="276" w:lineRule="auto"/>
+        <w:jc w:val="both"/>
+        <w:rPr>
+          <w:rFonts w:ascii="Arial" w:eastAsiaTheme="majorEastAsia" w:hAnsi="Arial" w:cs="Arial"/>
+          <w:sz w:val="24"/>
+          <w:szCs w:val="26"/>
+        </w:rPr>
+      </w:pPr>
+      <w:r>
+        <w:rPr>
+          <w:rFonts w:ascii="Arial" w:eastAsiaTheme="majorEastAsia" w:hAnsi="Arial" w:cs="Arial"/>
+          <w:sz w:val="24"/>
+          <w:szCs w:val="26"/>
+        </w:rPr>
+        <w:t>Tras la ejecución de los algoritmos se obtuvieron las siguientes métricas de rendimiento:</w:t>
+      </w:r>
+    </w:p>
+    <w:tbl>
+      <w:tblPr>
+        <w:tblStyle w:val="Tablaconcuadrcula"/>
+        <w:tblW w:w="0" w:type="auto"/>
+        <w:tblLook w:val="04A0" w:firstRow="1" w:lastRow="0" w:firstColumn="1" w:lastColumn="0" w:noHBand="0" w:noVBand="1"/>
+      </w:tblPr>
+      <w:tblGrid>
+        <w:gridCol w:w="1980"/>
+        <w:gridCol w:w="3260"/>
+        <w:gridCol w:w="3254"/>
+      </w:tblGrid>
+      <w:tr>
+        <w:tc>
+          <w:tcPr>
+            <w:tcW w:w="1980" w:type="dxa"/>
+            <w:vAlign w:val="center"/>
+          </w:tcPr>
+          <w:p>
+            <w:pPr>
+              <w:spacing w:line="276" w:lineRule="auto"/>
+              <w:jc w:val="center"/>
+              <w:rPr>
+                <w:rFonts w:ascii="Arial" w:eastAsiaTheme="majorEastAsia" w:hAnsi="Arial" w:cs="Arial"/>
+                <w:b/>
+                <w:sz w:val="24"/>
+                <w:szCs w:val="26"/>
+              </w:rPr>
+            </w:pPr>
+            <w:r>
+              <w:rPr>
+                <w:rFonts w:ascii="Arial" w:eastAsiaTheme="majorEastAsia" w:hAnsi="Arial" w:cs="Arial"/>
+                <w:b/>
+                <w:sz w:val="24"/>
+                <w:szCs w:val="26"/>
+              </w:rPr>
+              <w:t>Modelo</w:t>
+            </w:r>
+          </w:p>
+        </w:tc>
+        <w:tc>
+          <w:tcPr>
+            <w:tcW w:w="3260" w:type="dxa"/>
+            <w:vAlign w:val="center"/>
+          </w:tcPr>
+          <w:p>
+            <w:pPr>
+              <w:spacing w:line="276" w:lineRule="auto"/>
+              <w:jc w:val="center"/>
+              <w:rPr>
+                <w:rFonts w:ascii="Arial" w:eastAsiaTheme="majorEastAsia" w:hAnsi="Arial" w:cs="Arial"/>
+                <w:b/>
+                <w:sz w:val="24"/>
+                <w:szCs w:val="26"/>
+              </w:rPr>
+            </w:pPr>
+            <w:r>
+              <w:rPr>
+                <w:rFonts w:ascii="Arial" w:eastAsiaTheme="majorEastAsia" w:hAnsi="Arial" w:cs="Arial"/>
+                <w:b/>
+                <w:sz w:val="24"/>
+                <w:szCs w:val="26"/>
+              </w:rPr>
+              <w:t>Silhouette Score</w:t>
+            </w:r>
+          </w:p>
+        </w:tc>
+        <w:tc>
+          <w:tcPr>
+            <w:tcW w:w="3254" w:type="dxa"/>
+            <w:vAlign w:val="center"/>
+          </w:tcPr>
+          <w:p>
+            <w:pPr>
+              <w:spacing w:line="276" w:lineRule="auto"/>
+              <w:jc w:val="center"/>
+              <w:rPr>
+                <w:rFonts w:ascii="Arial" w:eastAsiaTheme="majorEastAsia" w:hAnsi="Arial" w:cs="Arial"/>
+                <w:b/>
+                <w:sz w:val="24"/>
+                <w:szCs w:val="26"/>
+              </w:rPr>
+            </w:pPr>
+            <w:r>
+              <w:rPr>
+                <w:rFonts w:ascii="Arial" w:eastAsiaTheme="majorEastAsia" w:hAnsi="Arial" w:cs="Arial"/>
+                <w:b/>
+                <w:sz w:val="24"/>
+                <w:szCs w:val="26"/>
+              </w:rPr>
+              <w:t>Davies-Bouldin Index</w:t>
+            </w:r>
+          </w:p>
+        </w:tc>
+      </w:tr>
+      <w:tr>
+        <w:tc>
+          <w:tcPr>
+            <w:tcW w:w="1980" w:type="dxa"/>
+            <w:vAlign w:val="center"/>
+          </w:tcPr>
+          <w:p>
+            <w:pPr>
+              <w:spacing w:line="276" w:lineRule="auto"/>
+              <w:jc w:val="center"/>
+              <w:rPr>
+                <w:rFonts w:ascii="Arial" w:eastAsiaTheme="majorEastAsia" w:hAnsi="Arial" w:cs="Arial"/>
+                <w:b/>
+                <w:sz w:val="24"/>
+                <w:szCs w:val="26"/>
+              </w:rPr>
+            </w:pPr>
+            <w:r>
+              <w:rPr>
+                <w:rFonts w:ascii="Arial" w:eastAsiaTheme="majorEastAsia" w:hAnsi="Arial" w:cs="Arial"/>
+                <w:b/>
+                <w:sz w:val="24"/>
+                <w:szCs w:val="26"/>
+              </w:rPr>
+              <w:t>K-Means</w:t>
+            </w:r>
+          </w:p>
+        </w:tc>
+        <w:tc>
+          <w:tcPr>
+            <w:tcW w:w="3260" w:type="dxa"/>
+            <w:vAlign w:val="center"/>
+          </w:tcPr>
+          <w:p>
+            <w:pPr>
+              <w:spacing w:line="276" w:lineRule="auto"/>
+              <w:jc w:val="center"/>
+              <w:rPr>
+                <w:rFonts w:ascii="Arial" w:eastAsiaTheme="majorEastAsia" w:hAnsi="Arial" w:cs="Arial"/>
+                <w:sz w:val="24"/>
+                <w:szCs w:val="26"/>
+              </w:rPr>
+            </w:pPr>
+            <w:r>
+              <w:rPr>
+                <w:rFonts w:ascii="Arial" w:eastAsiaTheme="majorEastAsia" w:hAnsi="Arial" w:cs="Arial"/>
+                <w:sz w:val="24"/>
+                <w:szCs w:val="26"/>
+              </w:rPr>
+              <w:t>0.2855</w:t>
+            </w:r>
+          </w:p>
+        </w:tc>
+        <w:tc>
+          <w:tcPr>
+            <w:tcW w:w="3254" w:type="dxa"/>
+            <w:vAlign w:val="center"/>
+          </w:tcPr>
+          <w:p>
+            <w:pPr>
+              <w:spacing w:line="276" w:lineRule="auto"/>
+              <w:jc w:val="center"/>
+              <w:rPr>
+                <w:rFonts w:ascii="Arial" w:eastAsiaTheme="majorEastAsia" w:hAnsi="Arial" w:cs="Arial"/>
+                <w:sz w:val="24"/>
+                <w:szCs w:val="26"/>
+              </w:rPr>
+            </w:pPr>
+            <w:r>
+              <w:rPr>
+                <w:rFonts w:ascii="Arial" w:eastAsiaTheme="majorEastAsia" w:hAnsi="Arial" w:cs="Arial"/>
+                <w:sz w:val="24"/>
+                <w:szCs w:val="26"/>
+              </w:rPr>
+              <w:t>0.3741</w:t>
+            </w:r>
+          </w:p>
+        </w:tc>
+      </w:tr>
+      <w:tr>
+        <w:tc>
+          <w:tcPr>
+            <w:tcW w:w="1980" w:type="dxa"/>
+            <w:vAlign w:val="center"/>
+          </w:tcPr>
+          <w:p>
+            <w:pPr>
+              <w:spacing w:line="276" w:lineRule="auto"/>
+              <w:jc w:val="center"/>
+              <w:rPr>
+                <w:rFonts w:ascii="Arial" w:eastAsiaTheme="majorEastAsia" w:hAnsi="Arial" w:cs="Arial"/>
+                <w:b/>
+                <w:sz w:val="24"/>
+                <w:szCs w:val="26"/>
+              </w:rPr>
+            </w:pPr>
+            <w:r>
+              <w:rPr>
+                <w:rFonts w:ascii="Arial" w:eastAsiaTheme="majorEastAsia" w:hAnsi="Arial" w:cs="Arial"/>
+                <w:b/>
+                <w:sz w:val="24"/>
+                <w:szCs w:val="26"/>
+              </w:rPr>
+              <w:t>DBSCAN</w:t>
+            </w:r>
+          </w:p>
+        </w:tc>
+        <w:tc>
+          <w:tcPr>
+            <w:tcW w:w="3260" w:type="dxa"/>
+            <w:vAlign w:val="center"/>
+          </w:tcPr>
+          <w:p>
+            <w:pPr>
+              <w:spacing w:line="276" w:lineRule="auto"/>
+              <w:jc w:val="center"/>
+              <w:rPr>
+                <w:rFonts w:ascii="Arial" w:eastAsiaTheme="majorEastAsia" w:hAnsi="Arial" w:cs="Arial"/>
+                <w:sz w:val="24"/>
+                <w:szCs w:val="26"/>
+              </w:rPr>
+            </w:pPr>
+            <w:r>
+              <w:rPr>
+                <w:rFonts w:ascii="Arial" w:eastAsiaTheme="majorEastAsia" w:hAnsi="Arial" w:cs="Arial"/>
+                <w:sz w:val="24"/>
+                <w:szCs w:val="26"/>
+              </w:rPr>
+              <w:t>0.0577</w:t>
+            </w:r>
+          </w:p>
+        </w:tc>
+        <w:tc>
+          <w:tcPr>
+            <w:tcW w:w="3254" w:type="dxa"/>
+            <w:vAlign w:val="center"/>
+          </w:tcPr>
+          <w:p>
+            <w:pPr>
+              <w:spacing w:line="276" w:lineRule="auto"/>
+              <w:jc w:val="center"/>
+              <w:rPr>
+                <w:rFonts w:ascii="Arial" w:eastAsiaTheme="majorEastAsia" w:hAnsi="Arial" w:cs="Arial"/>
+                <w:sz w:val="24"/>
+                <w:szCs w:val="26"/>
+              </w:rPr>
+            </w:pPr>
+            <w:r>
+              <w:rPr>
+                <w:rFonts w:ascii="Arial" w:eastAsiaTheme="majorEastAsia" w:hAnsi="Arial" w:cs="Arial"/>
+                <w:sz w:val="24"/>
+                <w:szCs w:val="26"/>
+              </w:rPr>
+              <w:t>1.842</w:t>
+            </w:r>
+          </w:p>
+        </w:tc>
+      </w:tr>
+    </w:tbl>
+    <w:p>
+      <w:pPr>
+        <w:spacing w:line="276" w:lineRule="auto"/>
+        <w:jc w:val="both"/>
+        <w:rPr>
+          <w:rFonts w:ascii="Arial" w:eastAsiaTheme="majorEastAsia" w:hAnsi="Arial" w:cs="Arial"/>
+          <w:sz w:val="24"/>
+          <w:szCs w:val="26"/>
+        </w:rPr>
+      </w:pPr>
+      <w:r>
+        <w:rPr>
+          <w:rFonts w:ascii="Arial" w:eastAsiaTheme="majorEastAsia" w:hAnsi="Arial" w:cs="Arial"/>
+          <w:sz w:val="24"/>
+          <w:szCs w:val="26"/>
+        </w:rPr>
+        <w:t xml:space="preserve">El contraste de las métricas revela una clara superioridad del modelo </w:t>
+      </w:r>
+      <w:r>
+        <w:rPr>
+          <w:rFonts w:ascii="Arial" w:eastAsiaTheme="majorEastAsia" w:hAnsi="Arial" w:cs="Arial"/>
+          <w:i/>
+          <w:sz w:val="24"/>
+          <w:szCs w:val="26"/>
+        </w:rPr>
+        <w:t>K-Means</w:t>
+      </w:r>
+      <w:r>
+        <w:rPr>
+          <w:rFonts w:ascii="Arial" w:eastAsiaTheme="majorEastAsia" w:hAnsi="Arial" w:cs="Arial"/>
+          <w:sz w:val="24"/>
+          <w:szCs w:val="26"/>
+        </w:rPr>
+        <w:t xml:space="preserve"> frente al DBSCAN para este conjunto de datos que hemos empleado.</w:t>
+      </w:r>
+    </w:p>
+    <w:p>
+      <w:pPr>
+        <w:spacing w:line="276" w:lineRule="auto"/>
+        <w:jc w:val="both"/>
+        <w:rPr>
+          <w:rFonts w:ascii="Arial" w:eastAsiaTheme="majorEastAsia" w:hAnsi="Arial" w:cs="Arial"/>
+          <w:sz w:val="24"/>
+          <w:szCs w:val="26"/>
+        </w:rPr>
+      </w:pPr>
+      <w:r>
+        <w:rPr>
+          <w:rFonts w:ascii="Arial" w:eastAsiaTheme="majorEastAsia" w:hAnsi="Arial" w:cs="Arial"/>
+          <w:sz w:val="24"/>
+          <w:szCs w:val="26"/>
+        </w:rPr>
+        <w:t xml:space="preserve">El valor del índice de </w:t>
+      </w:r>
+      <w:r>
+        <w:rPr>
+          <w:rFonts w:ascii="Arial" w:eastAsiaTheme="majorEastAsia" w:hAnsi="Arial" w:cs="Arial"/>
+          <w:i/>
+          <w:sz w:val="24"/>
+          <w:szCs w:val="26"/>
+        </w:rPr>
+        <w:t>Davies-Bouldin</w:t>
+      </w:r>
+      <w:r>
+        <w:rPr>
+          <w:rFonts w:ascii="Arial" w:eastAsiaTheme="majorEastAsia" w:hAnsi="Arial" w:cs="Arial"/>
+          <w:sz w:val="24"/>
+          <w:szCs w:val="26"/>
+        </w:rPr>
+        <w:t xml:space="preserve"> en el modelo de </w:t>
+      </w:r>
+      <w:r>
+        <w:rPr>
+          <w:rFonts w:ascii="Arial" w:eastAsiaTheme="majorEastAsia" w:hAnsi="Arial" w:cs="Arial"/>
+          <w:i/>
+          <w:sz w:val="24"/>
+          <w:szCs w:val="26"/>
+        </w:rPr>
+        <w:t>K-Means</w:t>
+      </w:r>
+      <w:r>
+        <w:rPr>
+          <w:rFonts w:ascii="Arial" w:eastAsiaTheme="majorEastAsia" w:hAnsi="Arial" w:cs="Arial"/>
+          <w:sz w:val="24"/>
+          <w:szCs w:val="26"/>
+        </w:rPr>
+        <w:t xml:space="preserve"> confirma que el algoritmo consiguió definir 3 grupos compactos. </w:t>
+      </w:r>
+      <w:r>
+        <w:rPr>
+          <w:rFonts w:ascii="Arial" w:eastAsiaTheme="majorEastAsia" w:hAnsi="Arial" w:cs="Arial"/>
+          <w:sz w:val="24"/>
+          <w:szCs w:val="26"/>
+        </w:rPr>
+        <w:t xml:space="preserve">El </w:t>
+      </w:r>
+      <w:r>
+        <w:rPr>
+          <w:rFonts w:ascii="Arial" w:eastAsiaTheme="majorEastAsia" w:hAnsi="Arial" w:cs="Arial"/>
+          <w:i/>
+          <w:sz w:val="24"/>
+          <w:szCs w:val="26"/>
+        </w:rPr>
+        <w:t>Silhouette Score</w:t>
+      </w:r>
+      <w:r>
+        <w:rPr>
+          <w:rFonts w:ascii="Arial" w:eastAsiaTheme="majorEastAsia" w:hAnsi="Arial" w:cs="Arial"/>
+          <w:sz w:val="24"/>
+          <w:szCs w:val="26"/>
+        </w:rPr>
+        <w:t xml:space="preserve"> de 0.2855 es un resultado robusto, lógico y muy positivo considerando la alta dimensionalidad del problema (decenas de variables per cápita creadas) y la heterogeneidad intrínseca de la macroeconomía de los países.</w:t>
+      </w:r>
+    </w:p>
+    <w:p>
+      <w:pPr>
+        <w:spacing w:line="276" w:lineRule="auto"/>
+        <w:jc w:val="both"/>
+        <w:rPr>
+          <w:rFonts w:ascii="Arial" w:hAnsi="Arial" w:cs="Arial"/>
+          <w:sz w:val="24"/>
+        </w:rPr>
+      </w:pPr>
+      <w:r>
+        <w:rPr>
+          <w:rFonts w:ascii="Arial" w:hAnsi="Arial" w:cs="Arial"/>
+          <w:sz w:val="24"/>
+        </w:rPr>
+        <w:t xml:space="preserve">Por el contrario, el pobre desempeño de </w:t>
+      </w:r>
+      <w:r>
+        <w:rPr>
+          <w:rFonts w:ascii="Arial" w:hAnsi="Arial" w:cs="Arial"/>
+          <w:i/>
+          <w:sz w:val="24"/>
+        </w:rPr>
+        <w:t>DBSCAN</w:t>
+      </w:r>
+      <w:r>
+        <w:rPr>
+          <w:rFonts w:ascii="Arial" w:hAnsi="Arial" w:cs="Arial"/>
+          <w:sz w:val="24"/>
+        </w:rPr>
+        <w:t xml:space="preserve"> (</w:t>
+      </w:r>
+      <w:r>
+        <w:rPr>
+          <w:rFonts w:ascii="Arial" w:hAnsi="Arial" w:cs="Arial"/>
+          <w:i/>
+          <w:sz w:val="24"/>
+        </w:rPr>
+        <w:t>Silhouette</w:t>
+      </w:r>
+      <w:r>
+        <w:rPr>
+          <w:rFonts w:ascii="Arial" w:hAnsi="Arial" w:cs="Arial"/>
+          <w:sz w:val="24"/>
+        </w:rPr>
+        <w:t xml:space="preserve"> cercano a 0 y </w:t>
+      </w:r>
+      <w:r>
+        <w:rPr>
+          <w:rFonts w:ascii="Arial" w:hAnsi="Arial" w:cs="Arial"/>
+          <w:i/>
+          <w:sz w:val="24"/>
+        </w:rPr>
+        <w:t>Davies-Bouldin</w:t>
+      </w:r>
+      <w:r>
+        <w:rPr>
+          <w:rFonts w:ascii="Arial" w:hAnsi="Arial" w:cs="Arial"/>
+          <w:sz w:val="24"/>
+        </w:rPr>
+        <w:t xml:space="preserve"> de 1.8042) es un reflejo directo de la naturaleza del algoritmo. Al basarse en la densidad, </w:t>
+      </w:r>
+      <w:r>
+        <w:rPr>
+          <w:rFonts w:ascii="Arial" w:hAnsi="Arial" w:cs="Arial"/>
+          <w:i/>
+          <w:sz w:val="24"/>
+        </w:rPr>
+        <w:t>DBSCAN</w:t>
+      </w:r>
+      <w:r>
+        <w:rPr>
+          <w:rFonts w:ascii="Arial" w:hAnsi="Arial" w:cs="Arial"/>
+          <w:sz w:val="24"/>
+        </w:rPr>
+        <w:t xml:space="preserve"> requiere un volumen de muestras considerable. Con un </w:t>
+      </w:r>
+      <w:r>
+        <w:rPr>
+          <w:rFonts w:ascii="Arial" w:hAnsi="Arial" w:cs="Arial"/>
+          <w:sz w:val="24"/>
+        </w:rPr>
+        <w:t>conjunto reducido de países</w:t>
+      </w:r>
+      <w:r>
+        <w:rPr>
+          <w:rFonts w:ascii="Arial" w:hAnsi="Arial" w:cs="Arial"/>
+          <w:sz w:val="24"/>
+        </w:rPr>
+        <w:t>, el espacio de datos es demasiado disperso, impidiendo que el algoritmo opere con eficacia y tendiendo a mezclar perfiles distintos o a clasificar a la mayoría del conjunto como ruido.</w:t>
+      </w:r>
+    </w:p>
+    <w:p>
+      <w:pPr>
+        <w:spacing w:line="276" w:lineRule="auto"/>
+        <w:jc w:val="both"/>
+        <w:rPr>
+          <w:rFonts w:ascii="Arial" w:hAnsi="Arial" w:cs="Arial"/>
+          <w:sz w:val="24"/>
+        </w:rPr>
+      </w:pPr>
+      <w:r>
+        <w:rPr>
+          <w:rFonts w:ascii="Arial" w:hAnsi="Arial" w:cs="Arial"/>
+          <w:sz w:val="24"/>
+        </w:rPr>
+        <w:t>Al analizar la composición de los 3 clústeres generados por el modelo, observamos un fenómeno estadístico muy revelador: el algoritmo ha identificado los modelos de Oceanía como anomalías globales (</w:t>
+      </w:r>
       <w:bookmarkStart w:id="0" w:name="_GoBack"/>
+      <w:r>
+        <w:rPr>
+          <w:rFonts w:ascii="Arial" w:hAnsi="Arial" w:cs="Arial"/>
+          <w:i/>
+          <w:sz w:val="24"/>
+        </w:rPr>
+        <w:t>outliers</w:t>
+      </w:r>
       <w:bookmarkEnd w:id="0"/>
-    </w:p>
-    <w:p>
-      <w:pPr>
+      <w:r>
+        <w:rPr>
+          <w:rFonts w:ascii="Arial" w:hAnsi="Arial" w:cs="Arial"/>
+          <w:sz w:val="24"/>
+        </w:rPr>
+        <w:t>), aislándolos en grupos propios y consolidando al resto de naciones en un macro-perfil estándar</w:t>
+      </w:r>
+      <w:r>
+        <w:rPr>
+          <w:rFonts w:ascii="Arial" w:hAnsi="Arial" w:cs="Arial"/>
+          <w:sz w:val="24"/>
+        </w:rPr>
+        <w:t>:</w:t>
+      </w:r>
+    </w:p>
+    <w:p>
+      <w:pPr>
+        <w:pStyle w:val="Prrafodelista"/>
+        <w:numPr>
+          <w:ilvl w:val="0"/>
+          <w:numId w:val="5"/>
+        </w:numPr>
         <w:spacing w:line="276" w:lineRule="auto"/>
         <w:jc w:val="both"/>
         <w:rPr>
@@ -15560,6 +17343,142 @@
           <w:sz w:val="24"/>
         </w:rPr>
       </w:pPr>
+      <w:r>
+        <w:rPr>
+          <w:rFonts w:ascii="Arial" w:hAnsi="Arial" w:cs="Arial"/>
+          <w:sz w:val="24"/>
+        </w:rPr>
+        <w:lastRenderedPageBreak/>
+        <w:t>Clúster 0: Este grupo representa la base</w:t>
+      </w:r>
+      <w:r>
+        <w:rPr>
+          <w:rFonts w:ascii="Arial" w:hAnsi="Arial" w:cs="Arial"/>
+          <w:sz w:val="24"/>
+        </w:rPr>
+        <w:t xml:space="preserve"> mundial. Aunque incluye países muy diversos en términos absolutos (como la escala masiva de China frente a la agricultura de España), sus proporciones per cápita y su equilibrio entre producción agrícola y ganadera se mantienen dentro de márge</w:t>
+      </w:r>
+      <w:r>
+        <w:rPr>
+          <w:rFonts w:ascii="Arial" w:hAnsi="Arial" w:cs="Arial"/>
+          <w:sz w:val="24"/>
+        </w:rPr>
+        <w:t>nes estadísticamente similares.</w:t>
+      </w:r>
+    </w:p>
+    <w:p>
+      <w:pPr>
+        <w:pStyle w:val="Prrafodelista"/>
+        <w:numPr>
+          <w:ilvl w:val="0"/>
+          <w:numId w:val="5"/>
+        </w:numPr>
+        <w:spacing w:line="276" w:lineRule="auto"/>
+        <w:jc w:val="both"/>
+        <w:rPr>
+          <w:rFonts w:ascii="Arial" w:hAnsi="Arial" w:cs="Arial"/>
+          <w:sz w:val="24"/>
+        </w:rPr>
+      </w:pPr>
+      <w:r>
+        <w:rPr>
+          <w:rFonts w:ascii="Arial" w:hAnsi="Arial" w:cs="Arial"/>
+          <w:sz w:val="24"/>
+        </w:rPr>
+        <w:t xml:space="preserve">Clúster 1: </w:t>
+      </w:r>
+      <w:r>
+        <w:rPr>
+          <w:rFonts w:ascii="Arial" w:hAnsi="Arial" w:cs="Arial"/>
+          <w:sz w:val="24"/>
+        </w:rPr>
+        <w:t>El algoritmo aísla a Nueva Zelanda debido a su híper-especialización. Presenta la e</w:t>
+      </w:r>
+      <w:r>
+        <w:rPr>
+          <w:rFonts w:ascii="Arial" w:hAnsi="Arial" w:cs="Arial"/>
+          <w:sz w:val="24"/>
+        </w:rPr>
+        <w:t>ficiencia agrícola más baja de todos los países</w:t>
+      </w:r>
+      <w:r>
+        <w:rPr>
+          <w:rFonts w:ascii="Arial" w:hAnsi="Arial" w:cs="Arial"/>
+          <w:sz w:val="24"/>
+        </w:rPr>
+        <w:t>, lo cual es coherente con un país donde la mayor parte de la superficie útil son p</w:t>
+      </w:r>
+      <w:r>
+        <w:rPr>
+          <w:rFonts w:ascii="Arial" w:hAnsi="Arial" w:cs="Arial"/>
+          <w:sz w:val="24"/>
+        </w:rPr>
+        <w:t xml:space="preserve">astos dedicados a la ganadería </w:t>
+      </w:r>
+      <w:r>
+        <w:rPr>
+          <w:rFonts w:ascii="Arial" w:hAnsi="Arial" w:cs="Arial"/>
+          <w:sz w:val="24"/>
+        </w:rPr>
+        <w:t xml:space="preserve">en lugar de cultivos agrícolas intensivos. Esta abrumadora carga ganadera por habitante hace que su </w:t>
+      </w:r>
+      <w:r>
+        <w:rPr>
+          <w:rFonts w:ascii="Arial" w:hAnsi="Arial" w:cs="Arial"/>
+          <w:sz w:val="24"/>
+        </w:rPr>
+        <w:t>perfil de emisiones de metano (CH4</w:t>
+      </w:r>
+      <w:r>
+        <w:rPr>
+          <w:rFonts w:ascii="Arial" w:hAnsi="Arial" w:cs="Arial"/>
+          <w:sz w:val="24"/>
+        </w:rPr>
+        <w:t>) y producción ganadera per cápita sea incomparable con el resto del mundo, justificando su separación matemática.</w:t>
+      </w:r>
+    </w:p>
+    <w:p>
+      <w:pPr>
+        <w:pStyle w:val="Prrafodelista"/>
+        <w:numPr>
+          <w:ilvl w:val="0"/>
+          <w:numId w:val="5"/>
+        </w:numPr>
+        <w:spacing w:line="276" w:lineRule="auto"/>
+        <w:jc w:val="both"/>
+        <w:rPr>
+          <w:rFonts w:ascii="Arial" w:hAnsi="Arial" w:cs="Arial"/>
+          <w:sz w:val="24"/>
+        </w:rPr>
+      </w:pPr>
+      <w:r>
+        <w:rPr>
+          <w:rFonts w:ascii="Arial" w:hAnsi="Arial" w:cs="Arial"/>
+          <w:sz w:val="24"/>
+        </w:rPr>
+        <w:t xml:space="preserve">Clúster 2: </w:t>
+      </w:r>
+      <w:r>
+        <w:rPr>
+          <w:rFonts w:ascii="Arial" w:hAnsi="Arial" w:cs="Arial"/>
+          <w:sz w:val="24"/>
+        </w:rPr>
+        <w:t xml:space="preserve">Australia forma su propio clúster al representar </w:t>
+      </w:r>
+      <w:r>
+        <w:rPr>
+          <w:rFonts w:ascii="Arial" w:hAnsi="Arial" w:cs="Arial"/>
+          <w:sz w:val="24"/>
+        </w:rPr>
+        <w:t>el extremo opuesto a Nueva Zelanda</w:t>
+      </w:r>
+      <w:r>
+        <w:rPr>
+          <w:rFonts w:ascii="Arial" w:hAnsi="Arial" w:cs="Arial"/>
+          <w:sz w:val="24"/>
+        </w:rPr>
+        <w:t>. Destaca por poseer la mayor eficiencia agrícola  combinada con la mayor extensión de superficie. Este perfil describe un modelo de agricultura capaz de generar enormes volúmenes de producción sostenida por una densidad poblacional muy baja.</w:t>
+      </w:r>
     </w:p>
     <w:p>
       <w:pPr>
@@ -15748,7 +17667,7 @@
           <w:rPr>
             <w:noProof/>
           </w:rPr>
-          <w:t>26</w:t>
+          <w:t>27</w:t>
         </w:r>
         <w:r>
           <w:fldChar w:fldCharType="end"/>
@@ -18189,7 +20108,7 @@
 </file>
 
 <file path=customXml/itemProps1.xml><?xml version="1.0" encoding="utf-8"?>
-<ds:datastoreItem xmlns:ds="http://schemas.openxmlformats.org/officeDocument/2006/customXml" ds:itemID="{51DD3726-52D8-456B-A2BC-3BF3B07F77C4}">
+<ds:datastoreItem xmlns:ds="http://schemas.openxmlformats.org/officeDocument/2006/customXml" ds:itemID="{595702B8-F93A-4EB9-9772-EFBFF75D92B0}">
   <ds:schemaRefs>
     <ds:schemaRef ds:uri="http://schemas.openxmlformats.org/officeDocument/2006/bibliography"/>
   </ds:schemaRefs>

</xml_diff>

<commit_message>
Introduccion, indice y modelos
</commit_message>
<xml_diff>
--- a/memoria.docx
+++ b/memoria.docx
@@ -459,15 +459,145 @@
     </w:p>
     <w:p>
       <w:pPr>
-        <w:rPr>
-          <w:color w:val="FF0000"/>
-        </w:rPr>
-      </w:pPr>
-      <w:r>
-        <w:rPr>
-          <w:color w:val="FF0000"/>
-        </w:rPr>
-        <w:t>TO DO</w:t>
+        <w:jc w:val="both"/>
+        <w:rPr>
+          <w:rFonts w:ascii="Arial" w:hAnsi="Arial" w:cs="Arial"/>
+          <w:sz w:val="24"/>
+          <w:szCs w:val="24"/>
+        </w:rPr>
+      </w:pPr>
+      <w:r>
+        <w:rPr>
+          <w:rFonts w:ascii="Arial" w:hAnsi="Arial" w:cs="Arial"/>
+          <w:sz w:val="24"/>
+          <w:szCs w:val="24"/>
+        </w:rPr>
+        <w:t>Este proyecto</w:t>
+      </w:r>
+      <w:r>
+        <w:rPr>
+          <w:rFonts w:ascii="Arial" w:hAnsi="Arial" w:cs="Arial"/>
+          <w:sz w:val="24"/>
+          <w:szCs w:val="24"/>
+        </w:rPr>
+        <w:t xml:space="preserve"> </w:t>
+      </w:r>
+      <w:r>
+        <w:rPr>
+          <w:rFonts w:ascii="Arial" w:hAnsi="Arial" w:cs="Arial"/>
+          <w:sz w:val="24"/>
+          <w:szCs w:val="24"/>
+        </w:rPr>
+        <w:t xml:space="preserve">consiste en el diseño y ejecución de un sistema integral de análisis aplicado a la agricultura y ganadería global. El objetivo fundamental es la integración de grandes volúmenes de datos provenientes de </w:t>
+      </w:r>
+      <w:r>
+        <w:rPr>
+          <w:rFonts w:ascii="Arial" w:hAnsi="Arial" w:cs="Arial"/>
+          <w:sz w:val="24"/>
+          <w:szCs w:val="24"/>
+        </w:rPr>
+        <w:t xml:space="preserve">las </w:t>
+      </w:r>
+      <w:r>
+        <w:rPr>
+          <w:rFonts w:ascii="Arial" w:hAnsi="Arial" w:cs="Arial"/>
+          <w:sz w:val="24"/>
+          <w:szCs w:val="24"/>
+        </w:rPr>
+        <w:t xml:space="preserve">fuentes </w:t>
+      </w:r>
+      <w:r>
+        <w:rPr>
+          <w:rFonts w:ascii="Arial" w:hAnsi="Arial" w:cs="Arial"/>
+          <w:sz w:val="24"/>
+          <w:szCs w:val="24"/>
+        </w:rPr>
+        <w:t>suministradas</w:t>
+      </w:r>
+      <w:r>
+        <w:rPr>
+          <w:rFonts w:ascii="Arial" w:hAnsi="Arial" w:cs="Arial"/>
+          <w:sz w:val="24"/>
+          <w:szCs w:val="24"/>
+        </w:rPr>
+        <w:t xml:space="preserve"> para generar conocimiento estratégico que facilite la toma de decisiones, mejore la sostenibilidad y permita una gestión eficiente de los recursos en el sector </w:t>
+      </w:r>
+      <w:r>
+        <w:rPr>
+          <w:rFonts w:ascii="Arial" w:hAnsi="Arial" w:cs="Arial"/>
+          <w:sz w:val="24"/>
+          <w:szCs w:val="24"/>
+        </w:rPr>
+        <w:t>agrícola y ganadero</w:t>
+      </w:r>
+    </w:p>
+    <w:p>
+      <w:pPr>
+        <w:jc w:val="both"/>
+        <w:rPr>
+          <w:rFonts w:ascii="Arial" w:hAnsi="Arial" w:cs="Arial"/>
+          <w:sz w:val="24"/>
+          <w:szCs w:val="24"/>
+        </w:rPr>
+      </w:pPr>
+      <w:r>
+        <w:rPr>
+          <w:rFonts w:ascii="Arial" w:hAnsi="Arial" w:cs="Arial"/>
+          <w:sz w:val="24"/>
+          <w:szCs w:val="24"/>
+        </w:rPr>
+        <w:t xml:space="preserve">La metodología se articula en torno a una robusta fase de prospección de información y procesos ETL. En esta etapa, se unificaron datos estructurados, semi-estructurados y no estructurados. Se aplicaron técnicas avanzadas de limpieza y calidad de datos para gestionar la presencia de valores nulos y anomalías temporales, asegurando la consistencia de los datasets mediante transformaciones de ingeniería de características y normalización de variables. El Análisis Exploratorio de Datos (EDA) posterior permitió identificar patrones de correlación entre el uso de </w:t>
+      </w:r>
+      <w:r>
+        <w:rPr>
+          <w:rFonts w:ascii="Arial" w:hAnsi="Arial" w:cs="Arial"/>
+          <w:sz w:val="24"/>
+          <w:szCs w:val="24"/>
+        </w:rPr>
+        <w:t>recursos</w:t>
+      </w:r>
+      <w:r>
+        <w:rPr>
+          <w:rFonts w:ascii="Arial" w:hAnsi="Arial" w:cs="Arial"/>
+          <w:sz w:val="24"/>
+          <w:szCs w:val="24"/>
+        </w:rPr>
+        <w:t>, el rendimiento productivo, el impacto ambiental de las emisiones ganaderas y la influencia del clima en los mercados</w:t>
+      </w:r>
+    </w:p>
+    <w:p>
+      <w:pPr>
+        <w:jc w:val="both"/>
+        <w:rPr>
+          <w:rFonts w:ascii="Arial" w:hAnsi="Arial" w:cs="Arial"/>
+          <w:sz w:val="24"/>
+          <w:szCs w:val="24"/>
+        </w:rPr>
+      </w:pPr>
+      <w:r>
+        <w:rPr>
+          <w:rFonts w:ascii="Arial" w:hAnsi="Arial" w:cs="Arial"/>
+          <w:sz w:val="24"/>
+          <w:szCs w:val="24"/>
+        </w:rPr>
+        <w:t>En el núcleo tecnológico del proyecto, se abordaron seis desafíos mediante modelos de Machine Learning: la predicción de rendimientos agrícolas, la clasificación de riesgo de plagas, la segmentación de perfiles productivos por países, la predicción de tendencias en los precios de mercado, la detección de anomalías en la producción y la recomendación de cultivos óptimos. Para ello, se implementaron y compararon diversas arquitecturas, incluyendo regresiones lineales, algoritmos de ensamble como Random Forest y XGBoost, redes neuronales profundas, y técnicas de aprendizaje no supervisado como K-Means y One-Class SVM.</w:t>
+      </w:r>
+    </w:p>
+    <w:p>
+      <w:pPr>
+        <w:rPr>
+          <w:rFonts w:ascii="Arial" w:hAnsi="Arial" w:cs="Arial"/>
+          <w:sz w:val="24"/>
+          <w:szCs w:val="24"/>
+        </w:rPr>
+      </w:pPr>
+      <w:r>
+        <w:rPr>
+          <w:rFonts w:ascii="Arial" w:hAnsi="Arial" w:cs="Arial"/>
+          <w:sz w:val="24"/>
+          <w:szCs w:val="24"/>
+        </w:rPr>
+        <w:br w:type="page"/>
       </w:r>
     </w:p>
     <w:p>
@@ -492,15 +622,1014 @@
     </w:p>
     <w:p>
       <w:pPr>
-        <w:rPr>
-          <w:color w:val="FF0000"/>
-        </w:rPr>
-      </w:pPr>
-      <w:r>
-        <w:rPr>
-          <w:color w:val="FF0000"/>
-        </w:rPr>
-        <w:t>TO DO</w:t>
+        <w:spacing w:after="120" w:line="240" w:lineRule="auto"/>
+        <w:ind w:left="708"/>
+        <w:rPr>
+          <w:rFonts w:ascii="Arial" w:hAnsi="Arial" w:cs="Arial"/>
+          <w:sz w:val="24"/>
+          <w:szCs w:val="24"/>
+        </w:rPr>
+      </w:pPr>
+      <w:r>
+        <w:rPr>
+          <w:rFonts w:ascii="Arial" w:hAnsi="Arial" w:cs="Arial"/>
+          <w:sz w:val="24"/>
+          <w:szCs w:val="24"/>
+        </w:rPr>
+        <w:t>Resumen</w:t>
+      </w:r>
+    </w:p>
+    <w:p>
+      <w:pPr>
+        <w:spacing w:after="120" w:line="240" w:lineRule="auto"/>
+        <w:ind w:left="708"/>
+        <w:rPr>
+          <w:rFonts w:ascii="Arial" w:hAnsi="Arial" w:cs="Arial"/>
+          <w:sz w:val="24"/>
+          <w:szCs w:val="24"/>
+        </w:rPr>
+      </w:pPr>
+      <w:r>
+        <w:rPr>
+          <w:rFonts w:ascii="Arial" w:hAnsi="Arial" w:cs="Arial"/>
+          <w:sz w:val="24"/>
+          <w:szCs w:val="24"/>
+        </w:rPr>
+        <w:t>Índice</w:t>
+      </w:r>
+    </w:p>
+    <w:p>
+      <w:pPr>
+        <w:spacing w:after="120" w:line="240" w:lineRule="auto"/>
+        <w:ind w:firstLine="708"/>
+        <w:rPr>
+          <w:rFonts w:ascii="Arial" w:hAnsi="Arial" w:cs="Arial"/>
+          <w:sz w:val="24"/>
+          <w:szCs w:val="24"/>
+        </w:rPr>
+      </w:pPr>
+      <w:r>
+        <w:rPr>
+          <w:rFonts w:ascii="Arial" w:hAnsi="Arial" w:cs="Arial"/>
+          <w:sz w:val="24"/>
+          <w:szCs w:val="24"/>
+        </w:rPr>
+        <w:t>1. E</w:t>
+      </w:r>
+      <w:r>
+        <w:rPr>
+          <w:rFonts w:ascii="Arial" w:hAnsi="Arial" w:cs="Arial"/>
+          <w:sz w:val="24"/>
+          <w:szCs w:val="24"/>
+        </w:rPr>
+        <w:t>stado</w:t>
+      </w:r>
+      <w:r>
+        <w:rPr>
+          <w:rFonts w:ascii="Arial" w:hAnsi="Arial" w:cs="Arial"/>
+          <w:sz w:val="24"/>
+          <w:szCs w:val="24"/>
+        </w:rPr>
+        <w:t xml:space="preserve"> del arte</w:t>
+      </w:r>
+    </w:p>
+    <w:p>
+      <w:pPr>
+        <w:spacing w:after="120" w:line="240" w:lineRule="auto"/>
+        <w:ind w:firstLine="708"/>
+        <w:rPr>
+          <w:rFonts w:ascii="Arial" w:hAnsi="Arial" w:cs="Arial"/>
+          <w:sz w:val="24"/>
+          <w:szCs w:val="24"/>
+        </w:rPr>
+      </w:pPr>
+      <w:r>
+        <w:rPr>
+          <w:rFonts w:ascii="Arial" w:hAnsi="Arial" w:cs="Arial"/>
+          <w:sz w:val="24"/>
+          <w:szCs w:val="24"/>
+        </w:rPr>
+        <w:t xml:space="preserve">2. </w:t>
+      </w:r>
+      <w:r>
+        <w:rPr>
+          <w:rFonts w:ascii="Arial" w:hAnsi="Arial" w:cs="Arial"/>
+          <w:sz w:val="24"/>
+          <w:szCs w:val="24"/>
+        </w:rPr>
+        <w:t>Dataset</w:t>
+      </w:r>
+    </w:p>
+    <w:p>
+      <w:pPr>
+        <w:spacing w:after="120" w:line="240" w:lineRule="auto"/>
+        <w:ind w:firstLine="708"/>
+        <w:rPr>
+          <w:rFonts w:ascii="Arial" w:hAnsi="Arial" w:cs="Arial"/>
+          <w:sz w:val="24"/>
+          <w:szCs w:val="24"/>
+        </w:rPr>
+      </w:pPr>
+      <w:r>
+        <w:rPr>
+          <w:rFonts w:ascii="Arial" w:hAnsi="Arial" w:cs="Arial"/>
+          <w:sz w:val="24"/>
+          <w:szCs w:val="24"/>
+        </w:rPr>
+        <w:t xml:space="preserve">3. </w:t>
+      </w:r>
+      <w:r>
+        <w:rPr>
+          <w:rFonts w:ascii="Arial" w:hAnsi="Arial" w:cs="Arial"/>
+          <w:sz w:val="24"/>
+          <w:szCs w:val="24"/>
+        </w:rPr>
+        <w:t>Metodología</w:t>
+      </w:r>
+    </w:p>
+    <w:p>
+      <w:pPr>
+        <w:spacing w:after="120" w:line="240" w:lineRule="auto"/>
+        <w:ind w:left="708" w:firstLine="708"/>
+        <w:rPr>
+          <w:rFonts w:ascii="Arial" w:hAnsi="Arial" w:cs="Arial"/>
+          <w:bCs/>
+          <w:sz w:val="24"/>
+          <w:szCs w:val="24"/>
+        </w:rPr>
+      </w:pPr>
+      <w:r>
+        <w:rPr>
+          <w:rFonts w:ascii="Arial" w:hAnsi="Arial" w:cs="Arial"/>
+          <w:sz w:val="24"/>
+          <w:szCs w:val="24"/>
+        </w:rPr>
+        <w:t xml:space="preserve">3.1. </w:t>
+      </w:r>
+      <w:r>
+        <w:rPr>
+          <w:rFonts w:ascii="Arial" w:hAnsi="Arial" w:cs="Arial"/>
+          <w:bCs/>
+          <w:sz w:val="24"/>
+          <w:szCs w:val="24"/>
+        </w:rPr>
+        <w:t>ETL</w:t>
+      </w:r>
+      <w:r>
+        <w:rPr>
+          <w:rFonts w:ascii="Arial" w:hAnsi="Arial" w:cs="Arial"/>
+          <w:bCs/>
+          <w:sz w:val="24"/>
+          <w:szCs w:val="24"/>
+        </w:rPr>
+        <w:t xml:space="preserve"> </w:t>
+      </w:r>
+      <w:r>
+        <w:rPr>
+          <w:rFonts w:ascii="Arial" w:hAnsi="Arial" w:cs="Arial"/>
+          <w:bCs/>
+          <w:sz w:val="24"/>
+          <w:szCs w:val="24"/>
+        </w:rPr>
+        <w:t>(</w:t>
+      </w:r>
+      <w:proofErr w:type="spellStart"/>
+      <w:r>
+        <w:rPr>
+          <w:rFonts w:ascii="Arial" w:hAnsi="Arial" w:cs="Arial"/>
+          <w:bCs/>
+          <w:sz w:val="24"/>
+          <w:szCs w:val="24"/>
+        </w:rPr>
+        <w:t>Extract</w:t>
+      </w:r>
+      <w:proofErr w:type="spellEnd"/>
+      <w:r>
+        <w:rPr>
+          <w:rFonts w:ascii="Arial" w:hAnsi="Arial" w:cs="Arial"/>
+          <w:bCs/>
+          <w:sz w:val="24"/>
+          <w:szCs w:val="24"/>
+        </w:rPr>
+        <w:t xml:space="preserve">, </w:t>
+      </w:r>
+      <w:proofErr w:type="spellStart"/>
+      <w:r>
+        <w:rPr>
+          <w:rFonts w:ascii="Arial" w:hAnsi="Arial" w:cs="Arial"/>
+          <w:bCs/>
+          <w:sz w:val="24"/>
+          <w:szCs w:val="24"/>
+        </w:rPr>
+        <w:t>transform</w:t>
+      </w:r>
+      <w:proofErr w:type="spellEnd"/>
+      <w:r>
+        <w:rPr>
+          <w:rFonts w:ascii="Arial" w:hAnsi="Arial" w:cs="Arial"/>
+          <w:bCs/>
+          <w:sz w:val="24"/>
+          <w:szCs w:val="24"/>
+        </w:rPr>
+        <w:t>, load)</w:t>
+      </w:r>
+    </w:p>
+    <w:p>
+      <w:pPr>
+        <w:tabs>
+          <w:tab w:val="left" w:pos="708"/>
+          <w:tab w:val="left" w:pos="1416"/>
+          <w:tab w:val="left" w:pos="2124"/>
+          <w:tab w:val="left" w:pos="2832"/>
+          <w:tab w:val="left" w:pos="3540"/>
+          <w:tab w:val="left" w:pos="4248"/>
+          <w:tab w:val="left" w:pos="4956"/>
+          <w:tab w:val="left" w:pos="5664"/>
+          <w:tab w:val="left" w:pos="6750"/>
+        </w:tabs>
+        <w:spacing w:after="120" w:line="240" w:lineRule="auto"/>
+        <w:ind w:left="708" w:firstLine="708"/>
+        <w:rPr>
+          <w:rFonts w:ascii="Arial" w:hAnsi="Arial" w:cs="Arial"/>
+          <w:bCs/>
+          <w:sz w:val="24"/>
+          <w:szCs w:val="24"/>
+        </w:rPr>
+      </w:pPr>
+      <w:r>
+        <w:rPr>
+          <w:rFonts w:ascii="Arial" w:hAnsi="Arial" w:cs="Arial"/>
+          <w:bCs/>
+          <w:sz w:val="24"/>
+          <w:szCs w:val="24"/>
+        </w:rPr>
+        <w:t xml:space="preserve">3.2. </w:t>
+      </w:r>
+      <w:r>
+        <w:rPr>
+          <w:rFonts w:ascii="Arial" w:hAnsi="Arial" w:cs="Arial"/>
+          <w:bCs/>
+          <w:sz w:val="24"/>
+          <w:szCs w:val="24"/>
+        </w:rPr>
+        <w:t>Análisis Exploratorio de Datos (EDA</w:t>
+      </w:r>
+      <w:r>
+        <w:rPr>
+          <w:rFonts w:ascii="Arial" w:hAnsi="Arial" w:cs="Arial"/>
+          <w:bCs/>
+          <w:sz w:val="24"/>
+          <w:szCs w:val="24"/>
+        </w:rPr>
+        <w:t>)</w:t>
+      </w:r>
+    </w:p>
+    <w:p>
+      <w:pPr>
+        <w:tabs>
+          <w:tab w:val="left" w:pos="708"/>
+          <w:tab w:val="left" w:pos="1416"/>
+          <w:tab w:val="left" w:pos="2124"/>
+          <w:tab w:val="left" w:pos="2832"/>
+          <w:tab w:val="left" w:pos="3540"/>
+          <w:tab w:val="left" w:pos="4248"/>
+          <w:tab w:val="left" w:pos="4956"/>
+          <w:tab w:val="left" w:pos="5664"/>
+          <w:tab w:val="left" w:pos="6750"/>
+        </w:tabs>
+        <w:spacing w:after="120" w:line="240" w:lineRule="auto"/>
+        <w:ind w:left="1416" w:firstLine="708"/>
+        <w:rPr>
+          <w:rFonts w:ascii="Arial" w:hAnsi="Arial" w:cs="Arial"/>
+          <w:bCs/>
+          <w:sz w:val="24"/>
+          <w:szCs w:val="24"/>
+        </w:rPr>
+      </w:pPr>
+      <w:r>
+        <w:rPr>
+          <w:rFonts w:ascii="Arial" w:hAnsi="Arial" w:cs="Arial"/>
+          <w:bCs/>
+          <w:sz w:val="24"/>
+          <w:szCs w:val="24"/>
+        </w:rPr>
+        <w:t xml:space="preserve">3.2.1. Datos </w:t>
+      </w:r>
+      <w:r>
+        <w:rPr>
+          <w:rFonts w:ascii="Arial" w:hAnsi="Arial" w:cs="Arial"/>
+          <w:bCs/>
+          <w:sz w:val="24"/>
+          <w:szCs w:val="24"/>
+        </w:rPr>
+        <w:t>estructurados</w:t>
+      </w:r>
+    </w:p>
+    <w:p>
+      <w:pPr>
+        <w:tabs>
+          <w:tab w:val="left" w:pos="708"/>
+          <w:tab w:val="left" w:pos="1416"/>
+          <w:tab w:val="left" w:pos="2124"/>
+          <w:tab w:val="left" w:pos="2832"/>
+          <w:tab w:val="left" w:pos="3540"/>
+          <w:tab w:val="left" w:pos="4248"/>
+          <w:tab w:val="left" w:pos="4956"/>
+          <w:tab w:val="left" w:pos="5664"/>
+          <w:tab w:val="left" w:pos="6750"/>
+        </w:tabs>
+        <w:spacing w:after="120" w:line="240" w:lineRule="auto"/>
+        <w:ind w:left="1416" w:firstLine="708"/>
+        <w:rPr>
+          <w:rFonts w:ascii="Arial" w:hAnsi="Arial" w:cs="Arial"/>
+          <w:bCs/>
+          <w:sz w:val="24"/>
+          <w:szCs w:val="24"/>
+        </w:rPr>
+      </w:pPr>
+      <w:r>
+        <w:rPr>
+          <w:rFonts w:ascii="Arial" w:hAnsi="Arial" w:cs="Arial"/>
+          <w:bCs/>
+          <w:sz w:val="24"/>
+          <w:szCs w:val="24"/>
+        </w:rPr>
+        <w:t xml:space="preserve">3.2.1. Datos </w:t>
+      </w:r>
+      <w:r>
+        <w:rPr>
+          <w:rFonts w:ascii="Arial" w:hAnsi="Arial" w:cs="Arial"/>
+          <w:bCs/>
+          <w:sz w:val="24"/>
+          <w:szCs w:val="24"/>
+        </w:rPr>
+        <w:t>Semi-</w:t>
+      </w:r>
+      <w:r>
+        <w:rPr>
+          <w:rFonts w:ascii="Arial" w:hAnsi="Arial" w:cs="Arial"/>
+          <w:bCs/>
+          <w:sz w:val="24"/>
+          <w:szCs w:val="24"/>
+        </w:rPr>
+        <w:t>estructurados</w:t>
+      </w:r>
+    </w:p>
+    <w:p>
+      <w:pPr>
+        <w:tabs>
+          <w:tab w:val="left" w:pos="708"/>
+          <w:tab w:val="left" w:pos="1416"/>
+          <w:tab w:val="left" w:pos="2124"/>
+          <w:tab w:val="left" w:pos="2832"/>
+          <w:tab w:val="left" w:pos="3540"/>
+          <w:tab w:val="left" w:pos="4248"/>
+          <w:tab w:val="left" w:pos="4956"/>
+          <w:tab w:val="left" w:pos="5664"/>
+          <w:tab w:val="left" w:pos="6750"/>
+        </w:tabs>
+        <w:spacing w:after="120" w:line="240" w:lineRule="auto"/>
+        <w:ind w:left="1416" w:firstLine="708"/>
+        <w:rPr>
+          <w:rFonts w:ascii="Arial" w:hAnsi="Arial" w:cs="Arial"/>
+          <w:bCs/>
+          <w:sz w:val="24"/>
+          <w:szCs w:val="24"/>
+        </w:rPr>
+      </w:pPr>
+      <w:r>
+        <w:rPr>
+          <w:rFonts w:ascii="Arial" w:hAnsi="Arial" w:cs="Arial"/>
+          <w:bCs/>
+          <w:sz w:val="24"/>
+          <w:szCs w:val="24"/>
+        </w:rPr>
+        <w:t xml:space="preserve">3.2.1. Datos </w:t>
+      </w:r>
+      <w:r>
+        <w:rPr>
+          <w:rFonts w:ascii="Arial" w:hAnsi="Arial" w:cs="Arial"/>
+          <w:bCs/>
+          <w:sz w:val="24"/>
+          <w:szCs w:val="24"/>
+        </w:rPr>
+        <w:t>No-</w:t>
+      </w:r>
+      <w:r>
+        <w:rPr>
+          <w:rFonts w:ascii="Arial" w:hAnsi="Arial" w:cs="Arial"/>
+          <w:bCs/>
+          <w:sz w:val="24"/>
+          <w:szCs w:val="24"/>
+        </w:rPr>
+        <w:t>estructurados</w:t>
+      </w:r>
+    </w:p>
+    <w:p>
+      <w:pPr>
+        <w:spacing w:after="120" w:line="240" w:lineRule="auto"/>
+        <w:ind w:left="708" w:firstLine="708"/>
+        <w:rPr>
+          <w:rFonts w:ascii="Arial" w:hAnsi="Arial" w:cs="Arial"/>
+          <w:sz w:val="24"/>
+          <w:szCs w:val="24"/>
+        </w:rPr>
+      </w:pPr>
+      <w:r>
+        <w:rPr>
+          <w:rFonts w:ascii="Arial" w:hAnsi="Arial" w:cs="Arial"/>
+          <w:sz w:val="24"/>
+          <w:szCs w:val="24"/>
+        </w:rPr>
+        <w:t xml:space="preserve">3.3. </w:t>
+      </w:r>
+      <w:r>
+        <w:rPr>
+          <w:rFonts w:ascii="Arial" w:hAnsi="Arial" w:cs="Arial"/>
+          <w:sz w:val="24"/>
+          <w:szCs w:val="24"/>
+        </w:rPr>
+        <w:t>Prospección</w:t>
+      </w:r>
+    </w:p>
+    <w:p>
+      <w:pPr>
+        <w:spacing w:after="120" w:line="240" w:lineRule="auto"/>
+        <w:ind w:left="1416" w:firstLine="708"/>
+        <w:rPr>
+          <w:rFonts w:ascii="Arial" w:hAnsi="Arial" w:cs="Arial"/>
+          <w:sz w:val="24"/>
+          <w:szCs w:val="24"/>
+        </w:rPr>
+      </w:pPr>
+      <w:r>
+        <w:rPr>
+          <w:rFonts w:ascii="Arial" w:hAnsi="Arial" w:cs="Arial"/>
+          <w:sz w:val="24"/>
+          <w:szCs w:val="24"/>
+        </w:rPr>
+        <w:t>Productividad</w:t>
+      </w:r>
+    </w:p>
+    <w:p>
+      <w:pPr>
+        <w:spacing w:after="120" w:line="240" w:lineRule="auto"/>
+        <w:ind w:left="1416" w:firstLine="708"/>
+        <w:rPr>
+          <w:rFonts w:ascii="Arial" w:hAnsi="Arial" w:cs="Arial"/>
+          <w:sz w:val="24"/>
+          <w:szCs w:val="24"/>
+        </w:rPr>
+      </w:pPr>
+      <w:r>
+        <w:rPr>
+          <w:rFonts w:ascii="Arial" w:hAnsi="Arial" w:cs="Arial"/>
+          <w:sz w:val="24"/>
+          <w:szCs w:val="24"/>
+        </w:rPr>
+        <w:t>Sostenibilidad</w:t>
+      </w:r>
+    </w:p>
+    <w:p>
+      <w:pPr>
+        <w:spacing w:after="120" w:line="240" w:lineRule="auto"/>
+        <w:ind w:left="1416" w:firstLine="708"/>
+        <w:rPr>
+          <w:rFonts w:ascii="Arial" w:hAnsi="Arial" w:cs="Arial"/>
+          <w:sz w:val="24"/>
+          <w:szCs w:val="24"/>
+        </w:rPr>
+      </w:pPr>
+      <w:r>
+        <w:rPr>
+          <w:rFonts w:ascii="Arial" w:hAnsi="Arial" w:cs="Arial"/>
+          <w:sz w:val="24"/>
+          <w:szCs w:val="24"/>
+        </w:rPr>
+        <w:t>Riesgo climático</w:t>
+      </w:r>
+    </w:p>
+    <w:p>
+      <w:pPr>
+        <w:spacing w:after="120" w:line="240" w:lineRule="auto"/>
+        <w:ind w:left="1416" w:firstLine="708"/>
+        <w:rPr>
+          <w:rFonts w:ascii="Arial" w:hAnsi="Arial" w:cs="Arial"/>
+          <w:sz w:val="24"/>
+          <w:szCs w:val="24"/>
+        </w:rPr>
+      </w:pPr>
+      <w:r>
+        <w:rPr>
+          <w:rFonts w:ascii="Arial" w:hAnsi="Arial" w:cs="Arial"/>
+          <w:sz w:val="24"/>
+          <w:szCs w:val="24"/>
+        </w:rPr>
+        <w:t>Mercados</w:t>
+      </w:r>
+    </w:p>
+    <w:p>
+      <w:pPr>
+        <w:spacing w:after="120" w:line="240" w:lineRule="auto"/>
+        <w:ind w:left="1416" w:firstLine="708"/>
+        <w:rPr>
+          <w:rFonts w:ascii="Arial" w:hAnsi="Arial" w:cs="Arial"/>
+          <w:sz w:val="24"/>
+          <w:szCs w:val="24"/>
+        </w:rPr>
+      </w:pPr>
+      <w:r>
+        <w:rPr>
+          <w:rFonts w:ascii="Arial" w:hAnsi="Arial" w:cs="Arial"/>
+          <w:sz w:val="24"/>
+          <w:szCs w:val="24"/>
+        </w:rPr>
+        <w:t>Políticas</w:t>
+      </w:r>
+    </w:p>
+    <w:p>
+      <w:pPr>
+        <w:spacing w:after="120" w:line="240" w:lineRule="auto"/>
+        <w:ind w:left="1416" w:firstLine="708"/>
+        <w:rPr>
+          <w:rFonts w:ascii="Arial" w:hAnsi="Arial" w:cs="Arial"/>
+          <w:sz w:val="24"/>
+          <w:szCs w:val="24"/>
+        </w:rPr>
+      </w:pPr>
+      <w:r>
+        <w:rPr>
+          <w:rFonts w:ascii="Arial" w:hAnsi="Arial" w:cs="Arial"/>
+          <w:sz w:val="24"/>
+          <w:szCs w:val="24"/>
+        </w:rPr>
+        <w:t>Sanidad Vegetal</w:t>
+      </w:r>
+    </w:p>
+    <w:p>
+      <w:pPr>
+        <w:spacing w:after="120" w:line="240" w:lineRule="auto"/>
+        <w:ind w:left="708" w:firstLine="708"/>
+        <w:rPr>
+          <w:rFonts w:ascii="Arial" w:hAnsi="Arial" w:cs="Arial"/>
+          <w:sz w:val="24"/>
+          <w:szCs w:val="24"/>
+        </w:rPr>
+      </w:pPr>
+      <w:r>
+        <w:rPr>
+          <w:rFonts w:ascii="Arial" w:hAnsi="Arial" w:cs="Arial"/>
+          <w:sz w:val="24"/>
+          <w:szCs w:val="24"/>
+        </w:rPr>
+        <w:t>3.4. Machine Learning</w:t>
+      </w:r>
+    </w:p>
+    <w:p>
+      <w:pPr>
+        <w:spacing w:after="120" w:line="240" w:lineRule="auto"/>
+        <w:ind w:left="1416" w:firstLine="708"/>
+        <w:rPr>
+          <w:rFonts w:ascii="Arial" w:hAnsi="Arial" w:cs="Arial"/>
+          <w:sz w:val="24"/>
+          <w:szCs w:val="24"/>
+        </w:rPr>
+      </w:pPr>
+      <w:r>
+        <w:rPr>
+          <w:rFonts w:ascii="Arial" w:hAnsi="Arial" w:cs="Arial"/>
+          <w:sz w:val="24"/>
+          <w:szCs w:val="24"/>
+        </w:rPr>
+        <w:t xml:space="preserve">3.4.1. </w:t>
+      </w:r>
+      <w:r>
+        <w:rPr>
+          <w:rFonts w:ascii="Arial" w:hAnsi="Arial" w:cs="Arial"/>
+          <w:sz w:val="24"/>
+          <w:szCs w:val="24"/>
+        </w:rPr>
+        <w:t>Predicción de Rendimiento</w:t>
+      </w:r>
+      <w:r>
+        <w:rPr>
+          <w:rFonts w:ascii="Arial" w:hAnsi="Arial" w:cs="Arial"/>
+          <w:sz w:val="24"/>
+          <w:szCs w:val="24"/>
+        </w:rPr>
+        <w:t xml:space="preserve"> Agricola</w:t>
+      </w:r>
+    </w:p>
+    <w:p>
+      <w:pPr>
+        <w:spacing w:after="120" w:line="240" w:lineRule="auto"/>
+        <w:ind w:left="1416" w:firstLine="708"/>
+        <w:rPr>
+          <w:rFonts w:ascii="Arial" w:hAnsi="Arial" w:cs="Arial"/>
+          <w:sz w:val="24"/>
+          <w:szCs w:val="24"/>
+        </w:rPr>
+      </w:pPr>
+      <w:r>
+        <w:rPr>
+          <w:rFonts w:ascii="Arial" w:hAnsi="Arial" w:cs="Arial"/>
+          <w:sz w:val="24"/>
+          <w:szCs w:val="24"/>
+        </w:rPr>
+        <w:t>3.4.</w:t>
+      </w:r>
+      <w:r>
+        <w:rPr>
+          <w:rFonts w:ascii="Arial" w:hAnsi="Arial" w:cs="Arial"/>
+          <w:sz w:val="24"/>
+          <w:szCs w:val="24"/>
+        </w:rPr>
+        <w:t>2</w:t>
+      </w:r>
+      <w:r>
+        <w:rPr>
+          <w:rFonts w:ascii="Arial" w:hAnsi="Arial" w:cs="Arial"/>
+          <w:sz w:val="24"/>
+          <w:szCs w:val="24"/>
+        </w:rPr>
+        <w:t xml:space="preserve">. </w:t>
+      </w:r>
+      <w:r>
+        <w:rPr>
+          <w:rFonts w:ascii="Arial" w:hAnsi="Arial" w:cs="Arial"/>
+          <w:sz w:val="24"/>
+          <w:szCs w:val="24"/>
+        </w:rPr>
+        <w:t>Clasificación de riesgo</w:t>
+      </w:r>
+      <w:r>
+        <w:rPr>
+          <w:rFonts w:ascii="Arial" w:hAnsi="Arial" w:cs="Arial"/>
+          <w:sz w:val="24"/>
+          <w:szCs w:val="24"/>
+        </w:rPr>
+        <w:t xml:space="preserve"> de plagas</w:t>
+      </w:r>
+    </w:p>
+    <w:p>
+      <w:pPr>
+        <w:spacing w:after="120" w:line="240" w:lineRule="auto"/>
+        <w:ind w:left="1416" w:firstLine="708"/>
+        <w:rPr>
+          <w:rFonts w:ascii="Arial" w:hAnsi="Arial" w:cs="Arial"/>
+          <w:sz w:val="24"/>
+          <w:szCs w:val="24"/>
+        </w:rPr>
+      </w:pPr>
+      <w:r>
+        <w:rPr>
+          <w:rFonts w:ascii="Arial" w:hAnsi="Arial" w:cs="Arial"/>
+          <w:sz w:val="24"/>
+          <w:szCs w:val="24"/>
+        </w:rPr>
+        <w:t>3.4.</w:t>
+      </w:r>
+      <w:r>
+        <w:rPr>
+          <w:rFonts w:ascii="Arial" w:hAnsi="Arial" w:cs="Arial"/>
+          <w:sz w:val="24"/>
+          <w:szCs w:val="24"/>
+        </w:rPr>
+        <w:t>3</w:t>
+      </w:r>
+      <w:r>
+        <w:rPr>
+          <w:rFonts w:ascii="Arial" w:hAnsi="Arial" w:cs="Arial"/>
+          <w:sz w:val="24"/>
+          <w:szCs w:val="24"/>
+        </w:rPr>
+        <w:t xml:space="preserve">. </w:t>
+      </w:r>
+      <w:r>
+        <w:rPr>
+          <w:rFonts w:ascii="Arial" w:hAnsi="Arial" w:cs="Arial"/>
+          <w:sz w:val="24"/>
+          <w:szCs w:val="24"/>
+        </w:rPr>
+        <w:t>Segmentación de países por patrones</w:t>
+      </w:r>
+      <w:r>
+        <w:rPr>
+          <w:rFonts w:ascii="Arial" w:hAnsi="Arial" w:cs="Arial"/>
+          <w:sz w:val="24"/>
+          <w:szCs w:val="24"/>
+        </w:rPr>
+        <w:t xml:space="preserve"> productivos</w:t>
+      </w:r>
+    </w:p>
+    <w:p>
+      <w:pPr>
+        <w:spacing w:after="120" w:line="240" w:lineRule="auto"/>
+        <w:ind w:left="1416" w:firstLine="708"/>
+        <w:rPr>
+          <w:rFonts w:ascii="Arial" w:hAnsi="Arial" w:cs="Arial"/>
+          <w:sz w:val="24"/>
+          <w:szCs w:val="24"/>
+        </w:rPr>
+      </w:pPr>
+      <w:r>
+        <w:rPr>
+          <w:rFonts w:ascii="Arial" w:hAnsi="Arial" w:cs="Arial"/>
+          <w:sz w:val="24"/>
+          <w:szCs w:val="24"/>
+        </w:rPr>
+        <w:t>3.4.</w:t>
+      </w:r>
+      <w:r>
+        <w:rPr>
+          <w:rFonts w:ascii="Arial" w:hAnsi="Arial" w:cs="Arial"/>
+          <w:sz w:val="24"/>
+          <w:szCs w:val="24"/>
+        </w:rPr>
+        <w:t>4</w:t>
+      </w:r>
+      <w:r>
+        <w:rPr>
+          <w:rFonts w:ascii="Arial" w:hAnsi="Arial" w:cs="Arial"/>
+          <w:sz w:val="24"/>
+          <w:szCs w:val="24"/>
+        </w:rPr>
+        <w:t xml:space="preserve">. </w:t>
+      </w:r>
+      <w:r>
+        <w:rPr>
+          <w:rFonts w:ascii="Arial" w:hAnsi="Arial" w:cs="Arial"/>
+          <w:sz w:val="24"/>
+          <w:szCs w:val="24"/>
+        </w:rPr>
+        <w:t>Predicción de precios de</w:t>
+      </w:r>
+      <w:r>
+        <w:rPr>
+          <w:rFonts w:ascii="Arial" w:hAnsi="Arial" w:cs="Arial"/>
+          <w:sz w:val="24"/>
+          <w:szCs w:val="24"/>
+        </w:rPr>
+        <w:t xml:space="preserve"> mercado</w:t>
+      </w:r>
+    </w:p>
+    <w:p>
+      <w:pPr>
+        <w:spacing w:after="120" w:line="240" w:lineRule="auto"/>
+        <w:ind w:left="1416" w:firstLine="708"/>
+        <w:rPr>
+          <w:rFonts w:ascii="Arial" w:hAnsi="Arial" w:cs="Arial"/>
+          <w:sz w:val="24"/>
+          <w:szCs w:val="24"/>
+        </w:rPr>
+      </w:pPr>
+      <w:r>
+        <w:rPr>
+          <w:rFonts w:ascii="Arial" w:hAnsi="Arial" w:cs="Arial"/>
+          <w:sz w:val="24"/>
+          <w:szCs w:val="24"/>
+        </w:rPr>
+        <w:t>3.4.</w:t>
+      </w:r>
+      <w:r>
+        <w:rPr>
+          <w:rFonts w:ascii="Arial" w:hAnsi="Arial" w:cs="Arial"/>
+          <w:sz w:val="24"/>
+          <w:szCs w:val="24"/>
+        </w:rPr>
+        <w:t>5</w:t>
+      </w:r>
+      <w:r>
+        <w:rPr>
+          <w:rFonts w:ascii="Arial" w:hAnsi="Arial" w:cs="Arial"/>
+          <w:sz w:val="24"/>
+          <w:szCs w:val="24"/>
+        </w:rPr>
+        <w:t xml:space="preserve">. </w:t>
+      </w:r>
+      <w:r>
+        <w:rPr>
+          <w:rFonts w:ascii="Arial" w:hAnsi="Arial" w:cs="Arial"/>
+          <w:sz w:val="24"/>
+          <w:szCs w:val="24"/>
+        </w:rPr>
+        <w:t>Detección de Anomalías en</w:t>
+      </w:r>
+      <w:r>
+        <w:rPr>
+          <w:rFonts w:ascii="Arial" w:hAnsi="Arial" w:cs="Arial"/>
+          <w:sz w:val="24"/>
+          <w:szCs w:val="24"/>
+        </w:rPr>
+        <w:t xml:space="preserve"> producción</w:t>
+      </w:r>
+    </w:p>
+    <w:p>
+      <w:pPr>
+        <w:spacing w:after="120" w:line="240" w:lineRule="auto"/>
+        <w:ind w:left="1416" w:firstLine="708"/>
+        <w:rPr>
+          <w:rFonts w:ascii="Arial" w:hAnsi="Arial" w:cs="Arial"/>
+          <w:sz w:val="24"/>
+          <w:szCs w:val="24"/>
+        </w:rPr>
+      </w:pPr>
+      <w:r>
+        <w:rPr>
+          <w:rFonts w:ascii="Arial" w:hAnsi="Arial" w:cs="Arial"/>
+          <w:sz w:val="24"/>
+          <w:szCs w:val="24"/>
+        </w:rPr>
+        <w:t>3.4.</w:t>
+      </w:r>
+      <w:r>
+        <w:rPr>
+          <w:rFonts w:ascii="Arial" w:hAnsi="Arial" w:cs="Arial"/>
+          <w:sz w:val="24"/>
+          <w:szCs w:val="24"/>
+        </w:rPr>
+        <w:t>6</w:t>
+      </w:r>
+      <w:r>
+        <w:rPr>
+          <w:rFonts w:ascii="Arial" w:hAnsi="Arial" w:cs="Arial"/>
+          <w:sz w:val="24"/>
+          <w:szCs w:val="24"/>
+        </w:rPr>
+        <w:t xml:space="preserve">. </w:t>
+      </w:r>
+      <w:r>
+        <w:rPr>
+          <w:rFonts w:ascii="Arial" w:hAnsi="Arial" w:cs="Arial"/>
+          <w:sz w:val="24"/>
+          <w:szCs w:val="24"/>
+        </w:rPr>
+        <w:t>Recomendación de C</w:t>
+      </w:r>
+      <w:r>
+        <w:rPr>
+          <w:rFonts w:ascii="Arial" w:hAnsi="Arial" w:cs="Arial"/>
+          <w:sz w:val="24"/>
+          <w:szCs w:val="24"/>
+        </w:rPr>
+        <w:t>ultivos</w:t>
+      </w:r>
+    </w:p>
+    <w:p>
+      <w:pPr>
+        <w:spacing w:after="120" w:line="240" w:lineRule="auto"/>
+        <w:ind w:left="708"/>
+        <w:rPr>
+          <w:rFonts w:ascii="Arial" w:hAnsi="Arial" w:cs="Arial"/>
+          <w:sz w:val="24"/>
+          <w:szCs w:val="24"/>
+        </w:rPr>
+      </w:pPr>
+      <w:r>
+        <w:rPr>
+          <w:rFonts w:ascii="Arial" w:hAnsi="Arial" w:cs="Arial"/>
+          <w:sz w:val="24"/>
+          <w:szCs w:val="24"/>
+        </w:rPr>
+        <w:t>4. Resultados</w:t>
+      </w:r>
+    </w:p>
+    <w:p>
+      <w:pPr>
+        <w:spacing w:after="120" w:line="240" w:lineRule="auto"/>
+        <w:ind w:left="708" w:firstLine="708"/>
+        <w:rPr>
+          <w:rFonts w:ascii="Arial" w:hAnsi="Arial" w:cs="Arial"/>
+          <w:sz w:val="24"/>
+          <w:szCs w:val="24"/>
+        </w:rPr>
+      </w:pPr>
+      <w:r>
+        <w:rPr>
+          <w:rFonts w:ascii="Arial" w:hAnsi="Arial" w:cs="Arial"/>
+          <w:sz w:val="24"/>
+          <w:szCs w:val="24"/>
+        </w:rPr>
+        <w:t>4.1. Predicción de Rendimiento Agricola</w:t>
+      </w:r>
+    </w:p>
+    <w:p>
+      <w:pPr>
+        <w:spacing w:after="120" w:line="240" w:lineRule="auto"/>
+        <w:ind w:left="708" w:firstLine="708"/>
+        <w:rPr>
+          <w:rFonts w:ascii="Arial" w:hAnsi="Arial" w:cs="Arial"/>
+          <w:sz w:val="24"/>
+          <w:szCs w:val="24"/>
+        </w:rPr>
+      </w:pPr>
+      <w:r>
+        <w:rPr>
+          <w:rFonts w:ascii="Arial" w:hAnsi="Arial" w:cs="Arial"/>
+          <w:sz w:val="24"/>
+          <w:szCs w:val="24"/>
+        </w:rPr>
+        <w:t>4.2. Clasificación de riesgo de plagas</w:t>
+      </w:r>
+    </w:p>
+    <w:p>
+      <w:pPr>
+        <w:spacing w:after="120" w:line="240" w:lineRule="auto"/>
+        <w:ind w:left="708" w:firstLine="708"/>
+        <w:rPr>
+          <w:rFonts w:ascii="Arial" w:hAnsi="Arial" w:cs="Arial"/>
+          <w:sz w:val="24"/>
+          <w:szCs w:val="24"/>
+        </w:rPr>
+      </w:pPr>
+      <w:r>
+        <w:rPr>
+          <w:rFonts w:ascii="Arial" w:hAnsi="Arial" w:cs="Arial"/>
+          <w:sz w:val="24"/>
+          <w:szCs w:val="24"/>
+        </w:rPr>
+        <w:t>4.3. Segmentación de países por patrones productivos</w:t>
+      </w:r>
+    </w:p>
+    <w:p>
+      <w:pPr>
+        <w:spacing w:after="120" w:line="240" w:lineRule="auto"/>
+        <w:ind w:left="708" w:firstLine="708"/>
+        <w:rPr>
+          <w:rFonts w:ascii="Arial" w:hAnsi="Arial" w:cs="Arial"/>
+          <w:sz w:val="24"/>
+          <w:szCs w:val="24"/>
+        </w:rPr>
+      </w:pPr>
+      <w:r>
+        <w:rPr>
+          <w:rFonts w:ascii="Arial" w:hAnsi="Arial" w:cs="Arial"/>
+          <w:sz w:val="24"/>
+          <w:szCs w:val="24"/>
+        </w:rPr>
+        <w:t>4.4. Predicción de precios de mercado</w:t>
+      </w:r>
+    </w:p>
+    <w:p>
+      <w:pPr>
+        <w:spacing w:after="120" w:line="240" w:lineRule="auto"/>
+        <w:ind w:left="708" w:firstLine="708"/>
+        <w:rPr>
+          <w:rFonts w:ascii="Arial" w:hAnsi="Arial" w:cs="Arial"/>
+          <w:sz w:val="24"/>
+          <w:szCs w:val="24"/>
+        </w:rPr>
+      </w:pPr>
+      <w:r>
+        <w:rPr>
+          <w:rFonts w:ascii="Arial" w:hAnsi="Arial" w:cs="Arial"/>
+          <w:sz w:val="24"/>
+          <w:szCs w:val="24"/>
+        </w:rPr>
+        <w:t>4.5. Detección de Anomalías en producción</w:t>
+      </w:r>
+    </w:p>
+    <w:p>
+      <w:pPr>
+        <w:spacing w:after="120" w:line="240" w:lineRule="auto"/>
+        <w:ind w:left="1416"/>
+        <w:rPr>
+          <w:rFonts w:ascii="Arial" w:hAnsi="Arial" w:cs="Arial"/>
+          <w:sz w:val="24"/>
+          <w:szCs w:val="24"/>
+        </w:rPr>
+      </w:pPr>
+      <w:r>
+        <w:rPr>
+          <w:rFonts w:ascii="Arial" w:hAnsi="Arial" w:cs="Arial"/>
+          <w:sz w:val="24"/>
+          <w:szCs w:val="24"/>
+        </w:rPr>
+        <w:t>4.6. Recomendación de Cultivos</w:t>
+      </w:r>
+    </w:p>
+    <w:p>
+      <w:pPr>
+        <w:spacing w:after="120" w:line="240" w:lineRule="auto"/>
+        <w:ind w:firstLine="708"/>
+        <w:rPr>
+          <w:rFonts w:ascii="Arial" w:hAnsi="Arial" w:cs="Arial"/>
+          <w:sz w:val="24"/>
+          <w:szCs w:val="24"/>
+        </w:rPr>
+      </w:pPr>
+      <w:r>
+        <w:rPr>
+          <w:rFonts w:ascii="Arial" w:hAnsi="Arial" w:cs="Arial"/>
+          <w:sz w:val="24"/>
+          <w:szCs w:val="24"/>
+        </w:rPr>
+        <w:t>Bibliografía</w:t>
+      </w:r>
+    </w:p>
+    <w:p>
+      <w:r>
+        <w:br w:type="page"/>
       </w:r>
     </w:p>
     <w:p>
@@ -616,23 +1745,7 @@
           <w:rFonts w:ascii="Arial" w:hAnsi="Arial" w:cs="Arial"/>
           <w:sz w:val="24"/>
         </w:rPr>
-        <w:t xml:space="preserve">Detección de elementos faltantes y anomalías en los datos para poder hacer una correcta limpieza de los diferentes </w:t>
-      </w:r>
-      <w:proofErr w:type="spellStart"/>
-      <w:r>
-        <w:rPr>
-          <w:rFonts w:ascii="Arial" w:hAnsi="Arial" w:cs="Arial"/>
-          <w:sz w:val="24"/>
-        </w:rPr>
-        <w:t>datasets</w:t>
-      </w:r>
-      <w:proofErr w:type="spellEnd"/>
-      <w:r>
-        <w:rPr>
-          <w:rFonts w:ascii="Arial" w:hAnsi="Arial" w:cs="Arial"/>
-          <w:sz w:val="24"/>
-        </w:rPr>
-        <w:t xml:space="preserve"> de los que se dispone.</w:t>
+        <w:t>Detección de elementos faltantes y anomalías en los datos para poder hacer una correcta limpieza de los diferentes datasets de los que se dispone.</w:t>
       </w:r>
     </w:p>
     <w:p>
@@ -654,7 +1767,21 @@
           <w:rFonts w:ascii="Arial" w:hAnsi="Arial" w:cs="Arial"/>
           <w:sz w:val="24"/>
         </w:rPr>
-        <w:t>Análisis exploratorio de datos para comprobar posible relaciones en los datos lo cual permita obtener conclusiones que pueden llegar a ser relevantes y detectar posibles anomalías que puedan resolver problemas en el futuro.</w:t>
+        <w:t>Análisis exploratorio de datos para comprobar posible</w:t>
+      </w:r>
+      <w:r>
+        <w:rPr>
+          <w:rFonts w:ascii="Arial" w:hAnsi="Arial" w:cs="Arial"/>
+          <w:sz w:val="24"/>
+        </w:rPr>
+        <w:t>s</w:t>
+      </w:r>
+      <w:r>
+        <w:rPr>
+          <w:rFonts w:ascii="Arial" w:hAnsi="Arial" w:cs="Arial"/>
+          <w:sz w:val="24"/>
+        </w:rPr>
+        <w:t xml:space="preserve"> relaciones en los datos lo cual permita obtener conclusiones que pueden llegar a ser relevantes y detectar posibles anomalías que puedan resolver problemas en el futuro.</w:t>
       </w:r>
     </w:p>
     <w:p>
@@ -727,170 +1854,320 @@
     </w:p>
     <w:p>
       <w:pPr>
-        <w:spacing w:line="276" w:lineRule="auto"/>
-        <w:jc w:val="both"/>
+        <w:pStyle w:val="Prrafodelista"/>
+        <w:numPr>
+          <w:ilvl w:val="0"/>
+          <w:numId w:val="47"/>
+        </w:numPr>
+        <w:spacing w:line="276" w:lineRule="auto"/>
+        <w:jc w:val="both"/>
+        <w:rPr>
+          <w:rFonts w:ascii="Arial" w:hAnsi="Arial" w:cs="Arial"/>
+          <w:sz w:val="24"/>
+        </w:rPr>
+      </w:pPr>
+      <w:r>
+        <w:rPr>
+          <w:rFonts w:ascii="Arial" w:hAnsi="Arial" w:cs="Arial"/>
+          <w:sz w:val="24"/>
+        </w:rPr>
+        <w:t xml:space="preserve">Para la </w:t>
+      </w:r>
+      <w:r>
         <w:rPr>
           <w:rFonts w:ascii="Arial" w:hAnsi="Arial" w:cs="Arial"/>
           <w:b/>
-          <w:color w:val="FF0000"/>
-          <w:sz w:val="24"/>
-        </w:rPr>
-      </w:pPr>
+          <w:bCs/>
+          <w:sz w:val="24"/>
+        </w:rPr>
+        <w:t>predicción de rendimiento agrícola</w:t>
+      </w:r>
+      <w:r>
+        <w:rPr>
+          <w:rFonts w:ascii="Arial" w:hAnsi="Arial" w:cs="Arial"/>
+          <w:sz w:val="24"/>
+        </w:rPr>
+        <w:t xml:space="preserve">, se implementó una regresión lineal múltiple como modelo base para capturar tendencias lineales y una red </w:t>
+      </w:r>
+      <w:r>
+        <w:rPr>
+          <w:rFonts w:ascii="Arial" w:hAnsi="Arial" w:cs="Arial"/>
+          <w:sz w:val="24"/>
+        </w:rPr>
+        <w:t>neuronal</w:t>
+      </w:r>
+      <w:r>
+        <w:rPr>
+          <w:rFonts w:ascii="Arial" w:hAnsi="Arial" w:cs="Arial"/>
+          <w:sz w:val="24"/>
+        </w:rPr>
+        <w:t xml:space="preserve"> profunda con capas de </w:t>
+      </w:r>
+      <w:proofErr w:type="spellStart"/>
+      <w:r>
+        <w:rPr>
+          <w:rFonts w:ascii="Arial" w:hAnsi="Arial" w:cs="Arial"/>
+          <w:sz w:val="24"/>
+        </w:rPr>
+        <w:t>dropout</w:t>
+      </w:r>
+      <w:proofErr w:type="spellEnd"/>
+      <w:r>
+        <w:rPr>
+          <w:rFonts w:ascii="Arial" w:hAnsi="Arial" w:cs="Arial"/>
+          <w:sz w:val="24"/>
+        </w:rPr>
+        <w:t xml:space="preserve"> y activación </w:t>
+      </w:r>
+      <w:proofErr w:type="spellStart"/>
+      <w:r>
+        <w:rPr>
+          <w:rFonts w:ascii="Arial" w:hAnsi="Arial" w:cs="Arial"/>
+          <w:sz w:val="24"/>
+        </w:rPr>
+        <w:t>ReLU</w:t>
+      </w:r>
+      <w:proofErr w:type="spellEnd"/>
+      <w:r>
+        <w:rPr>
+          <w:rFonts w:ascii="Arial" w:hAnsi="Arial" w:cs="Arial"/>
+          <w:sz w:val="24"/>
+        </w:rPr>
+        <w:t xml:space="preserve"> para modelar relaciones biológicas y climáticas más complejas</w:t>
+      </w:r>
+      <w:r>
+        <w:rPr>
+          <w:rFonts w:ascii="Arial" w:hAnsi="Arial" w:cs="Arial"/>
+          <w:sz w:val="24"/>
+        </w:rPr>
+        <w:t>.</w:t>
+      </w:r>
+    </w:p>
+    <w:p>
+      <w:pPr>
+        <w:pStyle w:val="Prrafodelista"/>
+        <w:numPr>
+          <w:ilvl w:val="0"/>
+          <w:numId w:val="48"/>
+        </w:numPr>
+        <w:spacing w:line="276" w:lineRule="auto"/>
+        <w:jc w:val="both"/>
+        <w:rPr>
+          <w:rFonts w:ascii="Arial" w:hAnsi="Arial" w:cs="Arial"/>
+          <w:sz w:val="24"/>
+        </w:rPr>
+      </w:pPr>
+      <w:r>
+        <w:rPr>
+          <w:rFonts w:ascii="Arial" w:hAnsi="Arial" w:cs="Arial"/>
+          <w:sz w:val="24"/>
+        </w:rPr>
+        <w:t xml:space="preserve">En la </w:t>
+      </w:r>
       <w:r>
         <w:rPr>
           <w:rFonts w:ascii="Arial" w:hAnsi="Arial" w:cs="Arial"/>
           <w:b/>
-          <w:color w:val="FF0000"/>
-          <w:sz w:val="24"/>
-        </w:rPr>
-        <w:t>TO DO</w:t>
+          <w:bCs/>
+          <w:sz w:val="24"/>
+        </w:rPr>
+        <w:t>clasificación de riesgo de plagas</w:t>
+      </w:r>
+      <w:r>
+        <w:rPr>
+          <w:rFonts w:ascii="Arial" w:hAnsi="Arial" w:cs="Arial"/>
+          <w:sz w:val="24"/>
+        </w:rPr>
+        <w:t>, se emplearon los algoritmos KNN para análisis de similitud y Random Forest, el cual también fue fundamental para la extracción de características de importancia que determinan la productividad.</w:t>
+      </w:r>
+    </w:p>
+    <w:p>
+      <w:pPr>
+        <w:pStyle w:val="Prrafodelista"/>
+        <w:numPr>
+          <w:ilvl w:val="0"/>
+          <w:numId w:val="48"/>
+        </w:numPr>
+        <w:spacing w:line="276" w:lineRule="auto"/>
+        <w:jc w:val="both"/>
+        <w:rPr>
+          <w:rFonts w:ascii="Arial" w:hAnsi="Arial" w:cs="Arial"/>
+          <w:sz w:val="24"/>
+        </w:rPr>
+      </w:pPr>
+      <w:r>
+        <w:rPr>
+          <w:rFonts w:ascii="Arial" w:hAnsi="Arial" w:cs="Arial"/>
+          <w:sz w:val="24"/>
+        </w:rPr>
+        <w:t xml:space="preserve">La </w:t>
       </w:r>
       <w:r>
         <w:rPr>
           <w:rFonts w:ascii="Arial" w:hAnsi="Arial" w:cs="Arial"/>
           <w:b/>
-          <w:color w:val="FF0000"/>
-          <w:sz w:val="24"/>
-        </w:rPr>
-        <w:t xml:space="preserve"> (métodos de machine </w:t>
+          <w:bCs/>
+          <w:sz w:val="24"/>
+        </w:rPr>
+        <w:t>segmentación de países por patrones productivos</w:t>
+      </w:r>
+      <w:r>
+        <w:rPr>
+          <w:rFonts w:ascii="Arial" w:hAnsi="Arial" w:cs="Arial"/>
+          <w:sz w:val="24"/>
+        </w:rPr>
+        <w:t xml:space="preserve"> se abordó mediante técnicas no supervisadas como K-Means y DBSCAN.</w:t>
+      </w:r>
+    </w:p>
+    <w:p>
+      <w:pPr>
+        <w:pStyle w:val="Prrafodelista"/>
+        <w:numPr>
+          <w:ilvl w:val="0"/>
+          <w:numId w:val="48"/>
+        </w:numPr>
+        <w:spacing w:line="276" w:lineRule="auto"/>
+        <w:jc w:val="both"/>
+        <w:rPr>
+          <w:rFonts w:ascii="Arial" w:hAnsi="Arial" w:cs="Arial"/>
+          <w:sz w:val="24"/>
+        </w:rPr>
+      </w:pPr>
+      <w:r>
+        <w:rPr>
+          <w:rFonts w:ascii="Arial" w:hAnsi="Arial" w:cs="Arial"/>
+          <w:sz w:val="24"/>
+        </w:rPr>
+        <w:t xml:space="preserve">Para la </w:t>
+      </w:r>
+      <w:r>
+        <w:rPr>
+          <w:rFonts w:ascii="Arial" w:hAnsi="Arial" w:cs="Arial"/>
+          <w:b/>
+          <w:bCs/>
+          <w:sz w:val="24"/>
+        </w:rPr>
+        <w:t>predicción de tendencias de precios</w:t>
+      </w:r>
+      <w:r>
+        <w:rPr>
+          <w:rFonts w:ascii="Arial" w:hAnsi="Arial" w:cs="Arial"/>
+          <w:sz w:val="24"/>
+        </w:rPr>
+        <w:t>, se utilizó XGBoost, evaluando arquitecturas multiclase y binarias para optimizar la toma de decisiones financieras</w:t>
+      </w:r>
+      <w:r>
+        <w:rPr>
+          <w:rFonts w:ascii="Arial" w:hAnsi="Arial" w:cs="Arial"/>
+          <w:sz w:val="24"/>
+        </w:rPr>
+        <w:t>.</w:t>
+      </w:r>
+    </w:p>
+    <w:p>
+      <w:pPr>
+        <w:pStyle w:val="Prrafodelista"/>
+        <w:numPr>
+          <w:ilvl w:val="0"/>
+          <w:numId w:val="48"/>
+        </w:numPr>
+        <w:spacing w:line="276" w:lineRule="auto"/>
+        <w:jc w:val="both"/>
+        <w:rPr>
+          <w:rFonts w:ascii="Arial" w:hAnsi="Arial" w:cs="Arial"/>
+          <w:sz w:val="24"/>
+        </w:rPr>
+      </w:pPr>
+      <w:r>
+        <w:rPr>
+          <w:rFonts w:ascii="Arial" w:hAnsi="Arial" w:cs="Arial"/>
+          <w:sz w:val="24"/>
+        </w:rPr>
+        <w:t xml:space="preserve">La </w:t>
+      </w:r>
+      <w:r>
+        <w:rPr>
+          <w:rFonts w:ascii="Arial" w:hAnsi="Arial" w:cs="Arial"/>
+          <w:b/>
+          <w:bCs/>
+          <w:sz w:val="24"/>
+        </w:rPr>
+        <w:t>detección de anomalías en la producción</w:t>
+      </w:r>
+      <w:r>
+        <w:rPr>
+          <w:rFonts w:ascii="Arial" w:hAnsi="Arial" w:cs="Arial"/>
+          <w:sz w:val="24"/>
+        </w:rPr>
+        <w:t xml:space="preserve"> se realizó mediante </w:t>
       </w:r>
       <w:proofErr w:type="spellStart"/>
       <w:r>
         <w:rPr>
           <w:rFonts w:ascii="Arial" w:hAnsi="Arial" w:cs="Arial"/>
+          <w:sz w:val="24"/>
+        </w:rPr>
+        <w:t>Isolation</w:t>
+      </w:r>
+      <w:proofErr w:type="spellEnd"/>
+      <w:r>
+        <w:rPr>
+          <w:rFonts w:ascii="Arial" w:hAnsi="Arial" w:cs="Arial"/>
+          <w:sz w:val="24"/>
+        </w:rPr>
+        <w:t xml:space="preserve"> Forest y One-Class SVM, permitiendo identificar fallos o éxitos agrícolas</w:t>
+      </w:r>
+      <w:r>
+        <w:rPr>
+          <w:rFonts w:ascii="Arial" w:hAnsi="Arial" w:cs="Arial"/>
+          <w:sz w:val="24"/>
+        </w:rPr>
+        <w:t>.</w:t>
+      </w:r>
+    </w:p>
+    <w:p>
+      <w:pPr>
+        <w:pStyle w:val="Prrafodelista"/>
+        <w:numPr>
+          <w:ilvl w:val="0"/>
+          <w:numId w:val="48"/>
+        </w:numPr>
+        <w:spacing w:line="276" w:lineRule="auto"/>
+        <w:jc w:val="both"/>
+        <w:rPr>
+          <w:rFonts w:ascii="Arial" w:hAnsi="Arial" w:cs="Arial"/>
+          <w:sz w:val="24"/>
+        </w:rPr>
+      </w:pPr>
+      <w:r>
+        <w:rPr>
+          <w:rFonts w:ascii="Arial" w:hAnsi="Arial" w:cs="Arial"/>
+          <w:sz w:val="24"/>
+        </w:rPr>
+        <w:t>P</w:t>
+      </w:r>
+      <w:r>
+        <w:rPr>
+          <w:rFonts w:ascii="Arial" w:hAnsi="Arial" w:cs="Arial"/>
+          <w:sz w:val="24"/>
+        </w:rPr>
+        <w:t xml:space="preserve">ara la </w:t>
+      </w:r>
+      <w:r>
+        <w:rPr>
+          <w:rFonts w:ascii="Arial" w:hAnsi="Arial" w:cs="Arial"/>
           <w:b/>
-          <w:color w:val="FF0000"/>
-          <w:sz w:val="24"/>
-        </w:rPr>
-        <w:t>learning</w:t>
-      </w:r>
-      <w:proofErr w:type="spellEnd"/>
-      <w:r>
-        <w:rPr>
-          <w:rFonts w:ascii="Arial" w:hAnsi="Arial" w:cs="Arial"/>
-          <w:b/>
-          <w:color w:val="FF0000"/>
-          <w:sz w:val="24"/>
-        </w:rPr>
-        <w:t xml:space="preserve"> utilizados: regresión lineal </w:t>
-      </w:r>
-      <w:proofErr w:type="spellStart"/>
-      <w:r>
-        <w:rPr>
-          <w:rFonts w:ascii="Arial" w:hAnsi="Arial" w:cs="Arial"/>
-          <w:b/>
-          <w:color w:val="FF0000"/>
-          <w:sz w:val="24"/>
-        </w:rPr>
-        <w:t>multiple</w:t>
-      </w:r>
-      <w:proofErr w:type="spellEnd"/>
-      <w:r>
-        <w:rPr>
-          <w:rFonts w:ascii="Arial" w:hAnsi="Arial" w:cs="Arial"/>
-          <w:b/>
-          <w:color w:val="FF0000"/>
-          <w:sz w:val="24"/>
-        </w:rPr>
-        <w:t xml:space="preserve">, </w:t>
-      </w:r>
-      <w:proofErr w:type="spellStart"/>
-      <w:r>
-        <w:rPr>
-          <w:rFonts w:ascii="Arial" w:hAnsi="Arial" w:cs="Arial"/>
-          <w:b/>
-          <w:color w:val="FF0000"/>
-          <w:sz w:val="24"/>
-        </w:rPr>
-        <w:t>random</w:t>
-      </w:r>
-      <w:proofErr w:type="spellEnd"/>
-      <w:r>
-        <w:rPr>
-          <w:rFonts w:ascii="Arial" w:hAnsi="Arial" w:cs="Arial"/>
-          <w:b/>
-          <w:color w:val="FF0000"/>
-          <w:sz w:val="24"/>
-        </w:rPr>
-        <w:t xml:space="preserve"> </w:t>
-      </w:r>
-      <w:proofErr w:type="spellStart"/>
-      <w:r>
-        <w:rPr>
-          <w:rFonts w:ascii="Arial" w:hAnsi="Arial" w:cs="Arial"/>
-          <w:b/>
-          <w:color w:val="FF0000"/>
-          <w:sz w:val="24"/>
-        </w:rPr>
-        <w:t>forest</w:t>
-      </w:r>
-      <w:proofErr w:type="spellEnd"/>
-      <w:r>
-        <w:rPr>
-          <w:rFonts w:ascii="Arial" w:hAnsi="Arial" w:cs="Arial"/>
-          <w:b/>
-          <w:color w:val="FF0000"/>
-          <w:sz w:val="24"/>
-        </w:rPr>
-        <w:t xml:space="preserve"> para extracción de características, redes de neuronas</w:t>
-      </w:r>
-      <w:r>
-        <w:rPr>
-          <w:rFonts w:ascii="Arial" w:hAnsi="Arial" w:cs="Arial"/>
-          <w:b/>
-          <w:color w:val="FF0000"/>
-          <w:sz w:val="24"/>
-        </w:rPr>
-        <w:t xml:space="preserve">, KNN y </w:t>
-      </w:r>
-      <w:proofErr w:type="spellStart"/>
-      <w:r>
-        <w:rPr>
-          <w:rFonts w:ascii="Arial" w:hAnsi="Arial" w:cs="Arial"/>
-          <w:b/>
-          <w:color w:val="FF0000"/>
-          <w:sz w:val="24"/>
-        </w:rPr>
-        <w:t>random</w:t>
-      </w:r>
-      <w:proofErr w:type="spellEnd"/>
-      <w:r>
-        <w:rPr>
-          <w:rFonts w:ascii="Arial" w:hAnsi="Arial" w:cs="Arial"/>
-          <w:b/>
-          <w:color w:val="FF0000"/>
-          <w:sz w:val="24"/>
-        </w:rPr>
-        <w:t xml:space="preserve"> </w:t>
-      </w:r>
-      <w:proofErr w:type="spellStart"/>
-      <w:r>
-        <w:rPr>
-          <w:rFonts w:ascii="Arial" w:hAnsi="Arial" w:cs="Arial"/>
-          <w:b/>
-          <w:color w:val="FF0000"/>
-          <w:sz w:val="24"/>
-        </w:rPr>
-        <w:t>forest</w:t>
-      </w:r>
-      <w:proofErr w:type="spellEnd"/>
-      <w:r>
-        <w:rPr>
-          <w:rFonts w:ascii="Arial" w:hAnsi="Arial" w:cs="Arial"/>
-          <w:b/>
-          <w:color w:val="FF0000"/>
-          <w:sz w:val="24"/>
-        </w:rPr>
-        <w:t xml:space="preserve"> para crear modelos</w:t>
-      </w:r>
-      <w:r>
-        <w:rPr>
-          <w:rFonts w:ascii="Arial" w:hAnsi="Arial" w:cs="Arial"/>
-          <w:b/>
-          <w:color w:val="FF0000"/>
-          <w:sz w:val="24"/>
-        </w:rPr>
-        <w:t>)</w:t>
+          <w:bCs/>
+          <w:sz w:val="24"/>
+        </w:rPr>
+        <w:t>recomendación de cultivos</w:t>
+      </w:r>
+      <w:r>
+        <w:rPr>
+          <w:rFonts w:ascii="Arial" w:hAnsi="Arial" w:cs="Arial"/>
+          <w:sz w:val="24"/>
+        </w:rPr>
+        <w:t>, se aplicaron modelos de Random Forest y XGBoost, logrando una precisión superior al incorporar la "inercia agrícola" de cada región</w:t>
       </w:r>
     </w:p>
     <w:p>
@@ -1036,25 +2313,7 @@
           <w:b/>
           <w:sz w:val="24"/>
         </w:rPr>
-        <w:t xml:space="preserve"> in Machine </w:t>
-      </w:r>
-      <w:proofErr w:type="spellStart"/>
-      <w:r>
-        <w:rPr>
-          <w:rFonts w:ascii="Arial" w:hAnsi="Arial" w:cs="Arial"/>
-          <w:b/>
-          <w:sz w:val="24"/>
-        </w:rPr>
-        <w:t>Learning</w:t>
-      </w:r>
-      <w:proofErr w:type="spellEnd"/>
-      <w:r>
-        <w:rPr>
-          <w:rFonts w:ascii="Arial" w:hAnsi="Arial" w:cs="Arial"/>
-          <w:b/>
-          <w:sz w:val="24"/>
-        </w:rPr>
-        <w:t xml:space="preserve"> </w:t>
+        <w:t xml:space="preserve"> in Machine Learning </w:t>
       </w:r>
       <w:proofErr w:type="spellStart"/>
       <w:r>
@@ -1278,7 +2537,6 @@
           <w:color w:val="000000" w:themeColor="text1"/>
         </w:rPr>
       </w:pPr>
-      <w:proofErr w:type="spellStart"/>
       <w:r>
         <w:rPr>
           <w:rFonts w:ascii="Arial" w:hAnsi="Arial" w:cs="Arial"/>
@@ -1287,7 +2545,6 @@
         </w:rPr>
         <w:t>Dataset</w:t>
       </w:r>
-      <w:proofErr w:type="spellEnd"/>
     </w:p>
     <w:p>
       <w:pPr>
@@ -1347,48 +2604,14 @@
           <w:color w:val="000000" w:themeColor="text1"/>
           <w:sz w:val="24"/>
         </w:rPr>
-        <w:t xml:space="preserve">El conjunto de datos se divide en estructurados, </w:t>
-      </w:r>
-      <w:proofErr w:type="spellStart"/>
-      <w:r>
-        <w:rPr>
-          <w:rFonts w:ascii="Arial" w:hAnsi="Arial" w:cs="Arial"/>
-          <w:color w:val="000000" w:themeColor="text1"/>
-          <w:sz w:val="24"/>
-        </w:rPr>
-        <w:t>semi-estructurados</w:t>
-      </w:r>
-      <w:proofErr w:type="spellEnd"/>
-      <w:r>
-        <w:rPr>
-          <w:rFonts w:ascii="Arial" w:hAnsi="Arial" w:cs="Arial"/>
-          <w:color w:val="000000" w:themeColor="text1"/>
-          <w:sz w:val="24"/>
-        </w:rPr>
-        <w:t xml:space="preserve"> y no estructurados. Por ello, como primera fase hemos estandarizado el formato de lectura. </w:t>
-      </w:r>
-      <w:r>
-        <w:rPr>
-          <w:rFonts w:ascii="Arial" w:hAnsi="Arial" w:cs="Arial"/>
-          <w:sz w:val="24"/>
-        </w:rPr>
-        <w:t xml:space="preserve">Para los datos </w:t>
-      </w:r>
-      <w:proofErr w:type="spellStart"/>
-      <w:r>
-        <w:rPr>
-          <w:rFonts w:ascii="Arial" w:hAnsi="Arial" w:cs="Arial"/>
-          <w:sz w:val="24"/>
-        </w:rPr>
-        <w:t>semi-estructurados</w:t>
-      </w:r>
-      <w:proofErr w:type="spellEnd"/>
-      <w:r>
-        <w:rPr>
-          <w:rFonts w:ascii="Arial" w:hAnsi="Arial" w:cs="Arial"/>
-          <w:sz w:val="24"/>
-        </w:rPr>
-        <w:t xml:space="preserve"> y no estructurados hemos usado Power Bi:</w:t>
+        <w:t xml:space="preserve">El conjunto de datos se divide en estructurados, semi-estructurados y no estructurados. Por ello, como primera fase hemos estandarizado el formato de lectura. </w:t>
+      </w:r>
+      <w:r>
+        <w:rPr>
+          <w:rFonts w:ascii="Arial" w:hAnsi="Arial" w:cs="Arial"/>
+          <w:sz w:val="24"/>
+        </w:rPr>
+        <w:t>Para los datos semi-estructurados y no estructurados hemos usado Power Bi:</w:t>
       </w:r>
     </w:p>
     <w:p>
@@ -1454,23 +2677,7 @@
           <w:rFonts w:ascii="Arial" w:hAnsi="Arial" w:cs="Arial"/>
           <w:sz w:val="24"/>
         </w:rPr>
-        <w:t xml:space="preserve">En el data set de noticias agrícolas hemos expandidos los campos para quitarlos de formato lista y luego hemos realizado un </w:t>
-      </w:r>
-      <w:proofErr w:type="spellStart"/>
-      <w:r>
-        <w:rPr>
-          <w:rFonts w:ascii="Arial" w:hAnsi="Arial" w:cs="Arial"/>
-          <w:sz w:val="24"/>
-        </w:rPr>
-        <w:t>One</w:t>
-      </w:r>
-      <w:proofErr w:type="spellEnd"/>
-      <w:r>
-        <w:rPr>
-          <w:rFonts w:ascii="Arial" w:hAnsi="Arial" w:cs="Arial"/>
-          <w:sz w:val="24"/>
-        </w:rPr>
-        <w:t xml:space="preserve"> Hot </w:t>
+        <w:t xml:space="preserve">En el data set de noticias agrícolas hemos expandidos los campos para quitarlos de formato lista y luego hemos realizado un One Hot </w:t>
       </w:r>
       <w:proofErr w:type="spellStart"/>
       <w:r>
@@ -6092,23 +7299,7 @@
           <w:rFonts w:ascii="Arial" w:hAnsi="Arial" w:cs="Arial"/>
           <w:sz w:val="24"/>
         </w:rPr>
-        <w:t xml:space="preserve">Datos </w:t>
-      </w:r>
-      <w:proofErr w:type="spellStart"/>
-      <w:r>
-        <w:rPr>
-          <w:rFonts w:ascii="Arial" w:hAnsi="Arial" w:cs="Arial"/>
-          <w:sz w:val="24"/>
-        </w:rPr>
-        <w:t>semi-estructurados</w:t>
-      </w:r>
-      <w:proofErr w:type="spellEnd"/>
-      <w:r>
-        <w:rPr>
-          <w:rFonts w:ascii="Arial" w:hAnsi="Arial" w:cs="Arial"/>
-          <w:sz w:val="24"/>
-        </w:rPr>
-        <w:t xml:space="preserve"> (adaptados a </w:t>
+        <w:t xml:space="preserve">Datos semi-estructurados (adaptados a </w:t>
       </w:r>
       <w:proofErr w:type="spellStart"/>
       <w:r>
@@ -8624,29 +9815,7 @@
                 <w:bdr w:val="none" w:sz="0" w:space="0" w:color="auto" w:frame="1"/>
                 <w:lang w:eastAsia="es-ES"/>
               </w:rPr>
-              <w:t>Variables binarias (</w:t>
-            </w:r>
-            <w:proofErr w:type="spellStart"/>
-            <w:r>
-              <w:rPr>
-                <w:rFonts w:ascii="Arial" w:eastAsia="Times New Roman" w:hAnsi="Arial" w:cs="Arial"/>
-                <w:sz w:val="24"/>
-                <w:szCs w:val="24"/>
-                <w:bdr w:val="none" w:sz="0" w:space="0" w:color="auto" w:frame="1"/>
-                <w:lang w:eastAsia="es-ES"/>
-              </w:rPr>
-              <w:t>One</w:t>
-            </w:r>
-            <w:proofErr w:type="spellEnd"/>
-            <w:r>
-              <w:rPr>
-                <w:rFonts w:ascii="Arial" w:eastAsia="Times New Roman" w:hAnsi="Arial" w:cs="Arial"/>
-                <w:sz w:val="24"/>
-                <w:szCs w:val="24"/>
-                <w:bdr w:val="none" w:sz="0" w:space="0" w:color="auto" w:frame="1"/>
-                <w:lang w:eastAsia="es-ES"/>
-              </w:rPr>
-              <w:t xml:space="preserve">-Hot </w:t>
+              <w:t xml:space="preserve">Variables binarias (One-Hot </w:t>
             </w:r>
             <w:proofErr w:type="spellStart"/>
             <w:r>
@@ -10231,18 +11400,8 @@
           <w:i/>
           <w:sz w:val="24"/>
         </w:rPr>
-        <w:t xml:space="preserve">Machine </w:t>
-      </w:r>
-      <w:proofErr w:type="spellStart"/>
-      <w:r>
-        <w:rPr>
-          <w:rFonts w:ascii="Arial" w:hAnsi="Arial" w:cs="Arial"/>
-          <w:i/>
-          <w:sz w:val="24"/>
-        </w:rPr>
-        <w:t>Learning</w:t>
-      </w:r>
-      <w:proofErr w:type="spellEnd"/>
+        <w:t>Machine Learning</w:t>
+      </w:r>
       <w:r>
         <w:rPr>
           <w:rFonts w:ascii="Arial" w:hAnsi="Arial" w:cs="Arial"/>
@@ -10915,14 +12074,23 @@
           <w:i/>
           <w:sz w:val="24"/>
         </w:rPr>
-        <w:t>acuerdo_</w:t>
-      </w:r>
+        <w:t>acuerdo</w:t>
+      </w:r>
+      <w:proofErr w:type="gramStart"/>
       <w:r>
         <w:rPr>
           <w:rFonts w:ascii="Arial" w:hAnsi="Arial" w:cs="Arial"/>
           <w:i/>
           <w:sz w:val="24"/>
         </w:rPr>
+        <w:t>_</w:t>
+      </w:r>
+      <w:r>
+        <w:rPr>
+          <w:rFonts w:ascii="Arial" w:hAnsi="Arial" w:cs="Arial"/>
+          <w:i/>
+          <w:sz w:val="24"/>
+        </w:rPr>
         <w:t xml:space="preserve">  </w:t>
       </w:r>
       <w:proofErr w:type="spellStart"/>
@@ -10932,7 +12100,16 @@
           <w:i/>
           <w:sz w:val="24"/>
         </w:rPr>
-        <w:t>internacional_anio_firma</w:t>
+        <w:t>internacional</w:t>
+      </w:r>
+      <w:proofErr w:type="gramEnd"/>
+      <w:r>
+        <w:rPr>
+          <w:rFonts w:ascii="Arial" w:hAnsi="Arial" w:cs="Arial"/>
+          <w:i/>
+          <w:sz w:val="24"/>
+        </w:rPr>
+        <w:t>_anio_firma</w:t>
       </w:r>
       <w:proofErr w:type="spellEnd"/>
       <w:r>
@@ -11096,23 +12273,7 @@
           <w:rFonts w:ascii="Arial" w:hAnsi="Arial" w:cs="Arial"/>
           <w:sz w:val="24"/>
         </w:rPr>
-        <w:t xml:space="preserve">el apartado donde se explican los diferentes </w:t>
-      </w:r>
-      <w:proofErr w:type="spellStart"/>
-      <w:r>
-        <w:rPr>
-          <w:rFonts w:ascii="Arial" w:hAnsi="Arial" w:cs="Arial"/>
-          <w:sz w:val="24"/>
-        </w:rPr>
-        <w:t>datasets</w:t>
-      </w:r>
-      <w:proofErr w:type="spellEnd"/>
-      <w:r>
-        <w:rPr>
-          <w:rFonts w:ascii="Arial" w:hAnsi="Arial" w:cs="Arial"/>
-          <w:sz w:val="24"/>
-        </w:rPr>
-        <w:t xml:space="preserve"> con los que contamos, hemos encontrado una serie de valores nulos. Por ello, hemos llevado a cabo un proceso de limpieza para asegurar la integridad de los datos.</w:t>
+        <w:t>el apartado donde se explican los diferentes datasets con los que contamos, hemos encontrado una serie de valores nulos. Por ello, hemos llevado a cabo un proceso de limpieza para asegurar la integridad de los datos.</w:t>
       </w:r>
     </w:p>
     <w:p>
@@ -12698,7 +13859,23 @@
           <w:rFonts w:ascii="Arial" w:hAnsi="Arial" w:cs="Arial"/>
           <w:sz w:val="24"/>
         </w:rPr>
-        <w:t xml:space="preserve"> lo niveles de humedad de la superficie del suelo aumenta. Además cabe destacar que habrá que tener en cuenta esta relación para evitar introducir ambas variables en ciertos modelos de aprendizaje automático. </w:t>
+        <w:t xml:space="preserve"> lo niveles de humedad de la superficie del suelo aumenta. </w:t>
+      </w:r>
+      <w:proofErr w:type="gramStart"/>
+      <w:r>
+        <w:rPr>
+          <w:rFonts w:ascii="Arial" w:hAnsi="Arial" w:cs="Arial"/>
+          <w:sz w:val="24"/>
+        </w:rPr>
+        <w:t>Además</w:t>
+      </w:r>
+      <w:proofErr w:type="gramEnd"/>
+      <w:r>
+        <w:rPr>
+          <w:rFonts w:ascii="Arial" w:hAnsi="Arial" w:cs="Arial"/>
+          <w:sz w:val="24"/>
+        </w:rPr>
+        <w:t xml:space="preserve"> cabe destacar que habrá que tener en cuenta esta relación para evitar introducir ambas variables en ciertos modelos de aprendizaje automático. </w:t>
       </w:r>
     </w:p>
     <w:p>
@@ -12833,7 +14010,15 @@
           <w:rFonts w:ascii="Arial" w:hAnsi="Arial" w:cs="Arial"/>
           <w:sz w:val="24"/>
         </w:rPr>
-        <w:t>Como se puede observar (aunque no se hayan sacado todos los países) no existe ninguna tendencia en los cultivos. Lo que sí podemos apreciar son unos cultivos que se suelen mantener con el tiempo como son el caso del café y el té. En la gráfica anterior no se incluye la caña de azúcar, por lo que hemos hecho otro gráfico para ese producto por sí</w:t>
+        <w:t xml:space="preserve">Como se puede observar (aunque no se hayan sacado todos los países) no existe ninguna tendencia en los cultivos. Lo que sí podemos apreciar son unos cultivos que se suelen mantener con el tiempo como son el caso del café y el té. En la gráfica anterior no se incluye la caña de azúcar, por lo que hemos hecho otro gráfico para ese producto por </w:t>
+      </w:r>
+      <w:proofErr w:type="gramStart"/>
+      <w:r>
+        <w:rPr>
+          <w:rFonts w:ascii="Arial" w:hAnsi="Arial" w:cs="Arial"/>
+          <w:sz w:val="24"/>
+        </w:rPr>
+        <w:t>sí</w:t>
       </w:r>
       <w:r>
         <w:rPr>
@@ -12847,7 +14032,15 @@
           <w:rFonts w:ascii="Arial" w:hAnsi="Arial" w:cs="Arial"/>
           <w:sz w:val="24"/>
         </w:rPr>
-        <w:t xml:space="preserve"> solo.</w:t>
+        <w:t xml:space="preserve"> solo</w:t>
+      </w:r>
+      <w:proofErr w:type="gramEnd"/>
+      <w:r>
+        <w:rPr>
+          <w:rFonts w:ascii="Arial" w:hAnsi="Arial" w:cs="Arial"/>
+          <w:sz w:val="24"/>
+        </w:rPr>
+        <w:t>.</w:t>
       </w:r>
     </w:p>
     <w:p>
@@ -12956,8 +14149,17 @@
           <w:rFonts w:ascii="Arial" w:hAnsi="Arial" w:cs="Arial"/>
           <w:sz w:val="24"/>
         </w:rPr>
-        <w:t xml:space="preserve"> Ahora vamos a comprobar si existe algún año donde la producción agrícola haya sufrido bajadas o subidas considerables que puedan verse como posible anomalías</w:t>
-      </w:r>
+        <w:t xml:space="preserve"> Ahora vamos a comprobar si existe algún año donde la producción agrícola haya sufrido bajadas o subidas considerables que puedan verse como </w:t>
+      </w:r>
+      <w:proofErr w:type="gramStart"/>
+      <w:r>
+        <w:rPr>
+          <w:rFonts w:ascii="Arial" w:hAnsi="Arial" w:cs="Arial"/>
+          <w:sz w:val="24"/>
+        </w:rPr>
+        <w:t>posible anomalías</w:t>
+      </w:r>
+      <w:proofErr w:type="gramEnd"/>
       <w:r>
         <w:rPr>
           <w:rFonts w:ascii="Arial" w:hAnsi="Arial" w:cs="Arial"/>
@@ -13150,7 +14352,39 @@
           <w:rFonts w:ascii="Arial" w:hAnsi="Arial" w:cs="Arial"/>
           <w:sz w:val="24"/>
         </w:rPr>
-        <w:t xml:space="preserve">En el gráfico se puede ver la temporalidad mensual de los mercados. Donde cabe destacar que los mercados sufren un abaratamiento de los mercados en el mes de Agosto seguido de encarecimiento de los productos en el mes de Septiembre. En todos los meses, se puede observar que si en un mes ha subido al siguiente </w:t>
+        <w:t xml:space="preserve">En el gráfico se puede ver la temporalidad mensual de los mercados. Donde cabe destacar que los mercados sufren un abaratamiento de los mercados en el mes de </w:t>
+      </w:r>
+      <w:proofErr w:type="gramStart"/>
+      <w:r>
+        <w:rPr>
+          <w:rFonts w:ascii="Arial" w:hAnsi="Arial" w:cs="Arial"/>
+          <w:sz w:val="24"/>
+        </w:rPr>
+        <w:t>Agosto</w:t>
+      </w:r>
+      <w:proofErr w:type="gramEnd"/>
+      <w:r>
+        <w:rPr>
+          <w:rFonts w:ascii="Arial" w:hAnsi="Arial" w:cs="Arial"/>
+          <w:sz w:val="24"/>
+        </w:rPr>
+        <w:t xml:space="preserve"> seguido de encarecimiento de los productos en el mes de </w:t>
+      </w:r>
+      <w:proofErr w:type="gramStart"/>
+      <w:r>
+        <w:rPr>
+          <w:rFonts w:ascii="Arial" w:hAnsi="Arial" w:cs="Arial"/>
+          <w:sz w:val="24"/>
+        </w:rPr>
+        <w:t>Septiembre</w:t>
+      </w:r>
+      <w:proofErr w:type="gramEnd"/>
+      <w:r>
+        <w:rPr>
+          <w:rFonts w:ascii="Arial" w:hAnsi="Arial" w:cs="Arial"/>
+          <w:sz w:val="24"/>
+        </w:rPr>
+        <w:t xml:space="preserve">. En todos los meses, se puede observar que si en un mes ha subido al siguiente </w:t>
       </w:r>
       <w:r>
         <w:rPr>
@@ -13760,7 +14994,23 @@
           <w:rFonts w:ascii="Arial" w:hAnsi="Arial" w:cs="Arial"/>
           <w:sz w:val="24"/>
         </w:rPr>
-        <w:t xml:space="preserve"> Por último, vamos a comprobar que países son  más eficientes, para ello tendremos en cuenta la variable que mide cuanto contamina un país por cada kilo de carne que se produce.</w:t>
+        <w:t xml:space="preserve"> Por último, vamos a comprobar que países </w:t>
+      </w:r>
+      <w:proofErr w:type="gramStart"/>
+      <w:r>
+        <w:rPr>
+          <w:rFonts w:ascii="Arial" w:hAnsi="Arial" w:cs="Arial"/>
+          <w:sz w:val="24"/>
+        </w:rPr>
+        <w:t>son  más</w:t>
+      </w:r>
+      <w:proofErr w:type="gramEnd"/>
+      <w:r>
+        <w:rPr>
+          <w:rFonts w:ascii="Arial" w:hAnsi="Arial" w:cs="Arial"/>
+          <w:sz w:val="24"/>
+        </w:rPr>
+        <w:t xml:space="preserve"> eficientes, para ello tendremos en cuenta la variable que mide cuanto contamina un país por cada kilo de carne que se produce.</w:t>
       </w:r>
     </w:p>
     <w:p>
@@ -14180,23 +15430,7 @@
           <w:rFonts w:ascii="Arial" w:hAnsi="Arial" w:cs="Arial"/>
           <w:sz w:val="24"/>
         </w:rPr>
-        <w:t xml:space="preserve">Este paso permitió estructurar la información y hacerla compatible con herramientas de análisis como pandas, facilitando su integración posterior con otros </w:t>
-      </w:r>
-      <w:proofErr w:type="spellStart"/>
-      <w:r>
-        <w:rPr>
-          <w:rFonts w:ascii="Arial" w:hAnsi="Arial" w:cs="Arial"/>
-          <w:sz w:val="24"/>
-        </w:rPr>
-        <w:t>datasets</w:t>
-      </w:r>
-      <w:proofErr w:type="spellEnd"/>
-      <w:r>
-        <w:rPr>
-          <w:rFonts w:ascii="Arial" w:hAnsi="Arial" w:cs="Arial"/>
-          <w:sz w:val="24"/>
-        </w:rPr>
-        <w:t>.</w:t>
+        <w:t>Este paso permitió estructurar la información y hacerla compatible con herramientas de análisis como pandas, facilitando su integración posterior con otros datasets.</w:t>
       </w:r>
     </w:p>
     <w:p>
@@ -15134,23 +16368,7 @@
           <w:rFonts w:ascii="Arial" w:hAnsi="Arial" w:cs="Arial"/>
           <w:sz w:val="24"/>
         </w:rPr>
-        <w:t xml:space="preserve">Para ello, ambos </w:t>
-      </w:r>
-      <w:proofErr w:type="spellStart"/>
-      <w:r>
-        <w:rPr>
-          <w:rFonts w:ascii="Arial" w:hAnsi="Arial" w:cs="Arial"/>
-          <w:sz w:val="24"/>
-        </w:rPr>
-        <w:t>datasets</w:t>
-      </w:r>
-      <w:proofErr w:type="spellEnd"/>
-      <w:r>
-        <w:rPr>
-          <w:rFonts w:ascii="Arial" w:hAnsi="Arial" w:cs="Arial"/>
-          <w:sz w:val="24"/>
-        </w:rPr>
-        <w:t xml:space="preserve"> se agregaron a nivel de país y se unieron mediante un </w:t>
+        <w:t xml:space="preserve">Para ello, ambos datasets se agregaron a nivel de país y se unieron mediante un </w:t>
       </w:r>
       <w:proofErr w:type="spellStart"/>
       <w:r>
@@ -15469,6 +16687,7 @@
         </w:rPr>
         <w:t xml:space="preserve">Muchos de los datos a extraer ya lo hemos hecho en el Power Bi, nos hemos dado cuenta que hay datos </w:t>
       </w:r>
+      <w:proofErr w:type="gramStart"/>
       <w:r>
         <w:rPr>
           <w:rFonts w:ascii="Arial" w:hAnsi="Arial" w:cs="Arial"/>
@@ -15476,28 +16695,13 @@
         </w:rPr>
         <w:t>que</w:t>
       </w:r>
-      <w:r>
-        <w:rPr>
-          <w:rFonts w:ascii="Arial" w:hAnsi="Arial" w:cs="Arial"/>
-          <w:sz w:val="24"/>
-        </w:rPr>
-        <w:t xml:space="preserve"> si podemos procesar, como es un país más que no se refleja en el </w:t>
-      </w:r>
-      <w:proofErr w:type="spellStart"/>
-      <w:r>
-        <w:rPr>
-          <w:rFonts w:ascii="Arial" w:hAnsi="Arial" w:cs="Arial"/>
-          <w:sz w:val="24"/>
-        </w:rPr>
-        <w:t>One</w:t>
-      </w:r>
-      <w:proofErr w:type="spellEnd"/>
-      <w:r>
-        <w:rPr>
-          <w:rFonts w:ascii="Arial" w:hAnsi="Arial" w:cs="Arial"/>
-          <w:sz w:val="24"/>
-        </w:rPr>
-        <w:t xml:space="preserve"> Hot </w:t>
+      <w:proofErr w:type="gramEnd"/>
+      <w:r>
+        <w:rPr>
+          <w:rFonts w:ascii="Arial" w:hAnsi="Arial" w:cs="Arial"/>
+          <w:sz w:val="24"/>
+        </w:rPr>
+        <w:t xml:space="preserve"> si podemos procesar, como es un país más que no se refleja en el One Hot </w:t>
       </w:r>
       <w:proofErr w:type="spellStart"/>
       <w:r>
@@ -17645,7 +18849,39 @@
           <w:rFonts w:ascii="Arial" w:hAnsi="Arial" w:cs="Arial"/>
           <w:sz w:val="24"/>
         </w:rPr>
-        <w:t xml:space="preserve">Se puede ver la temporalidad mensual de los mercados. Donde cabe destacar que los mercados sufren un abaratamiento de los mercados en el mes de Agosto seguido de encarecimiento de los productos en el mes de Septiembre. En todos los meses, se puede observar que si en un mes ha subido al siguiente se produce una bajada. </w:t>
+        <w:t xml:space="preserve">Se puede ver la temporalidad mensual de los mercados. Donde cabe destacar que los mercados sufren un abaratamiento de los mercados en el mes de </w:t>
+      </w:r>
+      <w:proofErr w:type="gramStart"/>
+      <w:r>
+        <w:rPr>
+          <w:rFonts w:ascii="Arial" w:hAnsi="Arial" w:cs="Arial"/>
+          <w:sz w:val="24"/>
+        </w:rPr>
+        <w:t>Agosto</w:t>
+      </w:r>
+      <w:proofErr w:type="gramEnd"/>
+      <w:r>
+        <w:rPr>
+          <w:rFonts w:ascii="Arial" w:hAnsi="Arial" w:cs="Arial"/>
+          <w:sz w:val="24"/>
+        </w:rPr>
+        <w:t xml:space="preserve"> seguido de encarecimiento de los productos en el mes de </w:t>
+      </w:r>
+      <w:proofErr w:type="gramStart"/>
+      <w:r>
+        <w:rPr>
+          <w:rFonts w:ascii="Arial" w:hAnsi="Arial" w:cs="Arial"/>
+          <w:sz w:val="24"/>
+        </w:rPr>
+        <w:t>Septiembre</w:t>
+      </w:r>
+      <w:proofErr w:type="gramEnd"/>
+      <w:r>
+        <w:rPr>
+          <w:rFonts w:ascii="Arial" w:hAnsi="Arial" w:cs="Arial"/>
+          <w:sz w:val="24"/>
+        </w:rPr>
+        <w:t xml:space="preserve">. En todos los meses, se puede observar que si en un mes ha subido al siguiente se produce una bajada. </w:t>
       </w:r>
     </w:p>
     <w:p>
@@ -19258,18 +20494,8 @@
           <w:b/>
           <w:color w:val="auto"/>
         </w:rPr>
-        <w:t xml:space="preserve">Machine </w:t>
-      </w:r>
-      <w:proofErr w:type="spellStart"/>
-      <w:r>
-        <w:rPr>
-          <w:rFonts w:ascii="Arial" w:hAnsi="Arial" w:cs="Arial"/>
-          <w:b/>
-          <w:color w:val="auto"/>
-        </w:rPr>
-        <w:t>Learning</w:t>
-      </w:r>
-      <w:proofErr w:type="spellEnd"/>
+        <w:t>Machine Learning</w:t>
+      </w:r>
     </w:p>
     <w:p>
       <w:pPr>
@@ -19464,7 +20690,23 @@
           <w:rFonts w:ascii="Arial" w:hAnsi="Arial" w:cs="Arial"/>
           <w:sz w:val="24"/>
         </w:rPr>
-        <w:t xml:space="preserve"> hemos realizado una validación cruzada de 5 particiones. Y como métricas hemos empleado el MSE, RMSE y R cuadrado, que han sido resultado de la media de cada una de las iteraciones de la validación cruzada. Los resultados de este modelo se comentaran en el apartado correspondiente de la memoria.</w:t>
+        <w:t xml:space="preserve"> hemos realizado una validación cruzada de 5 particiones. Y como métricas hemos empleado el MSE, RMSE y R cuadrado, que han sido resultado de la media de cada una de las iteraciones de la validación cruzada. Los resultados de este modelo se </w:t>
+      </w:r>
+      <w:proofErr w:type="gramStart"/>
+      <w:r>
+        <w:rPr>
+          <w:rFonts w:ascii="Arial" w:hAnsi="Arial" w:cs="Arial"/>
+          <w:sz w:val="24"/>
+        </w:rPr>
+        <w:t>comentaran</w:t>
+      </w:r>
+      <w:proofErr w:type="gramEnd"/>
+      <w:r>
+        <w:rPr>
+          <w:rFonts w:ascii="Arial" w:hAnsi="Arial" w:cs="Arial"/>
+          <w:sz w:val="24"/>
+        </w:rPr>
+        <w:t xml:space="preserve"> en el apartado correspondiente de la memoria.</w:t>
       </w:r>
     </w:p>
     <w:p>
@@ -19568,7 +20810,23 @@
           <w:rFonts w:ascii="Arial" w:hAnsi="Arial" w:cs="Arial"/>
           <w:sz w:val="24"/>
         </w:rPr>
-        <w:t xml:space="preserve">Una capa de entrada de 16 neuronas, conectada a una primera capa oculta que cuenta con 64 neuronas para buscar patrones más complejos en los datos. Le siguen dos capas ocultas de 32 y 16 neuronas respectivamente, buscando descartar el ruido y conservar las relaciones más relevantes. Y por último, al tratarse de un problema de regresión, la capa final consiste de una única neurona con activación lineal. Todas las capas ocultas tienen una función de activación </w:t>
+        <w:t xml:space="preserve">Una capa de entrada de 16 neuronas, conectada a una primera capa oculta que cuenta con 64 neuronas para buscar patrones más complejos en los datos. Le siguen dos capas ocultas de 32 y 16 neuronas respectivamente, buscando descartar el ruido y conservar las relaciones más relevantes. </w:t>
+      </w:r>
+      <w:proofErr w:type="gramStart"/>
+      <w:r>
+        <w:rPr>
+          <w:rFonts w:ascii="Arial" w:hAnsi="Arial" w:cs="Arial"/>
+          <w:sz w:val="24"/>
+        </w:rPr>
+        <w:t>Y</w:t>
+      </w:r>
+      <w:proofErr w:type="gramEnd"/>
+      <w:r>
+        <w:rPr>
+          <w:rFonts w:ascii="Arial" w:hAnsi="Arial" w:cs="Arial"/>
+          <w:sz w:val="24"/>
+        </w:rPr>
+        <w:t xml:space="preserve"> por último, al tratarse de un problema de regresión, la capa final consiste de una única neurona con activación lineal. Todas las capas ocultas tienen una función de activación </w:t>
       </w:r>
       <w:proofErr w:type="spellStart"/>
       <w:r>
@@ -19689,7 +20947,23 @@
           <w:rFonts w:ascii="Arial" w:hAnsi="Arial" w:cs="Arial"/>
           <w:sz w:val="24"/>
         </w:rPr>
-        <w:t>Hemos usado las mismas métricas de evaluación que en la regresión lineal para poder comparar los modelos que hemos generado. Lo cual se llevara a cabo en el apartado correspondiente a los resultados obtenidos.</w:t>
+        <w:t xml:space="preserve">Hemos usado las mismas métricas de evaluación que en la regresión lineal para poder comparar los modelos que hemos generado. Lo cual se </w:t>
+      </w:r>
+      <w:proofErr w:type="gramStart"/>
+      <w:r>
+        <w:rPr>
+          <w:rFonts w:ascii="Arial" w:hAnsi="Arial" w:cs="Arial"/>
+          <w:sz w:val="24"/>
+        </w:rPr>
+        <w:t>llevara</w:t>
+      </w:r>
+      <w:proofErr w:type="gramEnd"/>
+      <w:r>
+        <w:rPr>
+          <w:rFonts w:ascii="Arial" w:hAnsi="Arial" w:cs="Arial"/>
+          <w:sz w:val="24"/>
+        </w:rPr>
+        <w:t xml:space="preserve"> a cabo en el apartado correspondiente a los resultados obtenidos.</w:t>
       </w:r>
     </w:p>
     <w:p>
@@ -20075,23 +21349,7 @@
           <w:rFonts w:ascii="Arial" w:hAnsi="Arial" w:cs="Arial"/>
           <w:sz w:val="24"/>
         </w:rPr>
-        <w:t xml:space="preserve">Este problema se trata de un reto de aprendizaje no supervisado, donde el objetivo es identificar y agrupar países con características productivas similares, basándonos en su producción agrícola y ganadera per cápita, su eficiencia y su huella de emisiones. Al cruzar los </w:t>
-      </w:r>
-      <w:proofErr w:type="spellStart"/>
-      <w:r>
-        <w:rPr>
-          <w:rFonts w:ascii="Arial" w:hAnsi="Arial" w:cs="Arial"/>
-          <w:sz w:val="24"/>
-        </w:rPr>
-        <w:t>datasets</w:t>
-      </w:r>
-      <w:proofErr w:type="spellEnd"/>
-      <w:r>
-        <w:rPr>
-          <w:rFonts w:ascii="Arial" w:hAnsi="Arial" w:cs="Arial"/>
-          <w:sz w:val="24"/>
-        </w:rPr>
-        <w:t xml:space="preserve"> empleados nos hemos quedado con tan solo 12 países que contaban con registros completos de producción agrícola y ganadera.</w:t>
+        <w:t>Este problema se trata de un reto de aprendizaje no supervisado, donde el objetivo es identificar y agrupar países con características productivas similares, basándonos en su producción agrícola y ganadera per cápita, su eficiencia y su huella de emisiones. Al cruzar los datasets empleados nos hemos quedado con tan solo 12 países que contaban con registros completos de producción agrícola y ganadera.</w:t>
       </w:r>
     </w:p>
     <w:p>
@@ -20588,23 +21846,7 @@
           <w:rFonts w:ascii="Arial" w:hAnsi="Arial" w:cs="Arial"/>
           <w:sz w:val="24"/>
         </w:rPr>
-        <w:t xml:space="preserve">Para resolver el problema, se empleó el algoritmo </w:t>
-      </w:r>
-      <w:proofErr w:type="spellStart"/>
-      <w:r>
-        <w:rPr>
-          <w:rFonts w:ascii="Arial" w:hAnsi="Arial" w:cs="Arial"/>
-          <w:sz w:val="24"/>
-        </w:rPr>
-        <w:t>XGBoost</w:t>
-      </w:r>
-      <w:proofErr w:type="spellEnd"/>
-      <w:r>
-        <w:rPr>
-          <w:rFonts w:ascii="Arial" w:hAnsi="Arial" w:cs="Arial"/>
-          <w:sz w:val="24"/>
-        </w:rPr>
-        <w:t xml:space="preserve">, un modelo de ensamble basado en árboles de decisión capaz de capturar relaciones no lineales complejas. Dado que cada </w:t>
+        <w:t xml:space="preserve">Para resolver el problema, se empleó el algoritmo XGBoost, un modelo de ensamble basado en árboles de decisión capaz de capturar relaciones no lineales complejas. Dado que cada </w:t>
       </w:r>
       <w:r>
         <w:rPr>
@@ -20781,6 +22023,11 @@
     </w:p>
     <w:p>
       <w:pPr>
+        <w:pStyle w:val="Prrafodelista"/>
+        <w:numPr>
+          <w:ilvl w:val="0"/>
+          <w:numId w:val="49"/>
+        </w:numPr>
         <w:jc w:val="both"/>
         <w:rPr>
           <w:rFonts w:ascii="Arial" w:hAnsi="Arial" w:cs="Arial"/>
@@ -20817,36 +22064,25 @@
     </w:p>
     <w:p>
       <w:pPr>
-        <w:jc w:val="both"/>
-        <w:rPr>
-          <w:rFonts w:ascii="Arial" w:hAnsi="Arial" w:cs="Arial"/>
-          <w:sz w:val="24"/>
-          <w:szCs w:val="24"/>
-        </w:rPr>
-      </w:pPr>
-      <w:r>
-        <w:rPr>
-          <w:rFonts w:ascii="Arial" w:hAnsi="Arial" w:cs="Arial"/>
-          <w:sz w:val="24"/>
-          <w:szCs w:val="24"/>
-        </w:rPr>
-        <w:t xml:space="preserve">Exclusión del sesgo de magnitud: Se eliminó el cultivo de Caña de azúcar. Esta decisión se justifica técnicamente porque su rendimiento (superior a 100 ton/ha) "cegaba" a los modelos ante variaciones en cultivos estándar como el trigo o el maíz, cuyos cambios de 1 o 2 toneladas son vitales, pero quedaban </w:t>
-      </w:r>
-      <w:r>
-        <w:rPr>
-          <w:rFonts w:ascii="Arial" w:hAnsi="Arial" w:cs="Arial"/>
-          <w:sz w:val="24"/>
-          <w:szCs w:val="24"/>
-        </w:rPr>
-        <w:t>eclipsados</w:t>
-      </w:r>
-      <w:r>
-        <w:rPr>
-          <w:rFonts w:ascii="Arial" w:hAnsi="Arial" w:cs="Arial"/>
-          <w:sz w:val="24"/>
-          <w:szCs w:val="24"/>
-        </w:rPr>
-        <w:t xml:space="preserve"> en la escala global.</w:t>
+        <w:pStyle w:val="Prrafodelista"/>
+        <w:numPr>
+          <w:ilvl w:val="0"/>
+          <w:numId w:val="49"/>
+        </w:numPr>
+        <w:jc w:val="both"/>
+        <w:rPr>
+          <w:rFonts w:ascii="Arial" w:hAnsi="Arial" w:cs="Arial"/>
+          <w:sz w:val="24"/>
+          <w:szCs w:val="24"/>
+        </w:rPr>
+      </w:pPr>
+      <w:r>
+        <w:rPr>
+          <w:rFonts w:ascii="Arial" w:hAnsi="Arial" w:cs="Arial"/>
+          <w:sz w:val="24"/>
+          <w:szCs w:val="24"/>
+        </w:rPr>
+        <w:t>Exclusión del sesgo de magnitud: Se eliminó el cultivo de Caña de azúcar. Esta decisión se justifica técnicamente porque su rendimiento (superior a 100 ton/ha) "cegaba" a los modelos ante variaciones en cultivos estándar como el trigo o el maíz, cuyos cambios de 1 o 2 toneladas son vitales, pero quedaban eclipsados en la escala global.</w:t>
       </w:r>
     </w:p>
     <w:p>
@@ -20964,41 +22200,13 @@
           <w:szCs w:val="24"/>
         </w:rPr>
       </w:pPr>
-      <w:proofErr w:type="spellStart"/>
-      <w:r>
-        <w:rPr>
-          <w:rFonts w:ascii="Arial" w:hAnsi="Arial" w:cs="Arial"/>
-          <w:sz w:val="24"/>
-          <w:szCs w:val="24"/>
-        </w:rPr>
-        <w:t>One</w:t>
-      </w:r>
-      <w:proofErr w:type="spellEnd"/>
-      <w:r>
-        <w:rPr>
-          <w:rFonts w:ascii="Arial" w:hAnsi="Arial" w:cs="Arial"/>
-          <w:sz w:val="24"/>
-          <w:szCs w:val="24"/>
-        </w:rPr>
-        <w:t xml:space="preserve">-Class SVM: Basado en el aprendizaje de un hiperplano de separación que maximiza la distancia entre el origen y los puntos de datos en un espacio de características transformado por un </w:t>
-      </w:r>
-      <w:proofErr w:type="spellStart"/>
-      <w:r>
-        <w:rPr>
-          <w:rFonts w:ascii="Arial" w:hAnsi="Arial" w:cs="Arial"/>
-          <w:sz w:val="24"/>
-          <w:szCs w:val="24"/>
-        </w:rPr>
-        <w:t>Kernel</w:t>
-      </w:r>
-      <w:proofErr w:type="spellEnd"/>
-      <w:r>
-        <w:rPr>
-          <w:rFonts w:ascii="Arial" w:hAnsi="Arial" w:cs="Arial"/>
-          <w:sz w:val="24"/>
-          <w:szCs w:val="24"/>
-        </w:rPr>
-        <w:t xml:space="preserve"> RBF. Este modelo es superior para detectar fronteras de normalidad no lineales donde el clima y la producción interactúan de forma compleja.</w:t>
+      <w:r>
+        <w:rPr>
+          <w:rFonts w:ascii="Arial" w:hAnsi="Arial" w:cs="Arial"/>
+          <w:sz w:val="24"/>
+          <w:szCs w:val="24"/>
+        </w:rPr>
+        <w:t>One-Class SVM: Basado en el aprendizaje de un hiperplano de separación que maximiza la distancia entre el origen y los puntos de datos en un espacio de características. Este modelo es superior para detectar fronteras de normalidad no lineales donde el clima y la producción interactúan de forma compleja.</w:t>
       </w:r>
     </w:p>
     <w:p>
@@ -21030,15 +22238,7 @@
           <w:b/>
           <w:color w:val="auto"/>
         </w:rPr>
-        <w:t>ecomendación</w:t>
-      </w:r>
-      <w:r>
-        <w:rPr>
-          <w:rFonts w:ascii="Arial" w:hAnsi="Arial" w:cs="Arial"/>
-          <w:b/>
-          <w:color w:val="auto"/>
-        </w:rPr>
-        <w:t xml:space="preserve"> de Cultivos</w:t>
+        <w:t>ecomendación de Cultivos</w:t>
       </w:r>
     </w:p>
     <w:p>
@@ -21124,7 +22324,7 @@
           <w:sz w:val="24"/>
           <w:szCs w:val="24"/>
         </w:rPr>
-        <w:t xml:space="preserve"> y Geográfico. En esta primera etapa, el sistema fue alimentado con variables climáticas base (temperatura, precipitación, índice de aridez) y variables sintéticas generadas para medir el riesgo climático y la interacción temperatura-lluvia. Para dotar al modelo de contexto geográfico sin generar sesgos numéricos, se aplicó la técnica de </w:t>
+        <w:t xml:space="preserve"> y Geográfico. En esta primera etapa, el sistema fue alimentado con variables climáticas base (temperatura, precipitación, índice de aridez) y variables sintéticas generadas para medir el riesgo climático y la interacción temperatura-lluvia. Para dotar al modelo de contexto geográfico sin generar sesgos numéricos, se aplicó la técnica de One-Hot </w:t>
       </w:r>
       <w:proofErr w:type="spellStart"/>
       <w:r>
@@ -21133,7 +22333,7 @@
           <w:sz w:val="24"/>
           <w:szCs w:val="24"/>
         </w:rPr>
-        <w:t>One</w:t>
+        <w:t>Encoding</w:t>
       </w:r>
       <w:proofErr w:type="spellEnd"/>
       <w:r>
@@ -21142,7 +22342,7 @@
           <w:sz w:val="24"/>
           <w:szCs w:val="24"/>
         </w:rPr>
-        <w:t xml:space="preserve">-Hot </w:t>
+        <w:t xml:space="preserve"> sobre la variable </w:t>
       </w:r>
       <w:proofErr w:type="spellStart"/>
       <w:r>
@@ -21151,7 +22351,7 @@
           <w:sz w:val="24"/>
           <w:szCs w:val="24"/>
         </w:rPr>
-        <w:t>Encoding</w:t>
+        <w:t>pais</w:t>
       </w:r>
       <w:proofErr w:type="spellEnd"/>
       <w:r>
@@ -21160,7 +22360,49 @@
           <w:sz w:val="24"/>
           <w:szCs w:val="24"/>
         </w:rPr>
-        <w:t xml:space="preserve"> sobre la variable </w:t>
+        <w:t>, permitiendo a los algoritmos capturar las limitaciones de suelo</w:t>
+      </w:r>
+      <w:r>
+        <w:rPr>
+          <w:rFonts w:ascii="Arial" w:hAnsi="Arial" w:cs="Arial"/>
+          <w:sz w:val="24"/>
+          <w:szCs w:val="24"/>
+        </w:rPr>
+        <w:t>.</w:t>
+      </w:r>
+    </w:p>
+    <w:p>
+      <w:pPr>
+        <w:jc w:val="both"/>
+        <w:rPr>
+          <w:rFonts w:ascii="Arial" w:hAnsi="Arial" w:cs="Arial"/>
+          <w:sz w:val="24"/>
+          <w:szCs w:val="24"/>
+        </w:rPr>
+      </w:pPr>
+      <w:r>
+        <w:rPr>
+          <w:rFonts w:ascii="Arial" w:hAnsi="Arial" w:cs="Arial"/>
+          <w:sz w:val="24"/>
+          <w:szCs w:val="24"/>
+        </w:rPr>
+        <w:t xml:space="preserve">Fase 2: Incorporación de la Inercia Agrícola. Tras evaluar el primer modelo, se determinó que la agricultura real no obedece únicamente al clima del año en curso, sino que está fuertemente condicionada por la infraestructura </w:t>
+      </w:r>
+      <w:r>
+        <w:rPr>
+          <w:rFonts w:ascii="Arial" w:hAnsi="Arial" w:cs="Arial"/>
+          <w:sz w:val="24"/>
+          <w:szCs w:val="24"/>
+        </w:rPr>
+        <w:t>pasada</w:t>
+      </w:r>
+      <w:r>
+        <w:rPr>
+          <w:rFonts w:ascii="Arial" w:hAnsi="Arial" w:cs="Arial"/>
+          <w:sz w:val="24"/>
+          <w:szCs w:val="24"/>
+        </w:rPr>
+        <w:t xml:space="preserve">. Se introdujo una variable de retardo temporal denominada </w:t>
       </w:r>
       <w:proofErr w:type="spellStart"/>
       <w:r>
@@ -21169,7 +22411,7 @@
           <w:sz w:val="24"/>
           <w:szCs w:val="24"/>
         </w:rPr>
-        <w:t>pais</w:t>
+        <w:t>cultivo_anterior</w:t>
       </w:r>
       <w:proofErr w:type="spellEnd"/>
       <w:r>
@@ -21178,66 +22420,6 @@
           <w:sz w:val="24"/>
           <w:szCs w:val="24"/>
         </w:rPr>
-        <w:t>, permitiendo a los algoritmos capturar las limitaciones de suelo</w:t>
-      </w:r>
-      <w:r>
-        <w:rPr>
-          <w:rFonts w:ascii="Arial" w:hAnsi="Arial" w:cs="Arial"/>
-          <w:sz w:val="24"/>
-          <w:szCs w:val="24"/>
-        </w:rPr>
-        <w:t>.</w:t>
-      </w:r>
-    </w:p>
-    <w:p>
-      <w:pPr>
-        <w:jc w:val="both"/>
-        <w:rPr>
-          <w:rFonts w:ascii="Arial" w:hAnsi="Arial" w:cs="Arial"/>
-          <w:sz w:val="24"/>
-          <w:szCs w:val="24"/>
-        </w:rPr>
-      </w:pPr>
-      <w:r>
-        <w:rPr>
-          <w:rFonts w:ascii="Arial" w:hAnsi="Arial" w:cs="Arial"/>
-          <w:sz w:val="24"/>
-          <w:szCs w:val="24"/>
-        </w:rPr>
-        <w:t xml:space="preserve">Fase 2: Incorporación de la Inercia Agrícola. Tras evaluar el primer modelo, se determinó que la agricultura real no obedece únicamente al clima del año en curso, sino que está fuertemente condicionada por la infraestructura </w:t>
-      </w:r>
-      <w:r>
-        <w:rPr>
-          <w:rFonts w:ascii="Arial" w:hAnsi="Arial" w:cs="Arial"/>
-          <w:sz w:val="24"/>
-          <w:szCs w:val="24"/>
-        </w:rPr>
-        <w:t>pasada</w:t>
-      </w:r>
-      <w:r>
-        <w:rPr>
-          <w:rFonts w:ascii="Arial" w:hAnsi="Arial" w:cs="Arial"/>
-          <w:sz w:val="24"/>
-          <w:szCs w:val="24"/>
-        </w:rPr>
-        <w:t xml:space="preserve">. Se introdujo una variable de retardo temporal denominada </w:t>
-      </w:r>
-      <w:proofErr w:type="spellStart"/>
-      <w:r>
-        <w:rPr>
-          <w:rFonts w:ascii="Arial" w:hAnsi="Arial" w:cs="Arial"/>
-          <w:sz w:val="24"/>
-          <w:szCs w:val="24"/>
-        </w:rPr>
-        <w:t>cultivo_anterior</w:t>
-      </w:r>
-      <w:proofErr w:type="spellEnd"/>
-      <w:r>
-        <w:rPr>
-          <w:rFonts w:ascii="Arial" w:hAnsi="Arial" w:cs="Arial"/>
-          <w:sz w:val="24"/>
-          <w:szCs w:val="24"/>
-        </w:rPr>
         <w:t>, transformando el problema en un sistema autorregresivo que modela la continuidad y las lógicas de rotación de cultivos de cada país.</w:t>
       </w:r>
     </w:p>
@@ -21272,18 +22454,8 @@
           <w:sz w:val="24"/>
           <w:szCs w:val="24"/>
         </w:rPr>
-        <w:t xml:space="preserve">actualidad. Se implementaron dos arquitecturas de aprendizaje supervisado en paralelo: Random Forest y </w:t>
-      </w:r>
-      <w:proofErr w:type="spellStart"/>
-      <w:r>
-        <w:rPr>
-          <w:rFonts w:ascii="Arial" w:hAnsi="Arial" w:cs="Arial"/>
-          <w:sz w:val="24"/>
-          <w:szCs w:val="24"/>
-        </w:rPr>
-        <w:t>XGBoost</w:t>
-      </w:r>
-      <w:proofErr w:type="spellEnd"/>
+        <w:t>actualidad. Se implementaron dos arquitecturas de aprendizaje supervisado en paralelo: Random Forest y XGBoost</w:t>
+      </w:r>
       <w:r>
         <w:rPr>
           <w:rFonts w:ascii="Arial" w:hAnsi="Arial" w:cs="Arial"/>
@@ -23468,27 +24640,7 @@
           <w:sz w:val="24"/>
           <w:szCs w:val="24"/>
         </w:rPr>
-        <w:t xml:space="preserve">subida/bajada, el modelo </w:t>
-      </w:r>
-      <w:proofErr w:type="spellStart"/>
-      <w:r>
-        <w:rPr>
-          <w:rFonts w:ascii="Arial" w:eastAsiaTheme="majorEastAsia" w:hAnsi="Arial" w:cs="Arial"/>
-          <w:bCs/>
-          <w:sz w:val="24"/>
-          <w:szCs w:val="24"/>
-        </w:rPr>
-        <w:t>XGBoost</w:t>
-      </w:r>
-      <w:proofErr w:type="spellEnd"/>
-      <w:r>
-        <w:rPr>
-          <w:rFonts w:ascii="Arial" w:eastAsiaTheme="majorEastAsia" w:hAnsi="Arial" w:cs="Arial"/>
-          <w:bCs/>
-          <w:sz w:val="24"/>
-          <w:szCs w:val="24"/>
-        </w:rPr>
-        <w:t xml:space="preserve"> es capaz de aislar mejor las señales de mercado reales</w:t>
+        <w:t>subida/bajada, el modelo XGBoost es capaz de aislar mejor las señales de mercado reales</w:t>
       </w:r>
       <w:r>
         <w:rPr>
@@ -24025,7 +25177,6 @@
                 <w:szCs w:val="24"/>
               </w:rPr>
             </w:pPr>
-            <w:proofErr w:type="spellStart"/>
             <w:r>
               <w:rPr>
                 <w:rFonts w:ascii="Arial" w:eastAsiaTheme="majorEastAsia" w:hAnsi="Arial" w:cs="Arial"/>
@@ -24033,17 +25184,7 @@
                 <w:sz w:val="24"/>
                 <w:szCs w:val="24"/>
               </w:rPr>
-              <w:t>One</w:t>
-            </w:r>
-            <w:proofErr w:type="spellEnd"/>
-            <w:r>
-              <w:rPr>
-                <w:rFonts w:ascii="Arial" w:eastAsiaTheme="majorEastAsia" w:hAnsi="Arial" w:cs="Arial"/>
-                <w:b/>
-                <w:sz w:val="24"/>
-                <w:szCs w:val="24"/>
-              </w:rPr>
-              <w:t>-Class SVM</w:t>
+              <w:t>One-Class SVM</w:t>
             </w:r>
           </w:p>
         </w:tc>
@@ -24148,27 +25289,7 @@
           <w:sz w:val="24"/>
           <w:szCs w:val="24"/>
         </w:rPr>
-        <w:t xml:space="preserve">El rendimiento del </w:t>
-      </w:r>
-      <w:proofErr w:type="spellStart"/>
-      <w:r>
-        <w:rPr>
-          <w:rFonts w:ascii="Arial" w:eastAsiaTheme="majorEastAsia" w:hAnsi="Arial" w:cs="Arial"/>
-          <w:bCs/>
-          <w:sz w:val="24"/>
-          <w:szCs w:val="24"/>
-        </w:rPr>
-        <w:t>One</w:t>
-      </w:r>
-      <w:proofErr w:type="spellEnd"/>
-      <w:r>
-        <w:rPr>
-          <w:rFonts w:ascii="Arial" w:eastAsiaTheme="majorEastAsia" w:hAnsi="Arial" w:cs="Arial"/>
-          <w:bCs/>
-          <w:sz w:val="24"/>
-          <w:szCs w:val="24"/>
-        </w:rPr>
-        <w:t>-Class SVM (</w:t>
+        <w:t>El rendimiento del One-Class SVM (</w:t>
       </w:r>
       <w:r>
         <w:rPr>
@@ -24401,27 +25522,7 @@
           <w:sz w:val="24"/>
           <w:szCs w:val="24"/>
         </w:rPr>
-        <w:t xml:space="preserve">La implementación de esta versión mejorada ha permitido transformar un problema de búsqueda a ciegas en un sistema de recomendación de alta precisión. Con una tasa de acierto del 83.7% en el </w:t>
-      </w:r>
-      <w:proofErr w:type="spellStart"/>
-      <w:r>
-        <w:rPr>
-          <w:rFonts w:ascii="Arial" w:eastAsiaTheme="majorEastAsia" w:hAnsi="Arial" w:cs="Arial"/>
-          <w:bCs/>
-          <w:sz w:val="24"/>
-          <w:szCs w:val="24"/>
-        </w:rPr>
-        <w:t>One</w:t>
-      </w:r>
-      <w:proofErr w:type="spellEnd"/>
-      <w:r>
-        <w:rPr>
-          <w:rFonts w:ascii="Arial" w:eastAsiaTheme="majorEastAsia" w:hAnsi="Arial" w:cs="Arial"/>
-          <w:bCs/>
-          <w:sz w:val="24"/>
-          <w:szCs w:val="24"/>
-        </w:rPr>
-        <w:t>-Class SVM, se garantiza que los recursos de supervisión se enfoquen exclusivamente en aquellos puntos que presentan una realidad estadística divergente, optimizando la gestión de la producción agrícola a escala global.</w:t>
+        <w:t>La implementación de esta versión mejorada ha permitido transformar un problema de búsqueda a ciegas en un sistema de recomendación de alta precisión. Con una tasa de acierto del 83.7% en el One-Class SVM, se garantiza que los recursos de supervisión se enfoquen exclusivamente en aquellos puntos que presentan una realidad estadística divergente, optimizando la gestión de la producción agrícola a escala global.</w:t>
       </w:r>
     </w:p>
     <w:p>
@@ -24457,17 +25558,7 @@
           <w:sz w:val="24"/>
           <w:szCs w:val="24"/>
         </w:rPr>
-        <w:t>ecomendación</w:t>
-      </w:r>
-      <w:r>
-        <w:rPr>
-          <w:rFonts w:ascii="Arial" w:eastAsiaTheme="majorEastAsia" w:hAnsi="Arial" w:cs="Arial"/>
-          <w:b/>
-          <w:bCs/>
-          <w:sz w:val="24"/>
-          <w:szCs w:val="24"/>
-        </w:rPr>
-        <w:t xml:space="preserve"> de Cultivos</w:t>
+        <w:t>ecomendación de Cultivos</w:t>
       </w:r>
     </w:p>
     <w:p>
@@ -24679,16 +25770,7 @@
                 <w:sz w:val="24"/>
                 <w:szCs w:val="24"/>
               </w:rPr>
-              <w:t xml:space="preserve"> – Fase</w:t>
-            </w:r>
-            <w:r>
-              <w:rPr>
-                <w:rFonts w:ascii="Arial" w:eastAsiaTheme="majorEastAsia" w:hAnsi="Arial" w:cs="Arial"/>
-                <w:b/>
-                <w:sz w:val="24"/>
-                <w:szCs w:val="24"/>
-              </w:rPr>
-              <w:t>2</w:t>
+              <w:t xml:space="preserve"> – Fase2</w:t>
             </w:r>
           </w:p>
         </w:tc>
@@ -24793,7 +25875,6 @@
                 <w:szCs w:val="24"/>
               </w:rPr>
             </w:pPr>
-            <w:proofErr w:type="spellStart"/>
             <w:r>
               <w:rPr>
                 <w:rFonts w:ascii="Arial" w:eastAsiaTheme="majorEastAsia" w:hAnsi="Arial" w:cs="Arial"/>
@@ -24803,7 +25884,6 @@
               </w:rPr>
               <w:t>XGBoost</w:t>
             </w:r>
-            <w:proofErr w:type="spellEnd"/>
           </w:p>
         </w:tc>
         <w:tc>
@@ -24885,25 +25965,7 @@
           <w:sz w:val="24"/>
           <w:szCs w:val="24"/>
         </w:rPr>
-        <w:t>Eficacia de</w:t>
-      </w:r>
-      <w:r>
-        <w:rPr>
-          <w:rFonts w:ascii="Arial" w:eastAsiaTheme="majorEastAsia" w:hAnsi="Arial" w:cs="Arial"/>
-          <w:bCs/>
-          <w:sz w:val="24"/>
-          <w:szCs w:val="24"/>
-        </w:rPr>
-        <w:t xml:space="preserve"> la</w:t>
-      </w:r>
-      <w:r>
-        <w:rPr>
-          <w:rFonts w:ascii="Arial" w:eastAsiaTheme="majorEastAsia" w:hAnsi="Arial" w:cs="Arial"/>
-          <w:bCs/>
-          <w:sz w:val="24"/>
-          <w:szCs w:val="24"/>
-        </w:rPr>
-        <w:t xml:space="preserve"> Fase 1: El modelo inicial demostró una capacidad predictiva sólida (~71% en Random Forest). Esto confirma que, partiendo desde cero, el clima y la zona geográfica son suficientes para acotar sustancialmente el abanico de cultivos viables, descartando opciones biológicamente incompatibles.</w:t>
+        <w:t>Eficacia de la Fase 1: El modelo inicial demostró una capacidad predictiva sólida (~71% en Random Forest). Esto confirma que, partiendo desde cero, el clima y la zona geográfica son suficientes para acotar sustancialmente el abanico de cultivos viables, descartando opciones biológicamente incompatibles.</w:t>
       </w:r>
     </w:p>
     <w:p>
@@ -24947,7 +26009,7 @@
           <w:sz w:val="24"/>
           <w:szCs w:val="24"/>
         </w:rPr>
-        <w:t xml:space="preserve">: </w:t>
+        <w:t xml:space="preserve">: Al introducir el cultivo del año anterior, la precisión se disparó por encima del 99% en Random Forest. Lejos de ser un sobreajuste, este resultado refleja la realidad del dominio agrícola: la persistencia de infraestructura. Si un país cuenta con la maquinaria, las cadenas de suministro y el conocimiento para procesar trigo, la probabilidad de que rote drásticamente a un cultivo incompatible al año siguiente es mínima, sin importar las </w:t>
       </w:r>
       <w:r>
         <w:rPr>
@@ -24956,7 +26018,7 @@
           <w:sz w:val="24"/>
           <w:szCs w:val="24"/>
         </w:rPr>
-        <w:t xml:space="preserve">Al introducir el cultivo del año anterior, la precisión se disparó por encima del 99% en Random Forest. Lejos de ser un sobreajuste, este resultado refleja la realidad del dominio agrícola: la persistencia de infraestructura. Si un país cuenta con la maquinaria, las cadenas de suministro y el conocimiento para procesar trigo, la probabilidad de que rote drásticamente a un cultivo incompatible al año siguiente es mínima, sin importar las </w:t>
+        <w:t>diferencias</w:t>
       </w:r>
       <w:r>
         <w:rPr>
@@ -24965,57 +26027,28 @@
           <w:sz w:val="24"/>
           <w:szCs w:val="24"/>
         </w:rPr>
-        <w:t>diferencias</w:t>
-      </w:r>
-      <w:r>
+        <w:t xml:space="preserve"> climáticas.</w:t>
+      </w:r>
+    </w:p>
+    <w:p>
+      <w:pPr>
+        <w:spacing w:line="276" w:lineRule="auto"/>
+        <w:jc w:val="both"/>
         <w:rPr>
           <w:rFonts w:ascii="Arial" w:eastAsiaTheme="majorEastAsia" w:hAnsi="Arial" w:cs="Arial"/>
           <w:bCs/>
           <w:sz w:val="24"/>
           <w:szCs w:val="24"/>
         </w:rPr>
-        <w:t xml:space="preserve"> climáticas.</w:t>
-      </w:r>
-    </w:p>
-    <w:p>
-      <w:pPr>
-        <w:spacing w:line="276" w:lineRule="auto"/>
-        <w:jc w:val="both"/>
+      </w:pPr>
+      <w:r>
         <w:rPr>
           <w:rFonts w:ascii="Arial" w:eastAsiaTheme="majorEastAsia" w:hAnsi="Arial" w:cs="Arial"/>
           <w:bCs/>
           <w:sz w:val="24"/>
           <w:szCs w:val="24"/>
         </w:rPr>
-      </w:pPr>
-      <w:r>
-        <w:rPr>
-          <w:rFonts w:ascii="Arial" w:eastAsiaTheme="majorEastAsia" w:hAnsi="Arial" w:cs="Arial"/>
-          <w:bCs/>
-          <w:sz w:val="24"/>
-          <w:szCs w:val="24"/>
-        </w:rPr>
-        <w:t xml:space="preserve">Comparativa de Arquitecturas: En ambas fases, Random Forest mostró un rendimiento superior a </w:t>
-      </w:r>
-      <w:proofErr w:type="spellStart"/>
-      <w:r>
-        <w:rPr>
-          <w:rFonts w:ascii="Arial" w:eastAsiaTheme="majorEastAsia" w:hAnsi="Arial" w:cs="Arial"/>
-          <w:bCs/>
-          <w:sz w:val="24"/>
-          <w:szCs w:val="24"/>
-        </w:rPr>
-        <w:t>XGBoost</w:t>
-      </w:r>
-      <w:proofErr w:type="spellEnd"/>
-      <w:r>
-        <w:rPr>
-          <w:rFonts w:ascii="Arial" w:eastAsiaTheme="majorEastAsia" w:hAnsi="Arial" w:cs="Arial"/>
-          <w:bCs/>
-          <w:sz w:val="24"/>
-          <w:szCs w:val="24"/>
-        </w:rPr>
-        <w:t xml:space="preserve">. Al tratarse de un conjunto de datos con patrones categóricos muy marcados (país y cultivo previo), la estructura de del </w:t>
+        <w:t xml:space="preserve">Comparativa de Arquitecturas: En ambas fases, Random Forest mostró un rendimiento superior a XGBoost. Al tratarse de un conjunto de datos con patrones categóricos muy marcados (país y cultivo previo), la estructura de del </w:t>
       </w:r>
       <w:r>
         <w:rPr>
@@ -28047,6 +29080,119 @@
     </w:lvl>
   </w:abstractNum>
   <w:abstractNum w:abstractNumId="26" w15:restartNumberingAfterBreak="0">
+    <w:nsid w:val="40232FE0"/>
+    <w:multiLevelType w:val="hybridMultilevel"/>
+    <w:tmpl w:val="0C382D54"/>
+    <w:lvl w:ilvl="0" w:tplc="822C7756">
+      <w:start w:val="2"/>
+      <w:numFmt w:val="bullet"/>
+      <w:lvlText w:val="-"/>
+      <w:lvlJc w:val="left"/>
+      <w:pPr>
+        <w:ind w:left="720" w:hanging="360"/>
+      </w:pPr>
+      <w:rPr>
+        <w:rFonts w:ascii="Arial" w:eastAsiaTheme="minorHAnsi" w:hAnsi="Arial" w:cs="Arial" w:hint="default"/>
+      </w:rPr>
+    </w:lvl>
+    <w:lvl w:ilvl="1" w:tplc="0C0A0003" w:tentative="1">
+      <w:start w:val="1"/>
+      <w:numFmt w:val="bullet"/>
+      <w:lvlText w:val="o"/>
+      <w:lvlJc w:val="left"/>
+      <w:pPr>
+        <w:ind w:left="1440" w:hanging="360"/>
+      </w:pPr>
+      <w:rPr>
+        <w:rFonts w:ascii="Courier New" w:hAnsi="Courier New" w:cs="Courier New" w:hint="default"/>
+      </w:rPr>
+    </w:lvl>
+    <w:lvl w:ilvl="2" w:tplc="0C0A0005" w:tentative="1">
+      <w:start w:val="1"/>
+      <w:numFmt w:val="bullet"/>
+      <w:lvlText w:val=""/>
+      <w:lvlJc w:val="left"/>
+      <w:pPr>
+        <w:ind w:left="2160" w:hanging="360"/>
+      </w:pPr>
+      <w:rPr>
+        <w:rFonts w:ascii="Wingdings" w:hAnsi="Wingdings" w:hint="default"/>
+      </w:rPr>
+    </w:lvl>
+    <w:lvl w:ilvl="3" w:tplc="0C0A0001" w:tentative="1">
+      <w:start w:val="1"/>
+      <w:numFmt w:val="bullet"/>
+      <w:lvlText w:val=""/>
+      <w:lvlJc w:val="left"/>
+      <w:pPr>
+        <w:ind w:left="2880" w:hanging="360"/>
+      </w:pPr>
+      <w:rPr>
+        <w:rFonts w:ascii="Symbol" w:hAnsi="Symbol" w:hint="default"/>
+      </w:rPr>
+    </w:lvl>
+    <w:lvl w:ilvl="4" w:tplc="0C0A0003" w:tentative="1">
+      <w:start w:val="1"/>
+      <w:numFmt w:val="bullet"/>
+      <w:lvlText w:val="o"/>
+      <w:lvlJc w:val="left"/>
+      <w:pPr>
+        <w:ind w:left="3600" w:hanging="360"/>
+      </w:pPr>
+      <w:rPr>
+        <w:rFonts w:ascii="Courier New" w:hAnsi="Courier New" w:cs="Courier New" w:hint="default"/>
+      </w:rPr>
+    </w:lvl>
+    <w:lvl w:ilvl="5" w:tplc="0C0A0005" w:tentative="1">
+      <w:start w:val="1"/>
+      <w:numFmt w:val="bullet"/>
+      <w:lvlText w:val=""/>
+      <w:lvlJc w:val="left"/>
+      <w:pPr>
+        <w:ind w:left="4320" w:hanging="360"/>
+      </w:pPr>
+      <w:rPr>
+        <w:rFonts w:ascii="Wingdings" w:hAnsi="Wingdings" w:hint="default"/>
+      </w:rPr>
+    </w:lvl>
+    <w:lvl w:ilvl="6" w:tplc="0C0A0001" w:tentative="1">
+      <w:start w:val="1"/>
+      <w:numFmt w:val="bullet"/>
+      <w:lvlText w:val=""/>
+      <w:lvlJc w:val="left"/>
+      <w:pPr>
+        <w:ind w:left="5040" w:hanging="360"/>
+      </w:pPr>
+      <w:rPr>
+        <w:rFonts w:ascii="Symbol" w:hAnsi="Symbol" w:hint="default"/>
+      </w:rPr>
+    </w:lvl>
+    <w:lvl w:ilvl="7" w:tplc="0C0A0003" w:tentative="1">
+      <w:start w:val="1"/>
+      <w:numFmt w:val="bullet"/>
+      <w:lvlText w:val="o"/>
+      <w:lvlJc w:val="left"/>
+      <w:pPr>
+        <w:ind w:left="5760" w:hanging="360"/>
+      </w:pPr>
+      <w:rPr>
+        <w:rFonts w:ascii="Courier New" w:hAnsi="Courier New" w:cs="Courier New" w:hint="default"/>
+      </w:rPr>
+    </w:lvl>
+    <w:lvl w:ilvl="8" w:tplc="0C0A0005" w:tentative="1">
+      <w:start w:val="1"/>
+      <w:numFmt w:val="bullet"/>
+      <w:lvlText w:val=""/>
+      <w:lvlJc w:val="left"/>
+      <w:pPr>
+        <w:ind w:left="6480" w:hanging="360"/>
+      </w:pPr>
+      <w:rPr>
+        <w:rFonts w:ascii="Wingdings" w:hAnsi="Wingdings" w:hint="default"/>
+      </w:rPr>
+    </w:lvl>
+  </w:abstractNum>
+  <w:abstractNum w:abstractNumId="27" w15:restartNumberingAfterBreak="0">
     <w:nsid w:val="42E20D04"/>
     <w:multiLevelType w:val="hybridMultilevel"/>
     <w:tmpl w:val="36104B76"/>
@@ -28159,7 +29305,7 @@
       </w:rPr>
     </w:lvl>
   </w:abstractNum>
-  <w:abstractNum w:abstractNumId="27" w15:restartNumberingAfterBreak="0">
+  <w:abstractNum w:abstractNumId="28" w15:restartNumberingAfterBreak="0">
     <w:nsid w:val="43096A15"/>
     <w:multiLevelType w:val="hybridMultilevel"/>
     <w:tmpl w:val="3926FA06"/>
@@ -28248,7 +29394,7 @@
       </w:pPr>
     </w:lvl>
   </w:abstractNum>
-  <w:abstractNum w:abstractNumId="28" w15:restartNumberingAfterBreak="0">
+  <w:abstractNum w:abstractNumId="29" w15:restartNumberingAfterBreak="0">
     <w:nsid w:val="43DD399D"/>
     <w:multiLevelType w:val="hybridMultilevel"/>
     <w:tmpl w:val="F0CAF9DC"/>
@@ -28361,7 +29507,7 @@
       </w:rPr>
     </w:lvl>
   </w:abstractNum>
-  <w:abstractNum w:abstractNumId="29" w15:restartNumberingAfterBreak="0">
+  <w:abstractNum w:abstractNumId="30" w15:restartNumberingAfterBreak="0">
     <w:nsid w:val="49405B27"/>
     <w:multiLevelType w:val="multilevel"/>
     <w:tmpl w:val="29A038DE"/>
@@ -28450,7 +29596,7 @@
       </w:pPr>
     </w:lvl>
   </w:abstractNum>
-  <w:abstractNum w:abstractNumId="30" w15:restartNumberingAfterBreak="0">
+  <w:abstractNum w:abstractNumId="31" w15:restartNumberingAfterBreak="0">
     <w:nsid w:val="4B471FD2"/>
     <w:multiLevelType w:val="hybridMultilevel"/>
     <w:tmpl w:val="D1E496AA"/>
@@ -28539,7 +29685,7 @@
       </w:pPr>
     </w:lvl>
   </w:abstractNum>
-  <w:abstractNum w:abstractNumId="31" w15:restartNumberingAfterBreak="0">
+  <w:abstractNum w:abstractNumId="32" w15:restartNumberingAfterBreak="0">
     <w:nsid w:val="4C9D61B6"/>
     <w:multiLevelType w:val="hybridMultilevel"/>
     <w:tmpl w:val="26A6F206"/>
@@ -28625,7 +29771,7 @@
       </w:pPr>
     </w:lvl>
   </w:abstractNum>
-  <w:abstractNum w:abstractNumId="32" w15:restartNumberingAfterBreak="0">
+  <w:abstractNum w:abstractNumId="33" w15:restartNumberingAfterBreak="0">
     <w:nsid w:val="4CD25A8A"/>
     <w:multiLevelType w:val="hybridMultilevel"/>
     <w:tmpl w:val="69542ABC"/>
@@ -28738,7 +29884,120 @@
       </w:rPr>
     </w:lvl>
   </w:abstractNum>
-  <w:abstractNum w:abstractNumId="33" w15:restartNumberingAfterBreak="0">
+  <w:abstractNum w:abstractNumId="34" w15:restartNumberingAfterBreak="0">
+    <w:nsid w:val="4F36112B"/>
+    <w:multiLevelType w:val="hybridMultilevel"/>
+    <w:tmpl w:val="9D16EA36"/>
+    <w:lvl w:ilvl="0" w:tplc="822C7756">
+      <w:start w:val="2"/>
+      <w:numFmt w:val="bullet"/>
+      <w:lvlText w:val="-"/>
+      <w:lvlJc w:val="left"/>
+      <w:pPr>
+        <w:ind w:left="720" w:hanging="360"/>
+      </w:pPr>
+      <w:rPr>
+        <w:rFonts w:ascii="Arial" w:eastAsiaTheme="minorHAnsi" w:hAnsi="Arial" w:cs="Arial" w:hint="default"/>
+      </w:rPr>
+    </w:lvl>
+    <w:lvl w:ilvl="1" w:tplc="0C0A0003" w:tentative="1">
+      <w:start w:val="1"/>
+      <w:numFmt w:val="bullet"/>
+      <w:lvlText w:val="o"/>
+      <w:lvlJc w:val="left"/>
+      <w:pPr>
+        <w:ind w:left="1440" w:hanging="360"/>
+      </w:pPr>
+      <w:rPr>
+        <w:rFonts w:ascii="Courier New" w:hAnsi="Courier New" w:cs="Courier New" w:hint="default"/>
+      </w:rPr>
+    </w:lvl>
+    <w:lvl w:ilvl="2" w:tplc="0C0A0005" w:tentative="1">
+      <w:start w:val="1"/>
+      <w:numFmt w:val="bullet"/>
+      <w:lvlText w:val=""/>
+      <w:lvlJc w:val="left"/>
+      <w:pPr>
+        <w:ind w:left="2160" w:hanging="360"/>
+      </w:pPr>
+      <w:rPr>
+        <w:rFonts w:ascii="Wingdings" w:hAnsi="Wingdings" w:hint="default"/>
+      </w:rPr>
+    </w:lvl>
+    <w:lvl w:ilvl="3" w:tplc="0C0A0001" w:tentative="1">
+      <w:start w:val="1"/>
+      <w:numFmt w:val="bullet"/>
+      <w:lvlText w:val=""/>
+      <w:lvlJc w:val="left"/>
+      <w:pPr>
+        <w:ind w:left="2880" w:hanging="360"/>
+      </w:pPr>
+      <w:rPr>
+        <w:rFonts w:ascii="Symbol" w:hAnsi="Symbol" w:hint="default"/>
+      </w:rPr>
+    </w:lvl>
+    <w:lvl w:ilvl="4" w:tplc="0C0A0003" w:tentative="1">
+      <w:start w:val="1"/>
+      <w:numFmt w:val="bullet"/>
+      <w:lvlText w:val="o"/>
+      <w:lvlJc w:val="left"/>
+      <w:pPr>
+        <w:ind w:left="3600" w:hanging="360"/>
+      </w:pPr>
+      <w:rPr>
+        <w:rFonts w:ascii="Courier New" w:hAnsi="Courier New" w:cs="Courier New" w:hint="default"/>
+      </w:rPr>
+    </w:lvl>
+    <w:lvl w:ilvl="5" w:tplc="0C0A0005" w:tentative="1">
+      <w:start w:val="1"/>
+      <w:numFmt w:val="bullet"/>
+      <w:lvlText w:val=""/>
+      <w:lvlJc w:val="left"/>
+      <w:pPr>
+        <w:ind w:left="4320" w:hanging="360"/>
+      </w:pPr>
+      <w:rPr>
+        <w:rFonts w:ascii="Wingdings" w:hAnsi="Wingdings" w:hint="default"/>
+      </w:rPr>
+    </w:lvl>
+    <w:lvl w:ilvl="6" w:tplc="0C0A0001" w:tentative="1">
+      <w:start w:val="1"/>
+      <w:numFmt w:val="bullet"/>
+      <w:lvlText w:val=""/>
+      <w:lvlJc w:val="left"/>
+      <w:pPr>
+        <w:ind w:left="5040" w:hanging="360"/>
+      </w:pPr>
+      <w:rPr>
+        <w:rFonts w:ascii="Symbol" w:hAnsi="Symbol" w:hint="default"/>
+      </w:rPr>
+    </w:lvl>
+    <w:lvl w:ilvl="7" w:tplc="0C0A0003" w:tentative="1">
+      <w:start w:val="1"/>
+      <w:numFmt w:val="bullet"/>
+      <w:lvlText w:val="o"/>
+      <w:lvlJc w:val="left"/>
+      <w:pPr>
+        <w:ind w:left="5760" w:hanging="360"/>
+      </w:pPr>
+      <w:rPr>
+        <w:rFonts w:ascii="Courier New" w:hAnsi="Courier New" w:cs="Courier New" w:hint="default"/>
+      </w:rPr>
+    </w:lvl>
+    <w:lvl w:ilvl="8" w:tplc="0C0A0005" w:tentative="1">
+      <w:start w:val="1"/>
+      <w:numFmt w:val="bullet"/>
+      <w:lvlText w:val=""/>
+      <w:lvlJc w:val="left"/>
+      <w:pPr>
+        <w:ind w:left="6480" w:hanging="360"/>
+      </w:pPr>
+      <w:rPr>
+        <w:rFonts w:ascii="Wingdings" w:hAnsi="Wingdings" w:hint="default"/>
+      </w:rPr>
+    </w:lvl>
+  </w:abstractNum>
+  <w:abstractNum w:abstractNumId="35" w15:restartNumberingAfterBreak="0">
     <w:nsid w:val="4F3A39D3"/>
     <w:multiLevelType w:val="hybridMultilevel"/>
     <w:tmpl w:val="05BAEA86"/>
@@ -28827,7 +30086,7 @@
       </w:pPr>
     </w:lvl>
   </w:abstractNum>
-  <w:abstractNum w:abstractNumId="34" w15:restartNumberingAfterBreak="0">
+  <w:abstractNum w:abstractNumId="36" w15:restartNumberingAfterBreak="0">
     <w:nsid w:val="507F556E"/>
     <w:multiLevelType w:val="hybridMultilevel"/>
     <w:tmpl w:val="52A61F42"/>
@@ -28940,7 +30199,7 @@
       </w:rPr>
     </w:lvl>
   </w:abstractNum>
-  <w:abstractNum w:abstractNumId="35" w15:restartNumberingAfterBreak="0">
+  <w:abstractNum w:abstractNumId="37" w15:restartNumberingAfterBreak="0">
     <w:nsid w:val="548C3DB9"/>
     <w:multiLevelType w:val="hybridMultilevel"/>
     <w:tmpl w:val="F5AC7E98"/>
@@ -29035,7 +30294,7 @@
       </w:pPr>
     </w:lvl>
   </w:abstractNum>
-  <w:abstractNum w:abstractNumId="36" w15:restartNumberingAfterBreak="0">
+  <w:abstractNum w:abstractNumId="38" w15:restartNumberingAfterBreak="0">
     <w:nsid w:val="561934C3"/>
     <w:multiLevelType w:val="hybridMultilevel"/>
     <w:tmpl w:val="4EF68464"/>
@@ -29124,7 +30383,7 @@
       </w:pPr>
     </w:lvl>
   </w:abstractNum>
-  <w:abstractNum w:abstractNumId="37" w15:restartNumberingAfterBreak="0">
+  <w:abstractNum w:abstractNumId="39" w15:restartNumberingAfterBreak="0">
     <w:nsid w:val="5C2366B6"/>
     <w:multiLevelType w:val="hybridMultilevel"/>
     <w:tmpl w:val="58E83A30"/>
@@ -29237,7 +30496,7 @@
       </w:rPr>
     </w:lvl>
   </w:abstractNum>
-  <w:abstractNum w:abstractNumId="38" w15:restartNumberingAfterBreak="0">
+  <w:abstractNum w:abstractNumId="40" w15:restartNumberingAfterBreak="0">
     <w:nsid w:val="61414DE0"/>
     <w:multiLevelType w:val="hybridMultilevel"/>
     <w:tmpl w:val="B0C28F26"/>
@@ -29350,7 +30609,120 @@
       </w:rPr>
     </w:lvl>
   </w:abstractNum>
-  <w:abstractNum w:abstractNumId="39" w15:restartNumberingAfterBreak="0">
+  <w:abstractNum w:abstractNumId="41" w15:restartNumberingAfterBreak="0">
+    <w:nsid w:val="61B92F5F"/>
+    <w:multiLevelType w:val="hybridMultilevel"/>
+    <w:tmpl w:val="262E1FC8"/>
+    <w:lvl w:ilvl="0" w:tplc="822C7756">
+      <w:start w:val="2"/>
+      <w:numFmt w:val="bullet"/>
+      <w:lvlText w:val="-"/>
+      <w:lvlJc w:val="left"/>
+      <w:pPr>
+        <w:ind w:left="720" w:hanging="360"/>
+      </w:pPr>
+      <w:rPr>
+        <w:rFonts w:ascii="Arial" w:eastAsiaTheme="minorHAnsi" w:hAnsi="Arial" w:cs="Arial" w:hint="default"/>
+      </w:rPr>
+    </w:lvl>
+    <w:lvl w:ilvl="1" w:tplc="0C0A0003" w:tentative="1">
+      <w:start w:val="1"/>
+      <w:numFmt w:val="bullet"/>
+      <w:lvlText w:val="o"/>
+      <w:lvlJc w:val="left"/>
+      <w:pPr>
+        <w:ind w:left="1440" w:hanging="360"/>
+      </w:pPr>
+      <w:rPr>
+        <w:rFonts w:ascii="Courier New" w:hAnsi="Courier New" w:cs="Courier New" w:hint="default"/>
+      </w:rPr>
+    </w:lvl>
+    <w:lvl w:ilvl="2" w:tplc="0C0A0005" w:tentative="1">
+      <w:start w:val="1"/>
+      <w:numFmt w:val="bullet"/>
+      <w:lvlText w:val=""/>
+      <w:lvlJc w:val="left"/>
+      <w:pPr>
+        <w:ind w:left="2160" w:hanging="360"/>
+      </w:pPr>
+      <w:rPr>
+        <w:rFonts w:ascii="Wingdings" w:hAnsi="Wingdings" w:hint="default"/>
+      </w:rPr>
+    </w:lvl>
+    <w:lvl w:ilvl="3" w:tplc="0C0A0001" w:tentative="1">
+      <w:start w:val="1"/>
+      <w:numFmt w:val="bullet"/>
+      <w:lvlText w:val=""/>
+      <w:lvlJc w:val="left"/>
+      <w:pPr>
+        <w:ind w:left="2880" w:hanging="360"/>
+      </w:pPr>
+      <w:rPr>
+        <w:rFonts w:ascii="Symbol" w:hAnsi="Symbol" w:hint="default"/>
+      </w:rPr>
+    </w:lvl>
+    <w:lvl w:ilvl="4" w:tplc="0C0A0003" w:tentative="1">
+      <w:start w:val="1"/>
+      <w:numFmt w:val="bullet"/>
+      <w:lvlText w:val="o"/>
+      <w:lvlJc w:val="left"/>
+      <w:pPr>
+        <w:ind w:left="3600" w:hanging="360"/>
+      </w:pPr>
+      <w:rPr>
+        <w:rFonts w:ascii="Courier New" w:hAnsi="Courier New" w:cs="Courier New" w:hint="default"/>
+      </w:rPr>
+    </w:lvl>
+    <w:lvl w:ilvl="5" w:tplc="0C0A0005" w:tentative="1">
+      <w:start w:val="1"/>
+      <w:numFmt w:val="bullet"/>
+      <w:lvlText w:val=""/>
+      <w:lvlJc w:val="left"/>
+      <w:pPr>
+        <w:ind w:left="4320" w:hanging="360"/>
+      </w:pPr>
+      <w:rPr>
+        <w:rFonts w:ascii="Wingdings" w:hAnsi="Wingdings" w:hint="default"/>
+      </w:rPr>
+    </w:lvl>
+    <w:lvl w:ilvl="6" w:tplc="0C0A0001" w:tentative="1">
+      <w:start w:val="1"/>
+      <w:numFmt w:val="bullet"/>
+      <w:lvlText w:val=""/>
+      <w:lvlJc w:val="left"/>
+      <w:pPr>
+        <w:ind w:left="5040" w:hanging="360"/>
+      </w:pPr>
+      <w:rPr>
+        <w:rFonts w:ascii="Symbol" w:hAnsi="Symbol" w:hint="default"/>
+      </w:rPr>
+    </w:lvl>
+    <w:lvl w:ilvl="7" w:tplc="0C0A0003" w:tentative="1">
+      <w:start w:val="1"/>
+      <w:numFmt w:val="bullet"/>
+      <w:lvlText w:val="o"/>
+      <w:lvlJc w:val="left"/>
+      <w:pPr>
+        <w:ind w:left="5760" w:hanging="360"/>
+      </w:pPr>
+      <w:rPr>
+        <w:rFonts w:ascii="Courier New" w:hAnsi="Courier New" w:cs="Courier New" w:hint="default"/>
+      </w:rPr>
+    </w:lvl>
+    <w:lvl w:ilvl="8" w:tplc="0C0A0005" w:tentative="1">
+      <w:start w:val="1"/>
+      <w:numFmt w:val="bullet"/>
+      <w:lvlText w:val=""/>
+      <w:lvlJc w:val="left"/>
+      <w:pPr>
+        <w:ind w:left="6480" w:hanging="360"/>
+      </w:pPr>
+      <w:rPr>
+        <w:rFonts w:ascii="Wingdings" w:hAnsi="Wingdings" w:hint="default"/>
+      </w:rPr>
+    </w:lvl>
+  </w:abstractNum>
+  <w:abstractNum w:abstractNumId="42" w15:restartNumberingAfterBreak="0">
     <w:nsid w:val="745B2877"/>
     <w:multiLevelType w:val="hybridMultilevel"/>
     <w:tmpl w:val="3DCE7578"/>
@@ -29463,7 +30835,7 @@
       </w:rPr>
     </w:lvl>
   </w:abstractNum>
-  <w:abstractNum w:abstractNumId="40" w15:restartNumberingAfterBreak="0">
+  <w:abstractNum w:abstractNumId="43" w15:restartNumberingAfterBreak="0">
     <w:nsid w:val="766E321F"/>
     <w:multiLevelType w:val="hybridMultilevel"/>
     <w:tmpl w:val="0B2AB368"/>
@@ -29576,7 +30948,7 @@
       </w:rPr>
     </w:lvl>
   </w:abstractNum>
-  <w:abstractNum w:abstractNumId="41" w15:restartNumberingAfterBreak="0">
+  <w:abstractNum w:abstractNumId="44" w15:restartNumberingAfterBreak="0">
     <w:nsid w:val="77B52173"/>
     <w:multiLevelType w:val="hybridMultilevel"/>
     <w:tmpl w:val="EA40515A"/>
@@ -29689,7 +31061,7 @@
       </w:rPr>
     </w:lvl>
   </w:abstractNum>
-  <w:abstractNum w:abstractNumId="42" w15:restartNumberingAfterBreak="0">
+  <w:abstractNum w:abstractNumId="45" w15:restartNumberingAfterBreak="0">
     <w:nsid w:val="78A6510D"/>
     <w:multiLevelType w:val="hybridMultilevel"/>
     <w:tmpl w:val="2E0A9992"/>
@@ -29802,7 +31174,7 @@
       </w:rPr>
     </w:lvl>
   </w:abstractNum>
-  <w:abstractNum w:abstractNumId="43" w15:restartNumberingAfterBreak="0">
+  <w:abstractNum w:abstractNumId="46" w15:restartNumberingAfterBreak="0">
     <w:nsid w:val="79C1407A"/>
     <w:multiLevelType w:val="hybridMultilevel"/>
     <w:tmpl w:val="806077C8"/>
@@ -29915,7 +31287,7 @@
       </w:rPr>
     </w:lvl>
   </w:abstractNum>
-  <w:abstractNum w:abstractNumId="44" w15:restartNumberingAfterBreak="0">
+  <w:abstractNum w:abstractNumId="47" w15:restartNumberingAfterBreak="0">
     <w:nsid w:val="7B6812BC"/>
     <w:multiLevelType w:val="hybridMultilevel"/>
     <w:tmpl w:val="B4D4A3B4"/>
@@ -30028,7 +31400,7 @@
       </w:rPr>
     </w:lvl>
   </w:abstractNum>
-  <w:abstractNum w:abstractNumId="45" w15:restartNumberingAfterBreak="0">
+  <w:abstractNum w:abstractNumId="48" w15:restartNumberingAfterBreak="0">
     <w:nsid w:val="7C2A3DA0"/>
     <w:multiLevelType w:val="hybridMultilevel"/>
     <w:tmpl w:val="26A6F206"/>
@@ -30121,16 +31493,16 @@
     <w:abstractNumId w:val="23"/>
   </w:num>
   <w:num w:numId="3" w16cid:durableId="252200498">
-    <w:abstractNumId w:val="33"/>
+    <w:abstractNumId w:val="35"/>
   </w:num>
   <w:num w:numId="4" w16cid:durableId="1824657007">
-    <w:abstractNumId w:val="35"/>
+    <w:abstractNumId w:val="37"/>
   </w:num>
   <w:num w:numId="5" w16cid:durableId="692651846">
-    <w:abstractNumId w:val="44"/>
+    <w:abstractNumId w:val="47"/>
   </w:num>
   <w:num w:numId="6" w16cid:durableId="1112555354">
-    <w:abstractNumId w:val="30"/>
+    <w:abstractNumId w:val="31"/>
   </w:num>
   <w:num w:numId="7" w16cid:durableId="285239225">
     <w:abstractNumId w:val="5"/>
@@ -30145,7 +31517,7 @@
     <w:abstractNumId w:val="13"/>
   </w:num>
   <w:num w:numId="11" w16cid:durableId="1012150524">
-    <w:abstractNumId w:val="29"/>
+    <w:abstractNumId w:val="30"/>
   </w:num>
   <w:num w:numId="12" w16cid:durableId="1474908486">
     <w:abstractNumId w:val="12"/>
@@ -30154,19 +31526,19 @@
     <w:abstractNumId w:val="20"/>
   </w:num>
   <w:num w:numId="14" w16cid:durableId="14890660">
-    <w:abstractNumId w:val="36"/>
+    <w:abstractNumId w:val="38"/>
   </w:num>
   <w:num w:numId="15" w16cid:durableId="1162352676">
-    <w:abstractNumId w:val="38"/>
+    <w:abstractNumId w:val="40"/>
   </w:num>
   <w:num w:numId="16" w16cid:durableId="132212933">
-    <w:abstractNumId w:val="27"/>
+    <w:abstractNumId w:val="28"/>
   </w:num>
   <w:num w:numId="17" w16cid:durableId="1466847293">
-    <w:abstractNumId w:val="45"/>
+    <w:abstractNumId w:val="48"/>
   </w:num>
   <w:num w:numId="18" w16cid:durableId="1060177845">
-    <w:abstractNumId w:val="31"/>
+    <w:abstractNumId w:val="32"/>
   </w:num>
   <w:num w:numId="19" w16cid:durableId="1984701359">
     <w:abstractNumId w:val="22"/>
@@ -30178,10 +31550,10 @@
     <w:abstractNumId w:val="10"/>
   </w:num>
   <w:num w:numId="22" w16cid:durableId="1541939321">
-    <w:abstractNumId w:val="40"/>
+    <w:abstractNumId w:val="43"/>
   </w:num>
   <w:num w:numId="23" w16cid:durableId="1504474171">
-    <w:abstractNumId w:val="28"/>
+    <w:abstractNumId w:val="29"/>
   </w:num>
   <w:num w:numId="24" w16cid:durableId="2088140205">
     <w:abstractNumId w:val="15"/>
@@ -30193,22 +31565,22 @@
     <w:abstractNumId w:val="3"/>
   </w:num>
   <w:num w:numId="27" w16cid:durableId="1263033452">
-    <w:abstractNumId w:val="39"/>
+    <w:abstractNumId w:val="42"/>
   </w:num>
   <w:num w:numId="28" w16cid:durableId="2085250483">
-    <w:abstractNumId w:val="37"/>
+    <w:abstractNumId w:val="39"/>
   </w:num>
   <w:num w:numId="29" w16cid:durableId="59259136">
     <w:abstractNumId w:val="1"/>
   </w:num>
   <w:num w:numId="30" w16cid:durableId="2001618637">
-    <w:abstractNumId w:val="41"/>
+    <w:abstractNumId w:val="44"/>
   </w:num>
   <w:num w:numId="31" w16cid:durableId="1106117604">
-    <w:abstractNumId w:val="42"/>
+    <w:abstractNumId w:val="45"/>
   </w:num>
   <w:num w:numId="32" w16cid:durableId="1062748986">
-    <w:abstractNumId w:val="34"/>
+    <w:abstractNumId w:val="36"/>
   </w:num>
   <w:num w:numId="33" w16cid:durableId="2068913560">
     <w:abstractNumId w:val="9"/>
@@ -30217,13 +31589,13 @@
     <w:abstractNumId w:val="17"/>
   </w:num>
   <w:num w:numId="35" w16cid:durableId="1224827084">
-    <w:abstractNumId w:val="32"/>
+    <w:abstractNumId w:val="33"/>
   </w:num>
   <w:num w:numId="36" w16cid:durableId="1117988694">
     <w:abstractNumId w:val="14"/>
   </w:num>
   <w:num w:numId="37" w16cid:durableId="952326012">
-    <w:abstractNumId w:val="43"/>
+    <w:abstractNumId w:val="46"/>
   </w:num>
   <w:num w:numId="38" w16cid:durableId="1071466918">
     <w:abstractNumId w:val="11"/>
@@ -30250,7 +31622,16 @@
     <w:abstractNumId w:val="6"/>
   </w:num>
   <w:num w:numId="46" w16cid:durableId="1109548022">
+    <w:abstractNumId w:val="27"/>
+  </w:num>
+  <w:num w:numId="47" w16cid:durableId="1087727164">
+    <w:abstractNumId w:val="41"/>
+  </w:num>
+  <w:num w:numId="48" w16cid:durableId="568343523">
     <w:abstractNumId w:val="26"/>
+  </w:num>
+  <w:num w:numId="49" w16cid:durableId="932594473">
+    <w:abstractNumId w:val="34"/>
   </w:num>
 </w:numbering>
 </file>
@@ -30894,6 +32275,191 @@
       <w:u w:val="single"/>
     </w:rPr>
   </w:style>
+  <w:style w:type="paragraph" w:styleId="ndice1">
+    <w:name w:val="index 1"/>
+    <w:basedOn w:val="Normal"/>
+    <w:next w:val="Normal"/>
+    <w:autoRedefine/>
+    <w:uiPriority w:val="99"/>
+    <w:unhideWhenUsed/>
+    <w:rsid w:val="001D4DA2"/>
+    <w:pPr>
+      <w:spacing w:after="0"/>
+      <w:ind w:left="220" w:hanging="220"/>
+    </w:pPr>
+    <w:rPr>
+      <w:rFonts w:cstheme="minorHAnsi"/>
+      <w:sz w:val="18"/>
+      <w:szCs w:val="18"/>
+    </w:rPr>
+  </w:style>
+  <w:style w:type="paragraph" w:styleId="ndice2">
+    <w:name w:val="index 2"/>
+    <w:basedOn w:val="Normal"/>
+    <w:next w:val="Normal"/>
+    <w:autoRedefine/>
+    <w:uiPriority w:val="99"/>
+    <w:unhideWhenUsed/>
+    <w:rsid w:val="001D4DA2"/>
+    <w:pPr>
+      <w:spacing w:after="0"/>
+      <w:ind w:left="440" w:hanging="220"/>
+    </w:pPr>
+    <w:rPr>
+      <w:rFonts w:cstheme="minorHAnsi"/>
+      <w:sz w:val="18"/>
+      <w:szCs w:val="18"/>
+    </w:rPr>
+  </w:style>
+  <w:style w:type="paragraph" w:styleId="ndice3">
+    <w:name w:val="index 3"/>
+    <w:basedOn w:val="Normal"/>
+    <w:next w:val="Normal"/>
+    <w:autoRedefine/>
+    <w:uiPriority w:val="99"/>
+    <w:unhideWhenUsed/>
+    <w:rsid w:val="001D4DA2"/>
+    <w:pPr>
+      <w:spacing w:after="0"/>
+      <w:ind w:left="660" w:hanging="220"/>
+    </w:pPr>
+    <w:rPr>
+      <w:rFonts w:cstheme="minorHAnsi"/>
+      <w:sz w:val="18"/>
+      <w:szCs w:val="18"/>
+    </w:rPr>
+  </w:style>
+  <w:style w:type="paragraph" w:styleId="ndice4">
+    <w:name w:val="index 4"/>
+    <w:basedOn w:val="Normal"/>
+    <w:next w:val="Normal"/>
+    <w:autoRedefine/>
+    <w:uiPriority w:val="99"/>
+    <w:unhideWhenUsed/>
+    <w:rsid w:val="001D4DA2"/>
+    <w:pPr>
+      <w:spacing w:after="0"/>
+      <w:ind w:left="880" w:hanging="220"/>
+    </w:pPr>
+    <w:rPr>
+      <w:rFonts w:cstheme="minorHAnsi"/>
+      <w:sz w:val="18"/>
+      <w:szCs w:val="18"/>
+    </w:rPr>
+  </w:style>
+  <w:style w:type="paragraph" w:styleId="ndice5">
+    <w:name w:val="index 5"/>
+    <w:basedOn w:val="Normal"/>
+    <w:next w:val="Normal"/>
+    <w:autoRedefine/>
+    <w:uiPriority w:val="99"/>
+    <w:unhideWhenUsed/>
+    <w:rsid w:val="001D4DA2"/>
+    <w:pPr>
+      <w:spacing w:after="0"/>
+      <w:ind w:left="1100" w:hanging="220"/>
+    </w:pPr>
+    <w:rPr>
+      <w:rFonts w:cstheme="minorHAnsi"/>
+      <w:sz w:val="18"/>
+      <w:szCs w:val="18"/>
+    </w:rPr>
+  </w:style>
+  <w:style w:type="paragraph" w:styleId="ndice6">
+    <w:name w:val="index 6"/>
+    <w:basedOn w:val="Normal"/>
+    <w:next w:val="Normal"/>
+    <w:autoRedefine/>
+    <w:uiPriority w:val="99"/>
+    <w:unhideWhenUsed/>
+    <w:rsid w:val="001D4DA2"/>
+    <w:pPr>
+      <w:spacing w:after="0"/>
+      <w:ind w:left="1320" w:hanging="220"/>
+    </w:pPr>
+    <w:rPr>
+      <w:rFonts w:cstheme="minorHAnsi"/>
+      <w:sz w:val="18"/>
+      <w:szCs w:val="18"/>
+    </w:rPr>
+  </w:style>
+  <w:style w:type="paragraph" w:styleId="ndice7">
+    <w:name w:val="index 7"/>
+    <w:basedOn w:val="Normal"/>
+    <w:next w:val="Normal"/>
+    <w:autoRedefine/>
+    <w:uiPriority w:val="99"/>
+    <w:unhideWhenUsed/>
+    <w:rsid w:val="001D4DA2"/>
+    <w:pPr>
+      <w:spacing w:after="0"/>
+      <w:ind w:left="1540" w:hanging="220"/>
+    </w:pPr>
+    <w:rPr>
+      <w:rFonts w:cstheme="minorHAnsi"/>
+      <w:sz w:val="18"/>
+      <w:szCs w:val="18"/>
+    </w:rPr>
+  </w:style>
+  <w:style w:type="paragraph" w:styleId="ndice8">
+    <w:name w:val="index 8"/>
+    <w:basedOn w:val="Normal"/>
+    <w:next w:val="Normal"/>
+    <w:autoRedefine/>
+    <w:uiPriority w:val="99"/>
+    <w:unhideWhenUsed/>
+    <w:rsid w:val="001D4DA2"/>
+    <w:pPr>
+      <w:spacing w:after="0"/>
+      <w:ind w:left="1760" w:hanging="220"/>
+    </w:pPr>
+    <w:rPr>
+      <w:rFonts w:cstheme="minorHAnsi"/>
+      <w:sz w:val="18"/>
+      <w:szCs w:val="18"/>
+    </w:rPr>
+  </w:style>
+  <w:style w:type="paragraph" w:styleId="ndice9">
+    <w:name w:val="index 9"/>
+    <w:basedOn w:val="Normal"/>
+    <w:next w:val="Normal"/>
+    <w:autoRedefine/>
+    <w:uiPriority w:val="99"/>
+    <w:unhideWhenUsed/>
+    <w:rsid w:val="001D4DA2"/>
+    <w:pPr>
+      <w:spacing w:after="0"/>
+      <w:ind w:left="1980" w:hanging="220"/>
+    </w:pPr>
+    <w:rPr>
+      <w:rFonts w:cstheme="minorHAnsi"/>
+      <w:sz w:val="18"/>
+      <w:szCs w:val="18"/>
+    </w:rPr>
+  </w:style>
+  <w:style w:type="paragraph" w:styleId="Ttulodendice">
+    <w:name w:val="index heading"/>
+    <w:basedOn w:val="Normal"/>
+    <w:next w:val="ndice1"/>
+    <w:uiPriority w:val="99"/>
+    <w:unhideWhenUsed/>
+    <w:rsid w:val="001D4DA2"/>
+    <w:pPr>
+      <w:pBdr>
+        <w:top w:val="double" w:sz="6" w:space="0" w:color="auto" w:shadow="1"/>
+        <w:left w:val="double" w:sz="6" w:space="0" w:color="auto" w:shadow="1"/>
+        <w:bottom w:val="double" w:sz="6" w:space="0" w:color="auto" w:shadow="1"/>
+        <w:right w:val="double" w:sz="6" w:space="0" w:color="auto" w:shadow="1"/>
+      </w:pBdr>
+      <w:spacing w:before="240" w:after="120"/>
+      <w:jc w:val="center"/>
+    </w:pPr>
+    <w:rPr>
+      <w:rFonts w:asciiTheme="majorHAnsi" w:hAnsiTheme="majorHAnsi" w:cstheme="majorHAnsi"/>
+      <w:b/>
+      <w:bCs/>
+    </w:rPr>
+  </w:style>
 </w:styles>
 </file>
 

</xml_diff>